<commit_message>
Add client project tracker feature page
</commit_message>
<xml_diff>
--- a/docs/Text2Task_SEO_Master_Blueprint_2026-08-29.docx
+++ b/docs/Text2Task_SEO_Master_Blueprint_2026-08-29.docx
@@ -7974,14 +7974,14 @@
           <w:sz w:val="21"/>
           <w:szCs w:val="21"/>
         </w:rPr>
-        <w:t xml:space="preserve">Status update (2026-08-29, later same day): </w:t>
-      </w:r>
-      <w:r>
-        <w:rPr>
-          <w:sz w:val="21"/>
-          <w:szCs w:val="21"/>
-        </w:rPr>
-        <w:t xml:space="preserve">the P1 pre-implementation mapping/audit this section previously called for is now COMPLETE — see Section 11. The route /features/client-project-tracker has NOT been created. No production code was changed during the mapping phase; only this document was updated.</w:t>
+        <w:t xml:space="preserve">Status update (2026-08-29, P1C visual integration pass): </w:t>
+      </w:r>
+      <w:r>
+        <w:rPr>
+          <w:sz w:val="21"/>
+          <w:szCs w:val="21"/>
+        </w:rPr>
+        <w:t xml:space="preserve">P1A COMPLETE. P1C COMPLETE. The route /features/client-project-tracker exists in the repository, is live in the production build's static output, is fully tested, includes both approved Client Share marketing visuals, and is included in the sitemap. Full implementation records: §11.17 (P1A), §11.18 (post-P1A copy refinement), §11.19 (P1C visual integration). Nothing was staged, committed, pushed, or deployed as part of any of these phases — the working tree changes are ready for review.</w:t>
       </w:r>
     </w:p>
     <w:tbl>
@@ -8028,7 +8028,7 @@
                 <w:sz w:val="23"/>
                 <w:szCs w:val="23"/>
               </w:rPr>
-              <w:t xml:space="preserve">NEXT PLANNED IMPLEMENTATION PHASE: P1A — Client Project Tracker Feature Page (core build)</w:t>
+              <w:t xml:space="preserve">NEXT PLANNED PHASE: P1B — Client Project Tracker internal linking / discovery</w:t>
             </w:r>
           </w:p>
           <w:p>
@@ -8047,16 +8047,14 @@
                 <w:sz w:val="21"/>
                 <w:szCs w:val="21"/>
               </w:rPr>
-              <w:t xml:space="preserve">Candidate route: </w:t>
-            </w:r>
-            <w:r>
-              <w:rPr>
-                <w:rFonts w:ascii="Consolas" w:cs="Consolas" w:eastAsia="Consolas" w:hAnsi="Consolas"/>
-                <w:color w:val="1D4ED8"/>
-                <w:sz w:val="20"/>
-                <w:szCs w:val="20"/>
-              </w:rPr>
-              <w:t xml:space="preserve">/features/client-project-tracker</w:t>
+              <w:t xml:space="preserve">Candidate scope: </w:t>
+            </w:r>
+            <w:r>
+              <w:rPr>
+                <w:sz w:val="21"/>
+                <w:szCs w:val="21"/>
+              </w:rPr>
+              <w:t xml:space="preserve">Freelancer Solution reciprocal link, homepage capability card, the deferred Use Case per-page copy audit and any resulting links, optional Email/Messages cross-links</w:t>
             </w:r>
           </w:p>
           <w:p>
@@ -8075,14 +8073,14 @@
                 <w:sz w:val="21"/>
                 <w:szCs w:val="21"/>
               </w:rPr>
-              <w:t xml:space="preserve">Primary keyword: </w:t>
+              <w:t xml:space="preserve">Full spec: </w:t>
             </w:r>
             <w:r>
               <w:rPr>
                 <w:sz w:val="21"/>
                 <w:szCs w:val="21"/>
               </w:rPr>
-              <w:t xml:space="preserve">client project tracker</w:t>
+              <w:t xml:space="preserve">§11.14 (phasing) and §11.9 (internal linking plan) of this document</w:t>
             </w:r>
           </w:p>
           <w:p>
@@ -8101,40 +8099,14 @@
                 <w:sz w:val="21"/>
                 <w:szCs w:val="21"/>
               </w:rPr>
-              <w:t xml:space="preserve">Page type: </w:t>
+              <w:t xml:space="preserve">Status: </w:t>
             </w:r>
             <w:r>
               <w:rPr>
                 <w:sz w:val="21"/>
                 <w:szCs w:val="21"/>
               </w:rPr>
-              <w:t xml:space="preserve">Feature (matches the existing 5-Feature-page pattern)</w:t>
-            </w:r>
-          </w:p>
-          <w:p>
-            <w:pPr>
-              <w:pStyle w:val="ListParagraph"/>
-              <w:numPr>
-                <w:ilvl w:val="0"/>
-                <w:numId w:val="1"/>
-              </w:numPr>
-              <w:spacing w:after="60"/>
-            </w:pPr>
-            <w:r>
-              <w:rPr>
-                <w:b/>
-                <w:bCs/>
-                <w:sz w:val="21"/>
-                <w:szCs w:val="21"/>
-              </w:rPr>
-              <w:t xml:space="preserve">Full spec: </w:t>
-            </w:r>
-            <w:r>
-              <w:rPr>
-                <w:sz w:val="21"/>
-                <w:szCs w:val="21"/>
-              </w:rPr>
-              <w:t xml:space="preserve">Section 11 (this document)</w:t>
+              <w:t xml:space="preserve">NOT started. P1B has not been marked complete and must not be assumed complete.</w:t>
             </w:r>
           </w:p>
         </w:tc>
@@ -8158,92 +8130,92 @@
           <w:sz w:val="22"/>
           <w:szCs w:val="22"/>
         </w:rPr>
-        <w:t xml:space="preserve">Before implementation, the next session must:</w:t>
-      </w:r>
-    </w:p>
-    <w:p>
-      <w:pPr>
-        <w:pStyle w:val="ListParagraph"/>
-        <w:numPr>
-          <w:ilvl w:val="0"/>
-          <w:numId w:val="1"/>
-        </w:numPr>
-        <w:spacing w:after="60"/>
-      </w:pPr>
-      <w:r>
-        <w:rPr>
-          <w:sz w:val="21"/>
-          <w:szCs w:val="21"/>
-        </w:rPr>
-        <w:t xml:space="preserve">Re-read Section 11 in full — chosen architecture reference, verified Client Share capability matrix, exact content blueprint, portal-language rules, schema/sitemap/test plans, and file map are all already decided.</w:t>
-      </w:r>
-    </w:p>
-    <w:p>
-      <w:pPr>
-        <w:pStyle w:val="ListParagraph"/>
-        <w:numPr>
-          <w:ilvl w:val="0"/>
-          <w:numId w:val="1"/>
-        </w:numPr>
-        <w:spacing w:after="60"/>
-      </w:pPr>
-      <w:r>
-        <w:rPr>
-          <w:sz w:val="21"/>
-          <w:szCs w:val="21"/>
-        </w:rPr>
-        <w:t xml:space="preserve">Implement exactly the P1A file set listed in §11.13 — no more, no less, unless a new audit finding requires otherwise.</w:t>
-      </w:r>
-    </w:p>
-    <w:p>
-      <w:pPr>
-        <w:pStyle w:val="ListParagraph"/>
-        <w:numPr>
-          <w:ilvl w:val="0"/>
-          <w:numId w:val="1"/>
-        </w:numPr>
-        <w:spacing w:after="60"/>
-      </w:pPr>
-      <w:r>
-        <w:rPr>
-          <w:sz w:val="21"/>
-          <w:szCs w:val="21"/>
-        </w:rPr>
-        <w:t xml:space="preserve">Follow the portal-language SAFE / CONDITIONAL / AVOID rules in §11.6 verbatim; do not introduce new marketing language not covered there without flagging it first.</w:t>
-      </w:r>
-    </w:p>
-    <w:p>
-      <w:pPr>
-        <w:pStyle w:val="ListParagraph"/>
-        <w:numPr>
-          <w:ilvl w:val="0"/>
-          <w:numId w:val="1"/>
-        </w:numPr>
-        <w:spacing w:after="60"/>
-      </w:pPr>
-      <w:r>
-        <w:rPr>
-          <w:sz w:val="21"/>
-          <w:szCs w:val="21"/>
-        </w:rPr>
-        <w:t xml:space="preserve">Run the full verification ritual established throughout this project: npx tsc --noEmit, npm run build, targeted ESLint, git diff --check.</w:t>
-      </w:r>
-    </w:p>
-    <w:p>
-      <w:pPr>
-        <w:pStyle w:val="ListParagraph"/>
-        <w:numPr>
-          <w:ilvl w:val="0"/>
-          <w:numId w:val="1"/>
-        </w:numPr>
-        <w:spacing w:after="60"/>
-      </w:pPr>
-      <w:r>
-        <w:rPr>
-          <w:sz w:val="21"/>
-          <w:szCs w:val="21"/>
-        </w:rPr>
-        <w:t xml:space="preserve">Stop after P1A and report for review before proceeding to P1B (broader internal linking) or P1C (visual enhancement) — see §11.14.</w:t>
+        <w:t xml:space="preserve">Before starting P1B, the next session must:</w:t>
+      </w:r>
+    </w:p>
+    <w:p>
+      <w:pPr>
+        <w:pStyle w:val="ListParagraph"/>
+        <w:numPr>
+          <w:ilvl w:val="0"/>
+          <w:numId w:val="1"/>
+        </w:numPr>
+        <w:spacing w:after="60"/>
+      </w:pPr>
+      <w:r>
+        <w:rPr>
+          <w:sz w:val="21"/>
+          <w:szCs w:val="21"/>
+        </w:rPr>
+        <w:t xml:space="preserve">Re-read §11.17 (P1A), §11.18 (copy refinement), and §11.19 (P1C visuals) to confirm exactly what already shipped, then §11.9/§11.14 for the remaining P1B scope.</w:t>
+      </w:r>
+    </w:p>
+    <w:p>
+      <w:pPr>
+        <w:pStyle w:val="ListParagraph"/>
+        <w:numPr>
+          <w:ilvl w:val="0"/>
+          <w:numId w:val="1"/>
+        </w:numPr>
+        <w:spacing w:after="60"/>
+      </w:pPr>
+      <w:r>
+        <w:rPr>
+          <w:sz w:val="21"/>
+          <w:szCs w:val="21"/>
+        </w:rPr>
+        <w:t xml:space="preserve">Perform the per-page copy audit of the project-managers, small-agencies, and virtual-assistants Use Cases that §11.9/§11.15 explicitly deferred, before adding any link from them.</w:t>
+      </w:r>
+    </w:p>
+    <w:p>
+      <w:pPr>
+        <w:pStyle w:val="ListParagraph"/>
+        <w:numPr>
+          <w:ilvl w:val="0"/>
+          <w:numId w:val="1"/>
+        </w:numPr>
+        <w:spacing w:after="60"/>
+      </w:pPr>
+      <w:r>
+        <w:rPr>
+          <w:sz w:val="21"/>
+          <w:szCs w:val="21"/>
+        </w:rPr>
+        <w:t xml:space="preserve">Get explicit approval before editing app/solutions/freelancer-project-management-software/page.tsx — this file has now been edited under narrow, explicitly-scoped instructions on 4 separate occasions this project; treat each future edit the same way.</w:t>
+      </w:r>
+    </w:p>
+    <w:p>
+      <w:pPr>
+        <w:pStyle w:val="ListParagraph"/>
+        <w:numPr>
+          <w:ilvl w:val="0"/>
+          <w:numId w:val="1"/>
+        </w:numPr>
+        <w:spacing w:after="60"/>
+      </w:pPr>
+      <w:r>
+        <w:rPr>
+          <w:sz w:val="21"/>
+          <w:szCs w:val="21"/>
+        </w:rPr>
+        <w:t xml:space="preserve">Keep P1B's own diff as small and single-purpose as P1A's and P1C's were.</w:t>
+      </w:r>
+    </w:p>
+    <w:p>
+      <w:pPr>
+        <w:pStyle w:val="ListParagraph"/>
+        <w:numPr>
+          <w:ilvl w:val="0"/>
+          <w:numId w:val="1"/>
+        </w:numPr>
+        <w:spacing w:after="60"/>
+      </w:pPr>
+      <w:r>
+        <w:rPr>
+          <w:sz w:val="21"/>
+          <w:szCs w:val="21"/>
+        </w:rPr>
+        <w:t xml:space="preserve">Run the same full verification ritual used for every phase so far: npx tsc --noEmit, npm run build, targeted tests, git diff --check.</w:t>
       </w:r>
     </w:p>
     <w:p>
@@ -8262,7 +8234,7 @@
           <w:sz w:val="21"/>
           <w:szCs w:val="21"/>
         </w:rPr>
-        <w:t xml:space="preserve">The next Claude session should begin exactly here — Section 10 — after first re-reading Section 11 in full, and Sections 4, 5, and 6 for the underlying product-truth and cannibalization context.</w:t>
+        <w:t xml:space="preserve">The next Claude session should begin exactly here — Section 10 — after first re-reading §11.17–§11.19 for what already shipped, then §11.9 and §11.14 for the remaining P1B scope.</w:t>
       </w:r>
     </w:p>
     <w:p>
@@ -15733,7 +15705,7 @@
                 <w:sz w:val="23"/>
                 <w:szCs w:val="23"/>
               </w:rPr>
-              <w:t xml:space="preserve">Next action:</w:t>
+              <w:t xml:space="preserve">Next action (superseded — see §11.17):</w:t>
             </w:r>
           </w:p>
           <w:p>
@@ -15751,12 +15723,2988 @@
                 <w:sz w:val="20"/>
                 <w:szCs w:val="20"/>
               </w:rPr>
-              <w:t xml:space="preserve">Implement P1A exactly as specified in §11.5, §11.6, §11.7, §11.8, §11.12, and §11.13 — pending explicit user approval to begin implementation. No file has been created or modified as part of this mapping phase.</w:t>
+              <w:t xml:space="preserve">This action item ("implement P1A") was completed on 2026-08-29. §11.1 through §11.16 above are preserved unchanged as decision history — the plan they describe is exactly what was built. §11.17 records the implementation result.</w:t>
             </w:r>
           </w:p>
         </w:tc>
       </w:tr>
     </w:tbl>
+    <w:p>
+      <w:pPr>
+        <w:pStyle w:val="Heading2"/>
+        <w:spacing w:after="120" w:before="260"/>
+      </w:pPr>
+      <w:r>
+        <w:rPr>
+          <w:b/>
+          <w:bCs/>
+          <w:color w:val="1D4ED8"/>
+          <w:sz w:val="26"/>
+          <w:szCs w:val="26"/>
+        </w:rPr>
+        <w:t xml:space="preserve">11.17 P1A implementation status (2026-08-29) — COMPLETE</w:t>
+      </w:r>
+    </w:p>
+    <w:p>
+      <w:pPr>
+        <w:spacing w:after="120"/>
+      </w:pPr>
+      <w:r>
+        <w:rPr>
+          <w:sz w:val="21"/>
+          <w:szCs w:val="21"/>
+        </w:rPr>
+        <w:t xml:space="preserve">P1A shipped exactly as scoped in §11.1–§11.13, with the deviations disclosed below. Nothing was staged, committed, pushed, or deployed — this record describes a reviewed, verified, uncommitted working-tree change set.</w:t>
+      </w:r>
+    </w:p>
+    <w:p>
+      <w:pPr>
+        <w:pStyle w:val="Heading3"/>
+        <w:spacing w:after="80" w:before="180"/>
+      </w:pPr>
+      <w:r>
+        <w:rPr>
+          <w:b/>
+          <w:bCs/>
+          <w:color w:val="1F2937"/>
+          <w:sz w:val="22"/>
+          <w:szCs w:val="22"/>
+        </w:rPr>
+        <w:t xml:space="preserve">Route and files</w:t>
+      </w:r>
+    </w:p>
+    <w:p>
+      <w:pPr>
+        <w:spacing w:after="120"/>
+      </w:pPr>
+      <w:r>
+        <w:rPr>
+          <w:b/>
+          <w:bCs/>
+          <w:sz w:val="21"/>
+          <w:szCs w:val="21"/>
+        </w:rPr>
+        <w:t xml:space="preserve">Route created: </w:t>
+      </w:r>
+      <w:r>
+        <w:rPr>
+          <w:rFonts w:ascii="Consolas" w:cs="Consolas" w:eastAsia="Consolas" w:hAnsi="Consolas"/>
+          <w:color w:val="1D4ED8"/>
+          <w:sz w:val="20"/>
+          <w:szCs w:val="20"/>
+        </w:rPr>
+        <w:t xml:space="preserve">/features/client-project-tracker</w:t>
+      </w:r>
+      <w:r>
+        <w:rPr>
+          <w:sz w:val="21"/>
+          <w:szCs w:val="21"/>
+        </w:rPr>
+        <w:t xml:space="preserve"> — confirmed present in the production build's static output (○ prerendered).</w:t>
+      </w:r>
+    </w:p>
+    <w:tbl>
+      <w:tblPr>
+        <w:tblW w:type="pct" w:w="100%"/>
+        <w:tblBorders>
+          <w:top w:val="single" w:color="D1D5DB" w:sz="4"/>
+          <w:left w:val="single" w:color="D1D5DB" w:sz="4"/>
+          <w:bottom w:val="single" w:color="D1D5DB" w:sz="4"/>
+          <w:right w:val="single" w:color="D1D5DB" w:sz="4"/>
+          <w:insideH w:val="single" w:color="D1D5DB" w:sz="4"/>
+          <w:insideV w:val="single" w:color="D1D5DB" w:sz="4"/>
+        </w:tblBorders>
+      </w:tblPr>
+      <w:tblGrid>
+        <w:gridCol w:w="100"/>
+        <w:gridCol w:w="100"/>
+        <w:gridCol w:w="100"/>
+      </w:tblGrid>
+      <w:tr>
+        <w:trPr>
+          <w:tblHeader/>
+        </w:trPr>
+        <w:tc>
+          <w:tcPr>
+            <w:tcW w:type="dxa" w:w="3200"/>
+            <w:shd w:fill="1D4ED8" w:color="auto" w:val="clear"/>
+            <w:tcMar>
+              <w:top w:type="dxa" w:w="80"/>
+              <w:left w:type="dxa" w:w="100"/>
+              <w:bottom w:type="dxa" w:w="80"/>
+              <w:right w:type="dxa" w:w="100"/>
+            </w:tcMar>
+            <w:vAlign w:val="center"/>
+          </w:tcPr>
+          <w:p>
+            <w:r>
+              <w:rPr>
+                <w:b/>
+                <w:bCs/>
+                <w:color w:val="FFFFFF"/>
+                <w:sz w:val="19"/>
+                <w:szCs w:val="19"/>
+              </w:rPr>
+              <w:t xml:space="preserve">File</w:t>
+            </w:r>
+          </w:p>
+        </w:tc>
+        <w:tc>
+          <w:tcPr>
+            <w:tcW w:type="dxa" w:w="1200"/>
+            <w:shd w:fill="1D4ED8" w:color="auto" w:val="clear"/>
+            <w:tcMar>
+              <w:top w:type="dxa" w:w="80"/>
+              <w:left w:type="dxa" w:w="100"/>
+              <w:bottom w:type="dxa" w:w="80"/>
+              <w:right w:type="dxa" w:w="100"/>
+            </w:tcMar>
+            <w:vAlign w:val="center"/>
+          </w:tcPr>
+          <w:p>
+            <w:r>
+              <w:rPr>
+                <w:b/>
+                <w:bCs/>
+                <w:color w:val="FFFFFF"/>
+                <w:sz w:val="19"/>
+                <w:szCs w:val="19"/>
+              </w:rPr>
+              <w:t xml:space="preserve">Action</w:t>
+            </w:r>
+          </w:p>
+        </w:tc>
+        <w:tc>
+          <w:tcPr>
+            <w:tcW w:type="dxa" w:w="4914"/>
+            <w:shd w:fill="1D4ED8" w:color="auto" w:val="clear"/>
+            <w:tcMar>
+              <w:top w:type="dxa" w:w="80"/>
+              <w:left w:type="dxa" w:w="100"/>
+              <w:bottom w:type="dxa" w:w="80"/>
+              <w:right w:type="dxa" w:w="100"/>
+            </w:tcMar>
+            <w:vAlign w:val="center"/>
+          </w:tcPr>
+          <w:p>
+            <w:r>
+              <w:rPr>
+                <w:b/>
+                <w:bCs/>
+                <w:color w:val="FFFFFF"/>
+                <w:sz w:val="19"/>
+                <w:szCs w:val="19"/>
+              </w:rPr>
+              <w:t xml:space="preserve">Result</w:t>
+            </w:r>
+          </w:p>
+        </w:tc>
+      </w:tr>
+      <w:tr>
+        <w:tc>
+          <w:tcPr>
+            <w:tcW w:type="dxa" w:w="3200"/>
+            <w:tcMar>
+              <w:top w:type="dxa" w:w="80"/>
+              <w:left w:type="dxa" w:w="100"/>
+              <w:bottom w:type="dxa" w:w="80"/>
+              <w:right w:type="dxa" w:w="100"/>
+            </w:tcMar>
+            <w:vAlign w:val="center"/>
+          </w:tcPr>
+          <w:p>
+            <w:r>
+              <w:rPr>
+                <w:b w:val="false"/>
+                <w:bCs w:val="false"/>
+                <w:color w:val="1F2937"/>
+                <w:sz w:val="19"/>
+                <w:szCs w:val="19"/>
+              </w:rPr>
+              <w:t xml:space="preserve">app/features/client-project-tracker/page.tsx</w:t>
+            </w:r>
+          </w:p>
+        </w:tc>
+        <w:tc>
+          <w:tcPr>
+            <w:tcW w:type="dxa" w:w="1200"/>
+            <w:tcMar>
+              <w:top w:type="dxa" w:w="80"/>
+              <w:left w:type="dxa" w:w="100"/>
+              <w:bottom w:type="dxa" w:w="80"/>
+              <w:right w:type="dxa" w:w="100"/>
+            </w:tcMar>
+            <w:vAlign w:val="center"/>
+          </w:tcPr>
+          <w:p>
+            <w:r>
+              <w:rPr>
+                <w:b w:val="false"/>
+                <w:bCs w:val="false"/>
+                <w:color w:val="1F2937"/>
+                <w:sz w:val="19"/>
+                <w:szCs w:val="19"/>
+              </w:rPr>
+              <w:t xml:space="preserve">CREATE</w:t>
+            </w:r>
+          </w:p>
+        </w:tc>
+        <w:tc>
+          <w:tcPr>
+            <w:tcW w:type="dxa" w:w="4914"/>
+            <w:tcMar>
+              <w:top w:type="dxa" w:w="80"/>
+              <w:left w:type="dxa" w:w="100"/>
+              <w:bottom w:type="dxa" w:w="80"/>
+              <w:right w:type="dxa" w:w="100"/>
+            </w:tcMar>
+            <w:vAlign w:val="center"/>
+          </w:tcPr>
+          <w:p>
+            <w:r>
+              <w:rPr>
+                <w:b w:val="false"/>
+                <w:bCs w:val="false"/>
+                <w:color w:val="1F2937"/>
+                <w:sz w:val="19"/>
+                <w:szCs w:val="19"/>
+              </w:rPr>
+              <w:t xml:space="preserve">New Feature page — hero, preview comparison, problem, how-it-works, capability checklist, privacy trust section, opt-in comments section, audience note, related links, FAQ, final CTA.</w:t>
+            </w:r>
+          </w:p>
+        </w:tc>
+      </w:tr>
+      <w:tr>
+        <w:tc>
+          <w:tcPr>
+            <w:tcW w:type="dxa" w:w="3200"/>
+            <w:shd w:fill="F3F4F6" w:color="auto" w:val="clear"/>
+            <w:tcMar>
+              <w:top w:type="dxa" w:w="80"/>
+              <w:left w:type="dxa" w:w="100"/>
+              <w:bottom w:type="dxa" w:w="80"/>
+              <w:right w:type="dxa" w:w="100"/>
+            </w:tcMar>
+            <w:vAlign w:val="center"/>
+          </w:tcPr>
+          <w:p>
+            <w:r>
+              <w:rPr>
+                <w:b w:val="false"/>
+                <w:bCs w:val="false"/>
+                <w:color w:val="1F2937"/>
+                <w:sz w:val="19"/>
+                <w:szCs w:val="19"/>
+              </w:rPr>
+              <w:t xml:space="preserve">app/features/client-project-tracker/page.module.css</w:t>
+            </w:r>
+          </w:p>
+        </w:tc>
+        <w:tc>
+          <w:tcPr>
+            <w:tcW w:type="dxa" w:w="1200"/>
+            <w:shd w:fill="F3F4F6" w:color="auto" w:val="clear"/>
+            <w:tcMar>
+              <w:top w:type="dxa" w:w="80"/>
+              <w:left w:type="dxa" w:w="100"/>
+              <w:bottom w:type="dxa" w:w="80"/>
+              <w:right w:type="dxa" w:w="100"/>
+            </w:tcMar>
+            <w:vAlign w:val="center"/>
+          </w:tcPr>
+          <w:p>
+            <w:r>
+              <w:rPr>
+                <w:b w:val="false"/>
+                <w:bCs w:val="false"/>
+                <w:color w:val="1F2937"/>
+                <w:sz w:val="19"/>
+                <w:szCs w:val="19"/>
+              </w:rPr>
+              <w:t xml:space="preserve">CREATE</w:t>
+            </w:r>
+          </w:p>
+        </w:tc>
+        <w:tc>
+          <w:tcPr>
+            <w:tcW w:type="dxa" w:w="4914"/>
+            <w:shd w:fill="F3F4F6" w:color="auto" w:val="clear"/>
+            <w:tcMar>
+              <w:top w:type="dxa" w:w="80"/>
+              <w:left w:type="dxa" w:w="100"/>
+              <w:bottom w:type="dxa" w:w="80"/>
+              <w:right w:type="dxa" w:w="100"/>
+            </w:tcMar>
+            <w:vAlign w:val="center"/>
+          </w:tcPr>
+          <w:p>
+            <w:r>
+              <w:rPr>
+                <w:b w:val="false"/>
+                <w:bCs w:val="false"/>
+                <w:color w:val="1F2937"/>
+                <w:sz w:val="19"/>
+                <w:szCs w:val="19"/>
+              </w:rPr>
+              <w:t xml:space="preserve">Local styles for the private-workspace vs. shared-view preview comparison.</w:t>
+            </w:r>
+          </w:p>
+        </w:tc>
+      </w:tr>
+      <w:tr>
+        <w:tc>
+          <w:tcPr>
+            <w:tcW w:type="dxa" w:w="3200"/>
+            <w:tcMar>
+              <w:top w:type="dxa" w:w="80"/>
+              <w:left w:type="dxa" w:w="100"/>
+              <w:bottom w:type="dxa" w:w="80"/>
+              <w:right w:type="dxa" w:w="100"/>
+            </w:tcMar>
+            <w:vAlign w:val="center"/>
+          </w:tcPr>
+          <w:p>
+            <w:r>
+              <w:rPr>
+                <w:b w:val="false"/>
+                <w:bCs w:val="false"/>
+                <w:color w:val="1F2937"/>
+                <w:sz w:val="19"/>
+                <w:szCs w:val="19"/>
+              </w:rPr>
+              <w:t xml:space="preserve">app/features/client-project-tracker/page.test.tsx</w:t>
+            </w:r>
+          </w:p>
+        </w:tc>
+        <w:tc>
+          <w:tcPr>
+            <w:tcW w:type="dxa" w:w="1200"/>
+            <w:tcMar>
+              <w:top w:type="dxa" w:w="80"/>
+              <w:left w:type="dxa" w:w="100"/>
+              <w:bottom w:type="dxa" w:w="80"/>
+              <w:right w:type="dxa" w:w="100"/>
+            </w:tcMar>
+            <w:vAlign w:val="center"/>
+          </w:tcPr>
+          <w:p>
+            <w:r>
+              <w:rPr>
+                <w:b w:val="false"/>
+                <w:bCs w:val="false"/>
+                <w:color w:val="1F2937"/>
+                <w:sz w:val="19"/>
+                <w:szCs w:val="19"/>
+              </w:rPr>
+              <w:t xml:space="preserve">CREATE</w:t>
+            </w:r>
+          </w:p>
+        </w:tc>
+        <w:tc>
+          <w:tcPr>
+            <w:tcW w:type="dxa" w:w="4914"/>
+            <w:tcMar>
+              <w:top w:type="dxa" w:w="80"/>
+              <w:left w:type="dxa" w:w="100"/>
+              <w:bottom w:type="dxa" w:w="80"/>
+              <w:right w:type="dxa" w:w="100"/>
+            </w:tcMar>
+            <w:vAlign w:val="center"/>
+          </w:tcPr>
+          <w:p>
+            <w:r>
+              <w:rPr>
+                <w:b w:val="false"/>
+                <w:bCs w:val="false"/>
+                <w:color w:val="1F2937"/>
+                <w:sz w:val="19"/>
+                <w:szCs w:val="19"/>
+              </w:rPr>
+              <w:t xml:space="preserve">13 tests: metadata/canonical, H1 intent, forbidden-claims boundary, required internal link, FAQ/schema parity, WebPage/Breadcrumb/FAQPage schema correctness, no SoftwareApplication/aggregateRating.</w:t>
+            </w:r>
+          </w:p>
+        </w:tc>
+      </w:tr>
+      <w:tr>
+        <w:tc>
+          <w:tcPr>
+            <w:tcW w:type="dxa" w:w="3200"/>
+            <w:shd w:fill="F3F4F6" w:color="auto" w:val="clear"/>
+            <w:tcMar>
+              <w:top w:type="dxa" w:w="80"/>
+              <w:left w:type="dxa" w:w="100"/>
+              <w:bottom w:type="dxa" w:w="80"/>
+              <w:right w:type="dxa" w:w="100"/>
+            </w:tcMar>
+            <w:vAlign w:val="center"/>
+          </w:tcPr>
+          <w:p>
+            <w:r>
+              <w:rPr>
+                <w:b w:val="false"/>
+                <w:bCs w:val="false"/>
+                <w:color w:val="1F2937"/>
+                <w:sz w:val="19"/>
+                <w:szCs w:val="19"/>
+              </w:rPr>
+              <w:t xml:space="preserve">app/sitemap.ts</w:t>
+            </w:r>
+          </w:p>
+        </w:tc>
+        <w:tc>
+          <w:tcPr>
+            <w:tcW w:type="dxa" w:w="1200"/>
+            <w:shd w:fill="F3F4F6" w:color="auto" w:val="clear"/>
+            <w:tcMar>
+              <w:top w:type="dxa" w:w="80"/>
+              <w:left w:type="dxa" w:w="100"/>
+              <w:bottom w:type="dxa" w:w="80"/>
+              <w:right w:type="dxa" w:w="100"/>
+            </w:tcMar>
+            <w:vAlign w:val="center"/>
+          </w:tcPr>
+          <w:p>
+            <w:r>
+              <w:rPr>
+                <w:b w:val="false"/>
+                <w:bCs w:val="false"/>
+                <w:color w:val="1F2937"/>
+                <w:sz w:val="19"/>
+                <w:szCs w:val="19"/>
+              </w:rPr>
+              <w:t xml:space="preserve">MODIFY</w:t>
+            </w:r>
+          </w:p>
+        </w:tc>
+        <w:tc>
+          <w:tcPr>
+            <w:tcW w:type="dxa" w:w="4914"/>
+            <w:shd w:fill="F3F4F6" w:color="auto" w:val="clear"/>
+            <w:tcMar>
+              <w:top w:type="dxa" w:w="80"/>
+              <w:left w:type="dxa" w:w="100"/>
+              <w:bottom w:type="dxa" w:w="80"/>
+              <w:right w:type="dxa" w:w="100"/>
+            </w:tcMar>
+            <w:vAlign w:val="center"/>
+          </w:tcPr>
+          <w:p>
+            <w:r>
+              <w:rPr>
+                <w:b w:val="false"/>
+                <w:bCs w:val="false"/>
+                <w:color w:val="1F2937"/>
+                <w:sz w:val="19"/>
+                <w:szCs w:val="19"/>
+              </w:rPr>
+              <w:t xml:space="preserve">One new featureRoutes entry, values identical to all 5 sibling Feature routes (priority 0.84, monthly).</w:t>
+            </w:r>
+          </w:p>
+        </w:tc>
+      </w:tr>
+      <w:tr>
+        <w:tc>
+          <w:tcPr>
+            <w:tcW w:type="dxa" w:w="3200"/>
+            <w:tcMar>
+              <w:top w:type="dxa" w:w="80"/>
+              <w:left w:type="dxa" w:w="100"/>
+              <w:bottom w:type="dxa" w:w="80"/>
+              <w:right w:type="dxa" w:w="100"/>
+            </w:tcMar>
+            <w:vAlign w:val="center"/>
+          </w:tcPr>
+          <w:p>
+            <w:r>
+              <w:rPr>
+                <w:b w:val="false"/>
+                <w:bCs w:val="false"/>
+                <w:color w:val="1F2937"/>
+                <w:sz w:val="19"/>
+                <w:szCs w:val="19"/>
+              </w:rPr>
+              <w:t xml:space="preserve">app/lib/schema-dangling-entity-references.test.ts</w:t>
+            </w:r>
+          </w:p>
+        </w:tc>
+        <w:tc>
+          <w:tcPr>
+            <w:tcW w:type="dxa" w:w="1200"/>
+            <w:tcMar>
+              <w:top w:type="dxa" w:w="80"/>
+              <w:left w:type="dxa" w:w="100"/>
+              <w:bottom w:type="dxa" w:w="80"/>
+              <w:right w:type="dxa" w:w="100"/>
+            </w:tcMar>
+            <w:vAlign w:val="center"/>
+          </w:tcPr>
+          <w:p>
+            <w:r>
+              <w:rPr>
+                <w:b w:val="false"/>
+                <w:bCs w:val="false"/>
+                <w:color w:val="1F2937"/>
+                <w:sz w:val="19"/>
+                <w:szCs w:val="19"/>
+              </w:rPr>
+              <w:t xml:space="preserve">MODIFY</w:t>
+            </w:r>
+          </w:p>
+        </w:tc>
+        <w:tc>
+          <w:tcPr>
+            <w:tcW w:type="dxa" w:w="4914"/>
+            <w:tcMar>
+              <w:top w:type="dxa" w:w="80"/>
+              <w:left w:type="dxa" w:w="100"/>
+              <w:bottom w:type="dxa" w:w="80"/>
+              <w:right w:type="dxa" w:w="100"/>
+            </w:tcMar>
+            <w:vAlign w:val="center"/>
+          </w:tcPr>
+          <w:p>
+            <w:r>
+              <w:rPr>
+                <w:b w:val="false"/>
+                <w:bCs w:val="false"/>
+                <w:color w:val="1F2937"/>
+                <w:sz w:val="19"/>
+                <w:szCs w:val="19"/>
+              </w:rPr>
+              <w:t xml:space="preserve">New page's webPageJsonLd added to the existing describe.each list.</w:t>
+            </w:r>
+          </w:p>
+        </w:tc>
+      </w:tr>
+      <w:tr>
+        <w:tc>
+          <w:tcPr>
+            <w:tcW w:type="dxa" w:w="3200"/>
+            <w:shd w:fill="F3F4F6" w:color="auto" w:val="clear"/>
+            <w:tcMar>
+              <w:top w:type="dxa" w:w="80"/>
+              <w:left w:type="dxa" w:w="100"/>
+              <w:bottom w:type="dxa" w:w="80"/>
+              <w:right w:type="dxa" w:w="100"/>
+            </w:tcMar>
+            <w:vAlign w:val="center"/>
+          </w:tcPr>
+          <w:p>
+            <w:r>
+              <w:rPr>
+                <w:b w:val="false"/>
+                <w:bCs w:val="false"/>
+                <w:color w:val="1F2937"/>
+                <w:sz w:val="19"/>
+                <w:szCs w:val="19"/>
+              </w:rPr>
+              <w:t xml:space="preserve">app/features/client-feedback-to-tasks/page.tsx</w:t>
+            </w:r>
+          </w:p>
+        </w:tc>
+        <w:tc>
+          <w:tcPr>
+            <w:tcW w:type="dxa" w:w="1200"/>
+            <w:shd w:fill="F3F4F6" w:color="auto" w:val="clear"/>
+            <w:tcMar>
+              <w:top w:type="dxa" w:w="80"/>
+              <w:left w:type="dxa" w:w="100"/>
+              <w:bottom w:type="dxa" w:w="80"/>
+              <w:right w:type="dxa" w:w="100"/>
+            </w:tcMar>
+            <w:vAlign w:val="center"/>
+          </w:tcPr>
+          <w:p>
+            <w:r>
+              <w:rPr>
+                <w:b w:val="false"/>
+                <w:bCs w:val="false"/>
+                <w:color w:val="1F2937"/>
+                <w:sz w:val="19"/>
+                <w:szCs w:val="19"/>
+              </w:rPr>
+              <w:t xml:space="preserve">MODIFY</w:t>
+            </w:r>
+          </w:p>
+        </w:tc>
+        <w:tc>
+          <w:tcPr>
+            <w:tcW w:type="dxa" w:w="4914"/>
+            <w:shd w:fill="F3F4F6" w:color="auto" w:val="clear"/>
+            <w:tcMar>
+              <w:top w:type="dxa" w:w="80"/>
+              <w:left w:type="dxa" w:w="100"/>
+              <w:bottom w:type="dxa" w:w="80"/>
+              <w:right w:type="dxa" w:w="100"/>
+            </w:tcMar>
+            <w:vAlign w:val="center"/>
+          </w:tcPr>
+          <w:p>
+            <w:r>
+              <w:rPr>
+                <w:b w:val="false"/>
+                <w:bCs w:val="false"/>
+                <w:color w:val="1F2937"/>
+                <w:sz w:val="19"/>
+                <w:szCs w:val="19"/>
+              </w:rPr>
+              <w:t xml:space="preserve">One new relatedLinks entry, direction-explicit ("Share selected project status and progress back with your client") — satisfies Cannibalization Rule 4.</w:t>
+            </w:r>
+          </w:p>
+        </w:tc>
+      </w:tr>
+      <w:tr>
+        <w:tc>
+          <w:tcPr>
+            <w:tcW w:type="dxa" w:w="3200"/>
+            <w:tcMar>
+              <w:top w:type="dxa" w:w="80"/>
+              <w:left w:type="dxa" w:w="100"/>
+              <w:bottom w:type="dxa" w:w="80"/>
+              <w:right w:type="dxa" w:w="100"/>
+            </w:tcMar>
+            <w:vAlign w:val="center"/>
+          </w:tcPr>
+          <w:p>
+            <w:r>
+              <w:rPr>
+                <w:b w:val="false"/>
+                <w:bCs w:val="false"/>
+                <w:color w:val="1F2937"/>
+                <w:sz w:val="19"/>
+                <w:szCs w:val="19"/>
+              </w:rPr>
+              <w:t xml:space="preserve">app/components/landing/landing-footer.tsx</w:t>
+            </w:r>
+          </w:p>
+        </w:tc>
+        <w:tc>
+          <w:tcPr>
+            <w:tcW w:type="dxa" w:w="1200"/>
+            <w:tcMar>
+              <w:top w:type="dxa" w:w="80"/>
+              <w:left w:type="dxa" w:w="100"/>
+              <w:bottom w:type="dxa" w:w="80"/>
+              <w:right w:type="dxa" w:w="100"/>
+            </w:tcMar>
+            <w:vAlign w:val="center"/>
+          </w:tcPr>
+          <w:p>
+            <w:r>
+              <w:rPr>
+                <w:b w:val="false"/>
+                <w:bCs w:val="false"/>
+                <w:color w:val="1F2937"/>
+                <w:sz w:val="19"/>
+                <w:szCs w:val="19"/>
+              </w:rPr>
+              <w:t xml:space="preserve">MODIFY</w:t>
+            </w:r>
+          </w:p>
+        </w:tc>
+        <w:tc>
+          <w:tcPr>
+            <w:tcW w:type="dxa" w:w="4914"/>
+            <w:tcMar>
+              <w:top w:type="dxa" w:w="80"/>
+              <w:left w:type="dxa" w:w="100"/>
+              <w:bottom w:type="dxa" w:w="80"/>
+              <w:right w:type="dxa" w:w="100"/>
+            </w:tcMar>
+            <w:vAlign w:val="center"/>
+          </w:tcPr>
+          <w:p>
+            <w:r>
+              <w:rPr>
+                <w:b w:val="false"/>
+                <w:bCs w:val="false"/>
+                <w:color w:val="1F2937"/>
+                <w:sz w:val="19"/>
+                <w:szCs w:val="19"/>
+              </w:rPr>
+              <w:t xml:space="preserve">One new productLinks entry — matches the 4-of-5 baseline convention identified in §11.10.</w:t>
+            </w:r>
+          </w:p>
+        </w:tc>
+      </w:tr>
+    </w:tbl>
+    <w:p>
+      <w:pPr>
+        <w:spacing w:after="120"/>
+      </w:pPr>
+      <w:r>
+        <w:rPr>
+          <w:sz w:val="21"/>
+          <w:szCs w:val="21"/>
+        </w:rPr>
+        <w:t xml:space="preserve">No other file was touched. app/solutions/freelancer-project-management-software/page.tsx, homepage-post-extraction-section.tsx, landing-header.tsx, app/lib/schema.ts, app/components/JsonLd.tsx, all 12 Use Case pages, and every Client Share dashboard/migration file remain exactly as specified UNCHANGED in §11.13.</w:t>
+      </w:r>
+    </w:p>
+    <w:p>
+      <w:pPr>
+        <w:pStyle w:val="Heading3"/>
+        <w:spacing w:after="80" w:before="180"/>
+      </w:pPr>
+      <w:r>
+        <w:rPr>
+          <w:b/>
+          <w:bCs/>
+          <w:color w:val="1F2937"/>
+          <w:sz w:val="22"/>
+          <w:szCs w:val="22"/>
+        </w:rPr>
+        <w:t xml:space="preserve">Metadata implemented</w:t>
+      </w:r>
+    </w:p>
+    <w:p>
+      <w:pPr>
+        <w:pStyle w:val="ListParagraph"/>
+        <w:numPr>
+          <w:ilvl w:val="0"/>
+          <w:numId w:val="1"/>
+        </w:numPr>
+        <w:spacing w:after="60"/>
+      </w:pPr>
+      <w:r>
+        <w:rPr>
+          <w:sz w:val="21"/>
+          <w:szCs w:val="21"/>
+        </w:rPr>
+        <w:t xml:space="preserve">Title: "Client Project Tracker: Share Project Progress With Clients" — matches §11.5 exactly.</w:t>
+      </w:r>
+    </w:p>
+    <w:p>
+      <w:pPr>
+        <w:pStyle w:val="ListParagraph"/>
+        <w:numPr>
+          <w:ilvl w:val="0"/>
+          <w:numId w:val="1"/>
+        </w:numPr>
+        <w:spacing w:after="60"/>
+      </w:pPr>
+      <w:r>
+        <w:rPr>
+          <w:sz w:val="21"/>
+          <w:szCs w:val="21"/>
+        </w:rPr>
+        <w:t xml:space="preserve">Description: matches §11.5 exactly.</w:t>
+      </w:r>
+    </w:p>
+    <w:p>
+      <w:pPr>
+        <w:pStyle w:val="ListParagraph"/>
+        <w:numPr>
+          <w:ilvl w:val="0"/>
+          <w:numId w:val="1"/>
+        </w:numPr>
+        <w:spacing w:after="60"/>
+      </w:pPr>
+      <w:r>
+        <w:rPr>
+          <w:sz w:val="21"/>
+          <w:szCs w:val="21"/>
+        </w:rPr>
+        <w:t xml:space="preserve">Canonical: /features/client-project-tracker.</w:t>
+      </w:r>
+    </w:p>
+    <w:p>
+      <w:pPr>
+        <w:pStyle w:val="ListParagraph"/>
+        <w:numPr>
+          <w:ilvl w:val="0"/>
+          <w:numId w:val="1"/>
+        </w:numPr>
+        <w:spacing w:after="60"/>
+      </w:pPr>
+      <w:r>
+        <w:rPr>
+          <w:sz w:val="21"/>
+          <w:szCs w:val="21"/>
+        </w:rPr>
+        <w:t xml:space="preserve">H1: "Share project status and progress with your client." — matches §11.5 exactly.</w:t>
+      </w:r>
+    </w:p>
+    <w:p>
+      <w:pPr>
+        <w:pStyle w:val="ListParagraph"/>
+        <w:numPr>
+          <w:ilvl w:val="0"/>
+          <w:numId w:val="1"/>
+        </w:numPr>
+        <w:spacing w:after="60"/>
+      </w:pPr>
+      <w:r>
+        <w:rPr>
+          <w:sz w:val="21"/>
+          <w:szCs w:val="21"/>
+        </w:rPr>
+        <w:t xml:space="preserve">OpenGraph/Twitter: title/description implemented; image intentionally omitted (see Deviations below).</w:t>
+      </w:r>
+    </w:p>
+    <w:p>
+      <w:pPr>
+        <w:pStyle w:val="Heading3"/>
+        <w:spacing w:after="80" w:before="180"/>
+      </w:pPr>
+      <w:r>
+        <w:rPr>
+          <w:b/>
+          <w:bCs/>
+          <w:color w:val="1F2937"/>
+          <w:sz w:val="22"/>
+          <w:szCs w:val="22"/>
+        </w:rPr>
+        <w:t xml:space="preserve">Schema implemented</w:t>
+      </w:r>
+    </w:p>
+    <w:p>
+      <w:pPr>
+        <w:pStyle w:val="ListParagraph"/>
+        <w:numPr>
+          <w:ilvl w:val="0"/>
+          <w:numId w:val="1"/>
+        </w:numPr>
+        <w:spacing w:after="60"/>
+      </w:pPr>
+      <w:r>
+        <w:rPr>
+          <w:sz w:val="21"/>
+          <w:szCs w:val="21"/>
+        </w:rPr>
+        <w:t xml:space="preserve">WebPage (@id via buildWebPageEntityId, isPartOf/publisher as @id references, no mainEntity) — matches §11.7 exactly.</w:t>
+      </w:r>
+    </w:p>
+    <w:p>
+      <w:pPr>
+        <w:pStyle w:val="ListParagraph"/>
+        <w:numPr>
+          <w:ilvl w:val="0"/>
+          <w:numId w:val="1"/>
+        </w:numPr>
+        <w:spacing w:after="60"/>
+      </w:pPr>
+      <w:r>
+        <w:rPr>
+          <w:sz w:val="21"/>
+          <w:szCs w:val="21"/>
+        </w:rPr>
+        <w:t xml:space="preserve">BreadcrumbList — 2-level, Home → Client Project Tracker — matches §11.7 exactly.</w:t>
+      </w:r>
+    </w:p>
+    <w:p>
+      <w:pPr>
+        <w:pStyle w:val="ListParagraph"/>
+        <w:numPr>
+          <w:ilvl w:val="0"/>
+          <w:numId w:val="1"/>
+        </w:numPr>
+        <w:spacing w:after="60"/>
+      </w:pPr>
+      <w:r>
+        <w:rPr>
+          <w:sz w:val="21"/>
+          <w:szCs w:val="21"/>
+        </w:rPr>
+        <w:t xml:space="preserve">FAQPage — 6 questions, JSON-LD count verified equal to visible FAQ count by an automated test.</w:t>
+      </w:r>
+    </w:p>
+    <w:p>
+      <w:pPr>
+        <w:pStyle w:val="ListParagraph"/>
+        <w:numPr>
+          <w:ilvl w:val="0"/>
+          <w:numId w:val="1"/>
+        </w:numPr>
+        <w:spacing w:after="60"/>
+      </w:pPr>
+      <w:r>
+        <w:rPr>
+          <w:sz w:val="21"/>
+          <w:szCs w:val="21"/>
+        </w:rPr>
+        <w:t xml:space="preserve">No SoftwareApplication, no aggregateRating/review, no dangling @id references — verified by both the extended shared test suite and the new page's own test file.</w:t>
+      </w:r>
+    </w:p>
+    <w:p>
+      <w:pPr>
+        <w:pStyle w:val="Heading3"/>
+        <w:spacing w:after="80" w:before="180"/>
+      </w:pPr>
+      <w:r>
+        <w:rPr>
+          <w:b/>
+          <w:bCs/>
+          <w:color w:val="1F2937"/>
+          <w:sz w:val="22"/>
+          <w:szCs w:val="22"/>
+        </w:rPr>
+        <w:t xml:space="preserve">Client Share claims used (verified against §11.2 capability matrix)</w:t>
+      </w:r>
+    </w:p>
+    <w:p>
+      <w:pPr>
+        <w:pStyle w:val="ListParagraph"/>
+        <w:numPr>
+          <w:ilvl w:val="0"/>
+          <w:numId w:val="1"/>
+        </w:numPr>
+        <w:spacing w:after="60"/>
+      </w:pPr>
+      <w:r>
+        <w:rPr>
+          <w:sz w:val="21"/>
+          <w:szCs w:val="21"/>
+        </w:rPr>
+        <w:t xml:space="preserve">"No Text2Task account is required" for the client — matches the audited "Client account/login: NO, confirmed absent" row (wording refined 2026-08-29, see §11.18 — the original "no account, login, or sign-in required" phrasing risked implying a PIN-protected link needs no access step at all).</w:t>
+      </w:r>
+    </w:p>
+    <w:p>
+      <w:pPr>
+        <w:pStyle w:val="ListParagraph"/>
+        <w:numPr>
+          <w:ilvl w:val="0"/>
+          <w:numId w:val="1"/>
+        </w:numPr>
+        <w:spacing w:after="60"/>
+      </w:pPr>
+      <w:r>
+        <w:rPr>
+          <w:sz w:val="21"/>
+          <w:szCs w:val="21"/>
+        </w:rPr>
+        <w:t xml:space="preserve">"Choose exactly what's visible... status, target date, selected tasks, resources, and updates" — matches the audited opt-in-visibility rows.</w:t>
+      </w:r>
+    </w:p>
+    <w:p>
+      <w:pPr>
+        <w:pStyle w:val="ListParagraph"/>
+        <w:numPr>
+          <w:ilvl w:val="0"/>
+          <w:numId w:val="1"/>
+        </w:numPr>
+        <w:spacing w:after="60"/>
+      </w:pPr>
+      <w:r>
+        <w:rPr>
+          <w:sz w:val="21"/>
+          <w:szCs w:val="21"/>
+        </w:rPr>
+        <w:t xml:space="preserve">"Add a PIN" / "expire automatically" / "disable, re-enable, revoke, or generate a new link" — matches the audited PIN, expiration, and lifecycle-action rows ("rotate" was rendered in plain language as "generate a new link" for a public audience).</w:t>
+      </w:r>
+    </w:p>
+    <w:p>
+      <w:pPr>
+        <w:pStyle w:val="ListParagraph"/>
+        <w:numPr>
+          <w:ilvl w:val="0"/>
+          <w:numId w:val="1"/>
+        </w:numPr>
+        <w:spacing w:after="60"/>
+      </w:pPr>
+      <w:r>
+        <w:rPr>
+          <w:sz w:val="21"/>
+          <w:szCs w:val="21"/>
+        </w:rPr>
+        <w:t xml:space="preserve">"Internal notes, priority, budget, other projects, and your raw files stay private" — matches the audited privacy-boundary row exactly.</w:t>
+      </w:r>
+    </w:p>
+    <w:p>
+      <w:pPr>
+        <w:pStyle w:val="ListParagraph"/>
+        <w:numPr>
+          <w:ilvl w:val="0"/>
+          <w:numId w:val="1"/>
+        </w:numPr>
+        <w:spacing w:after="60"/>
+      </w:pPr>
+      <w:r>
+        <w:rPr>
+          <w:sz w:val="21"/>
+          <w:szCs w:val="21"/>
+        </w:rPr>
+        <w:t xml:space="preserve">"Your client can leave a comment... nothing is added to the project automatically" — matches the audited opt-in-comments row, including the explicit-owner-action requirement before anything reaches the project.</w:t>
+      </w:r>
+    </w:p>
+    <w:p>
+      <w:pPr>
+        <w:pStyle w:val="ListParagraph"/>
+        <w:numPr>
+          <w:ilvl w:val="0"/>
+          <w:numId w:val="1"/>
+        </w:numPr>
+        <w:spacing w:after="60"/>
+      </w:pPr>
+      <w:r>
+        <w:rPr>
+          <w:sz w:val="21"/>
+          <w:szCs w:val="21"/>
+        </w:rPr>
+        <w:t xml:space="preserve">No sentence on the page claims anything broader than a row in §11.2 — each was checked individually before finalizing copy, per this phase's explicit verification requirement.</w:t>
+      </w:r>
+    </w:p>
+    <w:p>
+      <w:pPr>
+        <w:pStyle w:val="Heading3"/>
+        <w:spacing w:after="80" w:before="180"/>
+      </w:pPr>
+      <w:r>
+        <w:rPr>
+          <w:b/>
+          <w:bCs/>
+          <w:color w:val="1F2937"/>
+          <w:sz w:val="22"/>
+          <w:szCs w:val="22"/>
+        </w:rPr>
+        <w:t xml:space="preserve">Tests and verification results</w:t>
+      </w:r>
+    </w:p>
+    <w:p>
+      <w:pPr>
+        <w:pStyle w:val="ListParagraph"/>
+        <w:numPr>
+          <w:ilvl w:val="0"/>
+          <w:numId w:val="1"/>
+        </w:numPr>
+        <w:spacing w:after="60"/>
+      </w:pPr>
+      <w:r>
+        <w:rPr>
+          <w:sz w:val="21"/>
+          <w:szCs w:val="21"/>
+        </w:rPr>
+        <w:t xml:space="preserve">Targeted tests (new + modified files): 134 tests passed across 5 test files.</w:t>
+      </w:r>
+    </w:p>
+    <w:p>
+      <w:pPr>
+        <w:pStyle w:val="ListParagraph"/>
+        <w:numPr>
+          <w:ilvl w:val="0"/>
+          <w:numId w:val="1"/>
+        </w:numPr>
+        <w:spacing w:after="60"/>
+      </w:pPr>
+      <w:r>
+        <w:rPr>
+          <w:sz w:val="21"/>
+          <w:szCs w:val="21"/>
+        </w:rPr>
+        <w:t xml:space="preserve">Full project test suite: 5,048 tests passed across 182 test files — zero regressions from the footer/relatedLinks/sitemap/schema-test edits.</w:t>
+      </w:r>
+    </w:p>
+    <w:p>
+      <w:pPr>
+        <w:pStyle w:val="ListParagraph"/>
+        <w:numPr>
+          <w:ilvl w:val="0"/>
+          <w:numId w:val="1"/>
+        </w:numPr>
+        <w:spacing w:after="60"/>
+      </w:pPr>
+      <w:r>
+        <w:rPr>
+          <w:sz w:val="21"/>
+          <w:szCs w:val="21"/>
+        </w:rPr>
+        <w:t xml:space="preserve">npx tsc --noEmit: clean, zero errors.</w:t>
+      </w:r>
+    </w:p>
+    <w:p>
+      <w:pPr>
+        <w:pStyle w:val="ListParagraph"/>
+        <w:numPr>
+          <w:ilvl w:val="0"/>
+          <w:numId w:val="1"/>
+        </w:numPr>
+        <w:spacing w:after="60"/>
+      </w:pPr>
+      <w:r>
+        <w:rPr>
+          <w:sz w:val="21"/>
+          <w:szCs w:val="21"/>
+        </w:rPr>
+        <w:t xml:space="preserve">npm run build: succeeded; /features/client-project-tracker confirmed present in the route output as a statically prerendered page.</w:t>
+      </w:r>
+    </w:p>
+    <w:p>
+      <w:pPr>
+        <w:pStyle w:val="ListParagraph"/>
+        <w:numPr>
+          <w:ilvl w:val="0"/>
+          <w:numId w:val="1"/>
+        </w:numPr>
+        <w:spacing w:after="60"/>
+      </w:pPr>
+      <w:r>
+        <w:rPr>
+          <w:sz w:val="21"/>
+          <w:szCs w:val="21"/>
+        </w:rPr>
+        <w:t xml:space="preserve">git diff --check: clean (only harmless LF/CRLF line-ending notices, no whitespace errors).</w:t>
+      </w:r>
+    </w:p>
+    <w:p>
+      <w:pPr>
+        <w:pStyle w:val="ListParagraph"/>
+        <w:numPr>
+          <w:ilvl w:val="0"/>
+          <w:numId w:val="1"/>
+        </w:numPr>
+        <w:spacing w:after="60"/>
+      </w:pPr>
+      <w:r>
+        <w:rPr>
+          <w:sz w:val="21"/>
+          <w:szCs w:val="21"/>
+        </w:rPr>
+        <w:t xml:space="preserve">Full diff reviewed line by line — confirmed to touch only the 4 modified files' intended single insertions, plus the 3 new files.</w:t>
+      </w:r>
+    </w:p>
+    <w:p>
+      <w:pPr>
+        <w:pStyle w:val="Heading3"/>
+        <w:spacing w:after="80" w:before="180"/>
+      </w:pPr>
+      <w:r>
+        <w:rPr>
+          <w:b/>
+          <w:bCs/>
+          <w:color w:val="1F2937"/>
+          <w:sz w:val="22"/>
+          <w:szCs w:val="22"/>
+        </w:rPr>
+        <w:t xml:space="preserve">Deviations from the original §11.1–§11.13 mapping, and why</w:t>
+      </w:r>
+    </w:p>
+    <w:p>
+      <w:pPr>
+        <w:pStyle w:val="ListParagraph"/>
+        <w:numPr>
+          <w:ilvl w:val="0"/>
+          <w:numId w:val="1"/>
+        </w:numPr>
+        <w:spacing w:after="60"/>
+      </w:pPr>
+      <w:r>
+        <w:rPr>
+          <w:sz w:val="21"/>
+          <w:szCs w:val="21"/>
+        </w:rPr>
+        <w:t xml:space="preserve">OpenGraph/Twitter image omitted (not specified either way in §11.5). Reusing an existing sibling page's screenshot would misrepresent this specific feature, and no new screenshot was permitted in P1A (§11.11). The root layout has no site-wide default image either, so this degrades gracefully rather than showing a broken or misleading image. Revisit in P1C once an authentic Client Share screenshot exists.</w:t>
+      </w:r>
+    </w:p>
+    <w:p>
+      <w:pPr>
+        <w:pStyle w:val="ListParagraph"/>
+        <w:numPr>
+          <w:ilvl w:val="0"/>
+          <w:numId w:val="1"/>
+        </w:numPr>
+        <w:spacing w:after="60"/>
+      </w:pPr>
+      <w:r>
+        <w:rPr>
+          <w:sz w:val="21"/>
+          <w:szCs w:val="21"/>
+        </w:rPr>
+        <w:t xml:space="preserve">"Who this helps" implemented as a single prose paragraph with one inline link to the Freelancer Solution, rather than the multi-card audienceGrid pattern every sibling page uses. This is a deliberate, disclosed deviation: an audienceGrid on this page would need Use Case links, and §11.9/§11.15 explicitly deferred that audit to P1B ("DO NOT LINK FROM THESE PAGES YET") — a one-card grid would look visually broken, so a short paragraph was used instead, per this phase's explicit instruction not to force identical section counts.</w:t>
+      </w:r>
+    </w:p>
+    <w:p>
+      <w:pPr>
+        <w:pStyle w:val="ListParagraph"/>
+        <w:numPr>
+          <w:ilvl w:val="0"/>
+          <w:numId w:val="1"/>
+        </w:numPr>
+        <w:spacing w:after="60"/>
+      </w:pPr>
+      <w:r>
+        <w:rPr>
+          <w:sz w:val="21"/>
+          <w:szCs w:val="21"/>
+        </w:rPr>
+        <w:t xml:space="preserve">Two-column preview comparison (private workspace vs. what the client sees) instead of client-feedback-to-tasks' three-column layout — matches ai-task-extractor/screenshot-to-tasks' simpler before/after pattern, appropriate to Tracker's simpler one-step comparison.</w:t>
+      </w:r>
+    </w:p>
+    <w:p>
+      <w:pPr>
+        <w:pStyle w:val="ListParagraph"/>
+        <w:numPr>
+          <w:ilvl w:val="0"/>
+          <w:numId w:val="1"/>
+        </w:numPr>
+        <w:spacing w:after="60"/>
+      </w:pPr>
+      <w:r>
+        <w:rPr>
+          <w:sz w:val="21"/>
+          <w:szCs w:val="21"/>
+        </w:rPr>
+        <w:t xml:space="preserve">No other deviations. Route, primary keyword, terminology split (Client Project Tracker as SEO framing, Client Share named explicitly in body copy), portal-language rules, schema graph, sitemap values, and the two P1A-required internal links all match §11.1–§11.13 exactly.</w:t>
+      </w:r>
+    </w:p>
+    <w:p>
+      <w:pPr>
+        <w:pStyle w:val="Heading3"/>
+        <w:spacing w:after="80" w:before="180"/>
+      </w:pPr>
+      <w:r>
+        <w:rPr>
+          <w:b/>
+          <w:bCs/>
+          <w:color w:val="1F2937"/>
+          <w:sz w:val="22"/>
+          <w:szCs w:val="22"/>
+        </w:rPr>
+        <w:t xml:space="preserve">Remaining P1B work (not started)</w:t>
+      </w:r>
+    </w:p>
+    <w:p>
+      <w:pPr>
+        <w:pStyle w:val="ListParagraph"/>
+        <w:numPr>
+          <w:ilvl w:val="0"/>
+          <w:numId w:val="1"/>
+        </w:numPr>
+        <w:spacing w:after="60"/>
+      </w:pPr>
+      <w:r>
+        <w:rPr>
+          <w:sz w:val="21"/>
+          <w:szCs w:val="21"/>
+        </w:rPr>
+        <w:t xml:space="preserve">Freelancer Solution reciprocal link — needs its own explicit approval (this file has now been edited 4 times this project under narrow scope each time).</w:t>
+      </w:r>
+    </w:p>
+    <w:p>
+      <w:pPr>
+        <w:pStyle w:val="ListParagraph"/>
+        <w:numPr>
+          <w:ilvl w:val="0"/>
+          <w:numId w:val="1"/>
+        </w:numPr>
+        <w:spacing w:after="60"/>
+      </w:pPr>
+      <w:r>
+        <w:rPr>
+          <w:sz w:val="21"/>
+          <w:szCs w:val="21"/>
+        </w:rPr>
+        <w:t xml:space="preserve">Homepage capability-card entry in homepage-post-extraction-section.tsx.</w:t>
+      </w:r>
+    </w:p>
+    <w:p>
+      <w:pPr>
+        <w:pStyle w:val="ListParagraph"/>
+        <w:numPr>
+          <w:ilvl w:val="0"/>
+          <w:numId w:val="1"/>
+        </w:numPr>
+        <w:spacing w:after="60"/>
+      </w:pPr>
+      <w:r>
+        <w:rPr>
+          <w:sz w:val="21"/>
+          <w:szCs w:val="21"/>
+        </w:rPr>
+        <w:t xml:space="preserve">Per-page copy audit of project-managers, small-agencies, and virtual-assistants Use Cases, and any resulting links.</w:t>
+      </w:r>
+    </w:p>
+    <w:p>
+      <w:pPr>
+        <w:pStyle w:val="ListParagraph"/>
+        <w:numPr>
+          <w:ilvl w:val="0"/>
+          <w:numId w:val="1"/>
+        </w:numPr>
+        <w:spacing w:after="60"/>
+      </w:pPr>
+      <w:r>
+        <w:rPr>
+          <w:sz w:val="21"/>
+          <w:szCs w:val="21"/>
+        </w:rPr>
+        <w:t xml:space="preserve">Optional Email to Tasks / Messages Resource cross-links.</w:t>
+      </w:r>
+    </w:p>
+    <w:p>
+      <w:pPr>
+        <w:pStyle w:val="Heading3"/>
+        <w:spacing w:after="80" w:before="180"/>
+      </w:pPr>
+      <w:r>
+        <w:rPr>
+          <w:b/>
+          <w:bCs/>
+          <w:color w:val="1F2937"/>
+          <w:sz w:val="22"/>
+          <w:szCs w:val="22"/>
+        </w:rPr>
+        <w:t xml:space="preserve">Remaining P1C work (not started)</w:t>
+      </w:r>
+    </w:p>
+    <w:p>
+      <w:pPr>
+        <w:pStyle w:val="ListParagraph"/>
+        <w:numPr>
+          <w:ilvl w:val="0"/>
+          <w:numId w:val="1"/>
+        </w:numPr>
+        <w:spacing w:after="60"/>
+      </w:pPr>
+      <w:r>
+        <w:rPr>
+          <w:sz w:val="21"/>
+          <w:szCs w:val="21"/>
+        </w:rPr>
+        <w:t xml:space="preserve">A real Client Share screenshot (ShareLinkConfigurationEditor and/or the public share view) captured from a safe demo/seed dataset — no real customer or tenant data.</w:t>
+      </w:r>
+    </w:p>
+    <w:p>
+      <w:pPr>
+        <w:pStyle w:val="ListParagraph"/>
+        <w:numPr>
+          <w:ilvl w:val="0"/>
+          <w:numId w:val="1"/>
+        </w:numPr>
+        <w:spacing w:after="60"/>
+      </w:pPr>
+      <w:r>
+        <w:rPr>
+          <w:sz w:val="21"/>
+          <w:szCs w:val="21"/>
+        </w:rPr>
+        <w:t xml:space="preserve">An OpenGraph/Twitter image for the page once that screenshot exists.</w:t>
+      </w:r>
+    </w:p>
+    <w:p>
+      <w:pPr>
+        <w:pStyle w:val="Heading2"/>
+        <w:spacing w:after="120" w:before="260"/>
+      </w:pPr>
+      <w:r>
+        <w:rPr>
+          <w:b/>
+          <w:bCs/>
+          <w:color w:val="1D4ED8"/>
+          <w:sz w:val="26"/>
+          <w:szCs w:val="26"/>
+        </w:rPr>
+        <w:t xml:space="preserve">11.18 Post-P1A copy refinement (2026-08-29, same day)</w:t>
+      </w:r>
+    </w:p>
+    <w:p>
+      <w:pPr>
+        <w:spacing w:after="120"/>
+      </w:pPr>
+      <w:r>
+        <w:rPr>
+          <w:sz w:val="21"/>
+          <w:szCs w:val="21"/>
+        </w:rPr>
+        <w:t xml:space="preserve">Six narrow, product-truth-motivated copy edits were made to the shipped page after initial review. No layout, metadata, H1, route, schema, sitemap, or link was touched.</w:t>
+      </w:r>
+    </w:p>
+    <w:tbl>
+      <w:tblPr>
+        <w:tblW w:type="pct" w:w="100%"/>
+        <w:tblBorders>
+          <w:top w:val="single" w:color="D1D5DB" w:sz="4"/>
+          <w:left w:val="single" w:color="D1D5DB" w:sz="4"/>
+          <w:bottom w:val="single" w:color="D1D5DB" w:sz="4"/>
+          <w:right w:val="single" w:color="D1D5DB" w:sz="4"/>
+          <w:insideH w:val="single" w:color="D1D5DB" w:sz="4"/>
+          <w:insideV w:val="single" w:color="D1D5DB" w:sz="4"/>
+        </w:tblBorders>
+      </w:tblPr>
+      <w:tblGrid>
+        <w:gridCol w:w="100"/>
+        <w:gridCol w:w="100"/>
+        <w:gridCol w:w="100"/>
+        <w:gridCol w:w="100"/>
+      </w:tblGrid>
+      <w:tr>
+        <w:trPr>
+          <w:tblHeader/>
+        </w:trPr>
+        <w:tc>
+          <w:tcPr>
+            <w:tcW w:type="dxa" w:w="1600"/>
+            <w:shd w:fill="1D4ED8" w:color="auto" w:val="clear"/>
+            <w:tcMar>
+              <w:top w:type="dxa" w:w="80"/>
+              <w:left w:type="dxa" w:w="100"/>
+              <w:bottom w:type="dxa" w:w="80"/>
+              <w:right w:type="dxa" w:w="100"/>
+            </w:tcMar>
+            <w:vAlign w:val="center"/>
+          </w:tcPr>
+          <w:p>
+            <w:r>
+              <w:rPr>
+                <w:b/>
+                <w:bCs/>
+                <w:color w:val="FFFFFF"/>
+                <w:sz w:val="19"/>
+                <w:szCs w:val="19"/>
+              </w:rPr>
+              <w:t xml:space="preserve">Location</w:t>
+            </w:r>
+          </w:p>
+        </w:tc>
+        <w:tc>
+          <w:tcPr>
+            <w:tcW w:type="dxa" w:w="2600"/>
+            <w:shd w:fill="1D4ED8" w:color="auto" w:val="clear"/>
+            <w:tcMar>
+              <w:top w:type="dxa" w:w="80"/>
+              <w:left w:type="dxa" w:w="100"/>
+              <w:bottom w:type="dxa" w:w="80"/>
+              <w:right w:type="dxa" w:w="100"/>
+            </w:tcMar>
+            <w:vAlign w:val="center"/>
+          </w:tcPr>
+          <w:p>
+            <w:r>
+              <w:rPr>
+                <w:b/>
+                <w:bCs/>
+                <w:color w:val="FFFFFF"/>
+                <w:sz w:val="19"/>
+                <w:szCs w:val="19"/>
+              </w:rPr>
+              <w:t xml:space="preserve">Old</w:t>
+            </w:r>
+          </w:p>
+        </w:tc>
+        <w:tc>
+          <w:tcPr>
+            <w:tcW w:type="dxa" w:w="2600"/>
+            <w:shd w:fill="1D4ED8" w:color="auto" w:val="clear"/>
+            <w:tcMar>
+              <w:top w:type="dxa" w:w="80"/>
+              <w:left w:type="dxa" w:w="100"/>
+              <w:bottom w:type="dxa" w:w="80"/>
+              <w:right w:type="dxa" w:w="100"/>
+            </w:tcMar>
+            <w:vAlign w:val="center"/>
+          </w:tcPr>
+          <w:p>
+            <w:r>
+              <w:rPr>
+                <w:b/>
+                <w:bCs/>
+                <w:color w:val="FFFFFF"/>
+                <w:sz w:val="19"/>
+                <w:szCs w:val="19"/>
+              </w:rPr>
+              <w:t xml:space="preserve">New</w:t>
+            </w:r>
+          </w:p>
+        </w:tc>
+        <w:tc>
+          <w:tcPr>
+            <w:tcW w:type="dxa" w:w="2514"/>
+            <w:shd w:fill="1D4ED8" w:color="auto" w:val="clear"/>
+            <w:tcMar>
+              <w:top w:type="dxa" w:w="80"/>
+              <w:left w:type="dxa" w:w="100"/>
+              <w:bottom w:type="dxa" w:w="80"/>
+              <w:right w:type="dxa" w:w="100"/>
+            </w:tcMar>
+            <w:vAlign w:val="center"/>
+          </w:tcPr>
+          <w:p>
+            <w:r>
+              <w:rPr>
+                <w:b/>
+                <w:bCs/>
+                <w:color w:val="FFFFFF"/>
+                <w:sz w:val="19"/>
+                <w:szCs w:val="19"/>
+              </w:rPr>
+              <w:t xml:space="preserve">Reason</w:t>
+            </w:r>
+          </w:p>
+        </w:tc>
+      </w:tr>
+      <w:tr>
+        <w:tc>
+          <w:tcPr>
+            <w:tcW w:type="dxa" w:w="1600"/>
+            <w:tcMar>
+              <w:top w:type="dxa" w:w="80"/>
+              <w:left w:type="dxa" w:w="100"/>
+              <w:bottom w:type="dxa" w:w="80"/>
+              <w:right w:type="dxa" w:w="100"/>
+            </w:tcMar>
+            <w:vAlign w:val="center"/>
+          </w:tcPr>
+          <w:p>
+            <w:r>
+              <w:rPr>
+                <w:b w:val="false"/>
+                <w:bCs w:val="false"/>
+                <w:color w:val="1F2937"/>
+                <w:sz w:val="19"/>
+                <w:szCs w:val="19"/>
+              </w:rPr>
+              <w:t xml:space="preserve">How-it-works step 1</w:t>
+            </w:r>
+          </w:p>
+        </w:tc>
+        <w:tc>
+          <w:tcPr>
+            <w:tcW w:type="dxa" w:w="2600"/>
+            <w:tcMar>
+              <w:top w:type="dxa" w:w="80"/>
+              <w:left w:type="dxa" w:w="100"/>
+              <w:bottom w:type="dxa" w:w="80"/>
+              <w:right w:type="dxa" w:w="100"/>
+            </w:tcMar>
+            <w:vAlign w:val="center"/>
+          </w:tcPr>
+          <w:p>
+            <w:r>
+              <w:rPr>
+                <w:b w:val="false"/>
+                <w:bCs w:val="false"/>
+                <w:color w:val="1F2937"/>
+                <w:sz w:val="19"/>
+                <w:szCs w:val="19"/>
+              </w:rPr>
+              <w:t xml:space="preserve">"Generate a private link for one project directly from Text2Task."</w:t>
+            </w:r>
+          </w:p>
+        </w:tc>
+        <w:tc>
+          <w:tcPr>
+            <w:tcW w:type="dxa" w:w="2600"/>
+            <w:tcMar>
+              <w:top w:type="dxa" w:w="80"/>
+              <w:left w:type="dxa" w:w="100"/>
+              <w:bottom w:type="dxa" w:w="80"/>
+              <w:right w:type="dxa" w:w="100"/>
+            </w:tcMar>
+            <w:vAlign w:val="center"/>
+          </w:tcPr>
+          <w:p>
+            <w:r>
+              <w:rPr>
+                <w:b w:val="false"/>
+                <w:bCs w:val="false"/>
+                <w:color w:val="1F2937"/>
+                <w:sz w:val="19"/>
+                <w:szCs w:val="19"/>
+              </w:rPr>
+              <w:t xml:space="preserve">"Generate a project share link directly from Text2Task."</w:t>
+            </w:r>
+          </w:p>
+        </w:tc>
+        <w:tc>
+          <w:tcPr>
+            <w:tcW w:type="dxa" w:w="2514"/>
+            <w:tcMar>
+              <w:top w:type="dxa" w:w="80"/>
+              <w:left w:type="dxa" w:w="100"/>
+              <w:bottom w:type="dxa" w:w="80"/>
+              <w:right w:type="dxa" w:w="100"/>
+            </w:tcMar>
+            <w:vAlign w:val="center"/>
+          </w:tcPr>
+          <w:p>
+            <w:r>
+              <w:rPr>
+                <w:b w:val="false"/>
+                <w:bCs w:val="false"/>
+                <w:color w:val="1F2937"/>
+                <w:sz w:val="19"/>
+                <w:szCs w:val="19"/>
+              </w:rPr>
+              <w:t xml:space="preserve">Plainer phrasing.</w:t>
+            </w:r>
+          </w:p>
+        </w:tc>
+      </w:tr>
+      <w:tr>
+        <w:tc>
+          <w:tcPr>
+            <w:tcW w:type="dxa" w:w="1600"/>
+            <w:shd w:fill="F3F4F6" w:color="auto" w:val="clear"/>
+            <w:tcMar>
+              <w:top w:type="dxa" w:w="80"/>
+              <w:left w:type="dxa" w:w="100"/>
+              <w:bottom w:type="dxa" w:w="80"/>
+              <w:right w:type="dxa" w:w="100"/>
+            </w:tcMar>
+            <w:vAlign w:val="center"/>
+          </w:tcPr>
+          <w:p>
+            <w:r>
+              <w:rPr>
+                <w:b w:val="false"/>
+                <w:bCs w:val="false"/>
+                <w:color w:val="1F2937"/>
+                <w:sz w:val="19"/>
+                <w:szCs w:val="19"/>
+              </w:rPr>
+              <w:t xml:space="preserve">How-it-works step 4</w:t>
+            </w:r>
+          </w:p>
+        </w:tc>
+        <w:tc>
+          <w:tcPr>
+            <w:tcW w:type="dxa" w:w="2600"/>
+            <w:shd w:fill="F3F4F6" w:color="auto" w:val="clear"/>
+            <w:tcMar>
+              <w:top w:type="dxa" w:w="80"/>
+              <w:left w:type="dxa" w:w="100"/>
+              <w:bottom w:type="dxa" w:w="80"/>
+              <w:right w:type="dxa" w:w="100"/>
+            </w:tcMar>
+            <w:vAlign w:val="center"/>
+          </w:tcPr>
+          <w:p>
+            <w:r>
+              <w:rPr>
+                <w:b w:val="false"/>
+                <w:bCs w:val="false"/>
+                <w:color w:val="1F2937"/>
+                <w:sz w:val="19"/>
+                <w:szCs w:val="19"/>
+              </w:rPr>
+              <w:t xml:space="preserve">"Your client opens it directly. No account or sign-in is required."</w:t>
+            </w:r>
+          </w:p>
+        </w:tc>
+        <w:tc>
+          <w:tcPr>
+            <w:tcW w:type="dxa" w:w="2600"/>
+            <w:shd w:fill="F3F4F6" w:color="auto" w:val="clear"/>
+            <w:tcMar>
+              <w:top w:type="dxa" w:w="80"/>
+              <w:left w:type="dxa" w:w="100"/>
+              <w:bottom w:type="dxa" w:w="80"/>
+              <w:right w:type="dxa" w:w="100"/>
+            </w:tcMar>
+            <w:vAlign w:val="center"/>
+          </w:tcPr>
+          <w:p>
+            <w:r>
+              <w:rPr>
+                <w:b w:val="false"/>
+                <w:bCs w:val="false"/>
+                <w:color w:val="1F2937"/>
+                <w:sz w:val="19"/>
+                <w:szCs w:val="19"/>
+              </w:rPr>
+              <w:t xml:space="preserve">"Your client opens it directly. No Text2Task account is required."</w:t>
+            </w:r>
+          </w:p>
+        </w:tc>
+        <w:tc>
+          <w:tcPr>
+            <w:tcW w:type="dxa" w:w="2514"/>
+            <w:shd w:fill="F3F4F6" w:color="auto" w:val="clear"/>
+            <w:tcMar>
+              <w:top w:type="dxa" w:w="80"/>
+              <w:left w:type="dxa" w:w="100"/>
+              <w:bottom w:type="dxa" w:w="80"/>
+              <w:right w:type="dxa" w:w="100"/>
+            </w:tcMar>
+            <w:vAlign w:val="center"/>
+          </w:tcPr>
+          <w:p>
+            <w:r>
+              <w:rPr>
+                <w:b w:val="false"/>
+                <w:bCs w:val="false"/>
+                <w:color w:val="1F2937"/>
+                <w:sz w:val="19"/>
+                <w:szCs w:val="19"/>
+              </w:rPr>
+              <w:t xml:space="preserve">Precision — avoids implying a PIN-protected link needs no access step.</w:t>
+            </w:r>
+          </w:p>
+        </w:tc>
+      </w:tr>
+      <w:tr>
+        <w:tc>
+          <w:tcPr>
+            <w:tcW w:type="dxa" w:w="1600"/>
+            <w:tcMar>
+              <w:top w:type="dxa" w:w="80"/>
+              <w:left w:type="dxa" w:w="100"/>
+              <w:bottom w:type="dxa" w:w="80"/>
+              <w:right w:type="dxa" w:w="100"/>
+            </w:tcMar>
+            <w:vAlign w:val="center"/>
+          </w:tcPr>
+          <w:p>
+            <w:r>
+              <w:rPr>
+                <w:b w:val="false"/>
+                <w:bCs w:val="false"/>
+                <w:color w:val="1F2937"/>
+                <w:sz w:val="19"/>
+                <w:szCs w:val="19"/>
+              </w:rPr>
+              <w:t xml:space="preserve">Capability checklist</w:t>
+            </w:r>
+          </w:p>
+        </w:tc>
+        <w:tc>
+          <w:tcPr>
+            <w:tcW w:type="dxa" w:w="2600"/>
+            <w:tcMar>
+              <w:top w:type="dxa" w:w="80"/>
+              <w:left w:type="dxa" w:w="100"/>
+              <w:bottom w:type="dxa" w:w="80"/>
+              <w:right w:type="dxa" w:w="100"/>
+            </w:tcMar>
+            <w:vAlign w:val="center"/>
+          </w:tcPr>
+          <w:p>
+            <w:r>
+              <w:rPr>
+                <w:b w:val="false"/>
+                <w:bCs w:val="false"/>
+                <w:color w:val="1F2937"/>
+                <w:sz w:val="19"/>
+                <w:szCs w:val="19"/>
+              </w:rPr>
+              <w:t xml:space="preserve">"Selected tasks, grouped as in progress, waiting on feedback, or completed"</w:t>
+            </w:r>
+          </w:p>
+        </w:tc>
+        <w:tc>
+          <w:tcPr>
+            <w:tcW w:type="dxa" w:w="2600"/>
+            <w:tcMar>
+              <w:top w:type="dxa" w:w="80"/>
+              <w:left w:type="dxa" w:w="100"/>
+              <w:bottom w:type="dxa" w:w="80"/>
+              <w:right w:type="dxa" w:w="100"/>
+            </w:tcMar>
+            <w:vAlign w:val="center"/>
+          </w:tcPr>
+          <w:p>
+            <w:r>
+              <w:rPr>
+                <w:b w:val="false"/>
+                <w:bCs w:val="false"/>
+                <w:color w:val="1F2937"/>
+                <w:sz w:val="19"/>
+                <w:szCs w:val="19"/>
+              </w:rPr>
+              <w:t xml:space="preserve">"Selected tasks and their shared status"</w:t>
+            </w:r>
+          </w:p>
+        </w:tc>
+        <w:tc>
+          <w:tcPr>
+            <w:tcW w:type="dxa" w:w="2514"/>
+            <w:tcMar>
+              <w:top w:type="dxa" w:w="80"/>
+              <w:left w:type="dxa" w:w="100"/>
+              <w:bottom w:type="dxa" w:w="80"/>
+              <w:right w:type="dxa" w:w="100"/>
+            </w:tcMar>
+            <w:vAlign w:val="center"/>
+          </w:tcPr>
+          <w:p>
+            <w:r>
+              <w:rPr>
+                <w:b w:val="false"/>
+                <w:bCs w:val="false"/>
+                <w:color w:val="1F2937"/>
+                <w:sz w:val="19"/>
+                <w:szCs w:val="19"/>
+              </w:rPr>
+              <w:t xml:space="preserve">The specific 3-way grouping is not a guaranteed implementation contract; do not assert it publicly.</w:t>
+            </w:r>
+          </w:p>
+        </w:tc>
+      </w:tr>
+      <w:tr>
+        <w:tc>
+          <w:tcPr>
+            <w:tcW w:type="dxa" w:w="1600"/>
+            <w:shd w:fill="F3F4F6" w:color="auto" w:val="clear"/>
+            <w:tcMar>
+              <w:top w:type="dxa" w:w="80"/>
+              <w:left w:type="dxa" w:w="100"/>
+              <w:bottom w:type="dxa" w:w="80"/>
+              <w:right w:type="dxa" w:w="100"/>
+            </w:tcMar>
+            <w:vAlign w:val="center"/>
+          </w:tcPr>
+          <w:p>
+            <w:r>
+              <w:rPr>
+                <w:b w:val="false"/>
+                <w:bCs w:val="false"/>
+                <w:color w:val="1F2937"/>
+                <w:sz w:val="19"/>
+                <w:szCs w:val="19"/>
+              </w:rPr>
+              <w:t xml:space="preserve">Never-shared checklist</w:t>
+            </w:r>
+          </w:p>
+        </w:tc>
+        <w:tc>
+          <w:tcPr>
+            <w:tcW w:type="dxa" w:w="2600"/>
+            <w:shd w:fill="F3F4F6" w:color="auto" w:val="clear"/>
+            <w:tcMar>
+              <w:top w:type="dxa" w:w="80"/>
+              <w:left w:type="dxa" w:w="100"/>
+              <w:bottom w:type="dxa" w:w="80"/>
+              <w:right w:type="dxa" w:w="100"/>
+            </w:tcMar>
+            <w:vAlign w:val="center"/>
+          </w:tcPr>
+          <w:p>
+            <w:r>
+              <w:rPr>
+                <w:b w:val="false"/>
+                <w:bCs w:val="false"/>
+                <w:color w:val="1F2937"/>
+                <w:sz w:val="19"/>
+                <w:szCs w:val="19"/>
+              </w:rPr>
+              <w:t xml:space="preserve">Two items: raw files/folders; client account/login</w:t>
+            </w:r>
+          </w:p>
+        </w:tc>
+        <w:tc>
+          <w:tcPr>
+            <w:tcW w:type="dxa" w:w="2600"/>
+            <w:shd w:fill="F3F4F6" w:color="auto" w:val="clear"/>
+            <w:tcMar>
+              <w:top w:type="dxa" w:w="80"/>
+              <w:left w:type="dxa" w:w="100"/>
+              <w:bottom w:type="dxa" w:w="80"/>
+              <w:right w:type="dxa" w:w="100"/>
+            </w:tcMar>
+            <w:vAlign w:val="center"/>
+          </w:tcPr>
+          <w:p>
+            <w:r>
+              <w:rPr>
+                <w:b w:val="false"/>
+                <w:bCs w:val="false"/>
+                <w:color w:val="1F2937"/>
+                <w:sz w:val="19"/>
+                <w:szCs w:val="19"/>
+              </w:rPr>
+              <w:t xml:space="preserve">One item: "Resources you haven't chosen to share"</w:t>
+            </w:r>
+          </w:p>
+        </w:tc>
+        <w:tc>
+          <w:tcPr>
+            <w:tcW w:type="dxa" w:w="2514"/>
+            <w:shd w:fill="F3F4F6" w:color="auto" w:val="clear"/>
+            <w:tcMar>
+              <w:top w:type="dxa" w:w="80"/>
+              <w:left w:type="dxa" w:w="100"/>
+              <w:bottom w:type="dxa" w:w="80"/>
+              <w:right w:type="dxa" w:w="100"/>
+            </w:tcMar>
+            <w:vAlign w:val="center"/>
+          </w:tcPr>
+          <w:p>
+            <w:r>
+              <w:rPr>
+                <w:b w:val="false"/>
+                <w:bCs w:val="false"/>
+                <w:color w:val="1F2937"/>
+                <w:sz w:val="19"/>
+                <w:szCs w:val="19"/>
+              </w:rPr>
+              <w:t xml:space="preserve">The no-account point doesn't belong in a list of private workspace data; it's covered elsewhere.</w:t>
+            </w:r>
+          </w:p>
+        </w:tc>
+      </w:tr>
+      <w:tr>
+        <w:tc>
+          <w:tcPr>
+            <w:tcW w:type="dxa" w:w="1600"/>
+            <w:tcMar>
+              <w:top w:type="dxa" w:w="80"/>
+              <w:left w:type="dxa" w:w="100"/>
+              <w:bottom w:type="dxa" w:w="80"/>
+              <w:right w:type="dxa" w:w="100"/>
+            </w:tcMar>
+            <w:vAlign w:val="center"/>
+          </w:tcPr>
+          <w:p>
+            <w:r>
+              <w:rPr>
+                <w:b w:val="false"/>
+                <w:bCs w:val="false"/>
+                <w:color w:val="1F2937"/>
+                <w:sz w:val="19"/>
+                <w:szCs w:val="19"/>
+              </w:rPr>
+              <w:t xml:space="preserve">FAQ — account question</w:t>
+            </w:r>
+          </w:p>
+        </w:tc>
+        <w:tc>
+          <w:tcPr>
+            <w:tcW w:type="dxa" w:w="2600"/>
+            <w:tcMar>
+              <w:top w:type="dxa" w:w="80"/>
+              <w:left w:type="dxa" w:w="100"/>
+              <w:bottom w:type="dxa" w:w="80"/>
+              <w:right w:type="dxa" w:w="100"/>
+            </w:tcMar>
+            <w:vAlign w:val="center"/>
+          </w:tcPr>
+          <w:p>
+            <w:r>
+              <w:rPr>
+                <w:b w:val="false"/>
+                <w:bCs w:val="false"/>
+                <w:color w:val="1F2937"/>
+                <w:sz w:val="19"/>
+                <w:szCs w:val="19"/>
+              </w:rPr>
+              <w:t xml:space="preserve">"No. Your client opens the link directly. There's no account, login, or sign-in required."</w:t>
+            </w:r>
+          </w:p>
+        </w:tc>
+        <w:tc>
+          <w:tcPr>
+            <w:tcW w:type="dxa" w:w="2600"/>
+            <w:tcMar>
+              <w:top w:type="dxa" w:w="80"/>
+              <w:left w:type="dxa" w:w="100"/>
+              <w:bottom w:type="dxa" w:w="80"/>
+              <w:right w:type="dxa" w:w="100"/>
+            </w:tcMar>
+            <w:vAlign w:val="center"/>
+          </w:tcPr>
+          <w:p>
+            <w:r>
+              <w:rPr>
+                <w:b w:val="false"/>
+                <w:bCs w:val="false"/>
+                <w:color w:val="1F2937"/>
+                <w:sz w:val="19"/>
+                <w:szCs w:val="19"/>
+              </w:rPr>
+              <w:t xml:space="preserve">"No. Your client opens the link directly without a Text2Task account. If you protect the link with a PIN, they'll enter that PIN before viewing it."</w:t>
+            </w:r>
+          </w:p>
+        </w:tc>
+        <w:tc>
+          <w:tcPr>
+            <w:tcW w:type="dxa" w:w="2514"/>
+            <w:tcMar>
+              <w:top w:type="dxa" w:w="80"/>
+              <w:left w:type="dxa" w:w="100"/>
+              <w:bottom w:type="dxa" w:w="80"/>
+              <w:right w:type="dxa" w:w="100"/>
+            </w:tcMar>
+            <w:vAlign w:val="center"/>
+          </w:tcPr>
+          <w:p>
+            <w:r>
+              <w:rPr>
+                <w:b w:val="false"/>
+                <w:bCs w:val="false"/>
+                <w:color w:val="1F2937"/>
+                <w:sz w:val="19"/>
+                <w:szCs w:val="19"/>
+              </w:rPr>
+              <w:t xml:space="preserve">Same PIN-access-step precision fix, applied to the FAQ answer.</w:t>
+            </w:r>
+          </w:p>
+        </w:tc>
+      </w:tr>
+      <w:tr>
+        <w:tc>
+          <w:tcPr>
+            <w:tcW w:type="dxa" w:w="1600"/>
+            <w:shd w:fill="F3F4F6" w:color="auto" w:val="clear"/>
+            <w:tcMar>
+              <w:top w:type="dxa" w:w="80"/>
+              <w:left w:type="dxa" w:w="100"/>
+              <w:bottom w:type="dxa" w:w="80"/>
+              <w:right w:type="dxa" w:w="100"/>
+            </w:tcMar>
+            <w:vAlign w:val="center"/>
+          </w:tcPr>
+          <w:p>
+            <w:r>
+              <w:rPr>
+                <w:b w:val="false"/>
+                <w:bCs w:val="false"/>
+                <w:color w:val="1F2937"/>
+                <w:sz w:val="19"/>
+                <w:szCs w:val="19"/>
+              </w:rPr>
+              <w:t xml:space="preserve">Problem section closing line</w:t>
+            </w:r>
+          </w:p>
+        </w:tc>
+        <w:tc>
+          <w:tcPr>
+            <w:tcW w:type="dxa" w:w="2600"/>
+            <w:shd w:fill="F3F4F6" w:color="auto" w:val="clear"/>
+            <w:tcMar>
+              <w:top w:type="dxa" w:w="80"/>
+              <w:left w:type="dxa" w:w="100"/>
+              <w:bottom w:type="dxa" w:w="80"/>
+              <w:right w:type="dxa" w:w="100"/>
+            </w:tcMar>
+            <w:vAlign w:val="center"/>
+          </w:tcPr>
+          <w:p>
+            <w:r>
+              <w:rPr>
+                <w:b w:val="false"/>
+                <w:bCs w:val="false"/>
+                <w:color w:val="1F2937"/>
+                <w:sz w:val="19"/>
+                <w:szCs w:val="19"/>
+              </w:rPr>
+              <w:t xml:space="preserve">"...That's why Text2Task includes a simple client project tracker built into every project."</w:t>
+            </w:r>
+          </w:p>
+        </w:tc>
+        <w:tc>
+          <w:tcPr>
+            <w:tcW w:type="dxa" w:w="2600"/>
+            <w:shd w:fill="F3F4F6" w:color="auto" w:val="clear"/>
+            <w:tcMar>
+              <w:top w:type="dxa" w:w="80"/>
+              <w:left w:type="dxa" w:w="100"/>
+              <w:bottom w:type="dxa" w:w="80"/>
+              <w:right w:type="dxa" w:w="100"/>
+            </w:tcMar>
+            <w:vAlign w:val="center"/>
+          </w:tcPr>
+          <w:p>
+            <w:r>
+              <w:rPr>
+                <w:b w:val="false"/>
+                <w:bCs w:val="false"/>
+                <w:color w:val="1F2937"/>
+                <w:sz w:val="19"/>
+                <w:szCs w:val="19"/>
+              </w:rPr>
+              <w:t xml:space="preserve">"...That's why Text2Task gives you a simple client-facing project view you can share directly from a project."</w:t>
+            </w:r>
+          </w:p>
+        </w:tc>
+        <w:tc>
+          <w:tcPr>
+            <w:tcW w:type="dxa" w:w="2514"/>
+            <w:shd w:fill="F3F4F6" w:color="auto" w:val="clear"/>
+            <w:tcMar>
+              <w:top w:type="dxa" w:w="80"/>
+              <w:left w:type="dxa" w:w="100"/>
+              <w:bottom w:type="dxa" w:w="80"/>
+              <w:right w:type="dxa" w:w="100"/>
+            </w:tcMar>
+            <w:vAlign w:val="center"/>
+          </w:tcPr>
+          <w:p>
+            <w:r>
+              <w:rPr>
+                <w:b w:val="false"/>
+                <w:bCs w:val="false"/>
+                <w:color w:val="1F2937"/>
+                <w:sz w:val="19"/>
+                <w:szCs w:val="19"/>
+              </w:rPr>
+              <w:t xml:space="preserve">Keeps "Client Project Tracker" as SEO/category framing rather than an implied official feature name (§11.4); removes the unnecessary absolute "every project" claim.</w:t>
+            </w:r>
+          </w:p>
+        </w:tc>
+      </w:tr>
+    </w:tbl>
+    <w:p>
+      <w:pPr>
+        <w:pStyle w:val="ListParagraph"/>
+        <w:numPr>
+          <w:ilvl w:val="0"/>
+          <w:numId w:val="1"/>
+        </w:numPr>
+        <w:spacing w:after="60"/>
+      </w:pPr>
+      <w:r>
+        <w:rPr>
+          <w:sz w:val="21"/>
+          <w:szCs w:val="21"/>
+        </w:rPr>
+        <w:t xml:space="preserve">app/features/client-project-tracker/page.test.tsx: one assertion updated to match the new safe phrasing (the old regex checked for "login"/"sign-in" wording that no longer exists in the copy) — the underlying invariant (no Text2Task account required) is unchanged.</w:t>
+      </w:r>
+    </w:p>
+    <w:p>
+      <w:pPr>
+        <w:pStyle w:val="ListParagraph"/>
+        <w:numPr>
+          <w:ilvl w:val="0"/>
+          <w:numId w:val="1"/>
+        </w:numPr>
+        <w:spacing w:after="60"/>
+      </w:pPr>
+      <w:r>
+        <w:rPr>
+          <w:sz w:val="21"/>
+          <w:szCs w:val="21"/>
+        </w:rPr>
+        <w:t xml:space="preserve">Verification re-run after this pass: targeted tests (69 passed, 2 files), npx tsc --noEmit clean, npm run build succeeded with /features/client-project-tracker still statically prerendered, git diff --check clean.</w:t>
+      </w:r>
+    </w:p>
+    <w:p>
+      <w:r>
+        <w:br w:type="page"/>
+      </w:r>
+    </w:p>
+    <w:p>
+      <w:pPr>
+        <w:pStyle w:val="Heading2"/>
+        <w:spacing w:after="120" w:before="260"/>
+      </w:pPr>
+      <w:r>
+        <w:rPr>
+          <w:b/>
+          <w:bCs/>
+          <w:color w:val="1D4ED8"/>
+          <w:sz w:val="26"/>
+          <w:szCs w:val="26"/>
+        </w:rPr>
+        <w:t xml:space="preserve">11.19 P1C — Client Project Tracker Visual Integration (2026-08-29) — COMPLETE</w:t>
+      </w:r>
+    </w:p>
+    <w:p>
+      <w:pPr>
+        <w:spacing w:after="120"/>
+      </w:pPr>
+      <w:r>
+        <w:rPr>
+          <w:sz w:val="21"/>
+          <w:szCs w:val="21"/>
+        </w:rPr>
+        <w:t xml:space="preserve">Two real Client Share marketing visuals were relocated to the correct asset directory and integrated into the P1A page. No SEO copy, H1, metadata title/description, schema, sitemap entry, or P1A internal link was changed beyond what P1C itself required (the OG/Twitter image re-evaluation).</w:t>
+      </w:r>
+    </w:p>
+    <w:p>
+      <w:pPr>
+        <w:pStyle w:val="Heading3"/>
+        <w:spacing w:after="80" w:before="180"/>
+      </w:pPr>
+      <w:r>
+        <w:rPr>
+          <w:b/>
+          <w:bCs/>
+          <w:color w:val="1F2937"/>
+          <w:sz w:val="22"/>
+          <w:szCs w:val="22"/>
+        </w:rPr>
+        <w:t xml:space="preserve">Asset discovery and relocation</w:t>
+      </w:r>
+    </w:p>
+    <w:p>
+      <w:pPr>
+        <w:pStyle w:val="ListParagraph"/>
+        <w:numPr>
+          <w:ilvl w:val="0"/>
+          <w:numId w:val="1"/>
+        </w:numPr>
+        <w:spacing w:after="60"/>
+      </w:pPr>
+      <w:r>
+        <w:rPr>
+          <w:sz w:val="21"/>
+          <w:szCs w:val="21"/>
+        </w:rPr>
+        <w:t xml:space="preserve">Two newly added PNGs were found misplaced under app/features/project-deadline-calendar/'s sibling asset folder, both untracked in git (never previously referenced by any code — confirmed by a repo-wide search before moving).</w:t>
+      </w:r>
+    </w:p>
+    <w:p>
+      <w:pPr>
+        <w:pStyle w:val="ListParagraph"/>
+        <w:numPr>
+          <w:ilvl w:val="0"/>
+          <w:numId w:val="1"/>
+        </w:numPr>
+        <w:spacing w:after="60"/>
+      </w:pPr>
+      <w:r>
+        <w:rPr>
+          <w:sz w:val="21"/>
+          <w:szCs w:val="21"/>
+        </w:rPr>
+        <w:t xml:space="preserve">Original filenames/location: public/landing/features/project-deadline-calendar/"Client project tracker showing how project progress is shared with a client.png" (1672×941) and .../"Text2Task Client Share controls for managing a shared project link.png" (1448×1086).</w:t>
+      </w:r>
+    </w:p>
+    <w:p>
+      <w:pPr>
+        <w:pStyle w:val="ListParagraph"/>
+        <w:numPr>
+          <w:ilvl w:val="0"/>
+          <w:numId w:val="1"/>
+        </w:numPr>
+        <w:spacing w:after="60"/>
+      </w:pPr>
+      <w:r>
+        <w:rPr>
+          <w:sz w:val="21"/>
+          <w:szCs w:val="21"/>
+        </w:rPr>
+        <w:t xml:space="preserve">Confirmed distinct from, and did not disturb, the existing legitimate tracked asset in that folder: text2task-project-deadline-calendar.png.</w:t>
+      </w:r>
+    </w:p>
+    <w:p>
+      <w:pPr>
+        <w:pStyle w:val="ListParagraph"/>
+        <w:numPr>
+          <w:ilvl w:val="0"/>
+          <w:numId w:val="1"/>
+        </w:numPr>
+        <w:spacing w:after="60"/>
+      </w:pPr>
+      <w:r>
+        <w:rPr>
+          <w:sz w:val="21"/>
+          <w:szCs w:val="21"/>
+        </w:rPr>
+        <w:t xml:space="preserve">Moved (not copied, not re-encoded — byte sizes and pixel dimensions confirmed identical before/after) into the new directory public/landing/features/client-project-tracker/, renamed to:</w:t>
+      </w:r>
+    </w:p>
+    <w:p>
+      <w:pPr>
+        <w:pStyle w:val="ListParagraph"/>
+        <w:numPr>
+          <w:ilvl w:val="1"/>
+          <w:numId w:val="1"/>
+        </w:numPr>
+        <w:spacing w:after="60"/>
+      </w:pPr>
+      <w:r>
+        <w:rPr>
+          <w:sz w:val="21"/>
+          <w:szCs w:val="21"/>
+        </w:rPr>
+        <w:t xml:space="preserve">client-project-tracker-share-progress-with-clients.png (primary, wide, 1672×941)</w:t>
+      </w:r>
+    </w:p>
+    <w:p>
+      <w:pPr>
+        <w:pStyle w:val="ListParagraph"/>
+        <w:numPr>
+          <w:ilvl w:val="1"/>
+          <w:numId w:val="1"/>
+        </w:numPr>
+        <w:spacing w:after="60"/>
+      </w:pPr>
+      <w:r>
+        <w:rPr>
+          <w:sz w:val="21"/>
+          <w:szCs w:val="21"/>
+        </w:rPr>
+        <w:t xml:space="preserve">client-share-project-link-management.png (secondary, 1448×1086)</w:t>
+      </w:r>
+    </w:p>
+    <w:p>
+      <w:pPr>
+        <w:pStyle w:val="ListParagraph"/>
+        <w:numPr>
+          <w:ilvl w:val="0"/>
+          <w:numId w:val="1"/>
+        </w:numPr>
+        <w:spacing w:after="60"/>
+      </w:pPr>
+      <w:r>
+        <w:rPr>
+          <w:sz w:val="21"/>
+          <w:szCs w:val="21"/>
+        </w:rPr>
+        <w:t xml:space="preserve">Verified afterward: the old project-deadline-calendar folder contains only its own legitimate asset; the new folder contains exactly the two relocated files.</w:t>
+      </w:r>
+    </w:p>
+    <w:p>
+      <w:pPr>
+        <w:pStyle w:val="Heading3"/>
+        <w:spacing w:after="80" w:before="180"/>
+      </w:pPr>
+      <w:r>
+        <w:rPr>
+          <w:b/>
+          <w:bCs/>
+          <w:color w:val="1F2937"/>
+          <w:sz w:val="22"/>
+          <w:szCs w:val="22"/>
+        </w:rPr>
+        <w:t xml:space="preserve">Visual integration</w:t>
+      </w:r>
+    </w:p>
+    <w:p>
+      <w:pPr>
+        <w:pStyle w:val="ListParagraph"/>
+        <w:numPr>
+          <w:ilvl w:val="0"/>
+          <w:numId w:val="1"/>
+        </w:numPr>
+        <w:spacing w:after="60"/>
+      </w:pPr>
+      <w:r>
+        <w:rPr>
+          <w:sz w:val="21"/>
+          <w:szCs w:val="21"/>
+        </w:rPr>
+        <w:t xml:space="preserve">Primary image (the 3-step "Configure sharing → Manage link &amp; access → Client sees a clean overview" workflow graphic) placed immediately after the Hero, REPLACING the CSS-generated "Your workspace (private) / What your client sees" comparison section.</w:t>
+      </w:r>
+    </w:p>
+    <w:p>
+      <w:pPr>
+        <w:pStyle w:val="ListParagraph"/>
+        <w:numPr>
+          <w:ilvl w:val="0"/>
+          <w:numId w:val="1"/>
+        </w:numPr>
+        <w:spacing w:after="60"/>
+      </w:pPr>
+      <w:r>
+        <w:rPr>
+          <w:sz w:val="21"/>
+          <w:szCs w:val="21"/>
+        </w:rPr>
+        <w:t xml:space="preserve">Reason for replacing rather than keeping both: the new image tells a more complete and credible product story (it also shows PIN/expiry/rotate/revoke controls the CSS mockup didn't), and keeping both would have been a redundant demonstration of the same idea immediately after the Hero.</w:t>
+      </w:r>
+    </w:p>
+    <w:p>
+      <w:pPr>
+        <w:pStyle w:val="ListParagraph"/>
+        <w:numPr>
+          <w:ilvl w:val="0"/>
+          <w:numId w:val="1"/>
+        </w:numPr>
+        <w:spacing w:after="60"/>
+      </w:pPr>
+      <w:r>
+        <w:rPr>
+          <w:sz w:val="21"/>
+          <w:szCs w:val="21"/>
+        </w:rPr>
+        <w:t xml:space="preserve">All CSS selectors that became unused as a result (previewSection, previewGrid, previewColumn, previewPrivatePanel, previewSharedPanel, previewArrow, previewResultRow, previewTaskList, previewNotShared, previewNote, and their one media-query block) were removed from page.module.css. No other selector or shared stylesheet was touched.</w:t>
+      </w:r>
+    </w:p>
+    <w:p>
+      <w:pPr>
+        <w:pStyle w:val="ListParagraph"/>
+        <w:numPr>
+          <w:ilvl w:val="0"/>
+          <w:numId w:val="1"/>
+        </w:numPr>
+        <w:spacing w:after="60"/>
+      </w:pPr>
+      <w:r>
+        <w:rPr>
+          <w:sz w:val="21"/>
+          <w:szCs w:val="21"/>
+        </w:rPr>
+        <w:t xml:space="preserve">Secondary image (the more editorial, annotated "You control what's shared" collage) placed after the "What you control" capability checklist and before "Keep the rest private" — it visually reinforces exactly that checklist's PIN/expiry/disable/revoke/rotate items, and sits with a full section of separation from the primary image on both sides, avoiding placing the two images too close together.</w:t>
+      </w:r>
+    </w:p>
+    <w:p>
+      <w:pPr>
+        <w:pStyle w:val="ListParagraph"/>
+        <w:numPr>
+          <w:ilvl w:val="0"/>
+          <w:numId w:val="1"/>
+        </w:numPr>
+        <w:spacing w:after="60"/>
+      </w:pPr>
+      <w:r>
+        <w:rPr>
+          <w:sz w:val="21"/>
+          <w:szCs w:val="21"/>
+        </w:rPr>
+        <w:t xml:space="preserve">Both images use next/image with the fill strategy inside an aspect-ratio-locked container (aspect-ratio: 1672/941 and 1448/1086 respectively) plus a sizes attribute — matching the established sibling convention (screenshot-to-tasks, project-deadline-calendar). A restrained card treatment (subtle border, border-radius, soft shadow, near-white background) was added around each frame, since — unlike the raw UI screenshots those siblings use — these two images already carry their own marketing typography and did not need additional decoration, only a clean frame.</w:t>
+      </w:r>
+    </w:p>
+    <w:p>
+      <w:pPr>
+        <w:pStyle w:val="ListParagraph"/>
+        <w:numPr>
+          <w:ilvl w:val="0"/>
+          <w:numId w:val="1"/>
+        </w:numPr>
+        <w:spacing w:after="60"/>
+      </w:pPr>
+      <w:r>
+        <w:rPr>
+          <w:sz w:val="21"/>
+          <w:szCs w:val="21"/>
+        </w:rPr>
+        <w:t xml:space="preserve">No essential product-truth or SEO copy was moved into either image — every claim the images illustrate is already present as real HTML text elsewhere on the page (per this phase's explicit accessibility requirement).</w:t>
+      </w:r>
+    </w:p>
+    <w:p>
+      <w:pPr>
+        <w:pStyle w:val="Heading3"/>
+        <w:spacing w:after="80" w:before="180"/>
+      </w:pPr>
+      <w:r>
+        <w:rPr>
+          <w:b/>
+          <w:bCs/>
+          <w:color w:val="1F2937"/>
+          <w:sz w:val="22"/>
+          <w:szCs w:val="22"/>
+        </w:rPr>
+        <w:t xml:space="preserve">Alt text (exact, as required)</w:t>
+      </w:r>
+    </w:p>
+    <w:p>
+      <w:pPr>
+        <w:pStyle w:val="ListParagraph"/>
+        <w:numPr>
+          <w:ilvl w:val="0"/>
+          <w:numId w:val="1"/>
+        </w:numPr>
+        <w:spacing w:after="60"/>
+      </w:pPr>
+      <w:r>
+        <w:rPr>
+          <w:sz w:val="21"/>
+          <w:szCs w:val="21"/>
+        </w:rPr>
+        <w:t xml:space="preserve">Primary: "Client project tracker showing how project progress is shared with a client"</w:t>
+      </w:r>
+    </w:p>
+    <w:p>
+      <w:pPr>
+        <w:pStyle w:val="ListParagraph"/>
+        <w:numPr>
+          <w:ilvl w:val="0"/>
+          <w:numId w:val="1"/>
+        </w:numPr>
+        <w:spacing w:after="60"/>
+      </w:pPr>
+      <w:r>
+        <w:rPr>
+          <w:sz w:val="21"/>
+          <w:szCs w:val="21"/>
+        </w:rPr>
+        <w:t xml:space="preserve">Secondary: "Text2Task Client Share controls for managing a shared project link"</w:t>
+      </w:r>
+    </w:p>
+    <w:p>
+      <w:pPr>
+        <w:pStyle w:val="Heading3"/>
+        <w:spacing w:after="80" w:before="180"/>
+      </w:pPr>
+      <w:r>
+        <w:rPr>
+          <w:b/>
+          <w:bCs/>
+          <w:color w:val="1F2937"/>
+          <w:sz w:val="22"/>
+          <w:szCs w:val="22"/>
+        </w:rPr>
+        <w:t xml:space="preserve">Loading / priority decision</w:t>
+      </w:r>
+    </w:p>
+    <w:p>
+      <w:pPr>
+        <w:pStyle w:val="ListParagraph"/>
+        <w:numPr>
+          <w:ilvl w:val="0"/>
+          <w:numId w:val="1"/>
+        </w:numPr>
+        <w:spacing w:after="60"/>
+      </w:pPr>
+      <w:r>
+        <w:rPr>
+          <w:sz w:val="21"/>
+          <w:szCs w:val="21"/>
+        </w:rPr>
+        <w:t xml:space="preserve">Neither image uses priority. Reasoning: real mobile viewport QA (390×844) showed the Hero content alone (eyebrow, H1, lead paragraph, two stacked CTA buttons, note) nearly fills the initial viewport, so the primary image is not reliably above the fold on the most important breakpoint for this phase. Using priority on an image that may render below the fold would preload roughly 1.1 MB ahead of genuinely critical resources without a guaranteed LCP benefit — this follows the explicit instruction not to blindly apply priority. Both images use normal lazy loading, matching screenshot-to-tasks' sibling precedent (which also omits priority on its hero-adjacent image).</w:t>
+      </w:r>
+    </w:p>
+    <w:p>
+      <w:pPr>
+        <w:pStyle w:val="Heading3"/>
+        <w:spacing w:after="80" w:before="180"/>
+      </w:pPr>
+      <w:r>
+        <w:rPr>
+          <w:b/>
+          <w:bCs/>
+          <w:color w:val="1F2937"/>
+          <w:sz w:val="22"/>
+          <w:szCs w:val="22"/>
+        </w:rPr>
+        <w:t xml:space="preserve">OpenGraph / Twitter metadata — re-evaluated</w:t>
+      </w:r>
+    </w:p>
+    <w:p>
+      <w:pPr>
+        <w:pStyle w:val="ListParagraph"/>
+        <w:numPr>
+          <w:ilvl w:val="0"/>
+          <w:numId w:val="1"/>
+        </w:numPr>
+        <w:spacing w:after="60"/>
+      </w:pPr>
+      <w:r>
+        <w:rPr>
+          <w:sz w:val="21"/>
+          <w:szCs w:val="21"/>
+        </w:rPr>
+        <w:t xml:space="preserve">P1A intentionally omitted a social-preview image because no accurate visual existed yet (§11.17). Now that the primary asset exists, openGraph.images and twitter.images were both added, using the primary wide asset only — no new image was created.</w:t>
+      </w:r>
+    </w:p>
+    <w:p>
+      <w:pPr>
+        <w:pStyle w:val="ListParagraph"/>
+        <w:numPr>
+          <w:ilvl w:val="0"/>
+          <w:numId w:val="1"/>
+        </w:numPr>
+        <w:spacing w:after="60"/>
+      </w:pPr>
+      <w:r>
+        <w:rPr>
+          <w:sz w:val="21"/>
+          <w:szCs w:val="21"/>
+        </w:rPr>
+        <w:t xml:space="preserve">openGraph.images: the primary asset with explicit width 1672 / height 941 and the primary alt text, matching the exact pattern already used by email-to-tasks/page.tsx for its own OG image.</w:t>
+      </w:r>
+    </w:p>
+    <w:p>
+      <w:pPr>
+        <w:pStyle w:val="ListParagraph"/>
+        <w:numPr>
+          <w:ilvl w:val="0"/>
+          <w:numId w:val="1"/>
+        </w:numPr>
+        <w:spacing w:after="60"/>
+      </w:pPr>
+      <w:r>
+        <w:rPr>
+          <w:sz w:val="21"/>
+          <w:szCs w:val="21"/>
+        </w:rPr>
+        <w:t xml:space="preserve">twitter.card was upgraded from "summary" (P1A, no image) to "summary_large_image" (matching every other Feature page's convention now that a real image backs it), with the same primary asset.</w:t>
+      </w:r>
+    </w:p>
+    <w:p>
+      <w:pPr>
+        <w:pStyle w:val="ListParagraph"/>
+        <w:numPr>
+          <w:ilvl w:val="0"/>
+          <w:numId w:val="1"/>
+        </w:numPr>
+        <w:spacing w:after="60"/>
+      </w:pPr>
+      <w:r>
+        <w:rPr>
+          <w:sz w:val="21"/>
+          <w:szCs w:val="21"/>
+        </w:rPr>
+        <w:t xml:space="preserve">The focused metadata test was updated accordingly (see Tests below).</w:t>
+      </w:r>
+    </w:p>
+    <w:p>
+      <w:pPr>
+        <w:pStyle w:val="Heading3"/>
+        <w:spacing w:after="80" w:before="180"/>
+      </w:pPr>
+      <w:r>
+        <w:rPr>
+          <w:b/>
+          <w:bCs/>
+          <w:color w:val="1F2937"/>
+          <w:sz w:val="22"/>
+          <w:szCs w:val="22"/>
+        </w:rPr>
+        <w:t xml:space="preserve">Desktop visual QA (1440×900, real headless-browser rendering)</w:t>
+      </w:r>
+    </w:p>
+    <w:p>
+      <w:pPr>
+        <w:pStyle w:val="ListParagraph"/>
+        <w:numPr>
+          <w:ilvl w:val="0"/>
+          <w:numId w:val="1"/>
+        </w:numPr>
+        <w:spacing w:after="60"/>
+      </w:pPr>
+      <w:r>
+        <w:rPr>
+          <w:sz w:val="21"/>
+          <w:szCs w:val="21"/>
+        </w:rPr>
+        <w:t xml:space="preserve">Rendered via a real Chromium browser (Playwright, installed in an isolated scratchpad location — not added to the project's own dependencies) against the local dev server, not merely inspected as static code.</w:t>
+      </w:r>
+    </w:p>
+    <w:p>
+      <w:pPr>
+        <w:pStyle w:val="ListParagraph"/>
+        <w:numPr>
+          <w:ilvl w:val="0"/>
+          <w:numId w:val="1"/>
+        </w:numPr>
+        <w:spacing w:after="60"/>
+      </w:pPr>
+      <w:r>
+        <w:rPr>
+          <w:sz w:val="21"/>
+          <w:szCs w:val="21"/>
+        </w:rPr>
+        <w:t xml:space="preserve">Both images render crisp and undistorted at their card widths (1180px primary, 760px secondary); the restrained frame (border/radius/shadow) reads as an intentional design choice consistent with the rest of the site, not a raw pasted screenshot.</w:t>
+      </w:r>
+    </w:p>
+    <w:p>
+      <w:pPr>
+        <w:pStyle w:val="ListParagraph"/>
+        <w:numPr>
+          <w:ilvl w:val="0"/>
+          <w:numId w:val="1"/>
+        </w:numPr>
+        <w:spacing w:after="60"/>
+      </w:pPr>
+      <w:r>
+        <w:rPr>
+          <w:sz w:val="21"/>
+          <w:szCs w:val="21"/>
+        </w:rPr>
+        <w:t xml:space="preserve">Section rhythm, spacing, Hero-to-primary-image transition, How it works, What you control, secondary image, privacy section, comments section, related links, FAQ, final CTA, and footer (showing the new "Client project tracker" link) all inspected directly — no visual compromise found.</w:t>
+      </w:r>
+    </w:p>
+    <w:p>
+      <w:pPr>
+        <w:pStyle w:val="Heading3"/>
+        <w:spacing w:after="80" w:before="180"/>
+      </w:pPr>
+      <w:r>
+        <w:rPr>
+          <w:b/>
+          <w:bCs/>
+          <w:color w:val="1F2937"/>
+          <w:sz w:val="22"/>
+          <w:szCs w:val="22"/>
+        </w:rPr>
+        <w:t xml:space="preserve">Mobile visual QA (~390px, real headless-browser rendering)</w:t>
+      </w:r>
+    </w:p>
+    <w:p>
+      <w:pPr>
+        <w:pStyle w:val="ListParagraph"/>
+        <w:numPr>
+          <w:ilvl w:val="0"/>
+          <w:numId w:val="1"/>
+        </w:numPr>
+        <w:spacing w:after="60"/>
+      </w:pPr>
+      <w:r>
+        <w:rPr>
+          <w:sz w:val="21"/>
+          <w:szCs w:val="21"/>
+        </w:rPr>
+        <w:t xml:space="preserve">Confirmed no horizontal overflow: document.documentElement.scrollWidth === clientWidth === 390 at the 390×844 viewport.</w:t>
+      </w:r>
+    </w:p>
+    <w:p>
+      <w:pPr>
+        <w:pStyle w:val="ListParagraph"/>
+        <w:numPr>
+          <w:ilvl w:val="0"/>
+          <w:numId w:val="1"/>
+        </w:numPr>
+        <w:spacing w:after="60"/>
+      </w:pPr>
+      <w:r>
+        <w:rPr>
+          <w:sz w:val="21"/>
+          <w:szCs w:val="21"/>
+        </w:rPr>
+        <w:t xml:space="preserve">Both images render full-width and responsively with their natural aspect ratio preserved — no cropping, matching the explicit instruction not to crop away UI when the image becomes small on mobile.</w:t>
+      </w:r>
+    </w:p>
+    <w:p>
+      <w:pPr>
+        <w:pStyle w:val="ListParagraph"/>
+        <w:numPr>
+          <w:ilvl w:val="0"/>
+          <w:numId w:val="1"/>
+        </w:numPr>
+        <w:spacing w:after="60"/>
+      </w:pPr>
+      <w:r>
+        <w:rPr>
+          <w:sz w:val="21"/>
+          <w:szCs w:val="21"/>
+        </w:rPr>
+        <w:t xml:space="preserve">The Hero is not overwhelmed by the primary image (it doesn't appear until after a full scroll past the Hero), and the secondary image does not create an oversized dead zone — its height scales naturally with the section's normal rhythm.</w:t>
+      </w:r>
+    </w:p>
+    <w:p>
+      <w:pPr>
+        <w:pStyle w:val="ListParagraph"/>
+        <w:numPr>
+          <w:ilvl w:val="0"/>
+          <w:numId w:val="1"/>
+        </w:numPr>
+        <w:spacing w:after="60"/>
+      </w:pPr>
+      <w:r>
+        <w:rPr>
+          <w:sz w:val="21"/>
+          <w:szCs w:val="21"/>
+        </w:rPr>
+        <w:t xml:space="preserve">Section spacing, FAQ, and final CTA are unaffected.</w:t>
+      </w:r>
+    </w:p>
+    <w:p>
+      <w:pPr>
+        <w:pStyle w:val="ListParagraph"/>
+        <w:numPr>
+          <w:ilvl w:val="0"/>
+          <w:numId w:val="1"/>
+        </w:numPr>
+        <w:spacing w:after="60"/>
+      </w:pPr>
+      <w:r>
+        <w:rPr>
+          <w:sz w:val="21"/>
+          <w:szCs w:val="21"/>
+        </w:rPr>
+        <w:t xml:space="preserve">Honest finding: the small in-image UI-mockup text (checkbox labels, button captions) inside both graphics is genuinely hard to read at 390px width — this is an inherent characteristic of rendering these particular wide, detail-rich marketing graphics responsively without cropping, which this phase explicitly required rather than inventing a separate mobile asset. Every claim those images illustrate remains available as legible real HTML text elsewhere on the page, so no essential information is lost — only supplementary visual detail is harder to make out at a glance on the smallest breakpoint.</w:t>
+      </w:r>
+    </w:p>
+    <w:p>
+      <w:pPr>
+        <w:pStyle w:val="Heading3"/>
+        <w:spacing w:after="80" w:before="180"/>
+      </w:pPr>
+      <w:r>
+        <w:rPr>
+          <w:b/>
+          <w:bCs/>
+          <w:color w:val="1F2937"/>
+          <w:sz w:val="22"/>
+          <w:szCs w:val="22"/>
+        </w:rPr>
+        <w:t xml:space="preserve">Exact production files changed</w:t>
+      </w:r>
+    </w:p>
+    <w:p>
+      <w:pPr>
+        <w:pStyle w:val="ListParagraph"/>
+        <w:numPr>
+          <w:ilvl w:val="0"/>
+          <w:numId w:val="1"/>
+        </w:numPr>
+        <w:spacing w:after="60"/>
+      </w:pPr>
+      <w:r>
+        <w:rPr>
+          <w:sz w:val="21"/>
+          <w:szCs w:val="21"/>
+        </w:rPr>
+        <w:t xml:space="preserve">app/features/client-project-tracker/page.tsx — image imports/constants added, metadata OG/Twitter images added, CSS-mockup section replaced with the primary image, secondary image section inserted.</w:t>
+      </w:r>
+    </w:p>
+    <w:p>
+      <w:pPr>
+        <w:pStyle w:val="ListParagraph"/>
+        <w:numPr>
+          <w:ilvl w:val="0"/>
+          <w:numId w:val="1"/>
+        </w:numPr>
+        <w:spacing w:after="60"/>
+      </w:pPr>
+      <w:r>
+        <w:rPr>
+          <w:sz w:val="21"/>
+          <w:szCs w:val="21"/>
+        </w:rPr>
+        <w:t xml:space="preserve">app/features/client-project-tracker/page.module.css — obsolete preview-comparison selectors removed; new primaryShowcase*/secondaryDetail* selectors added.</w:t>
+      </w:r>
+    </w:p>
+    <w:p>
+      <w:pPr>
+        <w:pStyle w:val="ListParagraph"/>
+        <w:numPr>
+          <w:ilvl w:val="0"/>
+          <w:numId w:val="1"/>
+        </w:numPr>
+        <w:spacing w:after="60"/>
+      </w:pPr>
+      <w:r>
+        <w:rPr>
+          <w:sz w:val="21"/>
+          <w:szCs w:val="21"/>
+        </w:rPr>
+        <w:t xml:space="preserve">app/features/client-project-tracker/page.test.tsx — new "P1C visuals" describe block (5 tests: primary image path+alt, secondary image path+alt, no accidental duplicate of either image, OpenGraph image, Twitter card/image).</w:t>
+      </w:r>
+    </w:p>
+    <w:p>
+      <w:pPr>
+        <w:pStyle w:val="ListParagraph"/>
+        <w:numPr>
+          <w:ilvl w:val="0"/>
+          <w:numId w:val="1"/>
+        </w:numPr>
+        <w:spacing w:after="60"/>
+      </w:pPr>
+      <w:r>
+        <w:rPr>
+          <w:sz w:val="21"/>
+          <w:szCs w:val="21"/>
+        </w:rPr>
+        <w:t xml:space="preserve">public/landing/features/client-project-tracker/ (new directory) — the two relocated, renamed image assets.</w:t>
+      </w:r>
+    </w:p>
+    <w:p>
+      <w:pPr>
+        <w:pStyle w:val="ListParagraph"/>
+        <w:numPr>
+          <w:ilvl w:val="0"/>
+          <w:numId w:val="1"/>
+        </w:numPr>
+        <w:spacing w:after="60"/>
+      </w:pPr>
+      <w:r>
+        <w:rPr>
+          <w:sz w:val="21"/>
+          <w:szCs w:val="21"/>
+        </w:rPr>
+        <w:t xml:space="preserve">No other file was touched. P1A's four modified files (sitemap.ts, schema-dangling-entity-references.test.ts, client-feedback-to-tasks/page.tsx, landing-footer.tsx) are unchanged by this phase.</w:t>
+      </w:r>
+    </w:p>
+    <w:p>
+      <w:pPr>
+        <w:pStyle w:val="Heading3"/>
+        <w:spacing w:after="80" w:before="180"/>
+      </w:pPr>
+      <w:r>
+        <w:rPr>
+          <w:b/>
+          <w:bCs/>
+          <w:color w:val="1F2937"/>
+          <w:sz w:val="22"/>
+          <w:szCs w:val="22"/>
+        </w:rPr>
+        <w:t xml:space="preserve">Tests and verification results</w:t>
+      </w:r>
+    </w:p>
+    <w:p>
+      <w:pPr>
+        <w:pStyle w:val="ListParagraph"/>
+        <w:numPr>
+          <w:ilvl w:val="0"/>
+          <w:numId w:val="1"/>
+        </w:numPr>
+        <w:spacing w:after="60"/>
+      </w:pPr>
+      <w:r>
+        <w:rPr>
+          <w:sz w:val="21"/>
+          <w:szCs w:val="21"/>
+        </w:rPr>
+        <w:t xml:space="preserve">app/features/client-project-tracker/page.test.tsx: 17 tests passed (13 from P1A/P1A-refinement, 5 new for P1C).</w:t>
+      </w:r>
+    </w:p>
+    <w:p>
+      <w:pPr>
+        <w:pStyle w:val="ListParagraph"/>
+        <w:numPr>
+          <w:ilvl w:val="0"/>
+          <w:numId w:val="1"/>
+        </w:numPr>
+        <w:spacing w:after="60"/>
+      </w:pPr>
+      <w:r>
+        <w:rPr>
+          <w:sz w:val="21"/>
+          <w:szCs w:val="21"/>
+        </w:rPr>
+        <w:t xml:space="preserve">Full project test suite: 5,053 tests passed across 182 test files — zero regressions.</w:t>
+      </w:r>
+    </w:p>
+    <w:p>
+      <w:pPr>
+        <w:pStyle w:val="ListParagraph"/>
+        <w:numPr>
+          <w:ilvl w:val="0"/>
+          <w:numId w:val="1"/>
+        </w:numPr>
+        <w:spacing w:after="60"/>
+      </w:pPr>
+      <w:r>
+        <w:rPr>
+          <w:sz w:val="21"/>
+          <w:szCs w:val="21"/>
+        </w:rPr>
+        <w:t xml:space="preserve">npx tsc --noEmit: clean, zero errors.</w:t>
+      </w:r>
+    </w:p>
+    <w:p>
+      <w:pPr>
+        <w:pStyle w:val="ListParagraph"/>
+        <w:numPr>
+          <w:ilvl w:val="0"/>
+          <w:numId w:val="1"/>
+        </w:numPr>
+        <w:spacing w:after="60"/>
+      </w:pPr>
+      <w:r>
+        <w:rPr>
+          <w:sz w:val="21"/>
+          <w:szCs w:val="21"/>
+        </w:rPr>
+        <w:t xml:space="preserve">npm run build: succeeded; /features/client-project-tracker confirmed present in the route output as a statically prerendered page.</w:t>
+      </w:r>
+    </w:p>
+    <w:p>
+      <w:pPr>
+        <w:pStyle w:val="ListParagraph"/>
+        <w:numPr>
+          <w:ilvl w:val="0"/>
+          <w:numId w:val="1"/>
+        </w:numPr>
+        <w:spacing w:after="60"/>
+      </w:pPr>
+      <w:r>
+        <w:rPr>
+          <w:sz w:val="21"/>
+          <w:szCs w:val="21"/>
+        </w:rPr>
+        <w:t xml:space="preserve">git diff --check: clean (only harmless LF/CRLF line-ending notices).</w:t>
+      </w:r>
+    </w:p>
+    <w:p>
+      <w:pPr>
+        <w:pStyle w:val="ListParagraph"/>
+        <w:numPr>
+          <w:ilvl w:val="0"/>
+          <w:numId w:val="1"/>
+        </w:numPr>
+        <w:spacing w:after="60"/>
+      </w:pPr>
+      <w:r>
+        <w:rPr>
+          <w:sz w:val="21"/>
+          <w:szCs w:val="21"/>
+        </w:rPr>
+        <w:t xml:space="preserve">Full diff reviewed line by line — confirmed to touch only the intended files; the four P1A files show no unexpected changes.</w:t>
+      </w:r>
+    </w:p>
     <w:sectPr>
       <w:headerReference w:type="default" r:id="rId11"/>
       <w:footerReference w:type="default" r:id="rId12"/>

</xml_diff>

<commit_message>
Add client project tracker internal links
</commit_message>
<xml_diff>
--- a/docs/Text2Task_SEO_Master_Blueprint_2026-08-29.docx
+++ b/docs/Text2Task_SEO_Master_Blueprint_2026-08-29.docx
@@ -7974,14 +7974,14 @@
           <w:sz w:val="21"/>
           <w:szCs w:val="21"/>
         </w:rPr>
-        <w:t xml:space="preserve">Status update (2026-08-29, P1C visual integration pass): </w:t>
-      </w:r>
-      <w:r>
-        <w:rPr>
-          <w:sz w:val="21"/>
-          <w:szCs w:val="21"/>
-        </w:rPr>
-        <w:t xml:space="preserve">P1A COMPLETE. P1C COMPLETE. The route /features/client-project-tracker exists in the repository, is live in the production build's static output, is fully tested, includes both approved Client Share marketing visuals, and is included in the sitemap. Full implementation records: §11.17 (P1A), §11.18 (post-P1A copy refinement), §11.19 (P1C visual integration). Nothing was staged, committed, pushed, or deployed as part of any of these phases — the working tree changes are ready for review.</w:t>
+        <w:t xml:space="preserve">Status update (2026-08-30, P1B internal-linking pass): </w:t>
+      </w:r>
+      <w:r>
+        <w:rPr>
+          <w:sz w:val="21"/>
+          <w:szCs w:val="21"/>
+        </w:rPr>
+        <w:t xml:space="preserve">P1A COMPLETE. P1B COMPLETE. P1C COMPLETE. The Client Project Tracker Feature page is fully built, visually integrated, discoverable from the Homepage and the Freelancer Solution page, and included in the sitemap and footer. Full implementation records: §11.17 (P1A), §11.18 (post-P1A copy refinement), §11.19 (P1C visual integration), §11.20 (P1B internal linking). Nothing was staged, committed, pushed, or deployed as part of any of these phases — the working tree changes are ready for review.</w:t>
       </w:r>
     </w:p>
     <w:tbl>
@@ -8028,7 +8028,7 @@
                 <w:sz w:val="23"/>
                 <w:szCs w:val="23"/>
               </w:rPr>
-              <w:t xml:space="preserve">NEXT PLANNED PHASE: P1B — Client Project Tracker internal linking / discovery</w:t>
+              <w:t xml:space="preserve">NEXT PLANNED PHASE: Email Feature H1 commercial-framing differentiation</w:t>
             </w:r>
           </w:p>
           <w:p>
@@ -8047,14 +8047,14 @@
                 <w:sz w:val="21"/>
                 <w:szCs w:val="21"/>
               </w:rPr>
-              <w:t xml:space="preserve">Candidate scope: </w:t>
+              <w:t xml:space="preserve">Source: </w:t>
             </w:r>
             <w:r>
               <w:rPr>
                 <w:sz w:val="21"/>
                 <w:szCs w:val="21"/>
               </w:rPr>
-              <w:t xml:space="preserve">Freelancer Solution reciprocal link, homepage capability card, the deferred Use Case per-page copy audit and any resulting links, optional Email/Messages cross-links</w:t>
+              <w:t xml:space="preserve">§8 (P1/P2 tier) and §3A's Email — Commercial cluster row, whose own recorded Next Action is "tighten H1 toward commercial framing."</w:t>
             </w:r>
           </w:p>
           <w:p>
@@ -8073,14 +8073,14 @@
                 <w:sz w:val="21"/>
                 <w:szCs w:val="21"/>
               </w:rPr>
-              <w:t xml:space="preserve">Full spec: </w:t>
+              <w:t xml:space="preserve">Why this item next: </w:t>
             </w:r>
             <w:r>
               <w:rPr>
                 <w:sz w:val="21"/>
                 <w:szCs w:val="21"/>
               </w:rPr>
-              <w:t xml:space="preserve">§11.14 (phasing) and §11.9 (internal linking plan) of this document</w:t>
+              <w:t xml:space="preserve">Client Project Tracker's P1A/P1B/P1C work is now fully complete; per §8's existing priority order (not reordered), this is the next unstarted item in the P1/P2 tier. The other P1/P2 item, "general internal-linking improvements (§6.1)," is now substantially addressed by the combined P1A+P1B work.</w:t>
             </w:r>
           </w:p>
           <w:p>
@@ -8106,7 +8106,7 @@
                 <w:sz w:val="21"/>
                 <w:szCs w:val="21"/>
               </w:rPr>
-              <w:t xml:space="preserve">NOT started. P1B has not been marked complete and must not be assumed complete.</w:t>
+              <w:t xml:space="preserve">NOT started. Requires its own audit/mapping turn before implementation, per this project's established discipline.</w:t>
             </w:r>
           </w:p>
         </w:tc>
@@ -8130,75 +8130,58 @@
           <w:sz w:val="22"/>
           <w:szCs w:val="22"/>
         </w:rPr>
-        <w:t xml:space="preserve">Before starting P1B, the next session must:</w:t>
-      </w:r>
-    </w:p>
-    <w:p>
-      <w:pPr>
-        <w:pStyle w:val="ListParagraph"/>
-        <w:numPr>
-          <w:ilvl w:val="0"/>
-          <w:numId w:val="1"/>
-        </w:numPr>
-        <w:spacing w:after="60"/>
-      </w:pPr>
-      <w:r>
-        <w:rPr>
-          <w:sz w:val="21"/>
-          <w:szCs w:val="21"/>
-        </w:rPr>
-        <w:t xml:space="preserve">Re-read §11.17 (P1A), §11.18 (copy refinement), and §11.19 (P1C visuals) to confirm exactly what already shipped, then §11.9/§11.14 for the remaining P1B scope.</w:t>
-      </w:r>
-    </w:p>
-    <w:p>
-      <w:pPr>
-        <w:pStyle w:val="ListParagraph"/>
-        <w:numPr>
-          <w:ilvl w:val="0"/>
-          <w:numId w:val="1"/>
-        </w:numPr>
-        <w:spacing w:after="60"/>
-      </w:pPr>
-      <w:r>
-        <w:rPr>
-          <w:sz w:val="21"/>
-          <w:szCs w:val="21"/>
-        </w:rPr>
-        <w:t xml:space="preserve">Perform the per-page copy audit of the project-managers, small-agencies, and virtual-assistants Use Cases that §11.9/§11.15 explicitly deferred, before adding any link from them.</w:t>
-      </w:r>
-    </w:p>
-    <w:p>
-      <w:pPr>
-        <w:pStyle w:val="ListParagraph"/>
-        <w:numPr>
-          <w:ilvl w:val="0"/>
-          <w:numId w:val="1"/>
-        </w:numPr>
-        <w:spacing w:after="60"/>
-      </w:pPr>
-      <w:r>
-        <w:rPr>
-          <w:sz w:val="21"/>
-          <w:szCs w:val="21"/>
-        </w:rPr>
-        <w:t xml:space="preserve">Get explicit approval before editing app/solutions/freelancer-project-management-software/page.tsx — this file has now been edited under narrow, explicitly-scoped instructions on 4 separate occasions this project; treat each future edit the same way.</w:t>
-      </w:r>
-    </w:p>
-    <w:p>
-      <w:pPr>
-        <w:pStyle w:val="ListParagraph"/>
-        <w:numPr>
-          <w:ilvl w:val="0"/>
-          <w:numId w:val="1"/>
-        </w:numPr>
-        <w:spacing w:after="60"/>
-      </w:pPr>
-      <w:r>
-        <w:rPr>
-          <w:sz w:val="21"/>
-          <w:szCs w:val="21"/>
-        </w:rPr>
-        <w:t xml:space="preserve">Keep P1B's own diff as small and single-purpose as P1A's and P1C's were.</w:t>
+        <w:t xml:space="preserve">Before starting the next phase, the next session must:</w:t>
+      </w:r>
+    </w:p>
+    <w:p>
+      <w:pPr>
+        <w:pStyle w:val="ListParagraph"/>
+        <w:numPr>
+          <w:ilvl w:val="0"/>
+          <w:numId w:val="1"/>
+        </w:numPr>
+        <w:spacing w:after="60"/>
+      </w:pPr>
+      <w:r>
+        <w:rPr>
+          <w:sz w:val="21"/>
+          <w:szCs w:val="21"/>
+        </w:rPr>
+        <w:t xml:space="preserve">Re-read §11.17 (P1A), §11.18 (copy refinement), §11.19 (P1C visuals), and §11.20 (P1B linking) to confirm exactly what already shipped for Client Project Tracker — that work is finished and should not be revisited without new evidence.</w:t>
+      </w:r>
+    </w:p>
+    <w:p>
+      <w:pPr>
+        <w:pStyle w:val="ListParagraph"/>
+        <w:numPr>
+          <w:ilvl w:val="0"/>
+          <w:numId w:val="1"/>
+        </w:numPr>
+        <w:spacing w:after="60"/>
+      </w:pPr>
+      <w:r>
+        <w:rPr>
+          <w:sz w:val="21"/>
+          <w:szCs w:val="21"/>
+        </w:rPr>
+        <w:t xml:space="preserve">Re-read §3A's Email — Commercial row and §2 for the full Email to Tasks context before proposing new H1 wording.</w:t>
+      </w:r>
+    </w:p>
+    <w:p>
+      <w:pPr>
+        <w:pStyle w:val="ListParagraph"/>
+        <w:numPr>
+          <w:ilvl w:val="0"/>
+          <w:numId w:val="1"/>
+        </w:numPr>
+        <w:spacing w:after="60"/>
+      </w:pPr>
+      <w:r>
+        <w:rPr>
+          <w:sz w:val="21"/>
+          <w:szCs w:val="21"/>
+        </w:rPr>
+        <w:t xml:space="preserve">Follow this project's established discipline: audit first, propose, wait for approval, then implement in a narrow, single-purpose diff.</w:t>
       </w:r>
     </w:p>
     <w:p>
@@ -8234,7 +8217,7 @@
           <w:sz w:val="21"/>
           <w:szCs w:val="21"/>
         </w:rPr>
-        <w:t xml:space="preserve">The next Claude session should begin exactly here — Section 10 — after first re-reading §11.17–§11.19 for what already shipped, then §11.9 and §11.14 for the remaining P1B scope.</w:t>
+        <w:t xml:space="preserve">The next Claude session should begin exactly here — Section 10 — after first re-reading §11.17–§11.20 to confirm Client Project Tracker is fully finished, then §3A and §8 before starting Email Feature H1 work.</w:t>
       </w:r>
     </w:p>
     <w:p>
@@ -18703,6 +18686,1739 @@
           <w:szCs w:val="21"/>
         </w:rPr>
         <w:t xml:space="preserve">Full diff reviewed line by line — confirmed to touch only the intended files; the four P1A files show no unexpected changes.</w:t>
+      </w:r>
+    </w:p>
+    <w:p>
+      <w:r>
+        <w:br w:type="page"/>
+      </w:r>
+    </w:p>
+    <w:p>
+      <w:pPr>
+        <w:pStyle w:val="Heading2"/>
+        <w:spacing w:after="120" w:before="260"/>
+      </w:pPr>
+      <w:r>
+        <w:rPr>
+          <w:b/>
+          <w:bCs/>
+          <w:color w:val="1D4ED8"/>
+          <w:sz w:val="26"/>
+          <w:szCs w:val="26"/>
+        </w:rPr>
+        <w:t xml:space="preserve">11.20 P1B — Client Project Tracker Internal Linking / Discovery (2026-08-30) — COMPLETE</w:t>
+      </w:r>
+    </w:p>
+    <w:p>
+      <w:pPr>
+        <w:spacing w:after="120"/>
+      </w:pPr>
+      <w:r>
+        <w:rPr>
+          <w:sz w:val="21"/>
+          <w:szCs w:val="21"/>
+        </w:rPr>
+        <w:t xml:space="preserve">Every candidate page named in §11.9 was re-inspected by reading its actual current content before any edit — the deferred Use Case and Email/Messages decisions were not assumed from the P1 mapping, they were independently re-verified against live copy. Two links were implemented; all other candidates were left untouched with a recorded reason. Direction discipline was maintained throughout: Client Project Tracker (owner → client, outbound) was never blurred with Client Feedback to Tasks (client → owner, inbound).</w:t>
+      </w:r>
+    </w:p>
+    <w:p>
+      <w:pPr>
+        <w:pStyle w:val="Heading3"/>
+        <w:spacing w:after="80" w:before="180"/>
+      </w:pPr>
+      <w:r>
+        <w:rPr>
+          <w:b/>
+          <w:bCs/>
+          <w:color w:val="1F2937"/>
+          <w:sz w:val="22"/>
+          <w:szCs w:val="22"/>
+        </w:rPr>
+        <w:t xml:space="preserve">Candidate audit table</w:t>
+      </w:r>
+    </w:p>
+    <w:tbl>
+      <w:tblPr>
+        <w:tblW w:type="pct" w:w="100%"/>
+        <w:tblBorders>
+          <w:top w:val="single" w:color="D1D5DB" w:sz="4"/>
+          <w:left w:val="single" w:color="D1D5DB" w:sz="4"/>
+          <w:bottom w:val="single" w:color="D1D5DB" w:sz="4"/>
+          <w:right w:val="single" w:color="D1D5DB" w:sz="4"/>
+          <w:insideH w:val="single" w:color="D1D5DB" w:sz="4"/>
+          <w:insideV w:val="single" w:color="D1D5DB" w:sz="4"/>
+        </w:tblBorders>
+      </w:tblPr>
+      <w:tblGrid>
+        <w:gridCol w:w="100"/>
+        <w:gridCol w:w="100"/>
+        <w:gridCol w:w="100"/>
+      </w:tblGrid>
+      <w:tr>
+        <w:trPr>
+          <w:tblHeader/>
+        </w:trPr>
+        <w:tc>
+          <w:tcPr>
+            <w:tcW w:type="dxa" w:w="3200"/>
+            <w:shd w:fill="1D4ED8" w:color="auto" w:val="clear"/>
+            <w:tcMar>
+              <w:top w:type="dxa" w:w="80"/>
+              <w:left w:type="dxa" w:w="100"/>
+              <w:bottom w:type="dxa" w:w="80"/>
+              <w:right w:type="dxa" w:w="100"/>
+            </w:tcMar>
+            <w:vAlign w:val="center"/>
+          </w:tcPr>
+          <w:p>
+            <w:r>
+              <w:rPr>
+                <w:b/>
+                <w:bCs/>
+                <w:color w:val="FFFFFF"/>
+                <w:sz w:val="19"/>
+                <w:szCs w:val="19"/>
+              </w:rPr>
+              <w:t xml:space="preserve">Candidate</w:t>
+            </w:r>
+          </w:p>
+        </w:tc>
+        <w:tc>
+          <w:tcPr>
+            <w:tcW w:type="dxa" w:w="1400"/>
+            <w:shd w:fill="1D4ED8" w:color="auto" w:val="clear"/>
+            <w:tcMar>
+              <w:top w:type="dxa" w:w="80"/>
+              <w:left w:type="dxa" w:w="100"/>
+              <w:bottom w:type="dxa" w:w="80"/>
+              <w:right w:type="dxa" w:w="100"/>
+            </w:tcMar>
+            <w:vAlign w:val="center"/>
+          </w:tcPr>
+          <w:p>
+            <w:r>
+              <w:rPr>
+                <w:b/>
+                <w:bCs/>
+                <w:color w:val="FFFFFF"/>
+                <w:sz w:val="19"/>
+                <w:szCs w:val="19"/>
+              </w:rPr>
+              <w:t xml:space="preserve">Decision</w:t>
+            </w:r>
+          </w:p>
+        </w:tc>
+        <w:tc>
+          <w:tcPr>
+            <w:tcW w:type="dxa" w:w="5314"/>
+            <w:shd w:fill="1D4ED8" w:color="auto" w:val="clear"/>
+            <w:tcMar>
+              <w:top w:type="dxa" w:w="80"/>
+              <w:left w:type="dxa" w:w="100"/>
+              <w:bottom w:type="dxa" w:w="80"/>
+              <w:right w:type="dxa" w:w="100"/>
+            </w:tcMar>
+            <w:vAlign w:val="center"/>
+          </w:tcPr>
+          <w:p>
+            <w:r>
+              <w:rPr>
+                <w:b/>
+                <w:bCs/>
+                <w:color w:val="FFFFFF"/>
+                <w:sz w:val="19"/>
+                <w:szCs w:val="19"/>
+              </w:rPr>
+              <w:t xml:space="preserve">Reason</w:t>
+            </w:r>
+          </w:p>
+        </w:tc>
+      </w:tr>
+      <w:tr>
+        <w:tc>
+          <w:tcPr>
+            <w:tcW w:type="dxa" w:w="3200"/>
+            <w:tcMar>
+              <w:top w:type="dxa" w:w="80"/>
+              <w:left w:type="dxa" w:w="100"/>
+              <w:bottom w:type="dxa" w:w="80"/>
+              <w:right w:type="dxa" w:w="100"/>
+            </w:tcMar>
+            <w:vAlign w:val="center"/>
+          </w:tcPr>
+          <w:p>
+            <w:r>
+              <w:rPr>
+                <w:b w:val="false"/>
+                <w:bCs w:val="false"/>
+                <w:color w:val="1F2937"/>
+                <w:sz w:val="19"/>
+                <w:szCs w:val="19"/>
+              </w:rPr>
+              <w:t xml:space="preserve">Homepage (homepage-post-extraction-section.tsx)</w:t>
+            </w:r>
+          </w:p>
+        </w:tc>
+        <w:tc>
+          <w:tcPr>
+            <w:tcW w:type="dxa" w:w="1400"/>
+            <w:tcMar>
+              <w:top w:type="dxa" w:w="80"/>
+              <w:left w:type="dxa" w:w="100"/>
+              <w:bottom w:type="dxa" w:w="80"/>
+              <w:right w:type="dxa" w:w="100"/>
+            </w:tcMar>
+            <w:vAlign w:val="center"/>
+          </w:tcPr>
+          <w:p>
+            <w:r>
+              <w:rPr>
+                <w:b w:val="false"/>
+                <w:bCs w:val="false"/>
+                <w:color w:val="1F2937"/>
+                <w:sz w:val="19"/>
+                <w:szCs w:val="19"/>
+              </w:rPr>
+              <w:t xml:space="preserve">LINK</w:t>
+            </w:r>
+          </w:p>
+        </w:tc>
+        <w:tc>
+          <w:tcPr>
+            <w:tcW w:type="dxa" w:w="5314"/>
+            <w:tcMar>
+              <w:top w:type="dxa" w:w="80"/>
+              <w:left w:type="dxa" w:w="100"/>
+              <w:bottom w:type="dxa" w:w="80"/>
+              <w:right w:type="dxa" w:w="100"/>
+            </w:tcMar>
+            <w:vAlign w:val="center"/>
+          </w:tcPr>
+          <w:p>
+            <w:r>
+              <w:rPr>
+                <w:b w:val="false"/>
+                <w:bCs w:val="false"/>
+                <w:color w:val="1F2937"/>
+                <w:sz w:val="19"/>
+                <w:szCs w:val="19"/>
+              </w:rPr>
+              <w:t xml:space="preserve">The "Everything you need after the first request" capability list already had a matching entry for outbound calendar sharing (project-deadline-calendar); it was missing the closing-the-loop capability entirely.</w:t>
+            </w:r>
+          </w:p>
+        </w:tc>
+      </w:tr>
+      <w:tr>
+        <w:tc>
+          <w:tcPr>
+            <w:tcW w:type="dxa" w:w="3200"/>
+            <w:shd w:fill="F3F4F6" w:color="auto" w:val="clear"/>
+            <w:tcMar>
+              <w:top w:type="dxa" w:w="80"/>
+              <w:left w:type="dxa" w:w="100"/>
+              <w:bottom w:type="dxa" w:w="80"/>
+              <w:right w:type="dxa" w:w="100"/>
+            </w:tcMar>
+            <w:vAlign w:val="center"/>
+          </w:tcPr>
+          <w:p>
+            <w:r>
+              <w:rPr>
+                <w:b w:val="false"/>
+                <w:bCs w:val="false"/>
+                <w:color w:val="1F2937"/>
+                <w:sz w:val="19"/>
+                <w:szCs w:val="19"/>
+              </w:rPr>
+              <w:t xml:space="preserve">Freelancer Solution (reciprocal)</w:t>
+            </w:r>
+          </w:p>
+        </w:tc>
+        <w:tc>
+          <w:tcPr>
+            <w:tcW w:type="dxa" w:w="1400"/>
+            <w:shd w:fill="F3F4F6" w:color="auto" w:val="clear"/>
+            <w:tcMar>
+              <w:top w:type="dxa" w:w="80"/>
+              <w:left w:type="dxa" w:w="100"/>
+              <w:bottom w:type="dxa" w:w="80"/>
+              <w:right w:type="dxa" w:w="100"/>
+            </w:tcMar>
+            <w:vAlign w:val="center"/>
+          </w:tcPr>
+          <w:p>
+            <w:r>
+              <w:rPr>
+                <w:b w:val="false"/>
+                <w:bCs w:val="false"/>
+                <w:color w:val="1F2937"/>
+                <w:sz w:val="19"/>
+                <w:szCs w:val="19"/>
+              </w:rPr>
+              <w:t xml:space="preserve">LINK</w:t>
+            </w:r>
+          </w:p>
+        </w:tc>
+        <w:tc>
+          <w:tcPr>
+            <w:tcW w:type="dxa" w:w="5314"/>
+            <w:shd w:fill="F3F4F6" w:color="auto" w:val="clear"/>
+            <w:tcMar>
+              <w:top w:type="dxa" w:w="80"/>
+              <w:left w:type="dxa" w:w="100"/>
+              <w:bottom w:type="dxa" w:w="80"/>
+              <w:right w:type="dxa" w:w="100"/>
+            </w:tcMar>
+            <w:vAlign w:val="center"/>
+          </w:tcPr>
+          <w:p>
+            <w:r>
+              <w:rPr>
+                <w:b w:val="false"/>
+                <w:bCs w:val="false"/>
+                <w:color w:val="1F2937"/>
+                <w:sz w:val="19"/>
+                <w:szCs w:val="19"/>
+              </w:rPr>
+              <w:t xml:space="preserve">The existing "Explore Text2Task features" link grid already lists all other Feature pages by the same card pattern; Tracker was the one sibling Feature missing from it.</w:t>
+            </w:r>
+          </w:p>
+        </w:tc>
+      </w:tr>
+      <w:tr>
+        <w:tc>
+          <w:tcPr>
+            <w:tcW w:type="dxa" w:w="3200"/>
+            <w:tcMar>
+              <w:top w:type="dxa" w:w="80"/>
+              <w:left w:type="dxa" w:w="100"/>
+              <w:bottom w:type="dxa" w:w="80"/>
+              <w:right w:type="dxa" w:w="100"/>
+            </w:tcMar>
+            <w:vAlign w:val="center"/>
+          </w:tcPr>
+          <w:p>
+            <w:r>
+              <w:rPr>
+                <w:b w:val="false"/>
+                <w:bCs w:val="false"/>
+                <w:color w:val="1F2937"/>
+                <w:sz w:val="19"/>
+                <w:szCs w:val="19"/>
+              </w:rPr>
+              <w:t xml:space="preserve">Use Case — project-managers</w:t>
+            </w:r>
+          </w:p>
+        </w:tc>
+        <w:tc>
+          <w:tcPr>
+            <w:tcW w:type="dxa" w:w="1400"/>
+            <w:tcMar>
+              <w:top w:type="dxa" w:w="80"/>
+              <w:left w:type="dxa" w:w="100"/>
+              <w:bottom w:type="dxa" w:w="80"/>
+              <w:right w:type="dxa" w:w="100"/>
+            </w:tcMar>
+            <w:vAlign w:val="center"/>
+          </w:tcPr>
+          <w:p>
+            <w:r>
+              <w:rPr>
+                <w:b w:val="false"/>
+                <w:bCs w:val="false"/>
+                <w:color w:val="1F2937"/>
+                <w:sz w:val="19"/>
+                <w:szCs w:val="19"/>
+              </w:rPr>
+              <w:t xml:space="preserve">DO NOT LINK</w:t>
+            </w:r>
+          </w:p>
+        </w:tc>
+        <w:tc>
+          <w:tcPr>
+            <w:tcW w:type="dxa" w:w="5314"/>
+            <w:tcMar>
+              <w:top w:type="dxa" w:w="80"/>
+              <w:left w:type="dxa" w:w="100"/>
+              <w:bottom w:type="dxa" w:w="80"/>
+              <w:right w:type="dxa" w:w="100"/>
+            </w:tcMar>
+            <w:vAlign w:val="center"/>
+          </w:tcPr>
+          <w:p>
+            <w:r>
+              <w:rPr>
+                <w:b w:val="false"/>
+                <w:bCs w:val="false"/>
+                <w:color w:val="1F2937"/>
+                <w:sz w:val="19"/>
+                <w:szCs w:val="19"/>
+              </w:rPr>
+              <w:t xml:space="preserve">Its clientUpdates section is entirely inbound (comparing a new stakeholder message against the saved project); no sentence anywhere on the page discusses sharing status back out.</w:t>
+            </w:r>
+          </w:p>
+        </w:tc>
+      </w:tr>
+      <w:tr>
+        <w:tc>
+          <w:tcPr>
+            <w:tcW w:type="dxa" w:w="3200"/>
+            <w:shd w:fill="F3F4F6" w:color="auto" w:val="clear"/>
+            <w:tcMar>
+              <w:top w:type="dxa" w:w="80"/>
+              <w:left w:type="dxa" w:w="100"/>
+              <w:bottom w:type="dxa" w:w="80"/>
+              <w:right w:type="dxa" w:w="100"/>
+            </w:tcMar>
+            <w:vAlign w:val="center"/>
+          </w:tcPr>
+          <w:p>
+            <w:r>
+              <w:rPr>
+                <w:b w:val="false"/>
+                <w:bCs w:val="false"/>
+                <w:color w:val="1F2937"/>
+                <w:sz w:val="19"/>
+                <w:szCs w:val="19"/>
+              </w:rPr>
+              <w:t xml:space="preserve">Use Case — small-agencies</w:t>
+            </w:r>
+          </w:p>
+        </w:tc>
+        <w:tc>
+          <w:tcPr>
+            <w:tcW w:type="dxa" w:w="1400"/>
+            <w:shd w:fill="F3F4F6" w:color="auto" w:val="clear"/>
+            <w:tcMar>
+              <w:top w:type="dxa" w:w="80"/>
+              <w:left w:type="dxa" w:w="100"/>
+              <w:bottom w:type="dxa" w:w="80"/>
+              <w:right w:type="dxa" w:w="100"/>
+            </w:tcMar>
+            <w:vAlign w:val="center"/>
+          </w:tcPr>
+          <w:p>
+            <w:r>
+              <w:rPr>
+                <w:b w:val="false"/>
+                <w:bCs w:val="false"/>
+                <w:color w:val="1F2937"/>
+                <w:sz w:val="19"/>
+                <w:szCs w:val="19"/>
+              </w:rPr>
+              <w:t xml:space="preserve">DO NOT LINK</w:t>
+            </w:r>
+          </w:p>
+        </w:tc>
+        <w:tc>
+          <w:tcPr>
+            <w:tcW w:type="dxa" w:w="5314"/>
+            <w:shd w:fill="F3F4F6" w:color="auto" w:val="clear"/>
+            <w:tcMar>
+              <w:top w:type="dxa" w:w="80"/>
+              <w:left w:type="dxa" w:w="100"/>
+              <w:bottom w:type="dxa" w:w="80"/>
+              <w:right w:type="dxa" w:w="100"/>
+            </w:tcMar>
+            <w:vAlign w:val="center"/>
+          </w:tcPr>
+          <w:p>
+            <w:r>
+              <w:rPr>
+                <w:b w:val="false"/>
+                <w:bCs w:val="false"/>
+                <w:color w:val="1F2937"/>
+                <w:sz w:val="19"/>
+                <w:szCs w:val="19"/>
+              </w:rPr>
+              <w:t xml:space="preserve">Same inbound-only pattern; "client" in this page's copy means the agency's own end client being coordinated internally, not a recipient of an outbound share link.</w:t>
+            </w:r>
+          </w:p>
+        </w:tc>
+      </w:tr>
+      <w:tr>
+        <w:tc>
+          <w:tcPr>
+            <w:tcW w:type="dxa" w:w="3200"/>
+            <w:tcMar>
+              <w:top w:type="dxa" w:w="80"/>
+              <w:left w:type="dxa" w:w="100"/>
+              <w:bottom w:type="dxa" w:w="80"/>
+              <w:right w:type="dxa" w:w="100"/>
+            </w:tcMar>
+            <w:vAlign w:val="center"/>
+          </w:tcPr>
+          <w:p>
+            <w:r>
+              <w:rPr>
+                <w:b w:val="false"/>
+                <w:bCs w:val="false"/>
+                <w:color w:val="1F2937"/>
+                <w:sz w:val="19"/>
+                <w:szCs w:val="19"/>
+              </w:rPr>
+              <w:t xml:space="preserve">Use Case — virtual-assistants</w:t>
+            </w:r>
+          </w:p>
+        </w:tc>
+        <w:tc>
+          <w:tcPr>
+            <w:tcW w:type="dxa" w:w="1400"/>
+            <w:tcMar>
+              <w:top w:type="dxa" w:w="80"/>
+              <w:left w:type="dxa" w:w="100"/>
+              <w:bottom w:type="dxa" w:w="80"/>
+              <w:right w:type="dxa" w:w="100"/>
+            </w:tcMar>
+            <w:vAlign w:val="center"/>
+          </w:tcPr>
+          <w:p>
+            <w:r>
+              <w:rPr>
+                <w:b w:val="false"/>
+                <w:bCs w:val="false"/>
+                <w:color w:val="1F2937"/>
+                <w:sz w:val="19"/>
+                <w:szCs w:val="19"/>
+              </w:rPr>
+              <w:t xml:space="preserve">DO NOT LINK</w:t>
+            </w:r>
+          </w:p>
+        </w:tc>
+        <w:tc>
+          <w:tcPr>
+            <w:tcW w:type="dxa" w:w="5314"/>
+            <w:tcMar>
+              <w:top w:type="dxa" w:w="80"/>
+              <w:left w:type="dxa" w:w="100"/>
+              <w:bottom w:type="dxa" w:w="80"/>
+              <w:right w:type="dxa" w:w="100"/>
+            </w:tcMar>
+            <w:vAlign w:val="center"/>
+          </w:tcPr>
+          <w:p>
+            <w:r>
+              <w:rPr>
+                <w:b w:val="false"/>
+                <w:bCs w:val="false"/>
+                <w:color w:val="1F2937"/>
+                <w:sz w:val="19"/>
+                <w:szCs w:val="19"/>
+              </w:rPr>
+              <w:t xml:space="preserve">Page is about a VA organizing their principal's admin requests; the VA is not the one who would share project status externally, and no outbound-sharing language exists on the page.</w:t>
+            </w:r>
+          </w:p>
+        </w:tc>
+      </w:tr>
+      <w:tr>
+        <w:tc>
+          <w:tcPr>
+            <w:tcW w:type="dxa" w:w="3200"/>
+            <w:shd w:fill="F3F4F6" w:color="auto" w:val="clear"/>
+            <w:tcMar>
+              <w:top w:type="dxa" w:w="80"/>
+              <w:left w:type="dxa" w:w="100"/>
+              <w:bottom w:type="dxa" w:w="80"/>
+              <w:right w:type="dxa" w:w="100"/>
+            </w:tcMar>
+            <w:vAlign w:val="center"/>
+          </w:tcPr>
+          <w:p>
+            <w:r>
+              <w:rPr>
+                <w:b w:val="false"/>
+                <w:bCs w:val="false"/>
+                <w:color w:val="1F2937"/>
+                <w:sz w:val="19"/>
+                <w:szCs w:val="19"/>
+              </w:rPr>
+              <w:t xml:space="preserve">Email to Tasks Feature</w:t>
+            </w:r>
+          </w:p>
+        </w:tc>
+        <w:tc>
+          <w:tcPr>
+            <w:tcW w:type="dxa" w:w="1400"/>
+            <w:shd w:fill="F3F4F6" w:color="auto" w:val="clear"/>
+            <w:tcMar>
+              <w:top w:type="dxa" w:w="80"/>
+              <w:left w:type="dxa" w:w="100"/>
+              <w:bottom w:type="dxa" w:w="80"/>
+              <w:right w:type="dxa" w:w="100"/>
+            </w:tcMar>
+            <w:vAlign w:val="center"/>
+          </w:tcPr>
+          <w:p>
+            <w:r>
+              <w:rPr>
+                <w:b w:val="false"/>
+                <w:bCs w:val="false"/>
+                <w:color w:val="1F2937"/>
+                <w:sz w:val="19"/>
+                <w:szCs w:val="19"/>
+              </w:rPr>
+              <w:t xml:space="preserve">DO NOT LINK</w:t>
+            </w:r>
+          </w:p>
+        </w:tc>
+        <w:tc>
+          <w:tcPr>
+            <w:tcW w:type="dxa" w:w="5314"/>
+            <w:shd w:fill="F3F4F6" w:color="auto" w:val="clear"/>
+            <w:tcMar>
+              <w:top w:type="dxa" w:w="80"/>
+              <w:left w:type="dxa" w:w="100"/>
+              <w:bottom w:type="dxa" w:w="80"/>
+              <w:right w:type="dxa" w:w="100"/>
+            </w:tcMar>
+            <w:vAlign w:val="center"/>
+          </w:tcPr>
+          <w:p>
+            <w:r>
+              <w:rPr>
+                <w:b w:val="false"/>
+                <w:bCs w:val="false"/>
+                <w:color w:val="1F2937"/>
+                <w:sz w:val="19"/>
+                <w:szCs w:val="19"/>
+              </w:rPr>
+              <w:t xml:space="preserve">Its "Continue organizing client work" related-links section and every FAQ stop at saving the draft; no post-intake/progress-sharing moment exists in the current copy to hook a link onto.</w:t>
+            </w:r>
+          </w:p>
+        </w:tc>
+      </w:tr>
+      <w:tr>
+        <w:tc>
+          <w:tcPr>
+            <w:tcW w:type="dxa" w:w="3200"/>
+            <w:tcMar>
+              <w:top w:type="dxa" w:w="80"/>
+              <w:left w:type="dxa" w:w="100"/>
+              <w:bottom w:type="dxa" w:w="80"/>
+              <w:right w:type="dxa" w:w="100"/>
+            </w:tcMar>
+            <w:vAlign w:val="center"/>
+          </w:tcPr>
+          <w:p>
+            <w:r>
+              <w:rPr>
+                <w:b w:val="false"/>
+                <w:bCs w:val="false"/>
+                <w:color w:val="1F2937"/>
+                <w:sz w:val="19"/>
+                <w:szCs w:val="19"/>
+              </w:rPr>
+              <w:t xml:space="preserve">Email Resource (how-to-turn-emails-into-tasks)</w:t>
+            </w:r>
+          </w:p>
+        </w:tc>
+        <w:tc>
+          <w:tcPr>
+            <w:tcW w:type="dxa" w:w="1400"/>
+            <w:tcMar>
+              <w:top w:type="dxa" w:w="80"/>
+              <w:left w:type="dxa" w:w="100"/>
+              <w:bottom w:type="dxa" w:w="80"/>
+              <w:right w:type="dxa" w:w="100"/>
+            </w:tcMar>
+            <w:vAlign w:val="center"/>
+          </w:tcPr>
+          <w:p>
+            <w:r>
+              <w:rPr>
+                <w:b w:val="false"/>
+                <w:bCs w:val="false"/>
+                <w:color w:val="1F2937"/>
+                <w:sz w:val="19"/>
+                <w:szCs w:val="19"/>
+              </w:rPr>
+              <w:t xml:space="preserve">DO NOT LINK</w:t>
+            </w:r>
+          </w:p>
+        </w:tc>
+        <w:tc>
+          <w:tcPr>
+            <w:tcW w:type="dxa" w:w="5314"/>
+            <w:tcMar>
+              <w:top w:type="dxa" w:w="80"/>
+              <w:left w:type="dxa" w:w="100"/>
+              <w:bottom w:type="dxa" w:w="80"/>
+              <w:right w:type="dxa" w:w="100"/>
+            </w:tcMar>
+            <w:vAlign w:val="center"/>
+          </w:tcPr>
+          <w:p>
+            <w:r>
+              <w:rPr>
+                <w:b w:val="false"/>
+                <w:bCs w:val="false"/>
+                <w:color w:val="1F2937"/>
+                <w:sz w:val="19"/>
+                <w:szCs w:val="19"/>
+              </w:rPr>
+              <w:t xml:space="preserve">Article scope ends at "review before saving"; its own Related guides already reach Freelancer Solution, one hop from Tracker.</w:t>
+            </w:r>
+          </w:p>
+        </w:tc>
+      </w:tr>
+      <w:tr>
+        <w:tc>
+          <w:tcPr>
+            <w:tcW w:type="dxa" w:w="3200"/>
+            <w:shd w:fill="F3F4F6" w:color="auto" w:val="clear"/>
+            <w:tcMar>
+              <w:top w:type="dxa" w:w="80"/>
+              <w:left w:type="dxa" w:w="100"/>
+              <w:bottom w:type="dxa" w:w="80"/>
+              <w:right w:type="dxa" w:w="100"/>
+            </w:tcMar>
+            <w:vAlign w:val="center"/>
+          </w:tcPr>
+          <w:p>
+            <w:r>
+              <w:rPr>
+                <w:b w:val="false"/>
+                <w:bCs w:val="false"/>
+                <w:color w:val="1F2937"/>
+                <w:sz w:val="19"/>
+                <w:szCs w:val="19"/>
+              </w:rPr>
+              <w:t xml:space="preserve">Messages Resource (turn-client-messages-into-tasks)</w:t>
+            </w:r>
+          </w:p>
+        </w:tc>
+        <w:tc>
+          <w:tcPr>
+            <w:tcW w:type="dxa" w:w="1400"/>
+            <w:shd w:fill="F3F4F6" w:color="auto" w:val="clear"/>
+            <w:tcMar>
+              <w:top w:type="dxa" w:w="80"/>
+              <w:left w:type="dxa" w:w="100"/>
+              <w:bottom w:type="dxa" w:w="80"/>
+              <w:right w:type="dxa" w:w="100"/>
+            </w:tcMar>
+            <w:vAlign w:val="center"/>
+          </w:tcPr>
+          <w:p>
+            <w:r>
+              <w:rPr>
+                <w:b w:val="false"/>
+                <w:bCs w:val="false"/>
+                <w:color w:val="1F2937"/>
+                <w:sz w:val="19"/>
+                <w:szCs w:val="19"/>
+              </w:rPr>
+              <w:t xml:space="preserve">DO NOT LINK</w:t>
+            </w:r>
+          </w:p>
+        </w:tc>
+        <w:tc>
+          <w:tcPr>
+            <w:tcW w:type="dxa" w:w="5314"/>
+            <w:shd w:fill="F3F4F6" w:color="auto" w:val="clear"/>
+            <w:tcMar>
+              <w:top w:type="dxa" w:w="80"/>
+              <w:left w:type="dxa" w:w="100"/>
+              <w:bottom w:type="dxa" w:w="80"/>
+              <w:right w:type="dxa" w:w="100"/>
+            </w:tcMar>
+            <w:vAlign w:val="center"/>
+          </w:tcPr>
+          <w:p>
+            <w:r>
+              <w:rPr>
+                <w:b w:val="false"/>
+                <w:bCs w:val="false"/>
+                <w:color w:val="1F2937"/>
+                <w:sz w:val="19"/>
+                <w:szCs w:val="19"/>
+              </w:rPr>
+              <w:t xml:space="preserve">Same — article scope ends at saving the task; forcing a link would distort its intake-focused intent.</w:t>
+            </w:r>
+          </w:p>
+        </w:tc>
+      </w:tr>
+    </w:tbl>
+    <w:p>
+      <w:pPr>
+        <w:pStyle w:val="Heading3"/>
+        <w:spacing w:after="80" w:before="180"/>
+      </w:pPr>
+      <w:r>
+        <w:rPr>
+          <w:b/>
+          <w:bCs/>
+          <w:color w:val="1F2937"/>
+          <w:sz w:val="22"/>
+          <w:szCs w:val="22"/>
+        </w:rPr>
+        <w:t xml:space="preserve">Exact links implemented</w:t>
+      </w:r>
+    </w:p>
+    <w:p>
+      <w:pPr>
+        <w:pStyle w:val="ListParagraph"/>
+        <w:numPr>
+          <w:ilvl w:val="0"/>
+          <w:numId w:val="1"/>
+        </w:numPr>
+        <w:spacing w:after="60"/>
+      </w:pPr>
+      <w:r>
+        <w:rPr>
+          <w:sz w:val="21"/>
+          <w:szCs w:val="21"/>
+        </w:rPr>
+        <w:t xml:space="preserve">Homepage → Tracker: new capability list entry in app/components/landing/homepage-post-extraction-section.tsx. Title "Share progress with your client"; description "Share selected status, tasks, and updates through a private link — nothing else in your workspace is shown."; link label "Explore Client Project Tracker" → /features/client-project-tracker.</w:t>
+      </w:r>
+    </w:p>
+    <w:p>
+      <w:pPr>
+        <w:pStyle w:val="ListParagraph"/>
+        <w:numPr>
+          <w:ilvl w:val="0"/>
+          <w:numId w:val="1"/>
+        </w:numPr>
+        <w:spacing w:after="60"/>
+      </w:pPr>
+      <w:r>
+        <w:rPr>
+          <w:sz w:val="21"/>
+          <w:szCs w:val="21"/>
+        </w:rPr>
+        <w:t xml:space="preserve">Freelancer Solution → Tracker: new card in the existing "Explore Text2Task features" link grid (featureLinks array) in app/solutions/freelancer-project-management-software/page.tsx. Title "Client Project Tracker"; description "Share selected project progress with your client through a private link." → /features/client-project-tracker.</w:t>
+      </w:r>
+    </w:p>
+    <w:p>
+      <w:pPr>
+        <w:pStyle w:val="Heading3"/>
+        <w:spacing w:after="80" w:before="180"/>
+      </w:pPr>
+      <w:r>
+        <w:rPr>
+          <w:b/>
+          <w:bCs/>
+          <w:color w:val="1F2937"/>
+          <w:sz w:val="22"/>
+          <w:szCs w:val="22"/>
+        </w:rPr>
+        <w:t xml:space="preserve">Navigation / footer</w:t>
+      </w:r>
+    </w:p>
+    <w:p>
+      <w:pPr>
+        <w:pStyle w:val="ListParagraph"/>
+        <w:numPr>
+          <w:ilvl w:val="0"/>
+          <w:numId w:val="1"/>
+        </w:numPr>
+        <w:spacing w:after="60"/>
+      </w:pPr>
+      <w:r>
+        <w:rPr>
+          <w:sz w:val="21"/>
+          <w:szCs w:val="21"/>
+        </w:rPr>
+        <w:t xml:space="preserve">NO CHANGE. Tracker was already added to the footer in P1A (§11.10/§11.13); this phase did not duplicate it.</w:t>
+      </w:r>
+    </w:p>
+    <w:p>
+      <w:pPr>
+        <w:pStyle w:val="ListParagraph"/>
+        <w:numPr>
+          <w:ilvl w:val="0"/>
+          <w:numId w:val="1"/>
+        </w:numPr>
+        <w:spacing w:after="60"/>
+      </w:pPr>
+      <w:r>
+        <w:rPr>
+          <w:sz w:val="21"/>
+          <w:szCs w:val="21"/>
+        </w:rPr>
+        <w:t xml:space="preserve">Header nav: no individual Feature links exist for ANY Feature page (Features nav item points to the homepage #features anchor); no change made or needed.</w:t>
+      </w:r>
+    </w:p>
+    <w:p>
+      <w:pPr>
+        <w:pStyle w:val="ListParagraph"/>
+        <w:numPr>
+          <w:ilvl w:val="0"/>
+          <w:numId w:val="1"/>
+        </w:numPr>
+        <w:spacing w:after="60"/>
+      </w:pPr>
+      <w:r>
+        <w:rPr>
+          <w:sz w:val="21"/>
+          <w:szCs w:val="21"/>
+        </w:rPr>
+        <w:t xml:space="preserve">No dedicated Feature-directory route exists anywhere in the codebase; none was created.</w:t>
+      </w:r>
+    </w:p>
+    <w:p>
+      <w:pPr>
+        <w:pStyle w:val="Heading3"/>
+        <w:spacing w:after="80" w:before="180"/>
+      </w:pPr>
+      <w:r>
+        <w:rPr>
+          <w:b/>
+          <w:bCs/>
+          <w:color w:val="1F2937"/>
+          <w:sz w:val="22"/>
+          <w:szCs w:val="22"/>
+        </w:rPr>
+        <w:t xml:space="preserve">Tracker outbound links</w:t>
+      </w:r>
+    </w:p>
+    <w:p>
+      <w:pPr>
+        <w:pStyle w:val="ListParagraph"/>
+        <w:numPr>
+          <w:ilvl w:val="0"/>
+          <w:numId w:val="1"/>
+        </w:numPr>
+        <w:spacing w:after="60"/>
+      </w:pPr>
+      <w:r>
+        <w:rPr>
+          <w:sz w:val="21"/>
+          <w:szCs w:val="21"/>
+        </w:rPr>
+        <w:t xml:space="preserve">NO CHANGE TO THE TRACKER PAGE ITSELF. Its existing outbound set (Client Feedback to Tasks, Email to Tasks, Freelancer Solution — all shipped in P1A) was reviewed and judged already sufficient; the already-approved Feature page was not reopened.</w:t>
+      </w:r>
+    </w:p>
+    <w:p>
+      <w:pPr>
+        <w:pStyle w:val="Heading3"/>
+        <w:spacing w:after="80" w:before="180"/>
+      </w:pPr>
+      <w:r>
+        <w:rPr>
+          <w:b/>
+          <w:bCs/>
+          <w:color w:val="1F2937"/>
+          <w:sz w:val="22"/>
+          <w:szCs w:val="22"/>
+        </w:rPr>
+        <w:t xml:space="preserve">Anchor language used</w:t>
+      </w:r>
+    </w:p>
+    <w:p>
+      <w:pPr>
+        <w:pStyle w:val="ListParagraph"/>
+        <w:numPr>
+          <w:ilvl w:val="0"/>
+          <w:numId w:val="1"/>
+        </w:numPr>
+        <w:spacing w:after="60"/>
+      </w:pPr>
+      <w:r>
+        <w:rPr>
+          <w:sz w:val="21"/>
+          <w:szCs w:val="21"/>
+        </w:rPr>
+        <w:t xml:space="preserve">Both new links use natural, non-repetitive concepts ("share progress with your client" / "share selected project progress with your client through a private link") rather than the bare exact-match phrase "client project tracker" repeated across pages — matching the anchor-text rules in this phase's own instructions.</w:t>
+      </w:r>
+    </w:p>
+    <w:p>
+      <w:pPr>
+        <w:pStyle w:val="ListParagraph"/>
+        <w:numPr>
+          <w:ilvl w:val="0"/>
+          <w:numId w:val="1"/>
+        </w:numPr>
+        <w:spacing w:after="60"/>
+      </w:pPr>
+      <w:r>
+        <w:rPr>
+          <w:sz w:val="21"/>
+          <w:szCs w:val="21"/>
+        </w:rPr>
+        <w:t xml:space="preserve">The literal phrase "client project tracker" appears exactly once in each modified page's own main content (verified by an automated test on the Freelancer Solution page; the site-wide footer's separate P1A occurrence is excluded from that count).</w:t>
+      </w:r>
+    </w:p>
+    <w:p>
+      <w:pPr>
+        <w:pStyle w:val="Heading3"/>
+        <w:spacing w:after="80" w:before="180"/>
+      </w:pPr>
+      <w:r>
+        <w:rPr>
+          <w:b/>
+          <w:bCs/>
+          <w:color w:val="1F2937"/>
+          <w:sz w:val="22"/>
+          <w:szCs w:val="22"/>
+        </w:rPr>
+        <w:t xml:space="preserve">Exact production files changed</w:t>
+      </w:r>
+    </w:p>
+    <w:p>
+      <w:pPr>
+        <w:pStyle w:val="ListParagraph"/>
+        <w:numPr>
+          <w:ilvl w:val="0"/>
+          <w:numId w:val="1"/>
+        </w:numPr>
+        <w:spacing w:after="60"/>
+      </w:pPr>
+      <w:r>
+        <w:rPr>
+          <w:sz w:val="21"/>
+          <w:szCs w:val="21"/>
+        </w:rPr>
+        <w:t xml:space="preserve">app/components/landing/homepage-post-extraction-section.tsx — one new capabilities array entry.</w:t>
+      </w:r>
+    </w:p>
+    <w:p>
+      <w:pPr>
+        <w:pStyle w:val="ListParagraph"/>
+        <w:numPr>
+          <w:ilvl w:val="0"/>
+          <w:numId w:val="1"/>
+        </w:numPr>
+        <w:spacing w:after="60"/>
+      </w:pPr>
+      <w:r>
+        <w:rPr>
+          <w:sz w:val="21"/>
+          <w:szCs w:val="21"/>
+        </w:rPr>
+        <w:t xml:space="preserve">app/solutions/freelancer-project-management-software/page.tsx — one new featureLinks array entry.</w:t>
+      </w:r>
+    </w:p>
+    <w:p>
+      <w:pPr>
+        <w:pStyle w:val="ListParagraph"/>
+        <w:numPr>
+          <w:ilvl w:val="0"/>
+          <w:numId w:val="1"/>
+        </w:numPr>
+        <w:spacing w:after="60"/>
+      </w:pPr>
+      <w:r>
+        <w:rPr>
+          <w:sz w:val="21"/>
+          <w:szCs w:val="21"/>
+        </w:rPr>
+        <w:t xml:space="preserve">app/components/landing/homepage-post-extraction-section.test.tsx — NEW. First test file for this component; 2 tests (new Tracker link present; existing Work Calendar link untouched).</w:t>
+      </w:r>
+    </w:p>
+    <w:p>
+      <w:pPr>
+        <w:pStyle w:val="ListParagraph"/>
+        <w:numPr>
+          <w:ilvl w:val="0"/>
+          <w:numId w:val="1"/>
+        </w:numPr>
+        <w:spacing w:after="60"/>
+      </w:pPr>
+      <w:r>
+        <w:rPr>
+          <w:sz w:val="21"/>
+          <w:szCs w:val="21"/>
+        </w:rPr>
+        <w:t xml:space="preserve">app/solutions/freelancer-project-management-software/page.test.tsx — NEW. First test file for this page; 4 tests (new Tracker link present; canonical/title identity unchanged; H1 still leads with the locked primary keyword; no keyword-stuffing of "client project tracker" within the page's own main content).</w:t>
+      </w:r>
+    </w:p>
+    <w:p>
+      <w:pPr>
+        <w:pStyle w:val="ListParagraph"/>
+        <w:numPr>
+          <w:ilvl w:val="0"/>
+          <w:numId w:val="1"/>
+        </w:numPr>
+        <w:spacing w:after="60"/>
+      </w:pPr>
+      <w:r>
+        <w:rPr>
+          <w:sz w:val="21"/>
+          <w:szCs w:val="21"/>
+        </w:rPr>
+        <w:t xml:space="preserve">No other file was touched. The Tracker page itself, all Use Case pages, all Email/Messages pages, navigation, and the footer are unchanged by this phase.</w:t>
+      </w:r>
+    </w:p>
+    <w:p>
+      <w:pPr>
+        <w:pStyle w:val="Heading3"/>
+        <w:spacing w:after="80" w:before="180"/>
+      </w:pPr>
+      <w:r>
+        <w:rPr>
+          <w:b/>
+          <w:bCs/>
+          <w:color w:val="1F2937"/>
+          <w:sz w:val="22"/>
+          <w:szCs w:val="22"/>
+        </w:rPr>
+        <w:t xml:space="preserve">Cannibalization / SEO QA</w:t>
+      </w:r>
+    </w:p>
+    <w:tbl>
+      <w:tblPr>
+        <w:tblW w:type="pct" w:w="100%"/>
+        <w:tblBorders>
+          <w:top w:val="single" w:color="D1D5DB" w:sz="4"/>
+          <w:left w:val="single" w:color="D1D5DB" w:sz="4"/>
+          <w:bottom w:val="single" w:color="D1D5DB" w:sz="4"/>
+          <w:right w:val="single" w:color="D1D5DB" w:sz="4"/>
+          <w:insideH w:val="single" w:color="D1D5DB" w:sz="4"/>
+          <w:insideV w:val="single" w:color="D1D5DB" w:sz="4"/>
+        </w:tblBorders>
+      </w:tblPr>
+      <w:tblGrid>
+        <w:gridCol w:w="100"/>
+        <w:gridCol w:w="100"/>
+      </w:tblGrid>
+      <w:tr>
+        <w:trPr>
+          <w:tblHeader/>
+        </w:trPr>
+        <w:tc>
+          <w:tcPr>
+            <w:tcW w:type="dxa" w:w="5500"/>
+            <w:shd w:fill="1D4ED8" w:color="auto" w:val="clear"/>
+            <w:tcMar>
+              <w:top w:type="dxa" w:w="80"/>
+              <w:left w:type="dxa" w:w="100"/>
+              <w:bottom w:type="dxa" w:w="80"/>
+              <w:right w:type="dxa" w:w="100"/>
+            </w:tcMar>
+            <w:vAlign w:val="center"/>
+          </w:tcPr>
+          <w:p>
+            <w:r>
+              <w:rPr>
+                <w:b/>
+                <w:bCs/>
+                <w:color w:val="FFFFFF"/>
+                <w:sz w:val="19"/>
+                <w:szCs w:val="19"/>
+              </w:rPr>
+              <w:t xml:space="preserve">Check</w:t>
+            </w:r>
+          </w:p>
+        </w:tc>
+        <w:tc>
+          <w:tcPr>
+            <w:tcW w:type="dxa" w:w="4414"/>
+            <w:shd w:fill="1D4ED8" w:color="auto" w:val="clear"/>
+            <w:tcMar>
+              <w:top w:type="dxa" w:w="80"/>
+              <w:left w:type="dxa" w:w="100"/>
+              <w:bottom w:type="dxa" w:w="80"/>
+              <w:right w:type="dxa" w:w="100"/>
+            </w:tcMar>
+            <w:vAlign w:val="center"/>
+          </w:tcPr>
+          <w:p>
+            <w:r>
+              <w:rPr>
+                <w:b/>
+                <w:bCs/>
+                <w:color w:val="FFFFFF"/>
+                <w:sz w:val="19"/>
+                <w:szCs w:val="19"/>
+              </w:rPr>
+              <w:t xml:space="preserve">Result</w:t>
+            </w:r>
+          </w:p>
+        </w:tc>
+      </w:tr>
+      <w:tr>
+        <w:tc>
+          <w:tcPr>
+            <w:tcW w:type="dxa" w:w="5500"/>
+            <w:tcMar>
+              <w:top w:type="dxa" w:w="80"/>
+              <w:left w:type="dxa" w:w="100"/>
+              <w:bottom w:type="dxa" w:w="80"/>
+              <w:right w:type="dxa" w:w="100"/>
+            </w:tcMar>
+            <w:vAlign w:val="center"/>
+          </w:tcPr>
+          <w:p>
+            <w:r>
+              <w:rPr>
+                <w:b w:val="false"/>
+                <w:bCs w:val="false"/>
+                <w:color w:val="1F2937"/>
+                <w:sz w:val="19"/>
+                <w:szCs w:val="19"/>
+              </w:rPr>
+              <w:t xml:space="preserve">H1 changed on any modified page?</w:t>
+            </w:r>
+          </w:p>
+        </w:tc>
+        <w:tc>
+          <w:tcPr>
+            <w:tcW w:type="dxa" w:w="4414"/>
+            <w:tcMar>
+              <w:top w:type="dxa" w:w="80"/>
+              <w:left w:type="dxa" w:w="100"/>
+              <w:bottom w:type="dxa" w:w="80"/>
+              <w:right w:type="dxa" w:w="100"/>
+            </w:tcMar>
+            <w:vAlign w:val="center"/>
+          </w:tcPr>
+          <w:p>
+            <w:r>
+              <w:rPr>
+                <w:b w:val="false"/>
+                <w:bCs w:val="false"/>
+                <w:color w:val="1F2937"/>
+                <w:sz w:val="19"/>
+                <w:szCs w:val="19"/>
+              </w:rPr>
+              <w:t xml:space="preserve">NO</w:t>
+            </w:r>
+          </w:p>
+        </w:tc>
+      </w:tr>
+      <w:tr>
+        <w:tc>
+          <w:tcPr>
+            <w:tcW w:type="dxa" w:w="5500"/>
+            <w:shd w:fill="F3F4F6" w:color="auto" w:val="clear"/>
+            <w:tcMar>
+              <w:top w:type="dxa" w:w="80"/>
+              <w:left w:type="dxa" w:w="100"/>
+              <w:bottom w:type="dxa" w:w="80"/>
+              <w:right w:type="dxa" w:w="100"/>
+            </w:tcMar>
+            <w:vAlign w:val="center"/>
+          </w:tcPr>
+          <w:p>
+            <w:r>
+              <w:rPr>
+                <w:b w:val="false"/>
+                <w:bCs w:val="false"/>
+                <w:color w:val="1F2937"/>
+                <w:sz w:val="19"/>
+                <w:szCs w:val="19"/>
+              </w:rPr>
+              <w:t xml:space="preserve">Metadata (title/description/canonical) changed on any modified page?</w:t>
+            </w:r>
+          </w:p>
+        </w:tc>
+        <w:tc>
+          <w:tcPr>
+            <w:tcW w:type="dxa" w:w="4414"/>
+            <w:shd w:fill="F3F4F6" w:color="auto" w:val="clear"/>
+            <w:tcMar>
+              <w:top w:type="dxa" w:w="80"/>
+              <w:left w:type="dxa" w:w="100"/>
+              <w:bottom w:type="dxa" w:w="80"/>
+              <w:right w:type="dxa" w:w="100"/>
+            </w:tcMar>
+            <w:vAlign w:val="center"/>
+          </w:tcPr>
+          <w:p>
+            <w:r>
+              <w:rPr>
+                <w:b w:val="false"/>
+                <w:bCs w:val="false"/>
+                <w:color w:val="1F2937"/>
+                <w:sz w:val="19"/>
+                <w:szCs w:val="19"/>
+              </w:rPr>
+              <w:t xml:space="preserve">NO</w:t>
+            </w:r>
+          </w:p>
+        </w:tc>
+      </w:tr>
+      <w:tr>
+        <w:tc>
+          <w:tcPr>
+            <w:tcW w:type="dxa" w:w="5500"/>
+            <w:tcMar>
+              <w:top w:type="dxa" w:w="80"/>
+              <w:left w:type="dxa" w:w="100"/>
+              <w:bottom w:type="dxa" w:w="80"/>
+              <w:right w:type="dxa" w:w="100"/>
+            </w:tcMar>
+            <w:vAlign w:val="center"/>
+          </w:tcPr>
+          <w:p>
+            <w:r>
+              <w:rPr>
+                <w:b w:val="false"/>
+                <w:bCs w:val="false"/>
+                <w:color w:val="1F2937"/>
+                <w:sz w:val="19"/>
+                <w:szCs w:val="19"/>
+              </w:rPr>
+              <w:t xml:space="preserve">Primary keyword ownership changed?</w:t>
+            </w:r>
+          </w:p>
+        </w:tc>
+        <w:tc>
+          <w:tcPr>
+            <w:tcW w:type="dxa" w:w="4414"/>
+            <w:tcMar>
+              <w:top w:type="dxa" w:w="80"/>
+              <w:left w:type="dxa" w:w="100"/>
+              <w:bottom w:type="dxa" w:w="80"/>
+              <w:right w:type="dxa" w:w="100"/>
+            </w:tcMar>
+            <w:vAlign w:val="center"/>
+          </w:tcPr>
+          <w:p>
+            <w:r>
+              <w:rPr>
+                <w:b w:val="false"/>
+                <w:bCs w:val="false"/>
+                <w:color w:val="1F2937"/>
+                <w:sz w:val="19"/>
+                <w:szCs w:val="19"/>
+              </w:rPr>
+              <w:t xml:space="preserve">NO — verified by an automated test that the Freelancer Solution H1 still leads with "freelancer project management software"</w:t>
+            </w:r>
+          </w:p>
+        </w:tc>
+      </w:tr>
+      <w:tr>
+        <w:tc>
+          <w:tcPr>
+            <w:tcW w:type="dxa" w:w="5500"/>
+            <w:shd w:fill="F3F4F6" w:color="auto" w:val="clear"/>
+            <w:tcMar>
+              <w:top w:type="dxa" w:w="80"/>
+              <w:left w:type="dxa" w:w="100"/>
+              <w:bottom w:type="dxa" w:w="80"/>
+              <w:right w:type="dxa" w:w="100"/>
+            </w:tcMar>
+            <w:vAlign w:val="center"/>
+          </w:tcPr>
+          <w:p>
+            <w:r>
+              <w:rPr>
+                <w:b w:val="false"/>
+                <w:bCs w:val="false"/>
+                <w:color w:val="1F2937"/>
+                <w:sz w:val="19"/>
+                <w:szCs w:val="19"/>
+              </w:rPr>
+              <w:t xml:space="preserve">"client project tracker" unnecessarily repeated?</w:t>
+            </w:r>
+          </w:p>
+        </w:tc>
+        <w:tc>
+          <w:tcPr>
+            <w:tcW w:type="dxa" w:w="4414"/>
+            <w:shd w:fill="F3F4F6" w:color="auto" w:val="clear"/>
+            <w:tcMar>
+              <w:top w:type="dxa" w:w="80"/>
+              <w:left w:type="dxa" w:w="100"/>
+              <w:bottom w:type="dxa" w:w="80"/>
+              <w:right w:type="dxa" w:w="100"/>
+            </w:tcMar>
+            <w:vAlign w:val="center"/>
+          </w:tcPr>
+          <w:p>
+            <w:r>
+              <w:rPr>
+                <w:b w:val="false"/>
+                <w:bCs w:val="false"/>
+                <w:color w:val="1F2937"/>
+                <w:sz w:val="19"/>
+                <w:szCs w:val="19"/>
+              </w:rPr>
+              <w:t xml:space="preserve">NO — appears once per modified page's own content, in natural non-exact-match anchor contexts elsewhere</w:t>
+            </w:r>
+          </w:p>
+        </w:tc>
+      </w:tr>
+      <w:tr>
+        <w:tc>
+          <w:tcPr>
+            <w:tcW w:type="dxa" w:w="5500"/>
+            <w:tcMar>
+              <w:top w:type="dxa" w:w="80"/>
+              <w:left w:type="dxa" w:w="100"/>
+              <w:bottom w:type="dxa" w:w="80"/>
+              <w:right w:type="dxa" w:w="100"/>
+            </w:tcMar>
+            <w:vAlign w:val="center"/>
+          </w:tcPr>
+          <w:p>
+            <w:r>
+              <w:rPr>
+                <w:b w:val="false"/>
+                <w:bCs w:val="false"/>
+                <w:color w:val="1F2937"/>
+                <w:sz w:val="19"/>
+                <w:szCs w:val="19"/>
+              </w:rPr>
+              <w:t xml:space="preserve">Freelancer Solution still clearly owns broad freelancer/client project management?</w:t>
+            </w:r>
+          </w:p>
+        </w:tc>
+        <w:tc>
+          <w:tcPr>
+            <w:tcW w:type="dxa" w:w="4414"/>
+            <w:tcMar>
+              <w:top w:type="dxa" w:w="80"/>
+              <w:left w:type="dxa" w:w="100"/>
+              <w:bottom w:type="dxa" w:w="80"/>
+              <w:right w:type="dxa" w:w="100"/>
+            </w:tcMar>
+            <w:vAlign w:val="center"/>
+          </w:tcPr>
+          <w:p>
+            <w:r>
+              <w:rPr>
+                <w:b w:val="false"/>
+                <w:bCs w:val="false"/>
+                <w:color w:val="1F2937"/>
+                <w:sz w:val="19"/>
+                <w:szCs w:val="19"/>
+              </w:rPr>
+              <w:t xml:space="preserve">YES — untouched hero/positioning/FAQ; only one link card added to an existing grid</w:t>
+            </w:r>
+          </w:p>
+        </w:tc>
+      </w:tr>
+      <w:tr>
+        <w:tc>
+          <w:tcPr>
+            <w:tcW w:type="dxa" w:w="5500"/>
+            <w:shd w:fill="F3F4F6" w:color="auto" w:val="clear"/>
+            <w:tcMar>
+              <w:top w:type="dxa" w:w="80"/>
+              <w:left w:type="dxa" w:w="100"/>
+              <w:bottom w:type="dxa" w:w="80"/>
+              <w:right w:type="dxa" w:w="100"/>
+            </w:tcMar>
+            <w:vAlign w:val="center"/>
+          </w:tcPr>
+          <w:p>
+            <w:r>
+              <w:rPr>
+                <w:b w:val="false"/>
+                <w:bCs w:val="false"/>
+                <w:color w:val="1F2937"/>
+                <w:sz w:val="19"/>
+                <w:szCs w:val="19"/>
+              </w:rPr>
+              <w:t xml:space="preserve">Tracker still clearly owns the narrow outbound client-visibility capability?</w:t>
+            </w:r>
+          </w:p>
+        </w:tc>
+        <w:tc>
+          <w:tcPr>
+            <w:tcW w:type="dxa" w:w="4414"/>
+            <w:shd w:fill="F3F4F6" w:color="auto" w:val="clear"/>
+            <w:tcMar>
+              <w:top w:type="dxa" w:w="80"/>
+              <w:left w:type="dxa" w:w="100"/>
+              <w:bottom w:type="dxa" w:w="80"/>
+              <w:right w:type="dxa" w:w="100"/>
+            </w:tcMar>
+            <w:vAlign w:val="center"/>
+          </w:tcPr>
+          <w:p>
+            <w:r>
+              <w:rPr>
+                <w:b w:val="false"/>
+                <w:bCs w:val="false"/>
+                <w:color w:val="1F2937"/>
+                <w:sz w:val="19"/>
+                <w:szCs w:val="19"/>
+              </w:rPr>
+              <w:t xml:space="preserve">YES — Tracker page itself was not modified in this phase</w:t>
+            </w:r>
+          </w:p>
+        </w:tc>
+      </w:tr>
+      <w:tr>
+        <w:tc>
+          <w:tcPr>
+            <w:tcW w:type="dxa" w:w="5500"/>
+            <w:tcMar>
+              <w:top w:type="dxa" w:w="80"/>
+              <w:left w:type="dxa" w:w="100"/>
+              <w:bottom w:type="dxa" w:w="80"/>
+              <w:right w:type="dxa" w:w="100"/>
+            </w:tcMar>
+            <w:vAlign w:val="center"/>
+          </w:tcPr>
+          <w:p>
+            <w:r>
+              <w:rPr>
+                <w:b w:val="false"/>
+                <w:bCs w:val="false"/>
+                <w:color w:val="1F2937"/>
+                <w:sz w:val="19"/>
+                <w:szCs w:val="19"/>
+              </w:rPr>
+              <w:t xml:space="preserve">Any Use Case started targeting a Feature keyword?</w:t>
+            </w:r>
+          </w:p>
+        </w:tc>
+        <w:tc>
+          <w:tcPr>
+            <w:tcW w:type="dxa" w:w="4414"/>
+            <w:tcMar>
+              <w:top w:type="dxa" w:w="80"/>
+              <w:left w:type="dxa" w:w="100"/>
+              <w:bottom w:type="dxa" w:w="80"/>
+              <w:right w:type="dxa" w:w="100"/>
+            </w:tcMar>
+            <w:vAlign w:val="center"/>
+          </w:tcPr>
+          <w:p>
+            <w:r>
+              <w:rPr>
+                <w:b w:val="false"/>
+                <w:bCs w:val="false"/>
+                <w:color w:val="1F2937"/>
+                <w:sz w:val="19"/>
+                <w:szCs w:val="19"/>
+              </w:rPr>
+              <w:t xml:space="preserve">NO — all three Use Cases were left unmodified</w:t>
+            </w:r>
+          </w:p>
+        </w:tc>
+      </w:tr>
+      <w:tr>
+        <w:tc>
+          <w:tcPr>
+            <w:tcW w:type="dxa" w:w="5500"/>
+            <w:shd w:fill="F3F4F6" w:color="auto" w:val="clear"/>
+            <w:tcMar>
+              <w:top w:type="dxa" w:w="80"/>
+              <w:left w:type="dxa" w:w="100"/>
+              <w:bottom w:type="dxa" w:w="80"/>
+              <w:right w:type="dxa" w:w="100"/>
+            </w:tcMar>
+            <w:vAlign w:val="center"/>
+          </w:tcPr>
+          <w:p>
+            <w:r>
+              <w:rPr>
+                <w:b w:val="false"/>
+                <w:bCs w:val="false"/>
+                <w:color w:val="1F2937"/>
+                <w:sz w:val="19"/>
+                <w:szCs w:val="19"/>
+              </w:rPr>
+              <w:t xml:space="preserve">Email/Message pages retained their original intent?</w:t>
+            </w:r>
+          </w:p>
+        </w:tc>
+        <w:tc>
+          <w:tcPr>
+            <w:tcW w:type="dxa" w:w="4414"/>
+            <w:shd w:fill="F3F4F6" w:color="auto" w:val="clear"/>
+            <w:tcMar>
+              <w:top w:type="dxa" w:w="80"/>
+              <w:left w:type="dxa" w:w="100"/>
+              <w:bottom w:type="dxa" w:w="80"/>
+              <w:right w:type="dxa" w:w="100"/>
+            </w:tcMar>
+            <w:vAlign w:val="center"/>
+          </w:tcPr>
+          <w:p>
+            <w:r>
+              <w:rPr>
+                <w:b w:val="false"/>
+                <w:bCs w:val="false"/>
+                <w:color w:val="1F2937"/>
+                <w:sz w:val="19"/>
+                <w:szCs w:val="19"/>
+              </w:rPr>
+              <w:t xml:space="preserve">YES — all three were left unmodified</w:t>
+            </w:r>
+          </w:p>
+        </w:tc>
+      </w:tr>
+    </w:tbl>
+    <w:p>
+      <w:pPr>
+        <w:pStyle w:val="Heading3"/>
+        <w:spacing w:after="80" w:before="180"/>
+      </w:pPr>
+      <w:r>
+        <w:rPr>
+          <w:b/>
+          <w:bCs/>
+          <w:color w:val="1F2937"/>
+          <w:sz w:val="22"/>
+          <w:szCs w:val="22"/>
+        </w:rPr>
+        <w:t xml:space="preserve">Tests and verification results</w:t>
+      </w:r>
+    </w:p>
+    <w:p>
+      <w:pPr>
+        <w:pStyle w:val="ListParagraph"/>
+        <w:numPr>
+          <w:ilvl w:val="0"/>
+          <w:numId w:val="1"/>
+        </w:numPr>
+        <w:spacing w:after="60"/>
+      </w:pPr>
+      <w:r>
+        <w:rPr>
+          <w:sz w:val="21"/>
+          <w:szCs w:val="21"/>
+        </w:rPr>
+        <w:t xml:space="preserve">Targeted tests: 71 passed across 4 files (2 new files + schema-dangling-entity-references.test.ts + app/page.test.ts, re-run as a sanity check since the homepage tree was touched).</w:t>
+      </w:r>
+    </w:p>
+    <w:p>
+      <w:pPr>
+        <w:pStyle w:val="ListParagraph"/>
+        <w:numPr>
+          <w:ilvl w:val="0"/>
+          <w:numId w:val="1"/>
+        </w:numPr>
+        <w:spacing w:after="60"/>
+      </w:pPr>
+      <w:r>
+        <w:rPr>
+          <w:sz w:val="21"/>
+          <w:szCs w:val="21"/>
+        </w:rPr>
+        <w:t xml:space="preserve">Full project test suite: 5,059 tests passed across 184 test files — zero regressions.</w:t>
+      </w:r>
+    </w:p>
+    <w:p>
+      <w:pPr>
+        <w:pStyle w:val="ListParagraph"/>
+        <w:numPr>
+          <w:ilvl w:val="0"/>
+          <w:numId w:val="1"/>
+        </w:numPr>
+        <w:spacing w:after="60"/>
+      </w:pPr>
+      <w:r>
+        <w:rPr>
+          <w:sz w:val="21"/>
+          <w:szCs w:val="21"/>
+        </w:rPr>
+        <w:t xml:space="preserve">npx tsc --noEmit: clean, zero errors.</w:t>
+      </w:r>
+    </w:p>
+    <w:p>
+      <w:pPr>
+        <w:pStyle w:val="ListParagraph"/>
+        <w:numPr>
+          <w:ilvl w:val="0"/>
+          <w:numId w:val="1"/>
+        </w:numPr>
+        <w:spacing w:after="60"/>
+      </w:pPr>
+      <w:r>
+        <w:rPr>
+          <w:sz w:val="21"/>
+          <w:szCs w:val="21"/>
+        </w:rPr>
+        <w:t xml:space="preserve">npm run build: succeeded; both /features/client-project-tracker and /solutions/freelancer-project-management-software confirmed present in the route output as statically prerendered pages.</w:t>
+      </w:r>
+    </w:p>
+    <w:p>
+      <w:pPr>
+        <w:pStyle w:val="ListParagraph"/>
+        <w:numPr>
+          <w:ilvl w:val="0"/>
+          <w:numId w:val="1"/>
+        </w:numPr>
+        <w:spacing w:after="60"/>
+      </w:pPr>
+      <w:r>
+        <w:rPr>
+          <w:sz w:val="21"/>
+          <w:szCs w:val="21"/>
+        </w:rPr>
+        <w:t xml:space="preserve">git diff --check: clean (one harmless LF/CRLF line-ending notice).</w:t>
+      </w:r>
+    </w:p>
+    <w:p>
+      <w:pPr>
+        <w:pStyle w:val="ListParagraph"/>
+        <w:numPr>
+          <w:ilvl w:val="0"/>
+          <w:numId w:val="1"/>
+        </w:numPr>
+        <w:spacing w:after="60"/>
+      </w:pPr>
+      <w:r>
+        <w:rPr>
+          <w:sz w:val="21"/>
+          <w:szCs w:val="21"/>
+        </w:rPr>
+        <w:t xml:space="preserve">Full diff reviewed line by line — exactly two production files changed, one array entry each; no unrelated code touched.</w:t>
+      </w:r>
+    </w:p>
+    <w:p>
+      <w:pPr>
+        <w:pStyle w:val="Heading3"/>
+        <w:spacing w:after="80" w:before="180"/>
+      </w:pPr>
+      <w:r>
+        <w:rPr>
+          <w:b/>
+          <w:bCs/>
+          <w:color w:val="1F2937"/>
+          <w:sz w:val="22"/>
+          <w:szCs w:val="22"/>
+        </w:rPr>
+        <w:t xml:space="preserve">Remaining work after P1B</w:t>
+      </w:r>
+    </w:p>
+    <w:p>
+      <w:pPr>
+        <w:pStyle w:val="ListParagraph"/>
+        <w:numPr>
+          <w:ilvl w:val="0"/>
+          <w:numId w:val="1"/>
+        </w:numPr>
+        <w:spacing w:after="60"/>
+      </w:pPr>
+      <w:r>
+        <w:rPr>
+          <w:sz w:val="21"/>
+          <w:szCs w:val="21"/>
+        </w:rPr>
+        <w:t xml:space="preserve">P1A, P1B, and P1C are all now COMPLETE for Client Project Tracker. No further Tracker-specific linking work is planned or recommended — the deferred Use Case and Email/Messages candidates were evaluated on their merits and genuinely do not warrant a link with the content as it exists today; revisit only if/when those pages' own copy changes to include an outbound-sharing narrative.</w:t>
+      </w:r>
+    </w:p>
+    <w:p>
+      <w:pPr>
+        <w:pStyle w:val="ListParagraph"/>
+        <w:numPr>
+          <w:ilvl w:val="0"/>
+          <w:numId w:val="1"/>
+        </w:numPr>
+        <w:spacing w:after="60"/>
+      </w:pPr>
+      <w:r>
+        <w:rPr>
+          <w:sz w:val="21"/>
+          <w:szCs w:val="21"/>
+        </w:rPr>
+        <w:t xml:space="preserve">Note for roadmap accuracy (§8): the P2 item "Client Project Tracker ↔ Client Feedback to Tasks direction-explicit cross-links" was already satisfied by P1A's relatedLinks addition on client-feedback-to-tasks/page.tsx — it does not require separate P1B/future work.</w:t>
+      </w:r>
+    </w:p>
+    <w:p>
+      <w:pPr>
+        <w:pStyle w:val="ListParagraph"/>
+        <w:numPr>
+          <w:ilvl w:val="0"/>
+          <w:numId w:val="1"/>
+        </w:numPr>
+        <w:spacing w:after="60"/>
+      </w:pPr>
+      <w:r>
+        <w:rPr>
+          <w:sz w:val="21"/>
+          <w:szCs w:val="21"/>
+        </w:rPr>
+        <w:t xml:space="preserve">Per §8's existing priority order, the next unstarted item in the P1/P2 tier is: Email Feature H1 commercial-framing differentiation (§3, Email — Commercial cluster's own recorded next action: "tighten H1 toward commercial framing"). General internal-linking improvements (§6.1) are now substantially addressed by the combined P1A+P1B work; any further items there would need their own fresh audit, not an assumption of remaining scope.</w:t>
       </w:r>
     </w:p>
     <w:sectPr>

</xml_diff>

<commit_message>
Differentiate email to tasks SEO intent
</commit_message>
<xml_diff>
--- a/docs/Text2Task_SEO_Master_Blueprint_2026-08-29.docx
+++ b/docs/Text2Task_SEO_Master_Blueprint_2026-08-29.docx
@@ -2165,7 +2165,7 @@
                 <w:sz w:val="17"/>
                 <w:szCs w:val="17"/>
               </w:rPr>
-              <w:t xml:space="preserve">Low (H1 phrasing softly echoes the Resource's phrase — cosmetic only)</w:t>
+              <w:t xml:space="preserve">None (H1 differentiation completed 2026-08-30 — §12)</w:t>
             </w:r>
           </w:p>
         </w:tc>
@@ -2190,7 +2190,7 @@
                 <w:sz w:val="17"/>
                 <w:szCs w:val="17"/>
               </w:rPr>
-              <w:t xml:space="preserve">Validated / stable</w:t>
+              <w:t xml:space="preserve">Validated / stable / H1 differentiated</w:t>
             </w:r>
           </w:p>
         </w:tc>
@@ -2215,7 +2215,7 @@
                 <w:sz w:val="17"/>
                 <w:szCs w:val="17"/>
               </w:rPr>
-              <w:t xml:space="preserve">P1/P2: tighten H1 toward commercial framing</w:t>
+              <w:t xml:space="preserve">Complete — see §12</w:t>
             </w:r>
           </w:p>
         </w:tc>
@@ -7445,24 +7445,24 @@
           <w:sz w:val="21"/>
           <w:szCs w:val="21"/>
         </w:rPr>
-        <w:t xml:space="preserve">Email Feature H1 commercial-framing differentiation.</w:t>
-      </w:r>
-    </w:p>
-    <w:p>
-      <w:pPr>
-        <w:pStyle w:val="ListParagraph"/>
-        <w:numPr>
-          <w:ilvl w:val="0"/>
-          <w:numId w:val="1"/>
-        </w:numPr>
-        <w:spacing w:after="60"/>
-      </w:pPr>
-      <w:r>
-        <w:rPr>
-          <w:sz w:val="21"/>
-          <w:szCs w:val="21"/>
-        </w:rPr>
-        <w:t xml:space="preserve">General internal-linking improvements identified in §6.1.</w:t>
+        <w:t xml:space="preserve">Email Feature H1 commercial-framing differentiation. [COMPLETE 2026-08-30 — see §12]</w:t>
+      </w:r>
+    </w:p>
+    <w:p>
+      <w:pPr>
+        <w:pStyle w:val="ListParagraph"/>
+        <w:numPr>
+          <w:ilvl w:val="0"/>
+          <w:numId w:val="1"/>
+        </w:numPr>
+        <w:spacing w:after="60"/>
+      </w:pPr>
+      <w:r>
+        <w:rPr>
+          <w:sz w:val="21"/>
+          <w:szCs w:val="21"/>
+        </w:rPr>
+        <w:t xml:space="preserve">General internal-linking improvements identified in §6.1. [Substantially addressed by P1A+P1B — see §11.20]</w:t>
       </w:r>
     </w:p>
     <w:p>
@@ -7974,14 +7974,14 @@
           <w:sz w:val="21"/>
           <w:szCs w:val="21"/>
         </w:rPr>
-        <w:t xml:space="preserve">Status update (2026-08-30, P1B internal-linking pass): </w:t>
-      </w:r>
-      <w:r>
-        <w:rPr>
-          <w:sz w:val="21"/>
-          <w:szCs w:val="21"/>
-        </w:rPr>
-        <w:t xml:space="preserve">P1A COMPLETE. P1B COMPLETE. P1C COMPLETE. The Client Project Tracker Feature page is fully built, visually integrated, discoverable from the Homepage and the Freelancer Solution page, and included in the sitemap and footer. Full implementation records: §11.17 (P1A), §11.18 (post-P1A copy refinement), §11.19 (P1C visual integration), §11.20 (P1B internal linking). Nothing was staged, committed, pushed, or deployed as part of any of these phases — the working tree changes are ready for review.</w:t>
+        <w:t xml:space="preserve">Status update (2026-08-30, Email Feature H1 differentiation pass): </w:t>
+      </w:r>
+      <w:r>
+        <w:rPr>
+          <w:sz w:val="21"/>
+          <w:szCs w:val="21"/>
+        </w:rPr>
+        <w:t xml:space="preserve">P1A COMPLETE. P1B COMPLETE. P1C COMPLETE. Email Feature H1 commercial-framing differentiation COMPLETE. Client Project Tracker is fully built, integrated, and discoverable (§11.17–§11.20). The Email Feature's H1 no longer echoes the Resource's informational phrasing (§12). Nothing was staged, committed, pushed, or deployed as part of any of these phases — the working tree changes are ready for review.</w:t>
       </w:r>
     </w:p>
     <w:tbl>
@@ -8028,7 +8028,7 @@
                 <w:sz w:val="23"/>
                 <w:szCs w:val="23"/>
               </w:rPr>
-              <w:t xml:space="preserve">NEXT PLANNED PHASE: Email Feature H1 commercial-framing differentiation</w:t>
+              <w:t xml:space="preserve">NEXT PLANNED PHASE: P2 tier (not yet authorized to start)</w:t>
             </w:r>
           </w:p>
           <w:p>
@@ -8054,7 +8054,7 @@
                 <w:sz w:val="21"/>
                 <w:szCs w:val="21"/>
               </w:rPr>
-              <w:t xml:space="preserve">§8 (P1/P2 tier) and §3A's Email — Commercial cluster row, whose own recorded Next Action is "tighten H1 toward commercial framing."</w:t>
+              <w:t xml:space="preserve">§8 (P2 tier)</w:t>
             </w:r>
           </w:p>
           <w:p>
@@ -8073,14 +8073,14 @@
                 <w:sz w:val="21"/>
                 <w:szCs w:val="21"/>
               </w:rPr>
-              <w:t xml:space="preserve">Why this item next: </w:t>
+              <w:t xml:space="preserve">Candidates: </w:t>
             </w:r>
             <w:r>
               <w:rPr>
                 <w:sz w:val="21"/>
                 <w:szCs w:val="21"/>
               </w:rPr>
-              <w:t xml:space="preserve">Client Project Tracker's P1A/P1B/P1C work is now fully complete; per §8's existing priority order (not reordered), this is the next unstarted item in the P1/P2 tier. The other P1/P2 item, "general internal-linking improvements (§6.1)," is now substantially addressed by the combined P1A+P1B work.</w:t>
+              <w:t xml:space="preserve">Web Designers Use Case vs. Revisions Resource differentiation (§5, rule 7); /features/project-deadline-calendar footer/navigation reinforcement.</w:t>
             </w:r>
           </w:p>
           <w:p>
@@ -8106,7 +8106,7 @@
                 <w:sz w:val="21"/>
                 <w:szCs w:val="21"/>
               </w:rPr>
-              <w:t xml:space="preserve">NOT started. Requires its own audit/mapping turn before implementation, per this project's established discipline.</w:t>
+              <w:t xml:space="preserve">NOT started. This document does not authorize beginning P2 work on its own — wait for an explicit instruction naming one of these items.</w:t>
             </w:r>
           </w:p>
         </w:tc>
@@ -8147,24 +8147,24 @@
           <w:sz w:val="21"/>
           <w:szCs w:val="21"/>
         </w:rPr>
-        <w:t xml:space="preserve">Re-read §11.17 (P1A), §11.18 (copy refinement), §11.19 (P1C visuals), and §11.20 (P1B linking) to confirm exactly what already shipped for Client Project Tracker — that work is finished and should not be revisited without new evidence.</w:t>
-      </w:r>
-    </w:p>
-    <w:p>
-      <w:pPr>
-        <w:pStyle w:val="ListParagraph"/>
-        <w:numPr>
-          <w:ilvl w:val="0"/>
-          <w:numId w:val="1"/>
-        </w:numPr>
-        <w:spacing w:after="60"/>
-      </w:pPr>
-      <w:r>
-        <w:rPr>
-          <w:sz w:val="21"/>
-          <w:szCs w:val="21"/>
-        </w:rPr>
-        <w:t xml:space="preserve">Re-read §3A's Email — Commercial row and §2 for the full Email to Tasks context before proposing new H1 wording.</w:t>
+        <w:t xml:space="preserve">Re-read §11.17–§11.20 to confirm Client Project Tracker is fully finished, and §12 to confirm the Email Feature H1 work is finished — neither should be revisited without new evidence.</w:t>
+      </w:r>
+    </w:p>
+    <w:p>
+      <w:pPr>
+        <w:pStyle w:val="ListParagraph"/>
+        <w:numPr>
+          <w:ilvl w:val="0"/>
+          <w:numId w:val="1"/>
+        </w:numPr>
+        <w:spacing w:after="60"/>
+      </w:pPr>
+      <w:r>
+        <w:rPr>
+          <w:sz w:val="21"/>
+          <w:szCs w:val="21"/>
+        </w:rPr>
+        <w:t xml:space="preserve">Wait for an explicit instruction identifying which P2 item to start; do not assume both, and do not begin without direction.</w:t>
       </w:r>
     </w:p>
     <w:p>
@@ -8217,7 +8217,7 @@
           <w:sz w:val="21"/>
           <w:szCs w:val="21"/>
         </w:rPr>
-        <w:t xml:space="preserve">The next Claude session should begin exactly here — Section 10 — after first re-reading §11.17–§11.20 to confirm Client Project Tracker is fully finished, then §3A and §8 before starting Email Feature H1 work.</w:t>
+        <w:t xml:space="preserve">The next Claude session should begin exactly here — Section 10 — after first re-reading §11.17–§11.20 and §12 to confirm what is already finished, then §5 and §8 before any P2 work — which requires its own explicit instruction to begin.</w:t>
       </w:r>
     </w:p>
     <w:p>
@@ -20421,6 +20421,1751 @@
         <w:t xml:space="preserve">Per §8's existing priority order, the next unstarted item in the P1/P2 tier is: Email Feature H1 commercial-framing differentiation (§3, Email — Commercial cluster's own recorded next action: "tighten H1 toward commercial framing"). General internal-linking improvements (§6.1) are now substantially addressed by the combined P1A+P1B work; any further items there would need their own fresh audit, not an assumption of remaining scope.</w:t>
       </w:r>
     </w:p>
+    <w:p>
+      <w:r>
+        <w:br w:type="page"/>
+      </w:r>
+    </w:p>
+    <w:p>
+      <w:pPr>
+        <w:pStyle w:val="Heading1"/>
+        <w:pBdr>
+          <w:bottom w:val="single" w:color="1D4ED8" w:sz="8" w:space="4"/>
+        </w:pBdr>
+        <w:spacing w:after="160" w:before="360"/>
+      </w:pPr>
+      <w:r>
+        <w:rPr>
+          <w:b/>
+          <w:bCs/>
+          <w:color w:val="1F2937"/>
+          <w:sz w:val="32"/>
+          <w:szCs w:val="32"/>
+        </w:rPr>
+        <w:t xml:space="preserve">12. Email Feature H1 Commercial-Framing Differentiation (2026-08-30) — COMPLETE</w:t>
+      </w:r>
+    </w:p>
+    <w:p>
+      <w:pPr>
+        <w:spacing w:after="120"/>
+      </w:pPr>
+      <w:r>
+        <w:rPr>
+          <w:sz w:val="21"/>
+          <w:szCs w:val="21"/>
+        </w:rPr>
+        <w:t xml:space="preserve">This is a separate roadmap item from Client Project Tracker (Section 11) — the next unstarted P1/P2-tier item per §8's existing priority order, not reordered or invented. Scope: a single H1 refinement on /features/email-to-tasks, resolving the low-grade cannibalization risk §3A had flagged against /resources/how-to-turn-emails-into-tasks. No route, canonical, schema, sitemap, FAQ, CTA, or Resource content was touched.</w:t>
+      </w:r>
+    </w:p>
+    <w:p>
+      <w:pPr>
+        <w:pStyle w:val="Heading2"/>
+        <w:spacing w:after="120" w:before="260"/>
+      </w:pPr>
+      <w:r>
+        <w:rPr>
+          <w:b/>
+          <w:bCs/>
+          <w:color w:val="1D4ED8"/>
+          <w:sz w:val="26"/>
+          <w:szCs w:val="26"/>
+        </w:rPr>
+        <w:t xml:space="preserve">12.1 Audit — both pages, as found</w:t>
+      </w:r>
+    </w:p>
+    <w:tbl>
+      <w:tblPr>
+        <w:tblW w:type="pct" w:w="100%"/>
+        <w:tblBorders>
+          <w:top w:val="single" w:color="D1D5DB" w:sz="4"/>
+          <w:left w:val="single" w:color="D1D5DB" w:sz="4"/>
+          <w:bottom w:val="single" w:color="D1D5DB" w:sz="4"/>
+          <w:right w:val="single" w:color="D1D5DB" w:sz="4"/>
+          <w:insideH w:val="single" w:color="D1D5DB" w:sz="4"/>
+          <w:insideV w:val="single" w:color="D1D5DB" w:sz="4"/>
+        </w:tblBorders>
+      </w:tblPr>
+      <w:tblGrid>
+        <w:gridCol w:w="100"/>
+        <w:gridCol w:w="100"/>
+        <w:gridCol w:w="100"/>
+      </w:tblGrid>
+      <w:tr>
+        <w:trPr>
+          <w:tblHeader/>
+        </w:trPr>
+        <w:tc>
+          <w:tcPr>
+            <w:tcW w:type="dxa" w:w="1700"/>
+            <w:shd w:fill="1D4ED8" w:color="auto" w:val="clear"/>
+            <w:tcMar>
+              <w:top w:type="dxa" w:w="80"/>
+              <w:left w:type="dxa" w:w="100"/>
+              <w:bottom w:type="dxa" w:w="80"/>
+              <w:right w:type="dxa" w:w="100"/>
+            </w:tcMar>
+            <w:vAlign w:val="center"/>
+          </w:tcPr>
+          <w:p>
+            <w:r>
+              <w:rPr>
+                <w:b/>
+                <w:bCs/>
+                <w:color w:val="FFFFFF"/>
+                <w:sz w:val="19"/>
+                <w:szCs w:val="19"/>
+              </w:rPr>
+              <w:t xml:space="preserve">Field</w:t>
+            </w:r>
+          </w:p>
+        </w:tc>
+        <w:tc>
+          <w:tcPr>
+            <w:tcW w:type="dxa" w:w="3700"/>
+            <w:shd w:fill="1D4ED8" w:color="auto" w:val="clear"/>
+            <w:tcMar>
+              <w:top w:type="dxa" w:w="80"/>
+              <w:left w:type="dxa" w:w="100"/>
+              <w:bottom w:type="dxa" w:w="80"/>
+              <w:right w:type="dxa" w:w="100"/>
+            </w:tcMar>
+            <w:vAlign w:val="center"/>
+          </w:tcPr>
+          <w:p>
+            <w:r>
+              <w:rPr>
+                <w:b/>
+                <w:bCs/>
+                <w:color w:val="FFFFFF"/>
+                <w:sz w:val="19"/>
+                <w:szCs w:val="19"/>
+              </w:rPr>
+              <w:t xml:space="preserve">Feature (/features/email-to-tasks)</w:t>
+            </w:r>
+          </w:p>
+        </w:tc>
+        <w:tc>
+          <w:tcPr>
+            <w:tcW w:type="dxa" w:w="4514"/>
+            <w:shd w:fill="1D4ED8" w:color="auto" w:val="clear"/>
+            <w:tcMar>
+              <w:top w:type="dxa" w:w="80"/>
+              <w:left w:type="dxa" w:w="100"/>
+              <w:bottom w:type="dxa" w:w="80"/>
+              <w:right w:type="dxa" w:w="100"/>
+            </w:tcMar>
+            <w:vAlign w:val="center"/>
+          </w:tcPr>
+          <w:p>
+            <w:r>
+              <w:rPr>
+                <w:b/>
+                <w:bCs/>
+                <w:color w:val="FFFFFF"/>
+                <w:sz w:val="19"/>
+                <w:szCs w:val="19"/>
+              </w:rPr>
+              <w:t xml:space="preserve">Resource (/resources/how-to-turn-emails-into-tasks)</w:t>
+            </w:r>
+          </w:p>
+        </w:tc>
+      </w:tr>
+      <w:tr>
+        <w:tc>
+          <w:tcPr>
+            <w:tcW w:type="dxa" w:w="1700"/>
+            <w:tcMar>
+              <w:top w:type="dxa" w:w="80"/>
+              <w:left w:type="dxa" w:w="100"/>
+              <w:bottom w:type="dxa" w:w="80"/>
+              <w:right w:type="dxa" w:w="100"/>
+            </w:tcMar>
+            <w:vAlign w:val="center"/>
+          </w:tcPr>
+          <w:p>
+            <w:r>
+              <w:rPr>
+                <w:b w:val="false"/>
+                <w:bCs w:val="false"/>
+                <w:color w:val="1F2937"/>
+                <w:sz w:val="19"/>
+                <w:szCs w:val="19"/>
+              </w:rPr>
+              <w:t xml:space="preserve">Title</w:t>
+            </w:r>
+          </w:p>
+        </w:tc>
+        <w:tc>
+          <w:tcPr>
+            <w:tcW w:type="dxa" w:w="3700"/>
+            <w:tcMar>
+              <w:top w:type="dxa" w:w="80"/>
+              <w:left w:type="dxa" w:w="100"/>
+              <w:bottom w:type="dxa" w:w="80"/>
+              <w:right w:type="dxa" w:w="100"/>
+            </w:tcMar>
+            <w:vAlign w:val="center"/>
+          </w:tcPr>
+          <w:p>
+            <w:r>
+              <w:rPr>
+                <w:b w:val="false"/>
+                <w:bCs w:val="false"/>
+                <w:color w:val="1F2937"/>
+                <w:sz w:val="19"/>
+                <w:szCs w:val="19"/>
+              </w:rPr>
+              <w:t xml:space="preserve">Email to Tasks: Turn Emails Into Projects</w:t>
+            </w:r>
+          </w:p>
+        </w:tc>
+        <w:tc>
+          <w:tcPr>
+            <w:tcW w:type="dxa" w:w="4514"/>
+            <w:tcMar>
+              <w:top w:type="dxa" w:w="80"/>
+              <w:left w:type="dxa" w:w="100"/>
+              <w:bottom w:type="dxa" w:w="80"/>
+              <w:right w:type="dxa" w:w="100"/>
+            </w:tcMar>
+            <w:vAlign w:val="center"/>
+          </w:tcPr>
+          <w:p>
+            <w:r>
+              <w:rPr>
+                <w:b w:val="false"/>
+                <w:bCs w:val="false"/>
+                <w:color w:val="1F2937"/>
+                <w:sz w:val="19"/>
+                <w:szCs w:val="19"/>
+              </w:rPr>
+              <w:t xml:space="preserve">How to Turn Emails Into Tasks: A Practical Workflow</w:t>
+            </w:r>
+          </w:p>
+        </w:tc>
+      </w:tr>
+      <w:tr>
+        <w:tc>
+          <w:tcPr>
+            <w:tcW w:type="dxa" w:w="1700"/>
+            <w:shd w:fill="F3F4F6" w:color="auto" w:val="clear"/>
+            <w:tcMar>
+              <w:top w:type="dxa" w:w="80"/>
+              <w:left w:type="dxa" w:w="100"/>
+              <w:bottom w:type="dxa" w:w="80"/>
+              <w:right w:type="dxa" w:w="100"/>
+            </w:tcMar>
+            <w:vAlign w:val="center"/>
+          </w:tcPr>
+          <w:p>
+            <w:r>
+              <w:rPr>
+                <w:b w:val="false"/>
+                <w:bCs w:val="false"/>
+                <w:color w:val="1F2937"/>
+                <w:sz w:val="19"/>
+                <w:szCs w:val="19"/>
+              </w:rPr>
+              <w:t xml:space="preserve">Meta description</w:t>
+            </w:r>
+          </w:p>
+        </w:tc>
+        <w:tc>
+          <w:tcPr>
+            <w:tcW w:type="dxa" w:w="3700"/>
+            <w:shd w:fill="F3F4F6" w:color="auto" w:val="clear"/>
+            <w:tcMar>
+              <w:top w:type="dxa" w:w="80"/>
+              <w:left w:type="dxa" w:w="100"/>
+              <w:bottom w:type="dxa" w:w="80"/>
+              <w:right w:type="dxa" w:w="100"/>
+            </w:tcMar>
+            <w:vAlign w:val="center"/>
+          </w:tcPr>
+          <w:p>
+            <w:r>
+              <w:rPr>
+                <w:b w:val="false"/>
+                <w:bCs w:val="false"/>
+                <w:color w:val="1F2937"/>
+                <w:sz w:val="19"/>
+                <w:szCs w:val="19"/>
+              </w:rPr>
+              <w:t xml:space="preserve">Paste an email into Text2Task to extract a reviewable project, tasks, deadlines, priorities, budget details, and client information before saving.</w:t>
+            </w:r>
+          </w:p>
+        </w:tc>
+        <w:tc>
+          <w:tcPr>
+            <w:tcW w:type="dxa" w:w="4514"/>
+            <w:shd w:fill="F3F4F6" w:color="auto" w:val="clear"/>
+            <w:tcMar>
+              <w:top w:type="dxa" w:w="80"/>
+              <w:left w:type="dxa" w:w="100"/>
+              <w:bottom w:type="dxa" w:w="80"/>
+              <w:right w:type="dxa" w:w="100"/>
+            </w:tcMar>
+            <w:vAlign w:val="center"/>
+          </w:tcPr>
+          <w:p>
+            <w:r>
+              <w:rPr>
+                <w:b w:val="false"/>
+                <w:bCs w:val="false"/>
+                <w:color w:val="1F2937"/>
+                <w:sz w:val="19"/>
+                <w:szCs w:val="19"/>
+              </w:rPr>
+              <w:t xml:space="preserve">Learn a practical workflow for turning client emails into organized tasks, deadlines, priorities, and a reviewable project before saving.</w:t>
+            </w:r>
+          </w:p>
+        </w:tc>
+      </w:tr>
+      <w:tr>
+        <w:tc>
+          <w:tcPr>
+            <w:tcW w:type="dxa" w:w="1700"/>
+            <w:tcMar>
+              <w:top w:type="dxa" w:w="80"/>
+              <w:left w:type="dxa" w:w="100"/>
+              <w:bottom w:type="dxa" w:w="80"/>
+              <w:right w:type="dxa" w:w="100"/>
+            </w:tcMar>
+            <w:vAlign w:val="center"/>
+          </w:tcPr>
+          <w:p>
+            <w:r>
+              <w:rPr>
+                <w:b w:val="false"/>
+                <w:bCs w:val="false"/>
+                <w:color w:val="1F2937"/>
+                <w:sz w:val="19"/>
+                <w:szCs w:val="19"/>
+              </w:rPr>
+              <w:t xml:space="preserve">H1 (before)</w:t>
+            </w:r>
+          </w:p>
+        </w:tc>
+        <w:tc>
+          <w:tcPr>
+            <w:tcW w:type="dxa" w:w="3700"/>
+            <w:tcMar>
+              <w:top w:type="dxa" w:w="80"/>
+              <w:left w:type="dxa" w:w="100"/>
+              <w:bottom w:type="dxa" w:w="80"/>
+              <w:right w:type="dxa" w:w="100"/>
+            </w:tcMar>
+            <w:vAlign w:val="center"/>
+          </w:tcPr>
+          <w:p>
+            <w:r>
+              <w:rPr>
+                <w:b w:val="false"/>
+                <w:bCs w:val="false"/>
+                <w:color w:val="1F2937"/>
+                <w:sz w:val="19"/>
+                <w:szCs w:val="19"/>
+              </w:rPr>
+              <w:t xml:space="preserve">Turn emails into organized projects and tasks.</w:t>
+            </w:r>
+          </w:p>
+        </w:tc>
+        <w:tc>
+          <w:tcPr>
+            <w:tcW w:type="dxa" w:w="4514"/>
+            <w:tcMar>
+              <w:top w:type="dxa" w:w="80"/>
+              <w:left w:type="dxa" w:w="100"/>
+              <w:bottom w:type="dxa" w:w="80"/>
+              <w:right w:type="dxa" w:w="100"/>
+            </w:tcMar>
+            <w:vAlign w:val="center"/>
+          </w:tcPr>
+          <w:p>
+            <w:r>
+              <w:rPr>
+                <w:b w:val="false"/>
+                <w:bCs w:val="false"/>
+                <w:color w:val="1F2937"/>
+                <w:sz w:val="19"/>
+                <w:szCs w:val="19"/>
+              </w:rPr>
+              <w:t xml:space="preserve">How to turn emails into tasks without losing project context (unchanged)</w:t>
+            </w:r>
+          </w:p>
+        </w:tc>
+      </w:tr>
+      <w:tr>
+        <w:tc>
+          <w:tcPr>
+            <w:tcW w:type="dxa" w:w="1700"/>
+            <w:shd w:fill="F3F4F6" w:color="auto" w:val="clear"/>
+            <w:tcMar>
+              <w:top w:type="dxa" w:w="80"/>
+              <w:left w:type="dxa" w:w="100"/>
+              <w:bottom w:type="dxa" w:w="80"/>
+              <w:right w:type="dxa" w:w="100"/>
+            </w:tcMar>
+            <w:vAlign w:val="center"/>
+          </w:tcPr>
+          <w:p>
+            <w:r>
+              <w:rPr>
+                <w:b w:val="false"/>
+                <w:bCs w:val="false"/>
+                <w:color w:val="1F2937"/>
+                <w:sz w:val="19"/>
+                <w:szCs w:val="19"/>
+              </w:rPr>
+              <w:t xml:space="preserve">Primary CTA</w:t>
+            </w:r>
+          </w:p>
+        </w:tc>
+        <w:tc>
+          <w:tcPr>
+            <w:tcW w:type="dxa" w:w="3700"/>
+            <w:shd w:fill="F3F4F6" w:color="auto" w:val="clear"/>
+            <w:tcMar>
+              <w:top w:type="dxa" w:w="80"/>
+              <w:left w:type="dxa" w:w="100"/>
+              <w:bottom w:type="dxa" w:w="80"/>
+              <w:right w:type="dxa" w:w="100"/>
+            </w:tcMar>
+            <w:vAlign w:val="center"/>
+          </w:tcPr>
+          <w:p>
+            <w:r>
+              <w:rPr>
+                <w:b w:val="false"/>
+                <w:bCs w:val="false"/>
+                <w:color w:val="1F2937"/>
+                <w:sz w:val="19"/>
+                <w:szCs w:val="19"/>
+              </w:rPr>
+              <w:t xml:space="preserve">"Start for free" → /signup</w:t>
+            </w:r>
+          </w:p>
+        </w:tc>
+        <w:tc>
+          <w:tcPr>
+            <w:tcW w:type="dxa" w:w="4514"/>
+            <w:shd w:fill="F3F4F6" w:color="auto" w:val="clear"/>
+            <w:tcMar>
+              <w:top w:type="dxa" w:w="80"/>
+              <w:left w:type="dxa" w:w="100"/>
+              <w:bottom w:type="dxa" w:w="80"/>
+              <w:right w:type="dxa" w:w="100"/>
+            </w:tcMar>
+            <w:vAlign w:val="center"/>
+          </w:tcPr>
+          <w:p>
+            <w:r>
+              <w:rPr>
+                <w:b w:val="false"/>
+                <w:bCs w:val="false"/>
+                <w:color w:val="1F2937"/>
+                <w:sz w:val="19"/>
+                <w:szCs w:val="19"/>
+              </w:rPr>
+              <w:t xml:space="preserve">"Explore Email to Tasks" → /features/email-to-tasks</w:t>
+            </w:r>
+          </w:p>
+        </w:tc>
+      </w:tr>
+      <w:tr>
+        <w:tc>
+          <w:tcPr>
+            <w:tcW w:type="dxa" w:w="1700"/>
+            <w:tcMar>
+              <w:top w:type="dxa" w:w="80"/>
+              <w:left w:type="dxa" w:w="100"/>
+              <w:bottom w:type="dxa" w:w="80"/>
+              <w:right w:type="dxa" w:w="100"/>
+            </w:tcMar>
+            <w:vAlign w:val="center"/>
+          </w:tcPr>
+          <w:p>
+            <w:r>
+              <w:rPr>
+                <w:b w:val="false"/>
+                <w:bCs w:val="false"/>
+                <w:color w:val="1F2937"/>
+                <w:sz w:val="19"/>
+                <w:szCs w:val="19"/>
+              </w:rPr>
+              <w:t xml:space="preserve">Schema</w:t>
+            </w:r>
+          </w:p>
+        </w:tc>
+        <w:tc>
+          <w:tcPr>
+            <w:tcW w:type="dxa" w:w="3700"/>
+            <w:tcMar>
+              <w:top w:type="dxa" w:w="80"/>
+              <w:left w:type="dxa" w:w="100"/>
+              <w:bottom w:type="dxa" w:w="80"/>
+              <w:right w:type="dxa" w:w="100"/>
+            </w:tcMar>
+            <w:vAlign w:val="center"/>
+          </w:tcPr>
+          <w:p>
+            <w:r>
+              <w:rPr>
+                <w:b w:val="false"/>
+                <w:bCs w:val="false"/>
+                <w:color w:val="1F2937"/>
+                <w:sz w:val="19"/>
+                <w:szCs w:val="19"/>
+              </w:rPr>
+              <w:t xml:space="preserve">WebPage + 2-level BreadcrumbList + FAQPage</w:t>
+            </w:r>
+          </w:p>
+        </w:tc>
+        <w:tc>
+          <w:tcPr>
+            <w:tcW w:type="dxa" w:w="4514"/>
+            <w:tcMar>
+              <w:top w:type="dxa" w:w="80"/>
+              <w:left w:type="dxa" w:w="100"/>
+              <w:bottom w:type="dxa" w:w="80"/>
+              <w:right w:type="dxa" w:w="100"/>
+            </w:tcMar>
+            <w:vAlign w:val="center"/>
+          </w:tcPr>
+          <w:p>
+            <w:r>
+              <w:rPr>
+                <w:b w:val="false"/>
+                <w:bCs w:val="false"/>
+                <w:color w:val="1F2937"/>
+                <w:sz w:val="19"/>
+                <w:szCs w:val="19"/>
+              </w:rPr>
+              <w:t xml:space="preserve">Article (buildArticleJsonLd) + 3-level BreadcrumbList (Home / Resources / article)</w:t>
+            </w:r>
+          </w:p>
+        </w:tc>
+      </w:tr>
+      <w:tr>
+        <w:tc>
+          <w:tcPr>
+            <w:tcW w:type="dxa" w:w="1700"/>
+            <w:shd w:fill="F3F4F6" w:color="auto" w:val="clear"/>
+            <w:tcMar>
+              <w:top w:type="dxa" w:w="80"/>
+              <w:left w:type="dxa" w:w="100"/>
+              <w:bottom w:type="dxa" w:w="80"/>
+              <w:right w:type="dxa" w:w="100"/>
+            </w:tcMar>
+            <w:vAlign w:val="center"/>
+          </w:tcPr>
+          <w:p>
+            <w:r>
+              <w:rPr>
+                <w:b w:val="false"/>
+                <w:bCs w:val="false"/>
+                <w:color w:val="1F2937"/>
+                <w:sz w:val="19"/>
+                <w:szCs w:val="19"/>
+              </w:rPr>
+              <w:t xml:space="preserve">Intent signal</w:t>
+            </w:r>
+          </w:p>
+        </w:tc>
+        <w:tc>
+          <w:tcPr>
+            <w:tcW w:type="dxa" w:w="3700"/>
+            <w:shd w:fill="F3F4F6" w:color="auto" w:val="clear"/>
+            <w:tcMar>
+              <w:top w:type="dxa" w:w="80"/>
+              <w:left w:type="dxa" w:w="100"/>
+              <w:bottom w:type="dxa" w:w="80"/>
+              <w:right w:type="dxa" w:w="100"/>
+            </w:tcMar>
+            <w:vAlign w:val="center"/>
+          </w:tcPr>
+          <w:p>
+            <w:r>
+              <w:rPr>
+                <w:b w:val="false"/>
+                <w:bCs w:val="false"/>
+                <w:color w:val="1F2937"/>
+                <w:sz w:val="19"/>
+                <w:szCs w:val="19"/>
+              </w:rPr>
+              <w:t xml:space="preserve">Commercial/tool: capability checklist, "How it works" steps, FAQ about the tool itself</w:t>
+            </w:r>
+          </w:p>
+        </w:tc>
+        <w:tc>
+          <w:tcPr>
+            <w:tcW w:type="dxa" w:w="4514"/>
+            <w:shd w:fill="F3F4F6" w:color="auto" w:val="clear"/>
+            <w:tcMar>
+              <w:top w:type="dxa" w:w="80"/>
+              <w:left w:type="dxa" w:w="100"/>
+              <w:bottom w:type="dxa" w:w="80"/>
+              <w:right w:type="dxa" w:w="100"/>
+            </w:tcMar>
+            <w:vAlign w:val="center"/>
+          </w:tcPr>
+          <w:p>
+            <w:r>
+              <w:rPr>
+                <w:b w:val="false"/>
+                <w:bCs w:val="false"/>
+                <w:color w:val="1F2937"/>
+                <w:sz w:val="19"/>
+                <w:szCs w:val="19"/>
+              </w:rPr>
+              <w:t xml:space="preserve">Informational/how-to: worked example, 5-step manual workflow, "Common mistakes" section</w:t>
+            </w:r>
+          </w:p>
+        </w:tc>
+      </w:tr>
+    </w:tbl>
+    <w:p>
+      <w:pPr>
+        <w:pStyle w:val="ListParagraph"/>
+        <w:numPr>
+          <w:ilvl w:val="0"/>
+          <w:numId w:val="1"/>
+        </w:numPr>
+        <w:spacing w:after="60"/>
+      </w:pPr>
+      <w:r>
+        <w:rPr>
+          <w:sz w:val="21"/>
+          <w:szCs w:val="21"/>
+        </w:rPr>
+        <w:t xml:space="preserve">Internal links between the two pages were already bidirectional before this phase: Feature → Resource via its relatedLinks card ("How to turn emails into tasks"); Resource → Feature via an inline sentence in its "How Text2Task supports this workflow" section ("turn selected email text into a reviewable project and task draft").</w:t>
+      </w:r>
+    </w:p>
+    <w:p>
+      <w:pPr>
+        <w:pStyle w:val="ListParagraph"/>
+        <w:numPr>
+          <w:ilvl w:val="0"/>
+          <w:numId w:val="1"/>
+        </w:numPr>
+        <w:spacing w:after="60"/>
+      </w:pPr>
+      <w:r>
+        <w:rPr>
+          <w:sz w:val="21"/>
+          <w:szCs w:val="21"/>
+        </w:rPr>
+        <w:t xml:space="preserve">No test file existed for either page before this phase.</w:t>
+      </w:r>
+    </w:p>
+    <w:p>
+      <w:pPr>
+        <w:pStyle w:val="ListParagraph"/>
+        <w:numPr>
+          <w:ilvl w:val="0"/>
+          <w:numId w:val="1"/>
+        </w:numPr>
+        <w:spacing w:after="60"/>
+      </w:pPr>
+      <w:r>
+        <w:rPr>
+          <w:sz w:val="21"/>
+          <w:szCs w:val="21"/>
+        </w:rPr>
+        <w:t xml:space="preserve">Repeated phrase: the Feature's old H1 ("Turn emails into organized projects and tasks") and the Resource's H1/primary keyword ("how to turn emails into tasks" / "turn emails into tasks") shared the same "turn emails into tasks" construction — the exact overlap §3A had already flagged as a low cannibalization risk.</w:t>
+      </w:r>
+    </w:p>
+    <w:p>
+      <w:pPr>
+        <w:pStyle w:val="Heading2"/>
+        <w:spacing w:after="120" w:before="260"/>
+      </w:pPr>
+      <w:r>
+        <w:rPr>
+          <w:b/>
+          <w:bCs/>
+          <w:color w:val="1D4ED8"/>
+          <w:sz w:val="26"/>
+          <w:szCs w:val="26"/>
+        </w:rPr>
+        <w:t xml:space="preserve">12.2 Cannibalization analysis</w:t>
+      </w:r>
+    </w:p>
+    <w:p>
+      <w:pPr>
+        <w:pStyle w:val="ListParagraph"/>
+        <w:numPr>
+          <w:ilvl w:val="0"/>
+          <w:numId w:val="1"/>
+        </w:numPr>
+        <w:spacing w:after="60"/>
+      </w:pPr>
+      <w:r>
+        <w:rPr>
+          <w:sz w:val="21"/>
+          <w:szCs w:val="21"/>
+        </w:rPr>
+        <w:t xml:space="preserve">Is the Feature's H1 too close to the Resource's informational intent? YES — both led with the identical "turn emails into tasks" construction, which is also the Resource's own validated informational keyword and the phrase GSC already ranks the Resource for.</w:t>
+      </w:r>
+    </w:p>
+    <w:p>
+      <w:pPr>
+        <w:pStyle w:val="ListParagraph"/>
+        <w:numPr>
+          <w:ilvl w:val="0"/>
+          <w:numId w:val="1"/>
+        </w:numPr>
+        <w:spacing w:after="60"/>
+      </w:pPr>
+      <w:r>
+        <w:rPr>
+          <w:sz w:val="21"/>
+          <w:szCs w:val="21"/>
+        </w:rPr>
+        <w:t xml:space="preserve">Does the current Feature title already provide enough commercial differentiation? YES — "Email to Tasks: Turn Emails Into Projects" already leads with the product name and is distinct from the Resource's "How to Turn Emails Into Tasks" title. No title change was needed.</w:t>
+      </w:r>
+    </w:p>
+    <w:p>
+      <w:pPr>
+        <w:pStyle w:val="ListParagraph"/>
+        <w:numPr>
+          <w:ilvl w:val="0"/>
+          <w:numId w:val="1"/>
+        </w:numPr>
+        <w:spacing w:after="60"/>
+      </w:pPr>
+      <w:r>
+        <w:rPr>
+          <w:sz w:val="21"/>
+          <w:szCs w:val="21"/>
+        </w:rPr>
+        <w:t xml:space="preserve">Does the H1 itself need changing? YES — it was the one element still echoing the Resource's phrasing.</w:t>
+      </w:r>
+    </w:p>
+    <w:p>
+      <w:pPr>
+        <w:pStyle w:val="ListParagraph"/>
+        <w:numPr>
+          <w:ilvl w:val="0"/>
+          <w:numId w:val="1"/>
+        </w:numPr>
+        <w:spacing w:after="60"/>
+      </w:pPr>
+      <w:r>
+        <w:rPr>
+          <w:sz w:val="21"/>
+          <w:szCs w:val="21"/>
+        </w:rPr>
+        <w:t xml:space="preserve">Would changing the H1 risk weakening a useful phrase already supported by GSC? NO — the GSC ranking cited in this project's research is for the Resource page's "turn emails into tasks" query, not for any Feature-page ranking tied to the old H1 string. No evidence exists that the Feature's exact old H1 wording itself was driving any tracked ranking.</w:t>
+      </w:r>
+    </w:p>
+    <w:p>
+      <w:pPr>
+        <w:pStyle w:val="ListParagraph"/>
+        <w:numPr>
+          <w:ilvl w:val="0"/>
+          <w:numId w:val="1"/>
+        </w:numPr>
+        <w:spacing w:after="60"/>
+      </w:pPr>
+      <w:r>
+        <w:rPr>
+          <w:sz w:val="21"/>
+          <w:szCs w:val="21"/>
+        </w:rPr>
+        <w:t xml:space="preserve">Can the commercial distinction be improved with a narrow H1 refinement rather than broader copy changes? YES — confirmed and implemented as the only change (§12.3).</w:t>
+      </w:r>
+    </w:p>
+    <w:p>
+      <w:pPr>
+        <w:pStyle w:val="ListParagraph"/>
+        <w:numPr>
+          <w:ilvl w:val="0"/>
+          <w:numId w:val="1"/>
+        </w:numPr>
+        <w:spacing w:after="60"/>
+      </w:pPr>
+      <w:r>
+        <w:rPr>
+          <w:sz w:val="21"/>
+          <w:szCs w:val="21"/>
+        </w:rPr>
+        <w:t xml:space="preserve">Is any metadata change actually needed? NO — title/description/canonical/OG/Twitter already commercially differentiate the page adequately; none was changed, per this phase's default expectation.</w:t>
+      </w:r>
+    </w:p>
+    <w:p>
+      <w:pPr>
+        <w:pStyle w:val="Heading2"/>
+        <w:spacing w:after="120" w:before="260"/>
+      </w:pPr>
+      <w:r>
+        <w:rPr>
+          <w:b/>
+          <w:bCs/>
+          <w:color w:val="1D4ED8"/>
+          <w:sz w:val="26"/>
+          <w:szCs w:val="26"/>
+        </w:rPr>
+        <w:t xml:space="preserve">12.3 H1 decision</w:t>
+      </w:r>
+    </w:p>
+    <w:p>
+      <w:pPr>
+        <w:spacing w:after="120"/>
+      </w:pPr>
+      <w:r>
+        <w:rPr>
+          <w:b/>
+          <w:bCs/>
+          <w:sz w:val="21"/>
+          <w:szCs w:val="21"/>
+        </w:rPr>
+        <w:t xml:space="preserve">Old H1: </w:t>
+      </w:r>
+      <w:r>
+        <w:rPr>
+          <w:sz w:val="21"/>
+          <w:szCs w:val="21"/>
+        </w:rPr>
+        <w:t xml:space="preserve">"Turn emails into organized projects and tasks."</w:t>
+      </w:r>
+    </w:p>
+    <w:p>
+      <w:pPr>
+        <w:spacing w:after="120"/>
+      </w:pPr>
+      <w:r>
+        <w:rPr>
+          <w:b/>
+          <w:bCs/>
+          <w:sz w:val="21"/>
+          <w:szCs w:val="21"/>
+        </w:rPr>
+        <w:t xml:space="preserve">Final H1: </w:t>
+      </w:r>
+      <w:r>
+        <w:rPr>
+          <w:sz w:val="21"/>
+          <w:szCs w:val="21"/>
+        </w:rPr>
+        <w:t xml:space="preserve">"Paste an email. Get an organized project and tasks."</w:t>
+      </w:r>
+    </w:p>
+    <w:p>
+      <w:pPr>
+        <w:pStyle w:val="ListParagraph"/>
+        <w:numPr>
+          <w:ilvl w:val="0"/>
+          <w:numId w:val="1"/>
+        </w:numPr>
+        <w:spacing w:after="60"/>
+      </w:pPr>
+      <w:r>
+        <w:rPr>
+          <w:sz w:val="21"/>
+          <w:szCs w:val="21"/>
+        </w:rPr>
+        <w:t xml:space="preserve">Structurally breaks the "Turn emails into tasks" pattern entirely (rather than a word-swap within the same construction), which is what actually resolves the overlap with the Resource's H1/keyword — a synonym substitution alone would not have.</w:t>
+      </w:r>
+    </w:p>
+    <w:p>
+      <w:pPr>
+        <w:pStyle w:val="ListParagraph"/>
+        <w:numPr>
+          <w:ilvl w:val="0"/>
+          <w:numId w:val="1"/>
+        </w:numPr>
+        <w:spacing w:after="60"/>
+      </w:pPr>
+      <w:r>
+        <w:rPr>
+          <w:sz w:val="21"/>
+          <w:szCs w:val="21"/>
+        </w:rPr>
+        <w:t xml:space="preserve">Leads with the real, product-accurate user action ("Paste an email") rather than an instructional "how to" framing, reinforcing commercial/tool intent (describing what the tool does for the user) instead of tutorial intent.</w:t>
+      </w:r>
+    </w:p>
+    <w:p>
+      <w:pPr>
+        <w:pStyle w:val="ListParagraph"/>
+        <w:numPr>
+          <w:ilvl w:val="0"/>
+          <w:numId w:val="1"/>
+        </w:numPr>
+        <w:spacing w:after="60"/>
+      </w:pPr>
+      <w:r>
+        <w:rPr>
+          <w:sz w:val="21"/>
+          <w:szCs w:val="21"/>
+        </w:rPr>
+        <w:t xml:space="preserve">"Get an organized project and tasks" is outcome-focused, transactional phrasing consistent with the "email to task" commercial cluster's intent, without exact-matching the phrase awkwardly.</w:t>
+      </w:r>
+    </w:p>
+    <w:p>
+      <w:pPr>
+        <w:pStyle w:val="ListParagraph"/>
+        <w:numPr>
+          <w:ilvl w:val="0"/>
+          <w:numId w:val="1"/>
+        </w:numPr>
+        <w:spacing w:after="60"/>
+      </w:pPr>
+      <w:r>
+        <w:rPr>
+          <w:sz w:val="21"/>
+          <w:szCs w:val="21"/>
+        </w:rPr>
+        <w:t xml:space="preserve">No mailbox/inbox-sync claim: "Paste" is the explicit, correct action — Text2Task does not connect to Gmail/Outlook or monitor an inbox (confirmed against the page's own existing "No inbox connection" / "Your inbox stays separate" copy, which was not touched and remains accurate alongside the new H1).</w:t>
+      </w:r>
+    </w:p>
+    <w:p>
+      <w:pPr>
+        <w:pStyle w:val="ListParagraph"/>
+        <w:numPr>
+          <w:ilvl w:val="0"/>
+          <w:numId w:val="1"/>
+        </w:numPr>
+        <w:spacing w:after="60"/>
+      </w:pPr>
+      <w:r>
+        <w:rPr>
+          <w:sz w:val="21"/>
+          <w:szCs w:val="21"/>
+        </w:rPr>
+        <w:t xml:space="preserve">Reads naturally to a US audience (short action → outcome pattern, a common and effective SaaS landing-page convention) rather than a keyword-first construction.</w:t>
+      </w:r>
+    </w:p>
+    <w:p>
+      <w:pPr>
+        <w:pStyle w:val="Heading2"/>
+        <w:spacing w:after="120" w:before="260"/>
+      </w:pPr>
+      <w:r>
+        <w:rPr>
+          <w:b/>
+          <w:bCs/>
+          <w:color w:val="1D4ED8"/>
+          <w:sz w:val="26"/>
+          <w:szCs w:val="26"/>
+        </w:rPr>
+        <w:t xml:space="preserve">12.4 Implementation</w:t>
+      </w:r>
+    </w:p>
+    <w:p>
+      <w:pPr>
+        <w:pStyle w:val="ListParagraph"/>
+        <w:numPr>
+          <w:ilvl w:val="0"/>
+          <w:numId w:val="1"/>
+        </w:numPr>
+        <w:spacing w:after="60"/>
+      </w:pPr>
+      <w:r>
+        <w:rPr>
+          <w:sz w:val="21"/>
+          <w:szCs w:val="21"/>
+        </w:rPr>
+        <w:t xml:space="preserve">Single line changed: the &lt;h1&gt; text in app/features/email-to-tasks/page.tsx. No hero-support copy, section, CTA, schema, metadata, canonical, or route was touched.</w:t>
+      </w:r>
+    </w:p>
+    <w:p>
+      <w:pPr>
+        <w:pStyle w:val="ListParagraph"/>
+        <w:numPr>
+          <w:ilvl w:val="0"/>
+          <w:numId w:val="1"/>
+        </w:numPr>
+        <w:spacing w:after="60"/>
+      </w:pPr>
+      <w:r>
+        <w:rPr>
+          <w:sz w:val="21"/>
+          <w:szCs w:val="21"/>
+        </w:rPr>
+        <w:t xml:space="preserve">The Resource page (app/resources/how-to-turn-emails-into-tasks/page.tsx) was not modified — no contradiction was found that would have justified touching it.</w:t>
+      </w:r>
+    </w:p>
+    <w:p>
+      <w:pPr>
+        <w:pStyle w:val="Heading2"/>
+        <w:spacing w:after="120" w:before="260"/>
+      </w:pPr>
+      <w:r>
+        <w:rPr>
+          <w:b/>
+          <w:bCs/>
+          <w:color w:val="1D4ED8"/>
+          <w:sz w:val="26"/>
+          <w:szCs w:val="26"/>
+        </w:rPr>
+        <w:t xml:space="preserve">12.5 Internal-link relationship after the change</w:t>
+      </w:r>
+    </w:p>
+    <w:p>
+      <w:pPr>
+        <w:pStyle w:val="ListParagraph"/>
+        <w:numPr>
+          <w:ilvl w:val="0"/>
+          <w:numId w:val="1"/>
+        </w:numPr>
+        <w:spacing w:after="60"/>
+      </w:pPr>
+      <w:r>
+        <w:rPr>
+          <w:sz w:val="21"/>
+          <w:szCs w:val="21"/>
+        </w:rPr>
+        <w:t xml:space="preserve">Both existing links (Feature → Resource card; Resource → Feature inline sentence) use descriptive anchor text unrelated to the literal old H1 string, so neither needed updating and neither was touched.</w:t>
+      </w:r>
+    </w:p>
+    <w:p>
+      <w:pPr>
+        <w:pStyle w:val="ListParagraph"/>
+        <w:numPr>
+          <w:ilvl w:val="0"/>
+          <w:numId w:val="1"/>
+        </w:numPr>
+        <w:spacing w:after="60"/>
+      </w:pPr>
+      <w:r>
+        <w:rPr>
+          <w:sz w:val="21"/>
+          <w:szCs w:val="21"/>
+        </w:rPr>
+        <w:t xml:space="preserve">No duplicate link was added.</w:t>
+      </w:r>
+    </w:p>
+    <w:p>
+      <w:pPr>
+        <w:pStyle w:val="Heading2"/>
+        <w:spacing w:after="120" w:before="260"/>
+      </w:pPr>
+      <w:r>
+        <w:rPr>
+          <w:b/>
+          <w:bCs/>
+          <w:color w:val="1D4ED8"/>
+          <w:sz w:val="26"/>
+          <w:szCs w:val="26"/>
+        </w:rPr>
+        <w:t xml:space="preserve">12.6 SEO QA</w:t>
+      </w:r>
+    </w:p>
+    <w:tbl>
+      <w:tblPr>
+        <w:tblW w:type="pct" w:w="100%"/>
+        <w:tblBorders>
+          <w:top w:val="single" w:color="D1D5DB" w:sz="4"/>
+          <w:left w:val="single" w:color="D1D5DB" w:sz="4"/>
+          <w:bottom w:val="single" w:color="D1D5DB" w:sz="4"/>
+          <w:right w:val="single" w:color="D1D5DB" w:sz="4"/>
+          <w:insideH w:val="single" w:color="D1D5DB" w:sz="4"/>
+          <w:insideV w:val="single" w:color="D1D5DB" w:sz="4"/>
+        </w:tblBorders>
+      </w:tblPr>
+      <w:tblGrid>
+        <w:gridCol w:w="100"/>
+        <w:gridCol w:w="100"/>
+      </w:tblGrid>
+      <w:tr>
+        <w:trPr>
+          <w:tblHeader/>
+        </w:trPr>
+        <w:tc>
+          <w:tcPr>
+            <w:tcW w:type="dxa" w:w="5500"/>
+            <w:shd w:fill="1D4ED8" w:color="auto" w:val="clear"/>
+            <w:tcMar>
+              <w:top w:type="dxa" w:w="80"/>
+              <w:left w:type="dxa" w:w="100"/>
+              <w:bottom w:type="dxa" w:w="80"/>
+              <w:right w:type="dxa" w:w="100"/>
+            </w:tcMar>
+            <w:vAlign w:val="center"/>
+          </w:tcPr>
+          <w:p>
+            <w:r>
+              <w:rPr>
+                <w:b/>
+                <w:bCs/>
+                <w:color w:val="FFFFFF"/>
+                <w:sz w:val="19"/>
+                <w:szCs w:val="19"/>
+              </w:rPr>
+              <w:t xml:space="preserve">Check</w:t>
+            </w:r>
+          </w:p>
+        </w:tc>
+        <w:tc>
+          <w:tcPr>
+            <w:tcW w:type="dxa" w:w="4414"/>
+            <w:shd w:fill="1D4ED8" w:color="auto" w:val="clear"/>
+            <w:tcMar>
+              <w:top w:type="dxa" w:w="80"/>
+              <w:left w:type="dxa" w:w="100"/>
+              <w:bottom w:type="dxa" w:w="80"/>
+              <w:right w:type="dxa" w:w="100"/>
+            </w:tcMar>
+            <w:vAlign w:val="center"/>
+          </w:tcPr>
+          <w:p>
+            <w:r>
+              <w:rPr>
+                <w:b/>
+                <w:bCs/>
+                <w:color w:val="FFFFFF"/>
+                <w:sz w:val="19"/>
+                <w:szCs w:val="19"/>
+              </w:rPr>
+              <w:t xml:space="preserve">Result</w:t>
+            </w:r>
+          </w:p>
+        </w:tc>
+      </w:tr>
+      <w:tr>
+        <w:tc>
+          <w:tcPr>
+            <w:tcW w:type="dxa" w:w="5500"/>
+            <w:tcMar>
+              <w:top w:type="dxa" w:w="80"/>
+              <w:left w:type="dxa" w:w="100"/>
+              <w:bottom w:type="dxa" w:w="80"/>
+              <w:right w:type="dxa" w:w="100"/>
+            </w:tcMar>
+            <w:vAlign w:val="center"/>
+          </w:tcPr>
+          <w:p>
+            <w:r>
+              <w:rPr>
+                <w:b w:val="false"/>
+                <w:bCs w:val="false"/>
+                <w:color w:val="1F2937"/>
+                <w:sz w:val="19"/>
+                <w:szCs w:val="19"/>
+              </w:rPr>
+              <w:t xml:space="preserve">Feature H1 is not a near-copy of Resource H1</w:t>
+            </w:r>
+          </w:p>
+        </w:tc>
+        <w:tc>
+          <w:tcPr>
+            <w:tcW w:type="dxa" w:w="4414"/>
+            <w:tcMar>
+              <w:top w:type="dxa" w:w="80"/>
+              <w:left w:type="dxa" w:w="100"/>
+              <w:bottom w:type="dxa" w:w="80"/>
+              <w:right w:type="dxa" w:w="100"/>
+            </w:tcMar>
+            <w:vAlign w:val="center"/>
+          </w:tcPr>
+          <w:p>
+            <w:r>
+              <w:rPr>
+                <w:b w:val="false"/>
+                <w:bCs w:val="false"/>
+                <w:color w:val="1F2937"/>
+                <w:sz w:val="19"/>
+                <w:szCs w:val="19"/>
+              </w:rPr>
+              <w:t xml:space="preserve">CONFIRMED — verified by an automated test</w:t>
+            </w:r>
+          </w:p>
+        </w:tc>
+      </w:tr>
+      <w:tr>
+        <w:tc>
+          <w:tcPr>
+            <w:tcW w:type="dxa" w:w="5500"/>
+            <w:shd w:fill="F3F4F6" w:color="auto" w:val="clear"/>
+            <w:tcMar>
+              <w:top w:type="dxa" w:w="80"/>
+              <w:left w:type="dxa" w:w="100"/>
+              <w:bottom w:type="dxa" w:w="80"/>
+              <w:right w:type="dxa" w:w="100"/>
+            </w:tcMar>
+            <w:vAlign w:val="center"/>
+          </w:tcPr>
+          <w:p>
+            <w:r>
+              <w:rPr>
+                <w:b w:val="false"/>
+                <w:bCs w:val="false"/>
+                <w:color w:val="1F2937"/>
+                <w:sz w:val="19"/>
+                <w:szCs w:val="19"/>
+              </w:rPr>
+              <w:t xml:space="preserve">Resource left untouched</w:t>
+            </w:r>
+          </w:p>
+        </w:tc>
+        <w:tc>
+          <w:tcPr>
+            <w:tcW w:type="dxa" w:w="4414"/>
+            <w:shd w:fill="F3F4F6" w:color="auto" w:val="clear"/>
+            <w:tcMar>
+              <w:top w:type="dxa" w:w="80"/>
+              <w:left w:type="dxa" w:w="100"/>
+              <w:bottom w:type="dxa" w:w="80"/>
+              <w:right w:type="dxa" w:w="100"/>
+            </w:tcMar>
+            <w:vAlign w:val="center"/>
+          </w:tcPr>
+          <w:p>
+            <w:r>
+              <w:rPr>
+                <w:b w:val="false"/>
+                <w:bCs w:val="false"/>
+                <w:color w:val="1F2937"/>
+                <w:sz w:val="19"/>
+                <w:szCs w:val="19"/>
+              </w:rPr>
+              <w:t xml:space="preserve">CONFIRMED — zero lines changed in the Resource page</w:t>
+            </w:r>
+          </w:p>
+        </w:tc>
+      </w:tr>
+      <w:tr>
+        <w:tc>
+          <w:tcPr>
+            <w:tcW w:type="dxa" w:w="5500"/>
+            <w:tcMar>
+              <w:top w:type="dxa" w:w="80"/>
+              <w:left w:type="dxa" w:w="100"/>
+              <w:bottom w:type="dxa" w:w="80"/>
+              <w:right w:type="dxa" w:w="100"/>
+            </w:tcMar>
+            <w:vAlign w:val="center"/>
+          </w:tcPr>
+          <w:p>
+            <w:r>
+              <w:rPr>
+                <w:b w:val="false"/>
+                <w:bCs w:val="false"/>
+                <w:color w:val="1F2937"/>
+                <w:sz w:val="19"/>
+                <w:szCs w:val="19"/>
+              </w:rPr>
+              <w:t xml:space="preserve">No exact-match keyword stuffing</w:t>
+            </w:r>
+          </w:p>
+        </w:tc>
+        <w:tc>
+          <w:tcPr>
+            <w:tcW w:type="dxa" w:w="4414"/>
+            <w:tcMar>
+              <w:top w:type="dxa" w:w="80"/>
+              <w:left w:type="dxa" w:w="100"/>
+              <w:bottom w:type="dxa" w:w="80"/>
+              <w:right w:type="dxa" w:w="100"/>
+            </w:tcMar>
+            <w:vAlign w:val="center"/>
+          </w:tcPr>
+          <w:p>
+            <w:r>
+              <w:rPr>
+                <w:b w:val="false"/>
+                <w:bCs w:val="false"/>
+                <w:color w:val="1F2937"/>
+                <w:sz w:val="19"/>
+                <w:szCs w:val="19"/>
+              </w:rPr>
+              <w:t xml:space="preserve">CONFIRMED — new H1 does not repeat "email to task" verbatim</w:t>
+            </w:r>
+          </w:p>
+        </w:tc>
+      </w:tr>
+      <w:tr>
+        <w:tc>
+          <w:tcPr>
+            <w:tcW w:type="dxa" w:w="5500"/>
+            <w:shd w:fill="F3F4F6" w:color="auto" w:val="clear"/>
+            <w:tcMar>
+              <w:top w:type="dxa" w:w="80"/>
+              <w:left w:type="dxa" w:w="100"/>
+              <w:bottom w:type="dxa" w:w="80"/>
+              <w:right w:type="dxa" w:w="100"/>
+            </w:tcMar>
+            <w:vAlign w:val="center"/>
+          </w:tcPr>
+          <w:p>
+            <w:r>
+              <w:rPr>
+                <w:b w:val="false"/>
+                <w:bCs w:val="false"/>
+                <w:color w:val="1F2937"/>
+                <w:sz w:val="19"/>
+                <w:szCs w:val="19"/>
+              </w:rPr>
+              <w:t xml:space="preserve">No mailbox-integration overclaim</w:t>
+            </w:r>
+          </w:p>
+        </w:tc>
+        <w:tc>
+          <w:tcPr>
+            <w:tcW w:type="dxa" w:w="4414"/>
+            <w:shd w:fill="F3F4F6" w:color="auto" w:val="clear"/>
+            <w:tcMar>
+              <w:top w:type="dxa" w:w="80"/>
+              <w:left w:type="dxa" w:w="100"/>
+              <w:bottom w:type="dxa" w:w="80"/>
+              <w:right w:type="dxa" w:w="100"/>
+            </w:tcMar>
+            <w:vAlign w:val="center"/>
+          </w:tcPr>
+          <w:p>
+            <w:r>
+              <w:rPr>
+                <w:b w:val="false"/>
+                <w:bCs w:val="false"/>
+                <w:color w:val="1F2937"/>
+                <w:sz w:val="19"/>
+                <w:szCs w:val="19"/>
+              </w:rPr>
+              <w:t xml:space="preserve">CONFIRMED — verified by an automated test asserting the absence of sync/connect/monitor phrasing</w:t>
+            </w:r>
+          </w:p>
+        </w:tc>
+      </w:tr>
+      <w:tr>
+        <w:tc>
+          <w:tcPr>
+            <w:tcW w:type="dxa" w:w="5500"/>
+            <w:tcMar>
+              <w:top w:type="dxa" w:w="80"/>
+              <w:left w:type="dxa" w:w="100"/>
+              <w:bottom w:type="dxa" w:w="80"/>
+              <w:right w:type="dxa" w:w="100"/>
+            </w:tcMar>
+            <w:vAlign w:val="center"/>
+          </w:tcPr>
+          <w:p>
+            <w:r>
+              <w:rPr>
+                <w:b w:val="false"/>
+                <w:bCs w:val="false"/>
+                <w:color w:val="1F2937"/>
+                <w:sz w:val="19"/>
+                <w:szCs w:val="19"/>
+              </w:rPr>
+              <w:t xml:space="preserve">No automatic-ingestion overclaim</w:t>
+            </w:r>
+          </w:p>
+        </w:tc>
+        <w:tc>
+          <w:tcPr>
+            <w:tcW w:type="dxa" w:w="4414"/>
+            <w:tcMar>
+              <w:top w:type="dxa" w:w="80"/>
+              <w:left w:type="dxa" w:w="100"/>
+              <w:bottom w:type="dxa" w:w="80"/>
+              <w:right w:type="dxa" w:w="100"/>
+            </w:tcMar>
+            <w:vAlign w:val="center"/>
+          </w:tcPr>
+          <w:p>
+            <w:r>
+              <w:rPr>
+                <w:b w:val="false"/>
+                <w:bCs w:val="false"/>
+                <w:color w:val="1F2937"/>
+                <w:sz w:val="19"/>
+                <w:szCs w:val="19"/>
+              </w:rPr>
+              <w:t xml:space="preserve">CONFIRMED — H1 explicitly says "Paste," matching the page's existing paste-only product truth</w:t>
+            </w:r>
+          </w:p>
+        </w:tc>
+      </w:tr>
+      <w:tr>
+        <w:tc>
+          <w:tcPr>
+            <w:tcW w:type="dxa" w:w="5500"/>
+            <w:shd w:fill="F3F4F6" w:color="auto" w:val="clear"/>
+            <w:tcMar>
+              <w:top w:type="dxa" w:w="80"/>
+              <w:left w:type="dxa" w:w="100"/>
+              <w:bottom w:type="dxa" w:w="80"/>
+              <w:right w:type="dxa" w:w="100"/>
+            </w:tcMar>
+            <w:vAlign w:val="center"/>
+          </w:tcPr>
+          <w:p>
+            <w:r>
+              <w:rPr>
+                <w:b w:val="false"/>
+                <w:bCs w:val="false"/>
+                <w:color w:val="1F2937"/>
+                <w:sz w:val="19"/>
+                <w:szCs w:val="19"/>
+              </w:rPr>
+              <w:t xml:space="preserve">No broad positioning drift</w:t>
+            </w:r>
+          </w:p>
+        </w:tc>
+        <w:tc>
+          <w:tcPr>
+            <w:tcW w:type="dxa" w:w="4414"/>
+            <w:shd w:fill="F3F4F6" w:color="auto" w:val="clear"/>
+            <w:tcMar>
+              <w:top w:type="dxa" w:w="80"/>
+              <w:left w:type="dxa" w:w="100"/>
+              <w:bottom w:type="dxa" w:w="80"/>
+              <w:right w:type="dxa" w:w="100"/>
+            </w:tcMar>
+            <w:vAlign w:val="center"/>
+          </w:tcPr>
+          <w:p>
+            <w:r>
+              <w:rPr>
+                <w:b w:val="false"/>
+                <w:bCs w:val="false"/>
+                <w:color w:val="1F2937"/>
+                <w:sz w:val="19"/>
+                <w:szCs w:val="19"/>
+              </w:rPr>
+              <w:t xml:space="preserve">CONFIRMED — title, hero lead, all H2s, FAQ, and CTA are unchanged</w:t>
+            </w:r>
+          </w:p>
+        </w:tc>
+      </w:tr>
+      <w:tr>
+        <w:tc>
+          <w:tcPr>
+            <w:tcW w:type="dxa" w:w="5500"/>
+            <w:tcMar>
+              <w:top w:type="dxa" w:w="80"/>
+              <w:left w:type="dxa" w:w="100"/>
+              <w:bottom w:type="dxa" w:w="80"/>
+              <w:right w:type="dxa" w:w="100"/>
+            </w:tcMar>
+            <w:vAlign w:val="center"/>
+          </w:tcPr>
+          <w:p>
+            <w:r>
+              <w:rPr>
+                <w:b w:val="false"/>
+                <w:bCs w:val="false"/>
+                <w:color w:val="1F2937"/>
+                <w:sz w:val="19"/>
+                <w:szCs w:val="19"/>
+              </w:rPr>
+              <w:t xml:space="preserve">No metadata drift</w:t>
+            </w:r>
+          </w:p>
+        </w:tc>
+        <w:tc>
+          <w:tcPr>
+            <w:tcW w:type="dxa" w:w="4414"/>
+            <w:tcMar>
+              <w:top w:type="dxa" w:w="80"/>
+              <w:left w:type="dxa" w:w="100"/>
+              <w:bottom w:type="dxa" w:w="80"/>
+              <w:right w:type="dxa" w:w="100"/>
+            </w:tcMar>
+            <w:vAlign w:val="center"/>
+          </w:tcPr>
+          <w:p>
+            <w:r>
+              <w:rPr>
+                <w:b w:val="false"/>
+                <w:bCs w:val="false"/>
+                <w:color w:val="1F2937"/>
+                <w:sz w:val="19"/>
+                <w:szCs w:val="19"/>
+              </w:rPr>
+              <w:t xml:space="preserve">CONFIRMED — title/description/canonical/OG/Twitter unchanged, verified by an automated test</w:t>
+            </w:r>
+          </w:p>
+        </w:tc>
+      </w:tr>
+    </w:tbl>
+    <w:p>
+      <w:pPr>
+        <w:pStyle w:val="Heading2"/>
+        <w:spacing w:after="120" w:before="260"/>
+      </w:pPr>
+      <w:r>
+        <w:rPr>
+          <w:b/>
+          <w:bCs/>
+          <w:color w:val="1D4ED8"/>
+          <w:sz w:val="26"/>
+          <w:szCs w:val="26"/>
+        </w:rPr>
+        <w:t xml:space="preserve">12.7 Exact production files changed</w:t>
+      </w:r>
+    </w:p>
+    <w:p>
+      <w:pPr>
+        <w:pStyle w:val="ListParagraph"/>
+        <w:numPr>
+          <w:ilvl w:val="0"/>
+          <w:numId w:val="1"/>
+        </w:numPr>
+        <w:spacing w:after="60"/>
+      </w:pPr>
+      <w:r>
+        <w:rPr>
+          <w:sz w:val="21"/>
+          <w:szCs w:val="21"/>
+        </w:rPr>
+        <w:t xml:space="preserve">app/features/email-to-tasks/page.tsx — one line (H1 text).</w:t>
+      </w:r>
+    </w:p>
+    <w:p>
+      <w:pPr>
+        <w:pStyle w:val="ListParagraph"/>
+        <w:numPr>
+          <w:ilvl w:val="0"/>
+          <w:numId w:val="1"/>
+        </w:numPr>
+        <w:spacing w:after="60"/>
+      </w:pPr>
+      <w:r>
+        <w:rPr>
+          <w:sz w:val="21"/>
+          <w:szCs w:val="21"/>
+        </w:rPr>
+        <w:t xml:space="preserve">app/features/email-to-tasks/page.test.tsx — NEW. First test file for this page; 5 tests.</w:t>
+      </w:r>
+    </w:p>
+    <w:p>
+      <w:pPr>
+        <w:pStyle w:val="ListParagraph"/>
+        <w:numPr>
+          <w:ilvl w:val="0"/>
+          <w:numId w:val="1"/>
+        </w:numPr>
+        <w:spacing w:after="60"/>
+      </w:pPr>
+      <w:r>
+        <w:rPr>
+          <w:sz w:val="21"/>
+          <w:szCs w:val="21"/>
+        </w:rPr>
+        <w:t xml:space="preserve">app/resources/how-to-turn-emails-into-tasks/page.test.tsx — NEW. First test file for this page; 3 tests (protects that it stays unmodified over time).</w:t>
+      </w:r>
+    </w:p>
+    <w:p>
+      <w:pPr>
+        <w:pStyle w:val="ListParagraph"/>
+        <w:numPr>
+          <w:ilvl w:val="0"/>
+          <w:numId w:val="1"/>
+        </w:numPr>
+        <w:spacing w:after="60"/>
+      </w:pPr>
+      <w:r>
+        <w:rPr>
+          <w:sz w:val="21"/>
+          <w:szCs w:val="21"/>
+        </w:rPr>
+        <w:t xml:space="preserve">No other file was touched.</w:t>
+      </w:r>
+    </w:p>
+    <w:p>
+      <w:pPr>
+        <w:pStyle w:val="Heading2"/>
+        <w:spacing w:after="120" w:before="260"/>
+      </w:pPr>
+      <w:r>
+        <w:rPr>
+          <w:b/>
+          <w:bCs/>
+          <w:color w:val="1D4ED8"/>
+          <w:sz w:val="26"/>
+          <w:szCs w:val="26"/>
+        </w:rPr>
+        <w:t xml:space="preserve">12.8 Tests and verification results</w:t>
+      </w:r>
+    </w:p>
+    <w:p>
+      <w:pPr>
+        <w:pStyle w:val="ListParagraph"/>
+        <w:numPr>
+          <w:ilvl w:val="0"/>
+          <w:numId w:val="1"/>
+        </w:numPr>
+        <w:spacing w:after="60"/>
+      </w:pPr>
+      <w:r>
+        <w:rPr>
+          <w:sz w:val="21"/>
+          <w:szCs w:val="21"/>
+        </w:rPr>
+        <w:t xml:space="preserve">Targeted tests: 65 passed across 3 files (2 new files + schema-dangling-entity-references.test.ts, re-run since email-to-tasks/page.tsx changed).</w:t>
+      </w:r>
+    </w:p>
+    <w:p>
+      <w:pPr>
+        <w:pStyle w:val="ListParagraph"/>
+        <w:numPr>
+          <w:ilvl w:val="0"/>
+          <w:numId w:val="1"/>
+        </w:numPr>
+        <w:spacing w:after="60"/>
+      </w:pPr>
+      <w:r>
+        <w:rPr>
+          <w:sz w:val="21"/>
+          <w:szCs w:val="21"/>
+        </w:rPr>
+        <w:t xml:space="preserve">Full project test suite: 5,067 tests passed across 186 test files — zero regressions.</w:t>
+      </w:r>
+    </w:p>
+    <w:p>
+      <w:pPr>
+        <w:pStyle w:val="ListParagraph"/>
+        <w:numPr>
+          <w:ilvl w:val="0"/>
+          <w:numId w:val="1"/>
+        </w:numPr>
+        <w:spacing w:after="60"/>
+      </w:pPr>
+      <w:r>
+        <w:rPr>
+          <w:sz w:val="21"/>
+          <w:szCs w:val="21"/>
+        </w:rPr>
+        <w:t xml:space="preserve">npx tsc --noEmit: clean, zero errors.</w:t>
+      </w:r>
+    </w:p>
+    <w:p>
+      <w:pPr>
+        <w:pStyle w:val="ListParagraph"/>
+        <w:numPr>
+          <w:ilvl w:val="0"/>
+          <w:numId w:val="1"/>
+        </w:numPr>
+        <w:spacing w:after="60"/>
+      </w:pPr>
+      <w:r>
+        <w:rPr>
+          <w:sz w:val="21"/>
+          <w:szCs w:val="21"/>
+        </w:rPr>
+        <w:t xml:space="preserve">npm run build: succeeded; /features/email-to-tasks confirmed present in the route output as a statically prerendered page.</w:t>
+      </w:r>
+    </w:p>
+    <w:p>
+      <w:pPr>
+        <w:pStyle w:val="ListParagraph"/>
+        <w:numPr>
+          <w:ilvl w:val="0"/>
+          <w:numId w:val="1"/>
+        </w:numPr>
+        <w:spacing w:after="60"/>
+      </w:pPr>
+      <w:r>
+        <w:rPr>
+          <w:sz w:val="21"/>
+          <w:szCs w:val="21"/>
+        </w:rPr>
+        <w:t xml:space="preserve">git diff --check: clean (one harmless LF/CRLF line-ending notice).</w:t>
+      </w:r>
+    </w:p>
+    <w:p>
+      <w:pPr>
+        <w:pStyle w:val="ListParagraph"/>
+        <w:numPr>
+          <w:ilvl w:val="0"/>
+          <w:numId w:val="1"/>
+        </w:numPr>
+        <w:spacing w:after="60"/>
+      </w:pPr>
+      <w:r>
+        <w:rPr>
+          <w:sz w:val="21"/>
+          <w:szCs w:val="21"/>
+        </w:rPr>
+        <w:t xml:space="preserve">Full diff reviewed line by line — exactly one line changed in one production file; no unrelated code touched.</w:t>
+      </w:r>
+    </w:p>
+    <w:p>
+      <w:pPr>
+        <w:pStyle w:val="Heading2"/>
+        <w:spacing w:after="120" w:before="260"/>
+      </w:pPr>
+      <w:r>
+        <w:rPr>
+          <w:b/>
+          <w:bCs/>
+          <w:color w:val="1D4ED8"/>
+          <w:sz w:val="26"/>
+          <w:szCs w:val="26"/>
+        </w:rPr>
+        <w:t xml:space="preserve">12.9 Next SEO roadmap item</w:t>
+      </w:r>
+    </w:p>
+    <w:tbl>
+      <w:tblPr>
+        <w:tblW w:type="pct" w:w="100%"/>
+        <w:tblBorders>
+          <w:top w:val="single" w:color="auto" w:sz="4"/>
+          <w:left w:val="single" w:color="auto" w:sz="4"/>
+          <w:bottom w:val="single" w:color="auto" w:sz="4"/>
+          <w:right w:val="single" w:color="auto" w:sz="4"/>
+          <w:insideH w:val="single" w:color="auto" w:sz="4"/>
+          <w:insideV w:val="single" w:color="auto" w:sz="4"/>
+        </w:tblBorders>
+      </w:tblPr>
+      <w:tblGrid>
+        <w:gridCol w:w="100"/>
+      </w:tblGrid>
+      <w:tr>
+        <w:tc>
+          <w:tcPr>
+            <w:tcBorders>
+              <w:top w:val="single" w:color="15803D" w:sz="12"/>
+              <w:left w:val="single" w:color="15803D" w:sz="12"/>
+              <w:bottom w:val="single" w:color="15803D" w:sz="12"/>
+              <w:right w:val="single" w:color="15803D" w:sz="12"/>
+            </w:tcBorders>
+            <w:shd w:fill="F0FDF4" w:color="auto" w:val="clear"/>
+            <w:tcMar>
+              <w:top w:type="dxa" w:w="160"/>
+              <w:left w:type="dxa" w:w="200"/>
+              <w:bottom w:type="dxa" w:w="160"/>
+              <w:right w:type="dxa" w:w="200"/>
+            </w:tcMar>
+          </w:tcPr>
+          <w:p>
+            <w:pPr>
+              <w:spacing w:after="100"/>
+            </w:pPr>
+            <w:r>
+              <w:rPr>
+                <w:b/>
+                <w:bCs/>
+                <w:color w:val="15803D"/>
+                <w:sz w:val="23"/>
+                <w:szCs w:val="23"/>
+              </w:rPr>
+              <w:t xml:space="preserve">Next action:</w:t>
+            </w:r>
+          </w:p>
+          <w:p>
+            <w:pPr>
+              <w:pStyle w:val="ListParagraph"/>
+              <w:numPr>
+                <w:ilvl w:val="0"/>
+                <w:numId w:val="1"/>
+              </w:numPr>
+              <w:spacing w:after="60"/>
+            </w:pPr>
+            <w:r>
+              <w:rPr>
+                <w:color w:val="1F2937"/>
+                <w:sz w:val="20"/>
+                <w:szCs w:val="20"/>
+              </w:rPr>
+              <w:t xml:space="preserve">Per §8's existing priority order, with Email Feature H1 differentiation now COMPLETE and Client Project Tracker (§11) fully COMPLETE, the next unstarted items are the P2 tier: Web Designers Use Case vs. Revisions Resource differentiation (§5, rule 7) and /features/project-deadline-calendar footer/navigation reinforcement. Do not begin either without a fresh, explicit instruction — this document does not authorize starting them on its own.</w:t>
+            </w:r>
+          </w:p>
+        </w:tc>
+      </w:tr>
+    </w:tbl>
     <w:sectPr>
       <w:headerReference w:type="default" r:id="rId11"/>
       <w:footerReference w:type="default" r:id="rId12"/>

</xml_diff>

<commit_message>
Map web designer SEO differentiation
</commit_message>
<xml_diff>
--- a/docs/Text2Task_SEO_Master_Blueprint_2026-08-29.docx
+++ b/docs/Text2Task_SEO_Master_Blueprint_2026-08-29.docx
@@ -5558,7 +5558,7 @@
                 <w:sz w:val="17"/>
                 <w:szCs w:val="17"/>
               </w:rPr>
-              <w:t xml:space="preserve">Medium-High — unresolved</w:t>
+              <w:t xml:space="preserve">Medium-High — audited, fix mapped, not yet implemented</w:t>
             </w:r>
           </w:p>
         </w:tc>
@@ -5583,7 +5583,7 @@
                 <w:sz w:val="17"/>
                 <w:szCs w:val="17"/>
               </w:rPr>
-              <w:t xml:space="preserve">Flagged, not yet resolved</w:t>
+              <w:t xml:space="preserve">Audited 2026-08-30 — see §13</w:t>
             </w:r>
           </w:p>
         </w:tc>
@@ -5608,7 +5608,7 @@
                 <w:sz w:val="17"/>
                 <w:szCs w:val="17"/>
               </w:rPr>
-              <w:t xml:space="preserve">P2: deliberate content differentiation pass</w:t>
+              <w:t xml:space="preserve">Implement per §13 blueprint (pending explicit approval)</w:t>
             </w:r>
           </w:p>
         </w:tc>
@@ -7512,7 +7512,7 @@
           <w:sz w:val="21"/>
           <w:szCs w:val="21"/>
         </w:rPr>
-        <w:t xml:space="preserve">Web Designers Use Case vs. Revisions Resource differentiation pass (§5, rule 7).</w:t>
+        <w:t xml:space="preserve">Web Designers Use Case vs. Revisions Resource differentiation pass (§5, rule 7). [MAPPED, NOT IMPLEMENTED 2026-08-30 — see §13]</w:t>
       </w:r>
     </w:p>
     <w:p>
@@ -7974,14 +7974,14 @@
           <w:sz w:val="21"/>
           <w:szCs w:val="21"/>
         </w:rPr>
-        <w:t xml:space="preserve">Status update (2026-08-30, Email Feature H1 differentiation pass): </w:t>
-      </w:r>
-      <w:r>
-        <w:rPr>
-          <w:sz w:val="21"/>
-          <w:szCs w:val="21"/>
-        </w:rPr>
-        <w:t xml:space="preserve">P1A COMPLETE. P1B COMPLETE. P1C COMPLETE. Email Feature H1 commercial-framing differentiation COMPLETE. Client Project Tracker is fully built, integrated, and discoverable (§11.17–§11.20). The Email Feature's H1 no longer echoes the Resource's informational phrasing (§12). Nothing was staged, committed, pushed, or deployed as part of any of these phases — the working tree changes are ready for review.</w:t>
+        <w:t xml:space="preserve">Status update (2026-08-30, P2 Web Designers audit pass): </w:t>
+      </w:r>
+      <w:r>
+        <w:rPr>
+          <w:sz w:val="21"/>
+          <w:szCs w:val="21"/>
+        </w:rPr>
+        <w:t xml:space="preserve">P1A COMPLETE. P1B COMPLETE. P1C COMPLETE. Email Feature H1 commercial-framing differentiation COMPLETE. P2 Web Designers vs. Revisions Resource differentiation: MAPPED, NOT IMPLEMENTED (§13) — audit and implementation blueprint only, no production code changed. Client Project Tracker is fully built, integrated, and discoverable (§11.17–§11.20). The Email Feature's H1 no longer echoes the Resource's informational phrasing (§12). Nothing was staged, committed, pushed, or deployed as part of any of these phases — the working tree changes are ready for review.</w:t>
       </w:r>
     </w:p>
     <w:tbl>
@@ -8028,7 +8028,7 @@
                 <w:sz w:val="23"/>
                 <w:szCs w:val="23"/>
               </w:rPr>
-              <w:t xml:space="preserve">NEXT PLANNED PHASE: P2 tier (not yet authorized to start)</w:t>
+              <w:t xml:space="preserve">NEXT PLANNED PHASE: implement the §13 Web Designers blueprint, OR the other unstarted P2 item — neither authorized to start automatically</w:t>
             </w:r>
           </w:p>
           <w:p>
@@ -8047,14 +8047,14 @@
                 <w:sz w:val="21"/>
                 <w:szCs w:val="21"/>
               </w:rPr>
-              <w:t xml:space="preserve">Source: </w:t>
+              <w:t xml:space="preserve">Option A: </w:t>
             </w:r>
             <w:r>
               <w:rPr>
                 <w:sz w:val="21"/>
                 <w:szCs w:val="21"/>
               </w:rPr>
-              <w:t xml:space="preserve">§8 (P2 tier)</w:t>
+              <w:t xml:space="preserve">Implement §13.10's blueprint (title/H1/description refinement on app/lib/use-cases/cases/web-designers.ts only) — requires its own explicit instruction to begin; exact final copy is not yet decided (§13.12).</w:t>
             </w:r>
           </w:p>
           <w:p>
@@ -8073,14 +8073,14 @@
                 <w:sz w:val="21"/>
                 <w:szCs w:val="21"/>
               </w:rPr>
-              <w:t xml:space="preserve">Candidates: </w:t>
+              <w:t xml:space="preserve">Option B: </w:t>
             </w:r>
             <w:r>
               <w:rPr>
                 <w:sz w:val="21"/>
                 <w:szCs w:val="21"/>
               </w:rPr>
-              <w:t xml:space="preserve">Web Designers Use Case vs. Revisions Resource differentiation (§5, rule 7); /features/project-deadline-calendar footer/navigation reinforcement.</w:t>
+              <w:t xml:space="preserve">/features/project-deadline-calendar footer/navigation reinforcement — remains unstarted AND unaudited; would need its own audit turn first.</w:t>
             </w:r>
           </w:p>
           <w:p>
@@ -8106,7 +8106,7 @@
                 <w:sz w:val="21"/>
                 <w:szCs w:val="21"/>
               </w:rPr>
-              <w:t xml:space="preserve">NOT started. This document does not authorize beginning P2 work on its own — wait for an explicit instruction naming one of these items.</w:t>
+              <w:t xml:space="preserve">NEITHER started. This document does not authorize beginning either on its own.</w:t>
             </w:r>
           </w:p>
         </w:tc>
@@ -8147,24 +8147,41 @@
           <w:sz w:val="21"/>
           <w:szCs w:val="21"/>
         </w:rPr>
-        <w:t xml:space="preserve">Re-read §11.17–§11.20 to confirm Client Project Tracker is fully finished, and §12 to confirm the Email Feature H1 work is finished — neither should be revisited without new evidence.</w:t>
-      </w:r>
-    </w:p>
-    <w:p>
-      <w:pPr>
-        <w:pStyle w:val="ListParagraph"/>
-        <w:numPr>
-          <w:ilvl w:val="0"/>
-          <w:numId w:val="1"/>
-        </w:numPr>
-        <w:spacing w:after="60"/>
-      </w:pPr>
-      <w:r>
-        <w:rPr>
-          <w:sz w:val="21"/>
-          <w:szCs w:val="21"/>
-        </w:rPr>
-        <w:t xml:space="preserve">Wait for an explicit instruction identifying which P2 item to start; do not assume both, and do not begin without direction.</w:t>
+        <w:t xml:space="preserve">Re-read §11.17–§11.20 and §12 to confirm Client Project Tracker and the Email Feature H1 work are both fully finished — neither should be revisited without new evidence.</w:t>
+      </w:r>
+    </w:p>
+    <w:p>
+      <w:pPr>
+        <w:pStyle w:val="ListParagraph"/>
+        <w:numPr>
+          <w:ilvl w:val="0"/>
+          <w:numId w:val="1"/>
+        </w:numPr>
+        <w:spacing w:after="60"/>
+      </w:pPr>
+      <w:r>
+        <w:rPr>
+          <w:sz w:val="21"/>
+          <w:szCs w:val="21"/>
+        </w:rPr>
+        <w:t xml:space="preserve">Re-read §13 in full (especially §13.10's blueprint and §13.12's unresolved items) before implementing the Web Designers differentiation — final title/H1/description copy still needs to be proposed and approved, it was not finalized in the audit.</w:t>
+      </w:r>
+    </w:p>
+    <w:p>
+      <w:pPr>
+        <w:pStyle w:val="ListParagraph"/>
+        <w:numPr>
+          <w:ilvl w:val="0"/>
+          <w:numId w:val="1"/>
+        </w:numPr>
+        <w:spacing w:after="60"/>
+      </w:pPr>
+      <w:r>
+        <w:rPr>
+          <w:sz w:val="21"/>
+          <w:szCs w:val="21"/>
+        </w:rPr>
+        <w:t xml:space="preserve">Wait for an explicit instruction identifying which next item to work on; do not assume either, and do not begin without direction.</w:t>
       </w:r>
     </w:p>
     <w:p>
@@ -8217,7 +8234,7 @@
           <w:sz w:val="21"/>
           <w:szCs w:val="21"/>
         </w:rPr>
-        <w:t xml:space="preserve">The next Claude session should begin exactly here — Section 10 — after first re-reading §11.17–§11.20 and §12 to confirm what is already finished, then §5 and §8 before any P2 work — which requires its own explicit instruction to begin.</w:t>
+        <w:t xml:space="preserve">The next Claude session should begin exactly here — Section 10 — after first re-reading §11.17–§11.20 and §12 to confirm what is already finished, then §13 in full before implementing the Web Designers differentiation — which requires its own explicit instruction to begin.</w:t>
       </w:r>
     </w:p>
     <w:p>
@@ -22142,7 +22159,7 @@
                 <w:sz w:val="23"/>
                 <w:szCs w:val="23"/>
               </w:rPr>
-              <w:t xml:space="preserve">Next action:</w:t>
+              <w:t xml:space="preserve">Next action (superseded — see §13):</w:t>
             </w:r>
           </w:p>
           <w:p>
@@ -22160,7 +22177,4801 @@
                 <w:sz w:val="20"/>
                 <w:szCs w:val="20"/>
               </w:rPr>
-              <w:t xml:space="preserve">Per §8's existing priority order, with Email Feature H1 differentiation now COMPLETE and Client Project Tracker (§11) fully COMPLETE, the next unstarted items are the P2 tier: Web Designers Use Case vs. Revisions Resource differentiation (§5, rule 7) and /features/project-deadline-calendar footer/navigation reinforcement. Do not begin either without a fresh, explicit instruction — this document does not authorize starting them on its own.</w:t>
+              <w:t xml:space="preserve">This pointed at the P2 tier next. Web Designers Use Case vs. Revisions Resource has since been AUDITED and MAPPED in §13 (not yet implemented). /features/project-deadline-calendar footer/navigation reinforcement remains unstarted and unaudited.</w:t>
+            </w:r>
+          </w:p>
+        </w:tc>
+      </w:tr>
+    </w:tbl>
+    <w:p>
+      <w:r>
+        <w:br w:type="page"/>
+      </w:r>
+    </w:p>
+    <w:p>
+      <w:pPr>
+        <w:pStyle w:val="Heading1"/>
+        <w:pBdr>
+          <w:bottom w:val="single" w:color="1D4ED8" w:sz="8" w:space="4"/>
+        </w:pBdr>
+        <w:spacing w:after="160" w:before="360"/>
+      </w:pPr>
+      <w:r>
+        <w:rPr>
+          <w:b/>
+          <w:bCs/>
+          <w:color w:val="1F2937"/>
+          <w:sz w:val="32"/>
+          <w:szCs w:val="32"/>
+        </w:rPr>
+        <w:t xml:space="preserve">13. P2 — Web Designers vs. Revisions Resource Pre-Implementation Audit (2026-08-30)</w:t>
+      </w:r>
+    </w:p>
+    <w:tbl>
+      <w:tblPr>
+        <w:tblW w:type="pct" w:w="100%"/>
+        <w:tblBorders>
+          <w:top w:val="single" w:color="auto" w:sz="4"/>
+          <w:left w:val="single" w:color="auto" w:sz="4"/>
+          <w:bottom w:val="single" w:color="auto" w:sz="4"/>
+          <w:right w:val="single" w:color="auto" w:sz="4"/>
+          <w:insideH w:val="single" w:color="auto" w:sz="4"/>
+          <w:insideV w:val="single" w:color="auto" w:sz="4"/>
+        </w:tblBorders>
+      </w:tblPr>
+      <w:tblGrid>
+        <w:gridCol w:w="100"/>
+      </w:tblGrid>
+      <w:tr>
+        <w:tc>
+          <w:tcPr>
+            <w:tcBorders>
+              <w:top w:val="single" w:color="15803D" w:sz="12"/>
+              <w:left w:val="single" w:color="15803D" w:sz="12"/>
+              <w:bottom w:val="single" w:color="15803D" w:sz="12"/>
+              <w:right w:val="single" w:color="15803D" w:sz="12"/>
+            </w:tcBorders>
+            <w:shd w:fill="F0FDF4" w:color="auto" w:val="clear"/>
+            <w:tcMar>
+              <w:top w:type="dxa" w:w="160"/>
+              <w:left w:type="dxa" w:w="200"/>
+              <w:bottom w:type="dxa" w:w="160"/>
+              <w:right w:type="dxa" w:w="200"/>
+            </w:tcMar>
+          </w:tcPr>
+          <w:p>
+            <w:pPr>
+              <w:spacing w:after="100"/>
+            </w:pPr>
+            <w:r>
+              <w:rPr>
+                <w:b/>
+                <w:bCs/>
+                <w:color w:val="15803D"/>
+                <w:sz w:val="23"/>
+                <w:szCs w:val="23"/>
+              </w:rPr>
+              <w:t xml:space="preserve">Status: P2 WEB DESIGNERS DIFFERENTIATION — MAPPED, NOT IMPLEMENTED</w:t>
+            </w:r>
+          </w:p>
+          <w:p>
+            <w:pPr>
+              <w:pStyle w:val="ListParagraph"/>
+              <w:numPr>
+                <w:ilvl w:val="0"/>
+                <w:numId w:val="1"/>
+              </w:numPr>
+              <w:spacing w:after="60"/>
+            </w:pPr>
+            <w:r>
+              <w:rPr>
+                <w:color w:val="1F2937"/>
+                <w:sz w:val="20"/>
+                <w:szCs w:val="20"/>
+              </w:rPr>
+              <w:t xml:space="preserve">This section is an audit and implementation blueprint only. No production code was changed. Nothing here is authorized to be implemented without a separate, explicit instruction.</w:t>
+            </w:r>
+          </w:p>
+        </w:tc>
+      </w:tr>
+    </w:tbl>
+    <w:p>
+      <w:pPr>
+        <w:spacing w:after="120"/>
+      </w:pPr>
+    </w:p>
+    <w:p>
+      <w:pPr>
+        <w:pStyle w:val="Heading2"/>
+        <w:spacing w:after="120" w:before="260"/>
+      </w:pPr>
+      <w:r>
+        <w:rPr>
+          <w:b/>
+          <w:bCs/>
+          <w:color w:val="1D4ED8"/>
+          <w:sz w:val="26"/>
+          <w:szCs w:val="26"/>
+        </w:rPr>
+        <w:t xml:space="preserve">13.1 Current state — both pages, as found</w:t>
+      </w:r>
+    </w:p>
+    <w:tbl>
+      <w:tblPr>
+        <w:tblW w:type="pct" w:w="100%"/>
+        <w:tblBorders>
+          <w:top w:val="single" w:color="D1D5DB" w:sz="4"/>
+          <w:left w:val="single" w:color="D1D5DB" w:sz="4"/>
+          <w:bottom w:val="single" w:color="D1D5DB" w:sz="4"/>
+          <w:right w:val="single" w:color="D1D5DB" w:sz="4"/>
+          <w:insideH w:val="single" w:color="D1D5DB" w:sz="4"/>
+          <w:insideV w:val="single" w:color="D1D5DB" w:sz="4"/>
+        </w:tblBorders>
+      </w:tblPr>
+      <w:tblGrid>
+        <w:gridCol w:w="100"/>
+        <w:gridCol w:w="100"/>
+        <w:gridCol w:w="100"/>
+      </w:tblGrid>
+      <w:tr>
+        <w:trPr>
+          <w:tblHeader/>
+        </w:trPr>
+        <w:tc>
+          <w:tcPr>
+            <w:tcW w:type="dxa" w:w="1600"/>
+            <w:shd w:fill="1D4ED8" w:color="auto" w:val="clear"/>
+            <w:tcMar>
+              <w:top w:type="dxa" w:w="80"/>
+              <w:left w:type="dxa" w:w="100"/>
+              <w:bottom w:type="dxa" w:w="80"/>
+              <w:right w:type="dxa" w:w="100"/>
+            </w:tcMar>
+            <w:vAlign w:val="center"/>
+          </w:tcPr>
+          <w:p>
+            <w:r>
+              <w:rPr>
+                <w:b/>
+                <w:bCs/>
+                <w:color w:val="FFFFFF"/>
+                <w:sz w:val="19"/>
+                <w:szCs w:val="19"/>
+              </w:rPr>
+              <w:t xml:space="preserve">Field</w:t>
+            </w:r>
+          </w:p>
+        </w:tc>
+        <w:tc>
+          <w:tcPr>
+            <w:tcW w:type="dxa" w:w="3900"/>
+            <w:shd w:fill="1D4ED8" w:color="auto" w:val="clear"/>
+            <w:tcMar>
+              <w:top w:type="dxa" w:w="80"/>
+              <w:left w:type="dxa" w:w="100"/>
+              <w:bottom w:type="dxa" w:w="80"/>
+              <w:right w:type="dxa" w:w="100"/>
+            </w:tcMar>
+            <w:vAlign w:val="center"/>
+          </w:tcPr>
+          <w:p>
+            <w:r>
+              <w:rPr>
+                <w:b/>
+                <w:bCs/>
+                <w:color w:val="FFFFFF"/>
+                <w:sz w:val="19"/>
+                <w:szCs w:val="19"/>
+              </w:rPr>
+              <w:t xml:space="preserve">Use Case (/use-cases/web-designers)</w:t>
+            </w:r>
+          </w:p>
+        </w:tc>
+        <w:tc>
+          <w:tcPr>
+            <w:tcW w:type="dxa" w:w="4414"/>
+            <w:shd w:fill="1D4ED8" w:color="auto" w:val="clear"/>
+            <w:tcMar>
+              <w:top w:type="dxa" w:w="80"/>
+              <w:left w:type="dxa" w:w="100"/>
+              <w:bottom w:type="dxa" w:w="80"/>
+              <w:right w:type="dxa" w:w="100"/>
+            </w:tcMar>
+            <w:vAlign w:val="center"/>
+          </w:tcPr>
+          <w:p>
+            <w:r>
+              <w:rPr>
+                <w:b/>
+                <w:bCs/>
+                <w:color w:val="FFFFFF"/>
+                <w:sz w:val="19"/>
+                <w:szCs w:val="19"/>
+              </w:rPr>
+              <w:t xml:space="preserve">Resource (/resources/manage-client-revisions-web-designers)</w:t>
+            </w:r>
+          </w:p>
+        </w:tc>
+      </w:tr>
+      <w:tr>
+        <w:tc>
+          <w:tcPr>
+            <w:tcW w:type="dxa" w:w="1600"/>
+            <w:tcMar>
+              <w:top w:type="dxa" w:w="80"/>
+              <w:left w:type="dxa" w:w="100"/>
+              <w:bottom w:type="dxa" w:w="80"/>
+              <w:right w:type="dxa" w:w="100"/>
+            </w:tcMar>
+            <w:vAlign w:val="center"/>
+          </w:tcPr>
+          <w:p>
+            <w:r>
+              <w:rPr>
+                <w:b w:val="false"/>
+                <w:bCs w:val="false"/>
+                <w:color w:val="1F2937"/>
+                <w:sz w:val="19"/>
+                <w:szCs w:val="19"/>
+              </w:rPr>
+              <w:t xml:space="preserve">Route/file</w:t>
+            </w:r>
+          </w:p>
+        </w:tc>
+        <w:tc>
+          <w:tcPr>
+            <w:tcW w:type="dxa" w:w="3900"/>
+            <w:tcMar>
+              <w:top w:type="dxa" w:w="80"/>
+              <w:left w:type="dxa" w:w="100"/>
+              <w:bottom w:type="dxa" w:w="80"/>
+              <w:right w:type="dxa" w:w="100"/>
+            </w:tcMar>
+            <w:vAlign w:val="center"/>
+          </w:tcPr>
+          <w:p>
+            <w:r>
+              <w:rPr>
+                <w:b w:val="false"/>
+                <w:bCs w:val="false"/>
+                <w:color w:val="1F2937"/>
+                <w:sz w:val="19"/>
+                <w:szCs w:val="19"/>
+              </w:rPr>
+              <w:t xml:space="preserve">app/lib/use-cases/cases/web-designers.ts (data) rendered via app/use-cases/[slug]/page.tsx + the shared UseCaseDetailPage template</w:t>
+            </w:r>
+          </w:p>
+        </w:tc>
+        <w:tc>
+          <w:tcPr>
+            <w:tcW w:type="dxa" w:w="4414"/>
+            <w:tcMar>
+              <w:top w:type="dxa" w:w="80"/>
+              <w:left w:type="dxa" w:w="100"/>
+              <w:bottom w:type="dxa" w:w="80"/>
+              <w:right w:type="dxa" w:w="100"/>
+            </w:tcMar>
+            <w:vAlign w:val="center"/>
+          </w:tcPr>
+          <w:p>
+            <w:r>
+              <w:rPr>
+                <w:b w:val="false"/>
+                <w:bCs w:val="false"/>
+                <w:color w:val="1F2937"/>
+                <w:sz w:val="19"/>
+                <w:szCs w:val="19"/>
+              </w:rPr>
+              <w:t xml:space="preserve">app/resources/manage-client-revisions-web-designers/page.tsx (standalone article)</w:t>
+            </w:r>
+          </w:p>
+        </w:tc>
+      </w:tr>
+      <w:tr>
+        <w:tc>
+          <w:tcPr>
+            <w:tcW w:type="dxa" w:w="1600"/>
+            <w:shd w:fill="F3F4F6" w:color="auto" w:val="clear"/>
+            <w:tcMar>
+              <w:top w:type="dxa" w:w="80"/>
+              <w:left w:type="dxa" w:w="100"/>
+              <w:bottom w:type="dxa" w:w="80"/>
+              <w:right w:type="dxa" w:w="100"/>
+            </w:tcMar>
+            <w:vAlign w:val="center"/>
+          </w:tcPr>
+          <w:p>
+            <w:r>
+              <w:rPr>
+                <w:b w:val="false"/>
+                <w:bCs w:val="false"/>
+                <w:color w:val="1F2937"/>
+                <w:sz w:val="19"/>
+                <w:szCs w:val="19"/>
+              </w:rPr>
+              <w:t xml:space="preserve">Title (meta)</w:t>
+            </w:r>
+          </w:p>
+        </w:tc>
+        <w:tc>
+          <w:tcPr>
+            <w:tcW w:type="dxa" w:w="3900"/>
+            <w:shd w:fill="F3F4F6" w:color="auto" w:val="clear"/>
+            <w:tcMar>
+              <w:top w:type="dxa" w:w="80"/>
+              <w:left w:type="dxa" w:w="100"/>
+              <w:bottom w:type="dxa" w:w="80"/>
+              <w:right w:type="dxa" w:w="100"/>
+            </w:tcMar>
+            <w:vAlign w:val="center"/>
+          </w:tcPr>
+          <w:p>
+            <w:r>
+              <w:rPr>
+                <w:b w:val="false"/>
+                <w:bCs w:val="false"/>
+                <w:color w:val="1F2937"/>
+                <w:sz w:val="19"/>
+                <w:szCs w:val="19"/>
+              </w:rPr>
+              <w:t xml:space="preserve">"Website Revision Task Manager for Web Designers" (seo.title)</w:t>
+            </w:r>
+          </w:p>
+        </w:tc>
+        <w:tc>
+          <w:tcPr>
+            <w:tcW w:type="dxa" w:w="4414"/>
+            <w:shd w:fill="F3F4F6" w:color="auto" w:val="clear"/>
+            <w:tcMar>
+              <w:top w:type="dxa" w:w="80"/>
+              <w:left w:type="dxa" w:w="100"/>
+              <w:bottom w:type="dxa" w:w="80"/>
+              <w:right w:type="dxa" w:w="100"/>
+            </w:tcMar>
+            <w:vAlign w:val="center"/>
+          </w:tcPr>
+          <w:p>
+            <w:r>
+              <w:rPr>
+                <w:b w:val="false"/>
+                <w:bCs w:val="false"/>
+                <w:color w:val="1F2937"/>
+                <w:sz w:val="19"/>
+                <w:szCs w:val="19"/>
+              </w:rPr>
+              <w:t xml:space="preserve">"How Web Designers Can Manage Client Revisions Faster"</w:t>
+            </w:r>
+          </w:p>
+        </w:tc>
+      </w:tr>
+      <w:tr>
+        <w:tc>
+          <w:tcPr>
+            <w:tcW w:type="dxa" w:w="1600"/>
+            <w:tcMar>
+              <w:top w:type="dxa" w:w="80"/>
+              <w:left w:type="dxa" w:w="100"/>
+              <w:bottom w:type="dxa" w:w="80"/>
+              <w:right w:type="dxa" w:w="100"/>
+            </w:tcMar>
+            <w:vAlign w:val="center"/>
+          </w:tcPr>
+          <w:p>
+            <w:r>
+              <w:rPr>
+                <w:b w:val="false"/>
+                <w:bCs w:val="false"/>
+                <w:color w:val="1F2937"/>
+                <w:sz w:val="19"/>
+                <w:szCs w:val="19"/>
+              </w:rPr>
+              <w:t xml:space="preserve">Meta description</w:t>
+            </w:r>
+          </w:p>
+        </w:tc>
+        <w:tc>
+          <w:tcPr>
+            <w:tcW w:type="dxa" w:w="3900"/>
+            <w:tcMar>
+              <w:top w:type="dxa" w:w="80"/>
+              <w:left w:type="dxa" w:w="100"/>
+              <w:bottom w:type="dxa" w:w="80"/>
+              <w:right w:type="dxa" w:w="100"/>
+            </w:tcMar>
+            <w:vAlign w:val="center"/>
+          </w:tcPr>
+          <w:p>
+            <w:r>
+              <w:rPr>
+                <w:b w:val="false"/>
+                <w:bCs w:val="false"/>
+                <w:color w:val="1F2937"/>
+                <w:sz w:val="19"/>
+                <w:szCs w:val="19"/>
+              </w:rPr>
+              <w:t xml:space="preserve">"Turn client revision emails, WhatsApp messages, and marked-up screenshots into tracked website tasks, organized by page and reviewed before saving."</w:t>
+            </w:r>
+          </w:p>
+        </w:tc>
+        <w:tc>
+          <w:tcPr>
+            <w:tcW w:type="dxa" w:w="4414"/>
+            <w:tcMar>
+              <w:top w:type="dxa" w:w="80"/>
+              <w:left w:type="dxa" w:w="100"/>
+              <w:bottom w:type="dxa" w:w="80"/>
+              <w:right w:type="dxa" w:w="100"/>
+            </w:tcMar>
+            <w:vAlign w:val="center"/>
+          </w:tcPr>
+          <w:p>
+            <w:r>
+              <w:rPr>
+                <w:b w:val="false"/>
+                <w:bCs w:val="false"/>
+                <w:color w:val="1F2937"/>
+                <w:sz w:val="19"/>
+                <w:szCs w:val="19"/>
+              </w:rPr>
+              <w:t xml:space="preserve">"Learn how web designers can organize client revision feedback, spot new scope early, and turn feedback into clear, reviewable tasks."</w:t>
+            </w:r>
+          </w:p>
+        </w:tc>
+      </w:tr>
+      <w:tr>
+        <w:tc>
+          <w:tcPr>
+            <w:tcW w:type="dxa" w:w="1600"/>
+            <w:shd w:fill="F3F4F6" w:color="auto" w:val="clear"/>
+            <w:tcMar>
+              <w:top w:type="dxa" w:w="80"/>
+              <w:left w:type="dxa" w:w="100"/>
+              <w:bottom w:type="dxa" w:w="80"/>
+              <w:right w:type="dxa" w:w="100"/>
+            </w:tcMar>
+            <w:vAlign w:val="center"/>
+          </w:tcPr>
+          <w:p>
+            <w:r>
+              <w:rPr>
+                <w:b w:val="false"/>
+                <w:bCs w:val="false"/>
+                <w:color w:val="1F2937"/>
+                <w:sz w:val="19"/>
+                <w:szCs w:val="19"/>
+              </w:rPr>
+              <w:t xml:space="preserve">Canonical</w:t>
+            </w:r>
+          </w:p>
+        </w:tc>
+        <w:tc>
+          <w:tcPr>
+            <w:tcW w:type="dxa" w:w="3900"/>
+            <w:shd w:fill="F3F4F6" w:color="auto" w:val="clear"/>
+            <w:tcMar>
+              <w:top w:type="dxa" w:w="80"/>
+              <w:left w:type="dxa" w:w="100"/>
+              <w:bottom w:type="dxa" w:w="80"/>
+              <w:right w:type="dxa" w:w="100"/>
+            </w:tcMar>
+            <w:vAlign w:val="center"/>
+          </w:tcPr>
+          <w:p>
+            <w:r>
+              <w:rPr>
+                <w:b w:val="false"/>
+                <w:bCs w:val="false"/>
+                <w:color w:val="1F2937"/>
+                <w:sz w:val="19"/>
+                <w:szCs w:val="19"/>
+              </w:rPr>
+              <w:t xml:space="preserve">/use-cases/web-designers</w:t>
+            </w:r>
+          </w:p>
+        </w:tc>
+        <w:tc>
+          <w:tcPr>
+            <w:tcW w:type="dxa" w:w="4414"/>
+            <w:shd w:fill="F3F4F6" w:color="auto" w:val="clear"/>
+            <w:tcMar>
+              <w:top w:type="dxa" w:w="80"/>
+              <w:left w:type="dxa" w:w="100"/>
+              <w:bottom w:type="dxa" w:w="80"/>
+              <w:right w:type="dxa" w:w="100"/>
+            </w:tcMar>
+            <w:vAlign w:val="center"/>
+          </w:tcPr>
+          <w:p>
+            <w:r>
+              <w:rPr>
+                <w:b w:val="false"/>
+                <w:bCs w:val="false"/>
+                <w:color w:val="1F2937"/>
+                <w:sz w:val="19"/>
+                <w:szCs w:val="19"/>
+              </w:rPr>
+              <w:t xml:space="preserve">/resources/manage-client-revisions-web-designers</w:t>
+            </w:r>
+          </w:p>
+        </w:tc>
+      </w:tr>
+      <w:tr>
+        <w:tc>
+          <w:tcPr>
+            <w:tcW w:type="dxa" w:w="1600"/>
+            <w:tcMar>
+              <w:top w:type="dxa" w:w="80"/>
+              <w:left w:type="dxa" w:w="100"/>
+              <w:bottom w:type="dxa" w:w="80"/>
+              <w:right w:type="dxa" w:w="100"/>
+            </w:tcMar>
+            <w:vAlign w:val="center"/>
+          </w:tcPr>
+          <w:p>
+            <w:r>
+              <w:rPr>
+                <w:b w:val="false"/>
+                <w:bCs w:val="false"/>
+                <w:color w:val="1F2937"/>
+                <w:sz w:val="19"/>
+                <w:szCs w:val="19"/>
+              </w:rPr>
+              <w:t xml:space="preserve">H1 (rendered)</w:t>
+            </w:r>
+          </w:p>
+        </w:tc>
+        <w:tc>
+          <w:tcPr>
+            <w:tcW w:type="dxa" w:w="3900"/>
+            <w:tcMar>
+              <w:top w:type="dxa" w:w="80"/>
+              <w:left w:type="dxa" w:w="100"/>
+              <w:bottom w:type="dxa" w:w="80"/>
+              <w:right w:type="dxa" w:w="100"/>
+            </w:tcMar>
+            <w:vAlign w:val="center"/>
+          </w:tcPr>
+          <w:p>
+            <w:r>
+              <w:rPr>
+                <w:b w:val="false"/>
+                <w:bCs w:val="false"/>
+                <w:color w:val="1F2937"/>
+                <w:sz w:val="19"/>
+                <w:szCs w:val="19"/>
+              </w:rPr>
+              <w:t xml:space="preserve">"Stop rebuilding revision emails into task lists. Start tracking each page change." (hero.title + hero.highlight, editorial variant)</w:t>
+            </w:r>
+          </w:p>
+        </w:tc>
+        <w:tc>
+          <w:tcPr>
+            <w:tcW w:type="dxa" w:w="4414"/>
+            <w:tcMar>
+              <w:top w:type="dxa" w:w="80"/>
+              <w:left w:type="dxa" w:w="100"/>
+              <w:bottom w:type="dxa" w:w="80"/>
+              <w:right w:type="dxa" w:w="100"/>
+            </w:tcMar>
+            <w:vAlign w:val="center"/>
+          </w:tcPr>
+          <w:p>
+            <w:r>
+              <w:rPr>
+                <w:b w:val="false"/>
+                <w:bCs w:val="false"/>
+                <w:color w:val="1F2937"/>
+                <w:sz w:val="19"/>
+                <w:szCs w:val="19"/>
+              </w:rPr>
+              <w:t xml:space="preserve">"How Web Designers Can Manage Client Revisions Faster" (H1 = title, standard Resource convention)</w:t>
+            </w:r>
+          </w:p>
+        </w:tc>
+      </w:tr>
+      <w:tr>
+        <w:tc>
+          <w:tcPr>
+            <w:tcW w:type="dxa" w:w="1600"/>
+            <w:shd w:fill="F3F4F6" w:color="auto" w:val="clear"/>
+            <w:tcMar>
+              <w:top w:type="dxa" w:w="80"/>
+              <w:left w:type="dxa" w:w="100"/>
+              <w:bottom w:type="dxa" w:w="80"/>
+              <w:right w:type="dxa" w:w="100"/>
+            </w:tcMar>
+            <w:vAlign w:val="center"/>
+          </w:tcPr>
+          <w:p>
+            <w:r>
+              <w:rPr>
+                <w:b w:val="false"/>
+                <w:bCs w:val="false"/>
+                <w:color w:val="1F2937"/>
+                <w:sz w:val="19"/>
+                <w:szCs w:val="19"/>
+              </w:rPr>
+              <w:t xml:space="preserve">Hero/lead copy</w:t>
+            </w:r>
+          </w:p>
+        </w:tc>
+        <w:tc>
+          <w:tcPr>
+            <w:tcW w:type="dxa" w:w="3900"/>
+            <w:shd w:fill="F3F4F6" w:color="auto" w:val="clear"/>
+            <w:tcMar>
+              <w:top w:type="dxa" w:w="80"/>
+              <w:left w:type="dxa" w:w="100"/>
+              <w:bottom w:type="dxa" w:w="80"/>
+              <w:right w:type="dxa" w:w="100"/>
+            </w:tcMar>
+            <w:vAlign w:val="center"/>
+          </w:tcPr>
+          <w:p>
+            <w:r>
+              <w:rPr>
+                <w:b w:val="false"/>
+                <w:bCs w:val="false"/>
+                <w:color w:val="1F2937"/>
+                <w:sz w:val="19"/>
+                <w:szCs w:val="19"/>
+              </w:rPr>
+              <w:t xml:space="preserve">"Paste a client's revision email, WhatsApp message, or a marked-up screenshot. Text2Task extracts the page or section it affects, the deadline, and whether it looks like a quick fix or bigger scope..."</w:t>
+            </w:r>
+          </w:p>
+        </w:tc>
+        <w:tc>
+          <w:tcPr>
+            <w:tcW w:type="dxa" w:w="4414"/>
+            <w:shd w:fill="F3F4F6" w:color="auto" w:val="clear"/>
+            <w:tcMar>
+              <w:top w:type="dxa" w:w="80"/>
+              <w:left w:type="dxa" w:w="100"/>
+              <w:bottom w:type="dxa" w:w="80"/>
+              <w:right w:type="dxa" w:w="100"/>
+            </w:tcMar>
+            <w:vAlign w:val="center"/>
+          </w:tcPr>
+          <w:p>
+            <w:r>
+              <w:rPr>
+                <w:b w:val="false"/>
+                <w:bCs w:val="false"/>
+                <w:color w:val="1F2937"/>
+                <w:sz w:val="19"/>
+                <w:szCs w:val="19"/>
+              </w:rPr>
+              <w:t xml:space="preserve">"Client revision feedback rarely arrives once. A hero headline note today, a photo swap and a deadline change tomorrow, then a marked-up screenshot a day later..."</w:t>
+            </w:r>
+          </w:p>
+        </w:tc>
+      </w:tr>
+      <w:tr>
+        <w:tc>
+          <w:tcPr>
+            <w:tcW w:type="dxa" w:w="1600"/>
+            <w:tcMar>
+              <w:top w:type="dxa" w:w="80"/>
+              <w:left w:type="dxa" w:w="100"/>
+              <w:bottom w:type="dxa" w:w="80"/>
+              <w:right w:type="dxa" w:w="100"/>
+            </w:tcMar>
+            <w:vAlign w:val="center"/>
+          </w:tcPr>
+          <w:p>
+            <w:r>
+              <w:rPr>
+                <w:b w:val="false"/>
+                <w:bCs w:val="false"/>
+                <w:color w:val="1F2937"/>
+                <w:sz w:val="19"/>
+                <w:szCs w:val="19"/>
+              </w:rPr>
+              <w:t xml:space="preserve">Major sections</w:t>
+            </w:r>
+          </w:p>
+        </w:tc>
+        <w:tc>
+          <w:tcPr>
+            <w:tcW w:type="dxa" w:w="3900"/>
+            <w:tcMar>
+              <w:top w:type="dxa" w:w="80"/>
+              <w:left w:type="dxa" w:w="100"/>
+              <w:bottom w:type="dxa" w:w="80"/>
+              <w:right w:type="dxa" w:w="100"/>
+            </w:tcMar>
+            <w:vAlign w:val="center"/>
+          </w:tcPr>
+          <w:p>
+            <w:r>
+              <w:rPr>
+                <w:b w:val="false"/>
+                <w:bCs w:val="false"/>
+                <w:color w:val="1F2937"/>
+                <w:sz w:val="19"/>
+                <w:szCs w:val="19"/>
+              </w:rPr>
+              <w:t xml:space="preserve">signatureModule (revision triage board), transformation (before/after example), painPoints, workflow (3 steps), clientUpdates, faq (4 Qs), capabilities, proof, relatedLinks, related, finalCta</w:t>
+            </w:r>
+          </w:p>
+        </w:tc>
+        <w:tc>
+          <w:tcPr>
+            <w:tcW w:type="dxa" w:w="4414"/>
+            <w:tcMar>
+              <w:top w:type="dxa" w:w="80"/>
+              <w:left w:type="dxa" w:w="100"/>
+              <w:bottom w:type="dxa" w:w="80"/>
+              <w:right w:type="dxa" w:w="100"/>
+            </w:tcMar>
+            <w:vAlign w:val="center"/>
+          </w:tcPr>
+          <w:p>
+            <w:r>
+              <w:rPr>
+                <w:b w:val="false"/>
+                <w:bCs w:val="false"/>
+                <w:color w:val="1F2937"/>
+                <w:sz w:val="19"/>
+                <w:szCs w:val="19"/>
+              </w:rPr>
+              <w:t xml:space="preserve">Why revision feedback gets disorganized; One project, three rounds of feedback; Is it a revision or new scope?; A better workflow for revisions; Keeping a record of what changed; Common mistakes; Where Text2Task fits; final CTA</w:t>
+            </w:r>
+          </w:p>
+        </w:tc>
+      </w:tr>
+      <w:tr>
+        <w:tc>
+          <w:tcPr>
+            <w:tcW w:type="dxa" w:w="1600"/>
+            <w:shd w:fill="F3F4F6" w:color="auto" w:val="clear"/>
+            <w:tcMar>
+              <w:top w:type="dxa" w:w="80"/>
+              <w:left w:type="dxa" w:w="100"/>
+              <w:bottom w:type="dxa" w:w="80"/>
+              <w:right w:type="dxa" w:w="100"/>
+            </w:tcMar>
+            <w:vAlign w:val="center"/>
+          </w:tcPr>
+          <w:p>
+            <w:r>
+              <w:rPr>
+                <w:b w:val="false"/>
+                <w:bCs w:val="false"/>
+                <w:color w:val="1F2937"/>
+                <w:sz w:val="19"/>
+                <w:szCs w:val="19"/>
+              </w:rPr>
+              <w:t xml:space="preserve">CTA</w:t>
+            </w:r>
+          </w:p>
+        </w:tc>
+        <w:tc>
+          <w:tcPr>
+            <w:tcW w:type="dxa" w:w="3900"/>
+            <w:shd w:fill="F3F4F6" w:color="auto" w:val="clear"/>
+            <w:tcMar>
+              <w:top w:type="dxa" w:w="80"/>
+              <w:left w:type="dxa" w:w="100"/>
+              <w:bottom w:type="dxa" w:w="80"/>
+              <w:right w:type="dxa" w:w="100"/>
+            </w:tcMar>
+            <w:vAlign w:val="center"/>
+          </w:tcPr>
+          <w:p>
+            <w:r>
+              <w:rPr>
+                <w:b w:val="false"/>
+                <w:bCs w:val="false"/>
+                <w:color w:val="1F2937"/>
+                <w:sz w:val="19"/>
+                <w:szCs w:val="19"/>
+              </w:rPr>
+              <w:t xml:space="preserve">"Try Text2Task" (hero) / "Start free" (final)</w:t>
+            </w:r>
+          </w:p>
+        </w:tc>
+        <w:tc>
+          <w:tcPr>
+            <w:tcW w:type="dxa" w:w="4414"/>
+            <w:shd w:fill="F3F4F6" w:color="auto" w:val="clear"/>
+            <w:tcMar>
+              <w:top w:type="dxa" w:w="80"/>
+              <w:left w:type="dxa" w:w="100"/>
+              <w:bottom w:type="dxa" w:w="80"/>
+              <w:right w:type="dxa" w:w="100"/>
+            </w:tcMar>
+            <w:vAlign w:val="center"/>
+          </w:tcPr>
+          <w:p>
+            <w:r>
+              <w:rPr>
+                <w:b w:val="false"/>
+                <w:bCs w:val="false"/>
+                <w:color w:val="1F2937"/>
+                <w:sz w:val="19"/>
+                <w:szCs w:val="19"/>
+              </w:rPr>
+              <w:t xml:space="preserve">"Try Text2Task free" (final only, no hero CTA — standard article shell)</w:t>
+            </w:r>
+          </w:p>
+        </w:tc>
+      </w:tr>
+      <w:tr>
+        <w:tc>
+          <w:tcPr>
+            <w:tcW w:type="dxa" w:w="1600"/>
+            <w:tcMar>
+              <w:top w:type="dxa" w:w="80"/>
+              <w:left w:type="dxa" w:w="100"/>
+              <w:bottom w:type="dxa" w:w="80"/>
+              <w:right w:type="dxa" w:w="100"/>
+            </w:tcMar>
+            <w:vAlign w:val="center"/>
+          </w:tcPr>
+          <w:p>
+            <w:r>
+              <w:rPr>
+                <w:b w:val="false"/>
+                <w:bCs w:val="false"/>
+                <w:color w:val="1F2937"/>
+                <w:sz w:val="19"/>
+                <w:szCs w:val="19"/>
+              </w:rPr>
+              <w:t xml:space="preserve">Schema</w:t>
+            </w:r>
+          </w:p>
+        </w:tc>
+        <w:tc>
+          <w:tcPr>
+            <w:tcW w:type="dxa" w:w="3900"/>
+            <w:tcMar>
+              <w:top w:type="dxa" w:w="80"/>
+              <w:left w:type="dxa" w:w="100"/>
+              <w:bottom w:type="dxa" w:w="80"/>
+              <w:right w:type="dxa" w:w="100"/>
+            </w:tcMar>
+            <w:vAlign w:val="center"/>
+          </w:tcPr>
+          <w:p>
+            <w:r>
+              <w:rPr>
+                <w:b w:val="false"/>
+                <w:bCs w:val="false"/>
+                <w:color w:val="1F2937"/>
+                <w:sz w:val="19"/>
+                <w:szCs w:val="19"/>
+              </w:rPr>
+              <w:t xml:space="preserve">WebPage + BreadcrumbList (Home / Use Cases / page) + FAQPage — shared template, no SoftwareApplication</w:t>
+            </w:r>
+          </w:p>
+        </w:tc>
+        <w:tc>
+          <w:tcPr>
+            <w:tcW w:type="dxa" w:w="4414"/>
+            <w:tcMar>
+              <w:top w:type="dxa" w:w="80"/>
+              <w:left w:type="dxa" w:w="100"/>
+              <w:bottom w:type="dxa" w:w="80"/>
+              <w:right w:type="dxa" w:w="100"/>
+            </w:tcMar>
+            <w:vAlign w:val="center"/>
+          </w:tcPr>
+          <w:p>
+            <w:r>
+              <w:rPr>
+                <w:b w:val="false"/>
+                <w:bCs w:val="false"/>
+                <w:color w:val="1F2937"/>
+                <w:sz w:val="19"/>
+                <w:szCs w:val="19"/>
+              </w:rPr>
+              <w:t xml:space="preserve">Article (buildArticleJsonLd) + BreadcrumbList (Home / Resources / article) — no FAQPage (no FAQ section)</w:t>
+            </w:r>
+          </w:p>
+        </w:tc>
+      </w:tr>
+      <w:tr>
+        <w:tc>
+          <w:tcPr>
+            <w:tcW w:type="dxa" w:w="1600"/>
+            <w:shd w:fill="F3F4F6" w:color="auto" w:val="clear"/>
+            <w:tcMar>
+              <w:top w:type="dxa" w:w="80"/>
+              <w:left w:type="dxa" w:w="100"/>
+              <w:bottom w:type="dxa" w:w="80"/>
+              <w:right w:type="dxa" w:w="100"/>
+            </w:tcMar>
+            <w:vAlign w:val="center"/>
+          </w:tcPr>
+          <w:p>
+            <w:r>
+              <w:rPr>
+                <w:b w:val="false"/>
+                <w:bCs w:val="false"/>
+                <w:color w:val="1F2937"/>
+                <w:sz w:val="19"/>
+                <w:szCs w:val="19"/>
+              </w:rPr>
+              <w:t xml:space="preserve">Existing internal links</w:t>
+            </w:r>
+          </w:p>
+        </w:tc>
+        <w:tc>
+          <w:tcPr>
+            <w:tcW w:type="dxa" w:w="3900"/>
+            <w:shd w:fill="F3F4F6" w:color="auto" w:val="clear"/>
+            <w:tcMar>
+              <w:top w:type="dxa" w:w="80"/>
+              <w:left w:type="dxa" w:w="100"/>
+              <w:bottom w:type="dxa" w:w="80"/>
+              <w:right w:type="dxa" w:w="100"/>
+            </w:tcMar>
+            <w:vAlign w:val="center"/>
+          </w:tcPr>
+          <w:p>
+            <w:r>
+              <w:rPr>
+                <w:b w:val="false"/>
+                <w:bCs w:val="false"/>
+                <w:color w:val="1F2937"/>
+                <w:sz w:val="19"/>
+                <w:szCs w:val="19"/>
+              </w:rPr>
+              <w:t xml:space="preserve">→ Resource via relatedLinks card ("How web designers can manage client revisions faster")</w:t>
+            </w:r>
+          </w:p>
+        </w:tc>
+        <w:tc>
+          <w:tcPr>
+            <w:tcW w:type="dxa" w:w="4414"/>
+            <w:shd w:fill="F3F4F6" w:color="auto" w:val="clear"/>
+            <w:tcMar>
+              <w:top w:type="dxa" w:w="80"/>
+              <w:left w:type="dxa" w:w="100"/>
+              <w:bottom w:type="dxa" w:w="80"/>
+              <w:right w:type="dxa" w:w="100"/>
+            </w:tcMar>
+            <w:vAlign w:val="center"/>
+          </w:tcPr>
+          <w:p>
+            <w:r>
+              <w:rPr>
+                <w:b w:val="false"/>
+                <w:bCs w:val="false"/>
+                <w:color w:val="1F2937"/>
+                <w:sz w:val="19"/>
+                <w:szCs w:val="19"/>
+              </w:rPr>
+              <w:t xml:space="preserve">→ Use Case via inline link in "Where Text2Task fits" ("web designers use case")</w:t>
+            </w:r>
+          </w:p>
+        </w:tc>
+      </w:tr>
+    </w:tbl>
+    <w:p>
+      <w:pPr>
+        <w:pStyle w:val="ListParagraph"/>
+        <w:numPr>
+          <w:ilvl w:val="0"/>
+          <w:numId w:val="1"/>
+        </w:numPr>
+        <w:spacing w:after="60"/>
+      </w:pPr>
+      <w:r>
+        <w:rPr>
+          <w:sz w:val="21"/>
+          <w:szCs w:val="21"/>
+        </w:rPr>
+        <w:t xml:space="preserve">No test file exists for either page's specific content. Only the shared, generic app/components/use-cases/use-case-detail-page.test.tsx (schema-shape checks, parameterized over all 12 Use Cases) touches web-designers.ts, and it asserts nothing about visible copy/H1 text.</w:t>
+      </w:r>
+    </w:p>
+    <w:p>
+      <w:pPr>
+        <w:pStyle w:val="ListParagraph"/>
+        <w:numPr>
+          <w:ilvl w:val="0"/>
+          <w:numId w:val="1"/>
+        </w:numPr>
+        <w:spacing w:after="60"/>
+      </w:pPr>
+      <w:r>
+        <w:rPr>
+          <w:sz w:val="21"/>
+          <w:szCs w:val="21"/>
+        </w:rPr>
+        <w:t xml:space="preserve">GSC evidence used (nothing beyond what was already observed/recorded is claimed here): Resource ~16 impressions, avg. position ~15.2, exact queries privacy-thresholded/hidden; Use Case traffic in the observed data is mostly branded, with very weak non-brand signal.</w:t>
+      </w:r>
+    </w:p>
+    <w:p>
+      <w:pPr>
+        <w:pStyle w:val="Heading2"/>
+        <w:spacing w:after="120" w:before="260"/>
+      </w:pPr>
+      <w:r>
+        <w:rPr>
+          <w:b/>
+          <w:bCs/>
+          <w:color w:val="1D4ED8"/>
+          <w:sz w:val="26"/>
+          <w:szCs w:val="26"/>
+        </w:rPr>
+        <w:t xml:space="preserve">13.2 Ideal intent of each page</w:t>
+      </w:r>
+    </w:p>
+    <w:p>
+      <w:pPr>
+        <w:pStyle w:val="ListParagraph"/>
+        <w:numPr>
+          <w:ilvl w:val="0"/>
+          <w:numId w:val="1"/>
+        </w:numPr>
+        <w:spacing w:after="60"/>
+      </w:pPr>
+      <w:r>
+        <w:rPr>
+          <w:sz w:val="21"/>
+          <w:szCs w:val="21"/>
+        </w:rPr>
+        <w:t xml:space="preserve">Use Case (/use-cases/web-designers) — SHOULD be an audience-segmented page answering "how does Text2Task fit a web designer's overall client-work workflow": turning an initial client request into a project AND tracking revisions/feedback rounds against it — matching how the other 11 Use Cases are structured (revisions/feedback as one workflow moment among several, not the entire page identity).</w:t>
+      </w:r>
+    </w:p>
+    <w:p>
+      <w:pPr>
+        <w:pStyle w:val="ListParagraph"/>
+        <w:numPr>
+          <w:ilvl w:val="0"/>
+          <w:numId w:val="1"/>
+        </w:numPr>
+        <w:spacing w:after="60"/>
+      </w:pPr>
+      <w:r>
+        <w:rPr>
+          <w:sz w:val="21"/>
+          <w:szCs w:val="21"/>
+        </w:rPr>
+        <w:t xml:space="preserve">Resource (/resources/manage-client-revisions-web-designers) — SHOULD be, and already is, a single-topic, evergreen how-to article: managing client revisions well as a web designer — round-tracking discipline, revision-vs-new-scope judgment, common mistakes. This does not change.</w:t>
+      </w:r>
+    </w:p>
+    <w:p>
+      <w:pPr>
+        <w:pStyle w:val="Heading2"/>
+        <w:spacing w:after="120" w:before="260"/>
+      </w:pPr>
+      <w:r>
+        <w:rPr>
+          <w:b/>
+          <w:bCs/>
+          <w:color w:val="1D4ED8"/>
+          <w:sz w:val="26"/>
+          <w:szCs w:val="26"/>
+        </w:rPr>
+        <w:t xml:space="preserve">13.3 Overlap matrix</w:t>
+      </w:r>
+    </w:p>
+    <w:tbl>
+      <w:tblPr>
+        <w:tblW w:type="pct" w:w="100%"/>
+        <w:tblBorders>
+          <w:top w:val="single" w:color="D1D5DB" w:sz="4"/>
+          <w:left w:val="single" w:color="D1D5DB" w:sz="4"/>
+          <w:bottom w:val="single" w:color="D1D5DB" w:sz="4"/>
+          <w:right w:val="single" w:color="D1D5DB" w:sz="4"/>
+          <w:insideH w:val="single" w:color="D1D5DB" w:sz="4"/>
+          <w:insideV w:val="single" w:color="D1D5DB" w:sz="4"/>
+        </w:tblBorders>
+      </w:tblPr>
+      <w:tblGrid>
+        <w:gridCol w:w="100"/>
+        <w:gridCol w:w="100"/>
+        <w:gridCol w:w="100"/>
+        <w:gridCol w:w="100"/>
+        <w:gridCol w:w="100"/>
+        <w:gridCol w:w="100"/>
+        <w:gridCol w:w="100"/>
+      </w:tblGrid>
+      <w:tr>
+        <w:trPr>
+          <w:tblHeader/>
+        </w:trPr>
+        <w:tc>
+          <w:tcPr>
+            <w:tcW w:type="dxa" w:w="1500"/>
+            <w:shd w:fill="1D4ED8" w:color="auto" w:val="clear"/>
+            <w:tcMar>
+              <w:top w:type="dxa" w:w="60"/>
+              <w:left w:type="dxa" w:w="90"/>
+              <w:bottom w:type="dxa" w:w="60"/>
+              <w:right w:type="dxa" w:w="90"/>
+            </w:tcMar>
+            <w:vAlign w:val="center"/>
+          </w:tcPr>
+          <w:p>
+            <w:r>
+              <w:rPr>
+                <w:b/>
+                <w:bCs/>
+                <w:color w:val="FFFFFF"/>
+                <w:sz w:val="18"/>
+                <w:szCs w:val="18"/>
+              </w:rPr>
+              <w:t xml:space="preserve">Element</w:t>
+            </w:r>
+          </w:p>
+        </w:tc>
+        <w:tc>
+          <w:tcPr>
+            <w:tcW w:type="dxa" w:w="2000"/>
+            <w:shd w:fill="1D4ED8" w:color="auto" w:val="clear"/>
+            <w:tcMar>
+              <w:top w:type="dxa" w:w="60"/>
+              <w:left w:type="dxa" w:w="90"/>
+              <w:bottom w:type="dxa" w:w="60"/>
+              <w:right w:type="dxa" w:w="90"/>
+            </w:tcMar>
+            <w:vAlign w:val="center"/>
+          </w:tcPr>
+          <w:p>
+            <w:r>
+              <w:rPr>
+                <w:b/>
+                <w:bCs/>
+                <w:color w:val="FFFFFF"/>
+                <w:sz w:val="18"/>
+                <w:szCs w:val="18"/>
+              </w:rPr>
+              <w:t xml:space="preserve">Use Case wording</w:t>
+            </w:r>
+          </w:p>
+        </w:tc>
+        <w:tc>
+          <w:tcPr>
+            <w:tcW w:type="dxa" w:w="2000"/>
+            <w:shd w:fill="1D4ED8" w:color="auto" w:val="clear"/>
+            <w:tcMar>
+              <w:top w:type="dxa" w:w="60"/>
+              <w:left w:type="dxa" w:w="90"/>
+              <w:bottom w:type="dxa" w:w="60"/>
+              <w:right w:type="dxa" w:w="90"/>
+            </w:tcMar>
+            <w:vAlign w:val="center"/>
+          </w:tcPr>
+          <w:p>
+            <w:r>
+              <w:rPr>
+                <w:b/>
+                <w:bCs/>
+                <w:color w:val="FFFFFF"/>
+                <w:sz w:val="18"/>
+                <w:szCs w:val="18"/>
+              </w:rPr>
+              <w:t xml:space="preserve">Resource wording</w:t>
+            </w:r>
+          </w:p>
+        </w:tc>
+        <w:tc>
+          <w:tcPr>
+            <w:tcW w:type="dxa" w:w="1200"/>
+            <w:shd w:fill="1D4ED8" w:color="auto" w:val="clear"/>
+            <w:tcMar>
+              <w:top w:type="dxa" w:w="60"/>
+              <w:left w:type="dxa" w:w="90"/>
+              <w:bottom w:type="dxa" w:w="60"/>
+              <w:right w:type="dxa" w:w="90"/>
+            </w:tcMar>
+            <w:vAlign w:val="center"/>
+          </w:tcPr>
+          <w:p>
+            <w:r>
+              <w:rPr>
+                <w:b/>
+                <w:bCs/>
+                <w:color w:val="FFFFFF"/>
+                <w:sz w:val="18"/>
+                <w:szCs w:val="18"/>
+              </w:rPr>
+              <w:t xml:space="preserve">Severity</w:t>
+            </w:r>
+          </w:p>
+        </w:tc>
+        <w:tc>
+          <w:tcPr>
+            <w:tcW w:type="dxa" w:w="2100"/>
+            <w:shd w:fill="1D4ED8" w:color="auto" w:val="clear"/>
+            <w:tcMar>
+              <w:top w:type="dxa" w:w="60"/>
+              <w:left w:type="dxa" w:w="90"/>
+              <w:bottom w:type="dxa" w:w="60"/>
+              <w:right w:type="dxa" w:w="90"/>
+            </w:tcMar>
+            <w:vAlign w:val="center"/>
+          </w:tcPr>
+          <w:p>
+            <w:r>
+              <w:rPr>
+                <w:b/>
+                <w:bCs/>
+                <w:color w:val="FFFFFF"/>
+                <w:sz w:val="18"/>
+                <w:szCs w:val="18"/>
+              </w:rPr>
+              <w:t xml:space="preserve">SEO risk</w:t>
+            </w:r>
+          </w:p>
+        </w:tc>
+        <w:tc>
+          <w:tcPr>
+            <w:tcW w:type="dxa" w:w="1600"/>
+            <w:shd w:fill="1D4ED8" w:color="auto" w:val="clear"/>
+            <w:tcMar>
+              <w:top w:type="dxa" w:w="60"/>
+              <w:left w:type="dxa" w:w="90"/>
+              <w:bottom w:type="dxa" w:w="60"/>
+              <w:right w:type="dxa" w:w="90"/>
+            </w:tcMar>
+            <w:vAlign w:val="center"/>
+          </w:tcPr>
+          <w:p>
+            <w:r>
+              <w:rPr>
+                <w:b/>
+                <w:bCs/>
+                <w:color w:val="FFFFFF"/>
+                <w:sz w:val="18"/>
+                <w:szCs w:val="18"/>
+              </w:rPr>
+              <w:t xml:space="preserve">UX risk</w:t>
+            </w:r>
+          </w:p>
+        </w:tc>
+        <w:tc>
+          <w:tcPr>
+            <w:tcW w:type="dxa" w:w="2114"/>
+            <w:shd w:fill="1D4ED8" w:color="auto" w:val="clear"/>
+            <w:tcMar>
+              <w:top w:type="dxa" w:w="60"/>
+              <w:left w:type="dxa" w:w="90"/>
+              <w:bottom w:type="dxa" w:w="60"/>
+              <w:right w:type="dxa" w:w="90"/>
+            </w:tcMar>
+            <w:vAlign w:val="center"/>
+          </w:tcPr>
+          <w:p>
+            <w:r>
+              <w:rPr>
+                <w:b/>
+                <w:bCs/>
+                <w:color w:val="FFFFFF"/>
+                <w:sz w:val="18"/>
+                <w:szCs w:val="18"/>
+              </w:rPr>
+              <w:t xml:space="preserve">Recommended action</w:t>
+            </w:r>
+          </w:p>
+        </w:tc>
+      </w:tr>
+      <w:tr>
+        <w:tc>
+          <w:tcPr>
+            <w:tcW w:type="dxa" w:w="1500"/>
+            <w:tcMar>
+              <w:top w:type="dxa" w:w="60"/>
+              <w:left w:type="dxa" w:w="90"/>
+              <w:bottom w:type="dxa" w:w="60"/>
+              <w:right w:type="dxa" w:w="90"/>
+            </w:tcMar>
+            <w:vAlign w:val="center"/>
+          </w:tcPr>
+          <w:p>
+            <w:r>
+              <w:rPr>
+                <w:b w:val="false"/>
+                <w:bCs w:val="false"/>
+                <w:color w:val="1F2937"/>
+                <w:sz w:val="17"/>
+                <w:szCs w:val="17"/>
+              </w:rPr>
+              <w:t xml:space="preserve">Title</w:t>
+            </w:r>
+          </w:p>
+        </w:tc>
+        <w:tc>
+          <w:tcPr>
+            <w:tcW w:type="dxa" w:w="2000"/>
+            <w:tcMar>
+              <w:top w:type="dxa" w:w="60"/>
+              <w:left w:type="dxa" w:w="90"/>
+              <w:bottom w:type="dxa" w:w="60"/>
+              <w:right w:type="dxa" w:w="90"/>
+            </w:tcMar>
+            <w:vAlign w:val="center"/>
+          </w:tcPr>
+          <w:p>
+            <w:r>
+              <w:rPr>
+                <w:b w:val="false"/>
+                <w:bCs w:val="false"/>
+                <w:color w:val="1F2937"/>
+                <w:sz w:val="17"/>
+                <w:szCs w:val="17"/>
+              </w:rPr>
+              <w:t xml:space="preserve">"Website Revision Task Manager for Web Designers"</w:t>
+            </w:r>
+          </w:p>
+        </w:tc>
+        <w:tc>
+          <w:tcPr>
+            <w:tcW w:type="dxa" w:w="2000"/>
+            <w:tcMar>
+              <w:top w:type="dxa" w:w="60"/>
+              <w:left w:type="dxa" w:w="90"/>
+              <w:bottom w:type="dxa" w:w="60"/>
+              <w:right w:type="dxa" w:w="90"/>
+            </w:tcMar>
+            <w:vAlign w:val="center"/>
+          </w:tcPr>
+          <w:p>
+            <w:r>
+              <w:rPr>
+                <w:b w:val="false"/>
+                <w:bCs w:val="false"/>
+                <w:color w:val="1F2937"/>
+                <w:sz w:val="17"/>
+                <w:szCs w:val="17"/>
+              </w:rPr>
+              <w:t xml:space="preserve">"How Web Designers Can Manage Client Revisions Faster"</w:t>
+            </w:r>
+          </w:p>
+        </w:tc>
+        <w:tc>
+          <w:tcPr>
+            <w:tcW w:type="dxa" w:w="1200"/>
+            <w:tcMar>
+              <w:top w:type="dxa" w:w="60"/>
+              <w:left w:type="dxa" w:w="90"/>
+              <w:bottom w:type="dxa" w:w="60"/>
+              <w:right w:type="dxa" w:w="90"/>
+            </w:tcMar>
+            <w:vAlign w:val="center"/>
+          </w:tcPr>
+          <w:p>
+            <w:r>
+              <w:rPr>
+                <w:b w:val="false"/>
+                <w:bCs w:val="false"/>
+                <w:color w:val="1F2937"/>
+                <w:sz w:val="17"/>
+                <w:szCs w:val="17"/>
+              </w:rPr>
+              <w:t xml:space="preserve">HIGH</w:t>
+            </w:r>
+          </w:p>
+        </w:tc>
+        <w:tc>
+          <w:tcPr>
+            <w:tcW w:type="dxa" w:w="2100"/>
+            <w:tcMar>
+              <w:top w:type="dxa" w:w="60"/>
+              <w:left w:type="dxa" w:w="90"/>
+              <w:bottom w:type="dxa" w:w="60"/>
+              <w:right w:type="dxa" w:w="90"/>
+            </w:tcMar>
+            <w:vAlign w:val="center"/>
+          </w:tcPr>
+          <w:p>
+            <w:r>
+              <w:rPr>
+                <w:b w:val="false"/>
+                <w:bCs w:val="false"/>
+                <w:color w:val="1F2937"/>
+                <w:sz w:val="17"/>
+                <w:szCs w:val="17"/>
+              </w:rPr>
+              <w:t xml:space="preserve">Both titles center on "revision(s)" + "Web Designers" as the same core topic</w:t>
+            </w:r>
+          </w:p>
+        </w:tc>
+        <w:tc>
+          <w:tcPr>
+            <w:tcW w:type="dxa" w:w="1600"/>
+            <w:tcMar>
+              <w:top w:type="dxa" w:w="60"/>
+              <w:left w:type="dxa" w:w="90"/>
+              <w:bottom w:type="dxa" w:w="60"/>
+              <w:right w:type="dxa" w:w="90"/>
+            </w:tcMar>
+            <w:vAlign w:val="center"/>
+          </w:tcPr>
+          <w:p>
+            <w:r>
+              <w:rPr>
+                <w:b w:val="false"/>
+                <w:bCs w:val="false"/>
+                <w:color w:val="1F2937"/>
+                <w:sz w:val="17"/>
+                <w:szCs w:val="17"/>
+              </w:rPr>
+              <w:t xml:space="preserve">Low</w:t>
+            </w:r>
+          </w:p>
+        </w:tc>
+        <w:tc>
+          <w:tcPr>
+            <w:tcW w:type="dxa" w:w="2114"/>
+            <w:tcMar>
+              <w:top w:type="dxa" w:w="60"/>
+              <w:left w:type="dxa" w:w="90"/>
+              <w:bottom w:type="dxa" w:w="60"/>
+              <w:right w:type="dxa" w:w="90"/>
+            </w:tcMar>
+            <w:vAlign w:val="center"/>
+          </w:tcPr>
+          <w:p>
+            <w:r>
+              <w:rPr>
+                <w:b w:val="false"/>
+                <w:bCs w:val="false"/>
+                <w:color w:val="1F2937"/>
+                <w:sz w:val="17"/>
+                <w:szCs w:val="17"/>
+              </w:rPr>
+              <w:t xml:space="preserve">Broaden Use Case title beyond revisions</w:t>
+            </w:r>
+          </w:p>
+        </w:tc>
+      </w:tr>
+      <w:tr>
+        <w:tc>
+          <w:tcPr>
+            <w:tcW w:type="dxa" w:w="1500"/>
+            <w:shd w:fill="F3F4F6" w:color="auto" w:val="clear"/>
+            <w:tcMar>
+              <w:top w:type="dxa" w:w="60"/>
+              <w:left w:type="dxa" w:w="90"/>
+              <w:bottom w:type="dxa" w:w="60"/>
+              <w:right w:type="dxa" w:w="90"/>
+            </w:tcMar>
+            <w:vAlign w:val="center"/>
+          </w:tcPr>
+          <w:p>
+            <w:r>
+              <w:rPr>
+                <w:b w:val="false"/>
+                <w:bCs w:val="false"/>
+                <w:color w:val="1F2937"/>
+                <w:sz w:val="17"/>
+                <w:szCs w:val="17"/>
+              </w:rPr>
+              <w:t xml:space="preserve">H1</w:t>
+            </w:r>
+          </w:p>
+        </w:tc>
+        <w:tc>
+          <w:tcPr>
+            <w:tcW w:type="dxa" w:w="2000"/>
+            <w:shd w:fill="F3F4F6" w:color="auto" w:val="clear"/>
+            <w:tcMar>
+              <w:top w:type="dxa" w:w="60"/>
+              <w:left w:type="dxa" w:w="90"/>
+              <w:bottom w:type="dxa" w:w="60"/>
+              <w:right w:type="dxa" w:w="90"/>
+            </w:tcMar>
+            <w:vAlign w:val="center"/>
+          </w:tcPr>
+          <w:p>
+            <w:r>
+              <w:rPr>
+                <w:b w:val="false"/>
+                <w:bCs w:val="false"/>
+                <w:color w:val="1F2937"/>
+                <w:sz w:val="17"/>
+                <w:szCs w:val="17"/>
+              </w:rPr>
+              <w:t xml:space="preserve">"Stop rebuilding revision emails into task lists..."</w:t>
+            </w:r>
+          </w:p>
+        </w:tc>
+        <w:tc>
+          <w:tcPr>
+            <w:tcW w:type="dxa" w:w="2000"/>
+            <w:shd w:fill="F3F4F6" w:color="auto" w:val="clear"/>
+            <w:tcMar>
+              <w:top w:type="dxa" w:w="60"/>
+              <w:left w:type="dxa" w:w="90"/>
+              <w:bottom w:type="dxa" w:w="60"/>
+              <w:right w:type="dxa" w:w="90"/>
+            </w:tcMar>
+            <w:vAlign w:val="center"/>
+          </w:tcPr>
+          <w:p>
+            <w:r>
+              <w:rPr>
+                <w:b w:val="false"/>
+                <w:bCs w:val="false"/>
+                <w:color w:val="1F2937"/>
+                <w:sz w:val="17"/>
+                <w:szCs w:val="17"/>
+              </w:rPr>
+              <w:t xml:space="preserve">"How Web Designers Can Manage Client Revisions Faster"</w:t>
+            </w:r>
+          </w:p>
+        </w:tc>
+        <w:tc>
+          <w:tcPr>
+            <w:tcW w:type="dxa" w:w="1200"/>
+            <w:shd w:fill="F3F4F6" w:color="auto" w:val="clear"/>
+            <w:tcMar>
+              <w:top w:type="dxa" w:w="60"/>
+              <w:left w:type="dxa" w:w="90"/>
+              <w:bottom w:type="dxa" w:w="60"/>
+              <w:right w:type="dxa" w:w="90"/>
+            </w:tcMar>
+            <w:vAlign w:val="center"/>
+          </w:tcPr>
+          <w:p>
+            <w:r>
+              <w:rPr>
+                <w:b w:val="false"/>
+                <w:bCs w:val="false"/>
+                <w:color w:val="1F2937"/>
+                <w:sz w:val="17"/>
+                <w:szCs w:val="17"/>
+              </w:rPr>
+              <w:t xml:space="preserve">MEDIUM</w:t>
+            </w:r>
+          </w:p>
+        </w:tc>
+        <w:tc>
+          <w:tcPr>
+            <w:tcW w:type="dxa" w:w="2100"/>
+            <w:shd w:fill="F3F4F6" w:color="auto" w:val="clear"/>
+            <w:tcMar>
+              <w:top w:type="dxa" w:w="60"/>
+              <w:left w:type="dxa" w:w="90"/>
+              <w:bottom w:type="dxa" w:w="60"/>
+              <w:right w:type="dxa" w:w="90"/>
+            </w:tcMar>
+            <w:vAlign w:val="center"/>
+          </w:tcPr>
+          <w:p>
+            <w:r>
+              <w:rPr>
+                <w:b w:val="false"/>
+                <w:bCs w:val="false"/>
+                <w:color w:val="1F2937"/>
+                <w:sz w:val="17"/>
+                <w:szCs w:val="17"/>
+              </w:rPr>
+              <w:t xml:space="preserve">Not verbatim, but "revision emails/revisions" is the leading idea on both</w:t>
+            </w:r>
+          </w:p>
+        </w:tc>
+        <w:tc>
+          <w:tcPr>
+            <w:tcW w:type="dxa" w:w="1600"/>
+            <w:shd w:fill="F3F4F6" w:color="auto" w:val="clear"/>
+            <w:tcMar>
+              <w:top w:type="dxa" w:w="60"/>
+              <w:left w:type="dxa" w:w="90"/>
+              <w:bottom w:type="dxa" w:w="60"/>
+              <w:right w:type="dxa" w:w="90"/>
+            </w:tcMar>
+            <w:vAlign w:val="center"/>
+          </w:tcPr>
+          <w:p>
+            <w:r>
+              <w:rPr>
+                <w:b w:val="false"/>
+                <w:bCs w:val="false"/>
+                <w:color w:val="1F2937"/>
+                <w:sz w:val="17"/>
+                <w:szCs w:val="17"/>
+              </w:rPr>
+              <w:t xml:space="preserve">Low</w:t>
+            </w:r>
+          </w:p>
+        </w:tc>
+        <w:tc>
+          <w:tcPr>
+            <w:tcW w:type="dxa" w:w="2114"/>
+            <w:shd w:fill="F3F4F6" w:color="auto" w:val="clear"/>
+            <w:tcMar>
+              <w:top w:type="dxa" w:w="60"/>
+              <w:left w:type="dxa" w:w="90"/>
+              <w:bottom w:type="dxa" w:w="60"/>
+              <w:right w:type="dxa" w:w="90"/>
+            </w:tcMar>
+            <w:vAlign w:val="center"/>
+          </w:tcPr>
+          <w:p>
+            <w:r>
+              <w:rPr>
+                <w:b w:val="false"/>
+                <w:bCs w:val="false"/>
+                <w:color w:val="1F2937"/>
+                <w:sz w:val="17"/>
+                <w:szCs w:val="17"/>
+              </w:rPr>
+              <w:t xml:space="preserve">Reframe Use Case H1 around the fuller request+revisions workflow</w:t>
+            </w:r>
+          </w:p>
+        </w:tc>
+      </w:tr>
+      <w:tr>
+        <w:tc>
+          <w:tcPr>
+            <w:tcW w:type="dxa" w:w="1500"/>
+            <w:tcMar>
+              <w:top w:type="dxa" w:w="60"/>
+              <w:left w:type="dxa" w:w="90"/>
+              <w:bottom w:type="dxa" w:w="60"/>
+              <w:right w:type="dxa" w:w="90"/>
+            </w:tcMar>
+            <w:vAlign w:val="center"/>
+          </w:tcPr>
+          <w:p>
+            <w:r>
+              <w:rPr>
+                <w:b w:val="false"/>
+                <w:bCs w:val="false"/>
+                <w:color w:val="1F2937"/>
+                <w:sz w:val="17"/>
+                <w:szCs w:val="17"/>
+              </w:rPr>
+              <w:t xml:space="preserve">Hero/intro</w:t>
+            </w:r>
+          </w:p>
+        </w:tc>
+        <w:tc>
+          <w:tcPr>
+            <w:tcW w:type="dxa" w:w="2000"/>
+            <w:tcMar>
+              <w:top w:type="dxa" w:w="60"/>
+              <w:left w:type="dxa" w:w="90"/>
+              <w:bottom w:type="dxa" w:w="60"/>
+              <w:right w:type="dxa" w:w="90"/>
+            </w:tcMar>
+            <w:vAlign w:val="center"/>
+          </w:tcPr>
+          <w:p>
+            <w:r>
+              <w:rPr>
+                <w:b w:val="false"/>
+                <w:bCs w:val="false"/>
+                <w:color w:val="1F2937"/>
+                <w:sz w:val="17"/>
+                <w:szCs w:val="17"/>
+              </w:rPr>
+              <w:t xml:space="preserve">Client revision email/WhatsApp/screenshot arriving, extracted into tasks</w:t>
+            </w:r>
+          </w:p>
+        </w:tc>
+        <w:tc>
+          <w:tcPr>
+            <w:tcW w:type="dxa" w:w="2000"/>
+            <w:tcMar>
+              <w:top w:type="dxa" w:w="60"/>
+              <w:left w:type="dxa" w:w="90"/>
+              <w:bottom w:type="dxa" w:w="60"/>
+              <w:right w:type="dxa" w:w="90"/>
+            </w:tcMar>
+            <w:vAlign w:val="center"/>
+          </w:tcPr>
+          <w:p>
+            <w:r>
+              <w:rPr>
+                <w:b w:val="false"/>
+                <w:bCs w:val="false"/>
+                <w:color w:val="1F2937"/>
+                <w:sz w:val="17"/>
+                <w:szCs w:val="17"/>
+              </w:rPr>
+              <w:t xml:space="preserve">Client revision feedback arriving in rounds across channels, described almost identically</w:t>
+            </w:r>
+          </w:p>
+        </w:tc>
+        <w:tc>
+          <w:tcPr>
+            <w:tcW w:type="dxa" w:w="1200"/>
+            <w:tcMar>
+              <w:top w:type="dxa" w:w="60"/>
+              <w:left w:type="dxa" w:w="90"/>
+              <w:bottom w:type="dxa" w:w="60"/>
+              <w:right w:type="dxa" w:w="90"/>
+            </w:tcMar>
+            <w:vAlign w:val="center"/>
+          </w:tcPr>
+          <w:p>
+            <w:r>
+              <w:rPr>
+                <w:b w:val="false"/>
+                <w:bCs w:val="false"/>
+                <w:color w:val="1F2937"/>
+                <w:sz w:val="17"/>
+                <w:szCs w:val="17"/>
+              </w:rPr>
+              <w:t xml:space="preserve">HIGH</w:t>
+            </w:r>
+          </w:p>
+        </w:tc>
+        <w:tc>
+          <w:tcPr>
+            <w:tcW w:type="dxa" w:w="2100"/>
+            <w:tcMar>
+              <w:top w:type="dxa" w:w="60"/>
+              <w:left w:type="dxa" w:w="90"/>
+              <w:bottom w:type="dxa" w:w="60"/>
+              <w:right w:type="dxa" w:w="90"/>
+            </w:tcMar>
+            <w:vAlign w:val="center"/>
+          </w:tcPr>
+          <w:p>
+            <w:r>
+              <w:rPr>
+                <w:b w:val="false"/>
+                <w:bCs w:val="false"/>
+                <w:color w:val="1F2937"/>
+                <w:sz w:val="17"/>
+                <w:szCs w:val="17"/>
+              </w:rPr>
+              <w:t xml:space="preserve">Near-identical scenario description</w:t>
+            </w:r>
+          </w:p>
+        </w:tc>
+        <w:tc>
+          <w:tcPr>
+            <w:tcW w:type="dxa" w:w="1600"/>
+            <w:tcMar>
+              <w:top w:type="dxa" w:w="60"/>
+              <w:left w:type="dxa" w:w="90"/>
+              <w:bottom w:type="dxa" w:w="60"/>
+              <w:right w:type="dxa" w:w="90"/>
+            </w:tcMar>
+            <w:vAlign w:val="center"/>
+          </w:tcPr>
+          <w:p>
+            <w:r>
+              <w:rPr>
+                <w:b w:val="false"/>
+                <w:bCs w:val="false"/>
+                <w:color w:val="1F2937"/>
+                <w:sz w:val="17"/>
+                <w:szCs w:val="17"/>
+              </w:rPr>
+              <w:t xml:space="preserve">Medium — a reader of both would feel deja vu</w:t>
+            </w:r>
+          </w:p>
+        </w:tc>
+        <w:tc>
+          <w:tcPr>
+            <w:tcW w:type="dxa" w:w="2114"/>
+            <w:tcMar>
+              <w:top w:type="dxa" w:w="60"/>
+              <w:left w:type="dxa" w:w="90"/>
+              <w:bottom w:type="dxa" w:w="60"/>
+              <w:right w:type="dxa" w:w="90"/>
+            </w:tcMar>
+            <w:vAlign w:val="center"/>
+          </w:tcPr>
+          <w:p>
+            <w:r>
+              <w:rPr>
+                <w:b w:val="false"/>
+                <w:bCs w:val="false"/>
+                <w:color w:val="1F2937"/>
+                <w:sz w:val="17"/>
+                <w:szCs w:val="17"/>
+              </w:rPr>
+              <w:t xml:space="preserve">Rebalance Use Case hero to include first-request intake, not only revisions</w:t>
+            </w:r>
+          </w:p>
+        </w:tc>
+      </w:tr>
+      <w:tr>
+        <w:tc>
+          <w:tcPr>
+            <w:tcW w:type="dxa" w:w="1500"/>
+            <w:shd w:fill="F3F4F6" w:color="auto" w:val="clear"/>
+            <w:tcMar>
+              <w:top w:type="dxa" w:w="60"/>
+              <w:left w:type="dxa" w:w="90"/>
+              <w:bottom w:type="dxa" w:w="60"/>
+              <w:right w:type="dxa" w:w="90"/>
+            </w:tcMar>
+            <w:vAlign w:val="center"/>
+          </w:tcPr>
+          <w:p>
+            <w:r>
+              <w:rPr>
+                <w:b w:val="false"/>
+                <w:bCs w:val="false"/>
+                <w:color w:val="1F2937"/>
+                <w:sz w:val="17"/>
+                <w:szCs w:val="17"/>
+              </w:rPr>
+              <w:t xml:space="preserve">"Revision(s)" density</w:t>
+            </w:r>
+          </w:p>
+        </w:tc>
+        <w:tc>
+          <w:tcPr>
+            <w:tcW w:type="dxa" w:w="2000"/>
+            <w:shd w:fill="F3F4F6" w:color="auto" w:val="clear"/>
+            <w:tcMar>
+              <w:top w:type="dxa" w:w="60"/>
+              <w:left w:type="dxa" w:w="90"/>
+              <w:bottom w:type="dxa" w:w="60"/>
+              <w:right w:type="dxa" w:w="90"/>
+            </w:tcMar>
+            <w:vAlign w:val="center"/>
+          </w:tcPr>
+          <w:p>
+            <w:r>
+              <w:rPr>
+                <w:b w:val="false"/>
+                <w:bCs w:val="false"/>
+                <w:color w:val="1F2937"/>
+                <w:sz w:val="17"/>
+                <w:szCs w:val="17"/>
+              </w:rPr>
+              <w:t xml:space="preserve">Heavy — used throughout hero, painPoints, workflow, capabilities, FAQ, finalCta</w:t>
+            </w:r>
+          </w:p>
+        </w:tc>
+        <w:tc>
+          <w:tcPr>
+            <w:tcW w:type="dxa" w:w="2000"/>
+            <w:shd w:fill="F3F4F6" w:color="auto" w:val="clear"/>
+            <w:tcMar>
+              <w:top w:type="dxa" w:w="60"/>
+              <w:left w:type="dxa" w:w="90"/>
+              <w:bottom w:type="dxa" w:w="60"/>
+              <w:right w:type="dxa" w:w="90"/>
+            </w:tcMar>
+            <w:vAlign w:val="center"/>
+          </w:tcPr>
+          <w:p>
+            <w:r>
+              <w:rPr>
+                <w:b w:val="false"/>
+                <w:bCs w:val="false"/>
+                <w:color w:val="1F2937"/>
+                <w:sz w:val="17"/>
+                <w:szCs w:val="17"/>
+              </w:rPr>
+              <w:t xml:space="preserve">Heavy — the article's entire subject</w:t>
+            </w:r>
+          </w:p>
+        </w:tc>
+        <w:tc>
+          <w:tcPr>
+            <w:tcW w:type="dxa" w:w="1200"/>
+            <w:shd w:fill="F3F4F6" w:color="auto" w:val="clear"/>
+            <w:tcMar>
+              <w:top w:type="dxa" w:w="60"/>
+              <w:left w:type="dxa" w:w="90"/>
+              <w:bottom w:type="dxa" w:w="60"/>
+              <w:right w:type="dxa" w:w="90"/>
+            </w:tcMar>
+            <w:vAlign w:val="center"/>
+          </w:tcPr>
+          <w:p>
+            <w:r>
+              <w:rPr>
+                <w:b w:val="false"/>
+                <w:bCs w:val="false"/>
+                <w:color w:val="1F2937"/>
+                <w:sz w:val="17"/>
+                <w:szCs w:val="17"/>
+              </w:rPr>
+              <w:t xml:space="preserve">HIGH (combined with title/H1)</w:t>
+            </w:r>
+          </w:p>
+        </w:tc>
+        <w:tc>
+          <w:tcPr>
+            <w:tcW w:type="dxa" w:w="2100"/>
+            <w:shd w:fill="F3F4F6" w:color="auto" w:val="clear"/>
+            <w:tcMar>
+              <w:top w:type="dxa" w:w="60"/>
+              <w:left w:type="dxa" w:w="90"/>
+              <w:bottom w:type="dxa" w:w="60"/>
+              <w:right w:type="dxa" w:w="90"/>
+            </w:tcMar>
+            <w:vAlign w:val="center"/>
+          </w:tcPr>
+          <w:p>
+            <w:r>
+              <w:rPr>
+                <w:b w:val="false"/>
+                <w:bCs w:val="false"/>
+                <w:color w:val="1F2937"/>
+                <w:sz w:val="17"/>
+                <w:szCs w:val="17"/>
+              </w:rPr>
+              <w:t xml:space="preserve">Appropriate depth for the Resource; over-weighted for a Use Case that should span broader ground</w:t>
+            </w:r>
+          </w:p>
+        </w:tc>
+        <w:tc>
+          <w:tcPr>
+            <w:tcW w:type="dxa" w:w="1600"/>
+            <w:shd w:fill="F3F4F6" w:color="auto" w:val="clear"/>
+            <w:tcMar>
+              <w:top w:type="dxa" w:w="60"/>
+              <w:left w:type="dxa" w:w="90"/>
+              <w:bottom w:type="dxa" w:w="60"/>
+              <w:right w:type="dxa" w:w="90"/>
+            </w:tcMar>
+            <w:vAlign w:val="center"/>
+          </w:tcPr>
+          <w:p>
+            <w:r>
+              <w:rPr>
+                <w:b w:val="false"/>
+                <w:bCs w:val="false"/>
+                <w:color w:val="1F2937"/>
+                <w:sz w:val="17"/>
+                <w:szCs w:val="17"/>
+              </w:rPr>
+              <w:t xml:space="preserve">Low individually</w:t>
+            </w:r>
+          </w:p>
+        </w:tc>
+        <w:tc>
+          <w:tcPr>
+            <w:tcW w:type="dxa" w:w="2114"/>
+            <w:shd w:fill="F3F4F6" w:color="auto" w:val="clear"/>
+            <w:tcMar>
+              <w:top w:type="dxa" w:w="60"/>
+              <w:left w:type="dxa" w:w="90"/>
+              <w:bottom w:type="dxa" w:w="60"/>
+              <w:right w:type="dxa" w:w="90"/>
+            </w:tcMar>
+            <w:vAlign w:val="center"/>
+          </w:tcPr>
+          <w:p>
+            <w:r>
+              <w:rPr>
+                <w:b w:val="false"/>
+                <w:bCs w:val="false"/>
+                <w:color w:val="1F2937"/>
+                <w:sz w:val="17"/>
+                <w:szCs w:val="17"/>
+              </w:rPr>
+              <w:t xml:space="preserve">Reduce revisions' share of the Use Case's overall content mix; Resource unchanged</w:t>
+            </w:r>
+          </w:p>
+        </w:tc>
+      </w:tr>
+      <w:tr>
+        <w:tc>
+          <w:tcPr>
+            <w:tcW w:type="dxa" w:w="1500"/>
+            <w:tcMar>
+              <w:top w:type="dxa" w:w="60"/>
+              <w:left w:type="dxa" w:w="90"/>
+              <w:bottom w:type="dxa" w:w="60"/>
+              <w:right w:type="dxa" w:w="90"/>
+            </w:tcMar>
+            <w:vAlign w:val="center"/>
+          </w:tcPr>
+          <w:p>
+            <w:r>
+              <w:rPr>
+                <w:b w:val="false"/>
+                <w:bCs w:val="false"/>
+                <w:color w:val="1F2937"/>
+                <w:sz w:val="17"/>
+                <w:szCs w:val="17"/>
+              </w:rPr>
+              <w:t xml:space="preserve">Revision-vs-new-scope distinction</w:t>
+            </w:r>
+          </w:p>
+        </w:tc>
+        <w:tc>
+          <w:tcPr>
+            <w:tcW w:type="dxa" w:w="2000"/>
+            <w:tcMar>
+              <w:top w:type="dxa" w:w="60"/>
+              <w:left w:type="dxa" w:w="90"/>
+              <w:bottom w:type="dxa" w:w="60"/>
+              <w:right w:type="dxa" w:w="90"/>
+            </w:tcMar>
+            <w:vAlign w:val="center"/>
+          </w:tcPr>
+          <w:p>
+            <w:r>
+              <w:rPr>
+                <w:b w:val="false"/>
+                <w:bCs w:val="false"/>
+                <w:color w:val="1F2937"/>
+                <w:sz w:val="17"/>
+                <w:szCs w:val="17"/>
+              </w:rPr>
+              <w:t xml:space="preserve">FAQ Q1, short answer</w:t>
+            </w:r>
+          </w:p>
+        </w:tc>
+        <w:tc>
+          <w:tcPr>
+            <w:tcW w:type="dxa" w:w="2000"/>
+            <w:tcMar>
+              <w:top w:type="dxa" w:w="60"/>
+              <w:left w:type="dxa" w:w="90"/>
+              <w:bottom w:type="dxa" w:w="60"/>
+              <w:right w:type="dxa" w:w="90"/>
+            </w:tcMar>
+            <w:vAlign w:val="center"/>
+          </w:tcPr>
+          <w:p>
+            <w:r>
+              <w:rPr>
+                <w:b w:val="false"/>
+                <w:bCs w:val="false"/>
+                <w:color w:val="1F2937"/>
+                <w:sz w:val="17"/>
+                <w:szCs w:val="17"/>
+              </w:rPr>
+              <w:t xml:space="preserve">Dedicated H2, full explanation</w:t>
+            </w:r>
+          </w:p>
+        </w:tc>
+        <w:tc>
+          <w:tcPr>
+            <w:tcW w:type="dxa" w:w="1200"/>
+            <w:tcMar>
+              <w:top w:type="dxa" w:w="60"/>
+              <w:left w:type="dxa" w:w="90"/>
+              <w:bottom w:type="dxa" w:w="60"/>
+              <w:right w:type="dxa" w:w="90"/>
+            </w:tcMar>
+            <w:vAlign w:val="center"/>
+          </w:tcPr>
+          <w:p>
+            <w:r>
+              <w:rPr>
+                <w:b w:val="false"/>
+                <w:bCs w:val="false"/>
+                <w:color w:val="1F2937"/>
+                <w:sz w:val="17"/>
+                <w:szCs w:val="17"/>
+              </w:rPr>
+              <w:t xml:space="preserve">MEDIUM</w:t>
+            </w:r>
+          </w:p>
+        </w:tc>
+        <w:tc>
+          <w:tcPr>
+            <w:tcW w:type="dxa" w:w="2100"/>
+            <w:tcMar>
+              <w:top w:type="dxa" w:w="60"/>
+              <w:left w:type="dxa" w:w="90"/>
+              <w:bottom w:type="dxa" w:w="60"/>
+              <w:right w:type="dxa" w:w="90"/>
+            </w:tcMar>
+            <w:vAlign w:val="center"/>
+          </w:tcPr>
+          <w:p>
+            <w:r>
+              <w:rPr>
+                <w:b w:val="false"/>
+                <w:bCs w:val="false"/>
+                <w:color w:val="1F2937"/>
+                <w:sz w:val="17"/>
+                <w:szCs w:val="17"/>
+              </w:rPr>
+              <w:t xml:space="preserve">Same specific concept covered at different depths</w:t>
+            </w:r>
+          </w:p>
+        </w:tc>
+        <w:tc>
+          <w:tcPr>
+            <w:tcW w:type="dxa" w:w="1600"/>
+            <w:tcMar>
+              <w:top w:type="dxa" w:w="60"/>
+              <w:left w:type="dxa" w:w="90"/>
+              <w:bottom w:type="dxa" w:w="60"/>
+              <w:right w:type="dxa" w:w="90"/>
+            </w:tcMar>
+            <w:vAlign w:val="center"/>
+          </w:tcPr>
+          <w:p>
+            <w:r>
+              <w:rPr>
+                <w:b w:val="false"/>
+                <w:bCs w:val="false"/>
+                <w:color w:val="1F2937"/>
+                <w:sz w:val="17"/>
+                <w:szCs w:val="17"/>
+              </w:rPr>
+              <w:t xml:space="preserve">Low — Use Case is a pointer, Resource is the depth</w:t>
+            </w:r>
+          </w:p>
+        </w:tc>
+        <w:tc>
+          <w:tcPr>
+            <w:tcW w:type="dxa" w:w="2114"/>
+            <w:tcMar>
+              <w:top w:type="dxa" w:w="60"/>
+              <w:left w:type="dxa" w:w="90"/>
+              <w:bottom w:type="dxa" w:w="60"/>
+              <w:right w:type="dxa" w:w="90"/>
+            </w:tcMar>
+            <w:vAlign w:val="center"/>
+          </w:tcPr>
+          <w:p>
+            <w:r>
+              <w:rPr>
+                <w:b w:val="false"/>
+                <w:bCs w:val="false"/>
+                <w:color w:val="1F2937"/>
+                <w:sz w:val="17"/>
+                <w:szCs w:val="17"/>
+              </w:rPr>
+              <w:t xml:space="preserve">No action — this depth split is already healthy</w:t>
+            </w:r>
+          </w:p>
+        </w:tc>
+      </w:tr>
+      <w:tr>
+        <w:tc>
+          <w:tcPr>
+            <w:tcW w:type="dxa" w:w="1500"/>
+            <w:shd w:fill="F3F4F6" w:color="auto" w:val="clear"/>
+            <w:tcMar>
+              <w:top w:type="dxa" w:w="60"/>
+              <w:left w:type="dxa" w:w="90"/>
+              <w:bottom w:type="dxa" w:w="60"/>
+              <w:right w:type="dxa" w:w="90"/>
+            </w:tcMar>
+            <w:vAlign w:val="center"/>
+          </w:tcPr>
+          <w:p>
+            <w:r>
+              <w:rPr>
+                <w:b w:val="false"/>
+                <w:bCs w:val="false"/>
+                <w:color w:val="1F2937"/>
+                <w:sz w:val="17"/>
+                <w:szCs w:val="17"/>
+              </w:rPr>
+              <w:t xml:space="preserve">Multi-round tracking</w:t>
+            </w:r>
+          </w:p>
+        </w:tc>
+        <w:tc>
+          <w:tcPr>
+            <w:tcW w:type="dxa" w:w="2000"/>
+            <w:shd w:fill="F3F4F6" w:color="auto" w:val="clear"/>
+            <w:tcMar>
+              <w:top w:type="dxa" w:w="60"/>
+              <w:left w:type="dxa" w:w="90"/>
+              <w:bottom w:type="dxa" w:w="60"/>
+              <w:right w:type="dxa" w:w="90"/>
+            </w:tcMar>
+            <w:vAlign w:val="center"/>
+          </w:tcPr>
+          <w:p>
+            <w:r>
+              <w:rPr>
+                <w:b w:val="false"/>
+                <w:bCs w:val="false"/>
+                <w:color w:val="1F2937"/>
+                <w:sz w:val="17"/>
+                <w:szCs w:val="17"/>
+              </w:rPr>
+              <w:t xml:space="preserve">clientUpdates section (standard template section on every Use Case)</w:t>
+            </w:r>
+          </w:p>
+        </w:tc>
+        <w:tc>
+          <w:tcPr>
+            <w:tcW w:type="dxa" w:w="2000"/>
+            <w:shd w:fill="F3F4F6" w:color="auto" w:val="clear"/>
+            <w:tcMar>
+              <w:top w:type="dxa" w:w="60"/>
+              <w:left w:type="dxa" w:w="90"/>
+              <w:bottom w:type="dxa" w:w="60"/>
+              <w:right w:type="dxa" w:w="90"/>
+            </w:tcMar>
+            <w:vAlign w:val="center"/>
+          </w:tcPr>
+          <w:p>
+            <w:r>
+              <w:rPr>
+                <w:b w:val="false"/>
+                <w:bCs w:val="false"/>
+                <w:color w:val="1F2937"/>
+                <w:sz w:val="17"/>
+                <w:szCs w:val="17"/>
+              </w:rPr>
+              <w:t xml:space="preserve">H2 "Keeping a record of what changed" + a 3-round worked example</w:t>
+            </w:r>
+          </w:p>
+        </w:tc>
+        <w:tc>
+          <w:tcPr>
+            <w:tcW w:type="dxa" w:w="1200"/>
+            <w:shd w:fill="F3F4F6" w:color="auto" w:val="clear"/>
+            <w:tcMar>
+              <w:top w:type="dxa" w:w="60"/>
+              <w:left w:type="dxa" w:w="90"/>
+              <w:bottom w:type="dxa" w:w="60"/>
+              <w:right w:type="dxa" w:w="90"/>
+            </w:tcMar>
+            <w:vAlign w:val="center"/>
+          </w:tcPr>
+          <w:p>
+            <w:r>
+              <w:rPr>
+                <w:b w:val="false"/>
+                <w:bCs w:val="false"/>
+                <w:color w:val="1F2937"/>
+                <w:sz w:val="17"/>
+                <w:szCs w:val="17"/>
+              </w:rPr>
+              <w:t xml:space="preserve">MEDIUM</w:t>
+            </w:r>
+          </w:p>
+        </w:tc>
+        <w:tc>
+          <w:tcPr>
+            <w:tcW w:type="dxa" w:w="2100"/>
+            <w:shd w:fill="F3F4F6" w:color="auto" w:val="clear"/>
+            <w:tcMar>
+              <w:top w:type="dxa" w:w="60"/>
+              <w:left w:type="dxa" w:w="90"/>
+              <w:bottom w:type="dxa" w:w="60"/>
+              <w:right w:type="dxa" w:w="90"/>
+            </w:tcMar>
+            <w:vAlign w:val="center"/>
+          </w:tcPr>
+          <w:p>
+            <w:r>
+              <w:rPr>
+                <w:b w:val="false"/>
+                <w:bCs w:val="false"/>
+                <w:color w:val="1F2937"/>
+                <w:sz w:val="17"/>
+                <w:szCs w:val="17"/>
+              </w:rPr>
+              <w:t xml:space="preserve">Same underlying concept</w:t>
+            </w:r>
+          </w:p>
+        </w:tc>
+        <w:tc>
+          <w:tcPr>
+            <w:tcW w:type="dxa" w:w="1600"/>
+            <w:shd w:fill="F3F4F6" w:color="auto" w:val="clear"/>
+            <w:tcMar>
+              <w:top w:type="dxa" w:w="60"/>
+              <w:left w:type="dxa" w:w="90"/>
+              <w:bottom w:type="dxa" w:w="60"/>
+              <w:right w:type="dxa" w:w="90"/>
+            </w:tcMar>
+            <w:vAlign w:val="center"/>
+          </w:tcPr>
+          <w:p>
+            <w:r>
+              <w:rPr>
+                <w:b w:val="false"/>
+                <w:bCs w:val="false"/>
+                <w:color w:val="1F2937"/>
+                <w:sz w:val="17"/>
+                <w:szCs w:val="17"/>
+              </w:rPr>
+              <w:t xml:space="preserve">Low — clientUpdates is shared template structure, not bespoke to this pair</w:t>
+            </w:r>
+          </w:p>
+        </w:tc>
+        <w:tc>
+          <w:tcPr>
+            <w:tcW w:type="dxa" w:w="2114"/>
+            <w:shd w:fill="F3F4F6" w:color="auto" w:val="clear"/>
+            <w:tcMar>
+              <w:top w:type="dxa" w:w="60"/>
+              <w:left w:type="dxa" w:w="90"/>
+              <w:bottom w:type="dxa" w:w="60"/>
+              <w:right w:type="dxa" w:w="90"/>
+            </w:tcMar>
+            <w:vAlign w:val="center"/>
+          </w:tcPr>
+          <w:p>
+            <w:r>
+              <w:rPr>
+                <w:b w:val="false"/>
+                <w:bCs w:val="false"/>
+                <w:color w:val="1F2937"/>
+                <w:sz w:val="17"/>
+                <w:szCs w:val="17"/>
+              </w:rPr>
+              <w:t xml:space="preserve">No action — template-level, not specific to this page pair</w:t>
+            </w:r>
+          </w:p>
+        </w:tc>
+      </w:tr>
+      <w:tr>
+        <w:tc>
+          <w:tcPr>
+            <w:tcW w:type="dxa" w:w="1500"/>
+            <w:tcMar>
+              <w:top w:type="dxa" w:w="60"/>
+              <w:left w:type="dxa" w:w="90"/>
+              <w:bottom w:type="dxa" w:w="60"/>
+              <w:right w:type="dxa" w:w="90"/>
+            </w:tcMar>
+            <w:vAlign w:val="center"/>
+          </w:tcPr>
+          <w:p>
+            <w:r>
+              <w:rPr>
+                <w:b w:val="false"/>
+                <w:bCs w:val="false"/>
+                <w:color w:val="1F2937"/>
+                <w:sz w:val="17"/>
+                <w:szCs w:val="17"/>
+              </w:rPr>
+              <w:t xml:space="preserve">Screenshot/marked-up feedback</w:t>
+            </w:r>
+          </w:p>
+        </w:tc>
+        <w:tc>
+          <w:tcPr>
+            <w:tcW w:type="dxa" w:w="2000"/>
+            <w:tcMar>
+              <w:top w:type="dxa" w:w="60"/>
+              <w:left w:type="dxa" w:w="90"/>
+              <w:bottom w:type="dxa" w:w="60"/>
+              <w:right w:type="dxa" w:w="90"/>
+            </w:tcMar>
+            <w:vAlign w:val="center"/>
+          </w:tcPr>
+          <w:p>
+            <w:r>
+              <w:rPr>
+                <w:b w:val="false"/>
+                <w:bCs w:val="false"/>
+                <w:color w:val="1F2937"/>
+                <w:sz w:val="17"/>
+                <w:szCs w:val="17"/>
+              </w:rPr>
+              <w:t xml:space="preserve">FAQ Q3 + hero mention</w:t>
+            </w:r>
+          </w:p>
+        </w:tc>
+        <w:tc>
+          <w:tcPr>
+            <w:tcW w:type="dxa" w:w="2000"/>
+            <w:tcMar>
+              <w:top w:type="dxa" w:w="60"/>
+              <w:left w:type="dxa" w:w="90"/>
+              <w:bottom w:type="dxa" w:w="60"/>
+              <w:right w:type="dxa" w:w="90"/>
+            </w:tcMar>
+            <w:vAlign w:val="center"/>
+          </w:tcPr>
+          <w:p>
+            <w:r>
+              <w:rPr>
+                <w:b w:val="false"/>
+                <w:bCs w:val="false"/>
+                <w:color w:val="1F2937"/>
+                <w:sz w:val="17"/>
+                <w:szCs w:val="17"/>
+              </w:rPr>
+              <w:t xml:space="preserve">One paragraph in "Where Text2Task fits"</w:t>
+            </w:r>
+          </w:p>
+        </w:tc>
+        <w:tc>
+          <w:tcPr>
+            <w:tcW w:type="dxa" w:w="1200"/>
+            <w:tcMar>
+              <w:top w:type="dxa" w:w="60"/>
+              <w:left w:type="dxa" w:w="90"/>
+              <w:bottom w:type="dxa" w:w="60"/>
+              <w:right w:type="dxa" w:w="90"/>
+            </w:tcMar>
+            <w:vAlign w:val="center"/>
+          </w:tcPr>
+          <w:p>
+            <w:r>
+              <w:rPr>
+                <w:b w:val="false"/>
+                <w:bCs w:val="false"/>
+                <w:color w:val="1F2937"/>
+                <w:sz w:val="17"/>
+                <w:szCs w:val="17"/>
+              </w:rPr>
+              <w:t xml:space="preserve">LOW</w:t>
+            </w:r>
+          </w:p>
+        </w:tc>
+        <w:tc>
+          <w:tcPr>
+            <w:tcW w:type="dxa" w:w="2100"/>
+            <w:tcMar>
+              <w:top w:type="dxa" w:w="60"/>
+              <w:left w:type="dxa" w:w="90"/>
+              <w:bottom w:type="dxa" w:w="60"/>
+              <w:right w:type="dxa" w:w="90"/>
+            </w:tcMar>
+            <w:vAlign w:val="center"/>
+          </w:tcPr>
+          <w:p>
+            <w:r>
+              <w:rPr>
+                <w:b w:val="false"/>
+                <w:bCs w:val="false"/>
+                <w:color w:val="1F2937"/>
+                <w:sz w:val="17"/>
+                <w:szCs w:val="17"/>
+              </w:rPr>
+              <w:t xml:space="preserve">Low</w:t>
+            </w:r>
+          </w:p>
+        </w:tc>
+        <w:tc>
+          <w:tcPr>
+            <w:tcW w:type="dxa" w:w="1600"/>
+            <w:tcMar>
+              <w:top w:type="dxa" w:w="60"/>
+              <w:left w:type="dxa" w:w="90"/>
+              <w:bottom w:type="dxa" w:w="60"/>
+              <w:right w:type="dxa" w:w="90"/>
+            </w:tcMar>
+            <w:vAlign w:val="center"/>
+          </w:tcPr>
+          <w:p>
+            <w:r>
+              <w:rPr>
+                <w:b w:val="false"/>
+                <w:bCs w:val="false"/>
+                <w:color w:val="1F2937"/>
+                <w:sz w:val="17"/>
+                <w:szCs w:val="17"/>
+              </w:rPr>
+              <w:t xml:space="preserve">Low</w:t>
+            </w:r>
+          </w:p>
+        </w:tc>
+        <w:tc>
+          <w:tcPr>
+            <w:tcW w:type="dxa" w:w="2114"/>
+            <w:tcMar>
+              <w:top w:type="dxa" w:w="60"/>
+              <w:left w:type="dxa" w:w="90"/>
+              <w:bottom w:type="dxa" w:w="60"/>
+              <w:right w:type="dxa" w:w="90"/>
+            </w:tcMar>
+            <w:vAlign w:val="center"/>
+          </w:tcPr>
+          <w:p>
+            <w:r>
+              <w:rPr>
+                <w:b w:val="false"/>
+                <w:bCs w:val="false"/>
+                <w:color w:val="1F2937"/>
+                <w:sz w:val="17"/>
+                <w:szCs w:val="17"/>
+              </w:rPr>
+              <w:t xml:space="preserve">No action</w:t>
+            </w:r>
+          </w:p>
+        </w:tc>
+      </w:tr>
+      <w:tr>
+        <w:tc>
+          <w:tcPr>
+            <w:tcW w:type="dxa" w:w="1500"/>
+            <w:shd w:fill="F3F4F6" w:color="auto" w:val="clear"/>
+            <w:tcMar>
+              <w:top w:type="dxa" w:w="60"/>
+              <w:left w:type="dxa" w:w="90"/>
+              <w:bottom w:type="dxa" w:w="60"/>
+              <w:right w:type="dxa" w:w="90"/>
+            </w:tcMar>
+            <w:vAlign w:val="center"/>
+          </w:tcPr>
+          <w:p>
+            <w:r>
+              <w:rPr>
+                <w:b w:val="false"/>
+                <w:bCs w:val="false"/>
+                <w:color w:val="1F2937"/>
+                <w:sz w:val="17"/>
+                <w:szCs w:val="17"/>
+              </w:rPr>
+              <w:t xml:space="preserve">Workflow steps</w:t>
+            </w:r>
+          </w:p>
+        </w:tc>
+        <w:tc>
+          <w:tcPr>
+            <w:tcW w:type="dxa" w:w="2000"/>
+            <w:shd w:fill="F3F4F6" w:color="auto" w:val="clear"/>
+            <w:tcMar>
+              <w:top w:type="dxa" w:w="60"/>
+              <w:left w:type="dxa" w:w="90"/>
+              <w:bottom w:type="dxa" w:w="60"/>
+              <w:right w:type="dxa" w:w="90"/>
+            </w:tcMar>
+            <w:vAlign w:val="center"/>
+          </w:tcPr>
+          <w:p>
+            <w:r>
+              <w:rPr>
+                <w:b w:val="false"/>
+                <w:bCs w:val="false"/>
+                <w:color w:val="1F2937"/>
+                <w:sz w:val="17"/>
+                <w:szCs w:val="17"/>
+              </w:rPr>
+              <w:t xml:space="preserve">3 tool-UI steps (capture / check page / save)</w:t>
+            </w:r>
+          </w:p>
+        </w:tc>
+        <w:tc>
+          <w:tcPr>
+            <w:tcW w:type="dxa" w:w="2000"/>
+            <w:shd w:fill="F3F4F6" w:color="auto" w:val="clear"/>
+            <w:tcMar>
+              <w:top w:type="dxa" w:w="60"/>
+              <w:left w:type="dxa" w:w="90"/>
+              <w:bottom w:type="dxa" w:w="60"/>
+              <w:right w:type="dxa" w:w="90"/>
+            </w:tcMar>
+            <w:vAlign w:val="center"/>
+          </w:tcPr>
+          <w:p>
+            <w:r>
+              <w:rPr>
+                <w:b w:val="false"/>
+                <w:bCs w:val="false"/>
+                <w:color w:val="1F2937"/>
+                <w:sz w:val="17"/>
+                <w:szCs w:val="17"/>
+              </w:rPr>
+              <w:t xml:space="preserve">5-step general methodology (separate / keep note / flag / link / mark status)</w:t>
+            </w:r>
+          </w:p>
+        </w:tc>
+        <w:tc>
+          <w:tcPr>
+            <w:tcW w:type="dxa" w:w="1200"/>
+            <w:shd w:fill="F3F4F6" w:color="auto" w:val="clear"/>
+            <w:tcMar>
+              <w:top w:type="dxa" w:w="60"/>
+              <w:left w:type="dxa" w:w="90"/>
+              <w:bottom w:type="dxa" w:w="60"/>
+              <w:right w:type="dxa" w:w="90"/>
+            </w:tcMar>
+            <w:vAlign w:val="center"/>
+          </w:tcPr>
+          <w:p>
+            <w:r>
+              <w:rPr>
+                <w:b w:val="false"/>
+                <w:bCs w:val="false"/>
+                <w:color w:val="1F2937"/>
+                <w:sz w:val="17"/>
+                <w:szCs w:val="17"/>
+              </w:rPr>
+              <w:t xml:space="preserve">LOW-MEDIUM</w:t>
+            </w:r>
+          </w:p>
+        </w:tc>
+        <w:tc>
+          <w:tcPr>
+            <w:tcW w:type="dxa" w:w="2100"/>
+            <w:shd w:fill="F3F4F6" w:color="auto" w:val="clear"/>
+            <w:tcMar>
+              <w:top w:type="dxa" w:w="60"/>
+              <w:left w:type="dxa" w:w="90"/>
+              <w:bottom w:type="dxa" w:w="60"/>
+              <w:right w:type="dxa" w:w="90"/>
+            </w:tcMar>
+            <w:vAlign w:val="center"/>
+          </w:tcPr>
+          <w:p>
+            <w:r>
+              <w:rPr>
+                <w:b w:val="false"/>
+                <w:bCs w:val="false"/>
+                <w:color w:val="1F2937"/>
+                <w:sz w:val="17"/>
+                <w:szCs w:val="17"/>
+              </w:rPr>
+              <w:t xml:space="preserve">Different granularity and framing (tool steps vs. methodology)</w:t>
+            </w:r>
+          </w:p>
+        </w:tc>
+        <w:tc>
+          <w:tcPr>
+            <w:tcW w:type="dxa" w:w="1600"/>
+            <w:shd w:fill="F3F4F6" w:color="auto" w:val="clear"/>
+            <w:tcMar>
+              <w:top w:type="dxa" w:w="60"/>
+              <w:left w:type="dxa" w:w="90"/>
+              <w:bottom w:type="dxa" w:w="60"/>
+              <w:right w:type="dxa" w:w="90"/>
+            </w:tcMar>
+            <w:vAlign w:val="center"/>
+          </w:tcPr>
+          <w:p>
+            <w:r>
+              <w:rPr>
+                <w:b w:val="false"/>
+                <w:bCs w:val="false"/>
+                <w:color w:val="1F2937"/>
+                <w:sz w:val="17"/>
+                <w:szCs w:val="17"/>
+              </w:rPr>
+              <w:t xml:space="preserve">Low</w:t>
+            </w:r>
+          </w:p>
+        </w:tc>
+        <w:tc>
+          <w:tcPr>
+            <w:tcW w:type="dxa" w:w="2114"/>
+            <w:shd w:fill="F3F4F6" w:color="auto" w:val="clear"/>
+            <w:tcMar>
+              <w:top w:type="dxa" w:w="60"/>
+              <w:left w:type="dxa" w:w="90"/>
+              <w:bottom w:type="dxa" w:w="60"/>
+              <w:right w:type="dxa" w:w="90"/>
+            </w:tcMar>
+            <w:vAlign w:val="center"/>
+          </w:tcPr>
+          <w:p>
+            <w:r>
+              <w:rPr>
+                <w:b w:val="false"/>
+                <w:bCs w:val="false"/>
+                <w:color w:val="1F2937"/>
+                <w:sz w:val="17"/>
+                <w:szCs w:val="17"/>
+              </w:rPr>
+              <w:t xml:space="preserve">No action — appropriately different</w:t>
+            </w:r>
+          </w:p>
+        </w:tc>
+      </w:tr>
+      <w:tr>
+        <w:tc>
+          <w:tcPr>
+            <w:tcW w:type="dxa" w:w="1500"/>
+            <w:tcMar>
+              <w:top w:type="dxa" w:w="60"/>
+              <w:left w:type="dxa" w:w="90"/>
+              <w:bottom w:type="dxa" w:w="60"/>
+              <w:right w:type="dxa" w:w="90"/>
+            </w:tcMar>
+            <w:vAlign w:val="center"/>
+          </w:tcPr>
+          <w:p>
+            <w:r>
+              <w:rPr>
+                <w:b w:val="false"/>
+                <w:bCs w:val="false"/>
+                <w:color w:val="1F2937"/>
+                <w:sz w:val="17"/>
+                <w:szCs w:val="17"/>
+              </w:rPr>
+              <w:t xml:space="preserve">Audience references</w:t>
+            </w:r>
+          </w:p>
+        </w:tc>
+        <w:tc>
+          <w:tcPr>
+            <w:tcW w:type="dxa" w:w="2000"/>
+            <w:tcMar>
+              <w:top w:type="dxa" w:w="60"/>
+              <w:left w:type="dxa" w:w="90"/>
+              <w:bottom w:type="dxa" w:w="60"/>
+              <w:right w:type="dxa" w:w="90"/>
+            </w:tcMar>
+            <w:vAlign w:val="center"/>
+          </w:tcPr>
+          <w:p>
+            <w:r>
+              <w:rPr>
+                <w:b w:val="false"/>
+                <w:bCs w:val="false"/>
+                <w:color w:val="1F2937"/>
+                <w:sz w:val="17"/>
+                <w:szCs w:val="17"/>
+              </w:rPr>
+              <w:t xml:space="preserve">"Web Designers" only</w:t>
+            </w:r>
+          </w:p>
+        </w:tc>
+        <w:tc>
+          <w:tcPr>
+            <w:tcW w:type="dxa" w:w="2000"/>
+            <w:tcMar>
+              <w:top w:type="dxa" w:w="60"/>
+              <w:left w:type="dxa" w:w="90"/>
+              <w:bottom w:type="dxa" w:w="60"/>
+              <w:right w:type="dxa" w:w="90"/>
+            </w:tcMar>
+            <w:vAlign w:val="center"/>
+          </w:tcPr>
+          <w:p>
+            <w:r>
+              <w:rPr>
+                <w:b w:val="false"/>
+                <w:bCs w:val="false"/>
+                <w:color w:val="1F2937"/>
+                <w:sz w:val="17"/>
+                <w:szCs w:val="17"/>
+              </w:rPr>
+              <w:t xml:space="preserve">"Web designers" + WordPress/Webflow freelancers + small agencies</w:t>
+            </w:r>
+          </w:p>
+        </w:tc>
+        <w:tc>
+          <w:tcPr>
+            <w:tcW w:type="dxa" w:w="1200"/>
+            <w:tcMar>
+              <w:top w:type="dxa" w:w="60"/>
+              <w:left w:type="dxa" w:w="90"/>
+              <w:bottom w:type="dxa" w:w="60"/>
+              <w:right w:type="dxa" w:w="90"/>
+            </w:tcMar>
+            <w:vAlign w:val="center"/>
+          </w:tcPr>
+          <w:p>
+            <w:r>
+              <w:rPr>
+                <w:b w:val="false"/>
+                <w:bCs w:val="false"/>
+                <w:color w:val="1F2937"/>
+                <w:sz w:val="17"/>
+                <w:szCs w:val="17"/>
+              </w:rPr>
+              <w:t xml:space="preserve">LOW</w:t>
+            </w:r>
+          </w:p>
+        </w:tc>
+        <w:tc>
+          <w:tcPr>
+            <w:tcW w:type="dxa" w:w="2100"/>
+            <w:tcMar>
+              <w:top w:type="dxa" w:w="60"/>
+              <w:left w:type="dxa" w:w="90"/>
+              <w:bottom w:type="dxa" w:w="60"/>
+              <w:right w:type="dxa" w:w="90"/>
+            </w:tcMar>
+            <w:vAlign w:val="center"/>
+          </w:tcPr>
+          <w:p>
+            <w:r>
+              <w:rPr>
+                <w:b w:val="false"/>
+                <w:bCs w:val="false"/>
+                <w:color w:val="1F2937"/>
+                <w:sz w:val="17"/>
+                <w:szCs w:val="17"/>
+              </w:rPr>
+              <w:t xml:space="preserve">Low</w:t>
+            </w:r>
+          </w:p>
+        </w:tc>
+        <w:tc>
+          <w:tcPr>
+            <w:tcW w:type="dxa" w:w="1600"/>
+            <w:tcMar>
+              <w:top w:type="dxa" w:w="60"/>
+              <w:left w:type="dxa" w:w="90"/>
+              <w:bottom w:type="dxa" w:w="60"/>
+              <w:right w:type="dxa" w:w="90"/>
+            </w:tcMar>
+            <w:vAlign w:val="center"/>
+          </w:tcPr>
+          <w:p>
+            <w:r>
+              <w:rPr>
+                <w:b w:val="false"/>
+                <w:bCs w:val="false"/>
+                <w:color w:val="1F2937"/>
+                <w:sz w:val="17"/>
+                <w:szCs w:val="17"/>
+              </w:rPr>
+              <w:t xml:space="preserve">Low</w:t>
+            </w:r>
+          </w:p>
+        </w:tc>
+        <w:tc>
+          <w:tcPr>
+            <w:tcW w:type="dxa" w:w="2114"/>
+            <w:tcMar>
+              <w:top w:type="dxa" w:w="60"/>
+              <w:left w:type="dxa" w:w="90"/>
+              <w:bottom w:type="dxa" w:w="60"/>
+              <w:right w:type="dxa" w:w="90"/>
+            </w:tcMar>
+            <w:vAlign w:val="center"/>
+          </w:tcPr>
+          <w:p>
+            <w:r>
+              <w:rPr>
+                <w:b w:val="false"/>
+                <w:bCs w:val="false"/>
+                <w:color w:val="1F2937"/>
+                <w:sz w:val="17"/>
+                <w:szCs w:val="17"/>
+              </w:rPr>
+              <w:t xml:space="preserve">No action</w:t>
+            </w:r>
+          </w:p>
+        </w:tc>
+      </w:tr>
+      <w:tr>
+        <w:tc>
+          <w:tcPr>
+            <w:tcW w:type="dxa" w:w="1500"/>
+            <w:shd w:fill="F3F4F6" w:color="auto" w:val="clear"/>
+            <w:tcMar>
+              <w:top w:type="dxa" w:w="60"/>
+              <w:left w:type="dxa" w:w="90"/>
+              <w:bottom w:type="dxa" w:w="60"/>
+              <w:right w:type="dxa" w:w="90"/>
+            </w:tcMar>
+            <w:vAlign w:val="center"/>
+          </w:tcPr>
+          <w:p>
+            <w:r>
+              <w:rPr>
+                <w:b w:val="false"/>
+                <w:bCs w:val="false"/>
+                <w:color w:val="1F2937"/>
+                <w:sz w:val="17"/>
+                <w:szCs w:val="17"/>
+              </w:rPr>
+              <w:t xml:space="preserve">CTA language</w:t>
+            </w:r>
+          </w:p>
+        </w:tc>
+        <w:tc>
+          <w:tcPr>
+            <w:tcW w:type="dxa" w:w="2000"/>
+            <w:shd w:fill="F3F4F6" w:color="auto" w:val="clear"/>
+            <w:tcMar>
+              <w:top w:type="dxa" w:w="60"/>
+              <w:left w:type="dxa" w:w="90"/>
+              <w:bottom w:type="dxa" w:w="60"/>
+              <w:right w:type="dxa" w:w="90"/>
+            </w:tcMar>
+            <w:vAlign w:val="center"/>
+          </w:tcPr>
+          <w:p>
+            <w:r>
+              <w:rPr>
+                <w:b w:val="false"/>
+                <w:bCs w:val="false"/>
+                <w:color w:val="1F2937"/>
+                <w:sz w:val="17"/>
+                <w:szCs w:val="17"/>
+              </w:rPr>
+              <w:t xml:space="preserve">"Try Text2Task" / "Start free"</w:t>
+            </w:r>
+          </w:p>
+        </w:tc>
+        <w:tc>
+          <w:tcPr>
+            <w:tcW w:type="dxa" w:w="2000"/>
+            <w:shd w:fill="F3F4F6" w:color="auto" w:val="clear"/>
+            <w:tcMar>
+              <w:top w:type="dxa" w:w="60"/>
+              <w:left w:type="dxa" w:w="90"/>
+              <w:bottom w:type="dxa" w:w="60"/>
+              <w:right w:type="dxa" w:w="90"/>
+            </w:tcMar>
+            <w:vAlign w:val="center"/>
+          </w:tcPr>
+          <w:p>
+            <w:r>
+              <w:rPr>
+                <w:b w:val="false"/>
+                <w:bCs w:val="false"/>
+                <w:color w:val="1F2937"/>
+                <w:sz w:val="17"/>
+                <w:szCs w:val="17"/>
+              </w:rPr>
+              <w:t xml:space="preserve">"Try Text2Task free"</w:t>
+            </w:r>
+          </w:p>
+        </w:tc>
+        <w:tc>
+          <w:tcPr>
+            <w:tcW w:type="dxa" w:w="1200"/>
+            <w:shd w:fill="F3F4F6" w:color="auto" w:val="clear"/>
+            <w:tcMar>
+              <w:top w:type="dxa" w:w="60"/>
+              <w:left w:type="dxa" w:w="90"/>
+              <w:bottom w:type="dxa" w:w="60"/>
+              <w:right w:type="dxa" w:w="90"/>
+            </w:tcMar>
+            <w:vAlign w:val="center"/>
+          </w:tcPr>
+          <w:p>
+            <w:r>
+              <w:rPr>
+                <w:b w:val="false"/>
+                <w:bCs w:val="false"/>
+                <w:color w:val="1F2937"/>
+                <w:sz w:val="17"/>
+                <w:szCs w:val="17"/>
+              </w:rPr>
+              <w:t xml:space="preserve">LOW</w:t>
+            </w:r>
+          </w:p>
+        </w:tc>
+        <w:tc>
+          <w:tcPr>
+            <w:tcW w:type="dxa" w:w="2100"/>
+            <w:shd w:fill="F3F4F6" w:color="auto" w:val="clear"/>
+            <w:tcMar>
+              <w:top w:type="dxa" w:w="60"/>
+              <w:left w:type="dxa" w:w="90"/>
+              <w:bottom w:type="dxa" w:w="60"/>
+              <w:right w:type="dxa" w:w="90"/>
+            </w:tcMar>
+            <w:vAlign w:val="center"/>
+          </w:tcPr>
+          <w:p>
+            <w:r>
+              <w:rPr>
+                <w:b w:val="false"/>
+                <w:bCs w:val="false"/>
+                <w:color w:val="1F2937"/>
+                <w:sz w:val="17"/>
+                <w:szCs w:val="17"/>
+              </w:rPr>
+              <w:t xml:space="preserve">Generic sitewide phrasing</w:t>
+            </w:r>
+          </w:p>
+        </w:tc>
+        <w:tc>
+          <w:tcPr>
+            <w:tcW w:type="dxa" w:w="1600"/>
+            <w:shd w:fill="F3F4F6" w:color="auto" w:val="clear"/>
+            <w:tcMar>
+              <w:top w:type="dxa" w:w="60"/>
+              <w:left w:type="dxa" w:w="90"/>
+              <w:bottom w:type="dxa" w:w="60"/>
+              <w:right w:type="dxa" w:w="90"/>
+            </w:tcMar>
+            <w:vAlign w:val="center"/>
+          </w:tcPr>
+          <w:p>
+            <w:r>
+              <w:rPr>
+                <w:b w:val="false"/>
+                <w:bCs w:val="false"/>
+                <w:color w:val="1F2937"/>
+                <w:sz w:val="17"/>
+                <w:szCs w:val="17"/>
+              </w:rPr>
+              <w:t xml:space="preserve">Low</w:t>
+            </w:r>
+          </w:p>
+        </w:tc>
+        <w:tc>
+          <w:tcPr>
+            <w:tcW w:type="dxa" w:w="2114"/>
+            <w:shd w:fill="F3F4F6" w:color="auto" w:val="clear"/>
+            <w:tcMar>
+              <w:top w:type="dxa" w:w="60"/>
+              <w:left w:type="dxa" w:w="90"/>
+              <w:bottom w:type="dxa" w:w="60"/>
+              <w:right w:type="dxa" w:w="90"/>
+            </w:tcMar>
+            <w:vAlign w:val="center"/>
+          </w:tcPr>
+          <w:p>
+            <w:r>
+              <w:rPr>
+                <w:b w:val="false"/>
+                <w:bCs w:val="false"/>
+                <w:color w:val="1F2937"/>
+                <w:sz w:val="17"/>
+                <w:szCs w:val="17"/>
+              </w:rPr>
+              <w:t xml:space="preserve">No action</w:t>
+            </w:r>
+          </w:p>
+        </w:tc>
+      </w:tr>
+      <w:tr>
+        <w:tc>
+          <w:tcPr>
+            <w:tcW w:type="dxa" w:w="1500"/>
+            <w:tcMar>
+              <w:top w:type="dxa" w:w="60"/>
+              <w:left w:type="dxa" w:w="90"/>
+              <w:bottom w:type="dxa" w:w="60"/>
+              <w:right w:type="dxa" w:w="90"/>
+            </w:tcMar>
+            <w:vAlign w:val="center"/>
+          </w:tcPr>
+          <w:p>
+            <w:r>
+              <w:rPr>
+                <w:b w:val="false"/>
+                <w:bCs w:val="false"/>
+                <w:color w:val="1F2937"/>
+                <w:sz w:val="17"/>
+                <w:szCs w:val="17"/>
+              </w:rPr>
+              <w:t xml:space="preserve">Internal anchors</w:t>
+            </w:r>
+          </w:p>
+        </w:tc>
+        <w:tc>
+          <w:tcPr>
+            <w:tcW w:type="dxa" w:w="2000"/>
+            <w:tcMar>
+              <w:top w:type="dxa" w:w="60"/>
+              <w:left w:type="dxa" w:w="90"/>
+              <w:bottom w:type="dxa" w:w="60"/>
+              <w:right w:type="dxa" w:w="90"/>
+            </w:tcMar>
+            <w:vAlign w:val="center"/>
+          </w:tcPr>
+          <w:p>
+            <w:r>
+              <w:rPr>
+                <w:b w:val="false"/>
+                <w:bCs w:val="false"/>
+                <w:color w:val="1F2937"/>
+                <w:sz w:val="17"/>
+                <w:szCs w:val="17"/>
+              </w:rPr>
+              <w:t xml:space="preserve">→ Resource, descriptive, non-exact-match</w:t>
+            </w:r>
+          </w:p>
+        </w:tc>
+        <w:tc>
+          <w:tcPr>
+            <w:tcW w:type="dxa" w:w="2000"/>
+            <w:tcMar>
+              <w:top w:type="dxa" w:w="60"/>
+              <w:left w:type="dxa" w:w="90"/>
+              <w:bottom w:type="dxa" w:w="60"/>
+              <w:right w:type="dxa" w:w="90"/>
+            </w:tcMar>
+            <w:vAlign w:val="center"/>
+          </w:tcPr>
+          <w:p>
+            <w:r>
+              <w:rPr>
+                <w:b w:val="false"/>
+                <w:bCs w:val="false"/>
+                <w:color w:val="1F2937"/>
+                <w:sz w:val="17"/>
+                <w:szCs w:val="17"/>
+              </w:rPr>
+              <w:t xml:space="preserve">→ Use Case, descriptive, non-exact-match</w:t>
+            </w:r>
+          </w:p>
+        </w:tc>
+        <w:tc>
+          <w:tcPr>
+            <w:tcW w:type="dxa" w:w="1200"/>
+            <w:tcMar>
+              <w:top w:type="dxa" w:w="60"/>
+              <w:left w:type="dxa" w:w="90"/>
+              <w:bottom w:type="dxa" w:w="60"/>
+              <w:right w:type="dxa" w:w="90"/>
+            </w:tcMar>
+            <w:vAlign w:val="center"/>
+          </w:tcPr>
+          <w:p>
+            <w:r>
+              <w:rPr>
+                <w:b w:val="false"/>
+                <w:bCs w:val="false"/>
+                <w:color w:val="1F2937"/>
+                <w:sz w:val="17"/>
+                <w:szCs w:val="17"/>
+              </w:rPr>
+              <w:t xml:space="preserve">N/A (healthy)</w:t>
+            </w:r>
+          </w:p>
+        </w:tc>
+        <w:tc>
+          <w:tcPr>
+            <w:tcW w:type="dxa" w:w="2100"/>
+            <w:tcMar>
+              <w:top w:type="dxa" w:w="60"/>
+              <w:left w:type="dxa" w:w="90"/>
+              <w:bottom w:type="dxa" w:w="60"/>
+              <w:right w:type="dxa" w:w="90"/>
+            </w:tcMar>
+            <w:vAlign w:val="center"/>
+          </w:tcPr>
+          <w:p>
+            <w:r>
+              <w:rPr>
+                <w:b w:val="false"/>
+                <w:bCs w:val="false"/>
+                <w:color w:val="1F2937"/>
+                <w:sz w:val="17"/>
+                <w:szCs w:val="17"/>
+              </w:rPr>
+              <w:t xml:space="preserve">N/A</w:t>
+            </w:r>
+          </w:p>
+        </w:tc>
+        <w:tc>
+          <w:tcPr>
+            <w:tcW w:type="dxa" w:w="1600"/>
+            <w:tcMar>
+              <w:top w:type="dxa" w:w="60"/>
+              <w:left w:type="dxa" w:w="90"/>
+              <w:bottom w:type="dxa" w:w="60"/>
+              <w:right w:type="dxa" w:w="90"/>
+            </w:tcMar>
+            <w:vAlign w:val="center"/>
+          </w:tcPr>
+          <w:p>
+            <w:r>
+              <w:rPr>
+                <w:b w:val="false"/>
+                <w:bCs w:val="false"/>
+                <w:color w:val="1F2937"/>
+                <w:sz w:val="17"/>
+                <w:szCs w:val="17"/>
+              </w:rPr>
+              <w:t xml:space="preserve">N/A</w:t>
+            </w:r>
+          </w:p>
+        </w:tc>
+        <w:tc>
+          <w:tcPr>
+            <w:tcW w:type="dxa" w:w="2114"/>
+            <w:tcMar>
+              <w:top w:type="dxa" w:w="60"/>
+              <w:left w:type="dxa" w:w="90"/>
+              <w:bottom w:type="dxa" w:w="60"/>
+              <w:right w:type="dxa" w:w="90"/>
+            </w:tcMar>
+            <w:vAlign w:val="center"/>
+          </w:tcPr>
+          <w:p>
+            <w:r>
+              <w:rPr>
+                <w:b w:val="false"/>
+                <w:bCs w:val="false"/>
+                <w:color w:val="1F2937"/>
+                <w:sz w:val="17"/>
+                <w:szCs w:val="17"/>
+              </w:rPr>
+              <w:t xml:space="preserve">Keep as-is</w:t>
+            </w:r>
+          </w:p>
+        </w:tc>
+      </w:tr>
+    </w:tbl>
+    <w:p>
+      <w:pPr>
+        <w:spacing w:after="120"/>
+      </w:pPr>
+      <w:r>
+        <w:rPr>
+          <w:sz w:val="21"/>
+          <w:szCs w:val="21"/>
+        </w:rPr>
+        <w:t xml:space="preserve">Note: this table renders best in the portrait width available; cells were kept terse. The severity concentration is specific and useful — HIGH-severity items are all in the page's top-level identity layer (title, H1, hero intro), while mid-page and deep sections (workflow steps, FAQ depth, audience references, CTAs, the existing cross-links) are already appropriately differentiated. This significantly narrows the actual fix required.</w:t>
+      </w:r>
+    </w:p>
+    <w:p>
+      <w:pPr>
+        <w:pStyle w:val="Heading2"/>
+        <w:spacing w:after="120" w:before="260"/>
+      </w:pPr>
+      <w:r>
+        <w:rPr>
+          <w:b/>
+          <w:bCs/>
+          <w:color w:val="1D4ED8"/>
+          <w:sz w:val="26"/>
+          <w:szCs w:val="26"/>
+        </w:rPr>
+        <w:t xml:space="preserve">13.4 Cannibalization severity conclusion</w:t>
+      </w:r>
+    </w:p>
+    <w:p>
+      <w:pPr>
+        <w:pStyle w:val="ListParagraph"/>
+        <w:numPr>
+          <w:ilvl w:val="0"/>
+          <w:numId w:val="1"/>
+        </w:numPr>
+        <w:spacing w:after="60"/>
+      </w:pPr>
+      <w:r>
+        <w:rPr>
+          <w:sz w:val="21"/>
+          <w:szCs w:val="21"/>
+        </w:rPr>
+        <w:t xml:space="preserve">Overall: Medium-High, confirming the master blueprint's existing flag — but concentrated specifically in title, H1, and hero-intro framing, not spread evenly across the whole page.</w:t>
+      </w:r>
+    </w:p>
+    <w:p>
+      <w:pPr>
+        <w:pStyle w:val="ListParagraph"/>
+        <w:numPr>
+          <w:ilvl w:val="0"/>
+          <w:numId w:val="1"/>
+        </w:numPr>
+        <w:spacing w:after="60"/>
+      </w:pPr>
+      <w:r>
+        <w:rPr>
+          <w:sz w:val="21"/>
+          <w:szCs w:val="21"/>
+        </w:rPr>
+        <w:t xml:space="preserve">Root cause: the Use Case's page identity (title/H1) was authored narrowly around "revisions" specifically, rather than the broader web-designer client-work workflow every other Use Case covers — this is what created the overlap with the Resource, which correctly and deliberately owns the narrow "revisions" topic.</w:t>
+      </w:r>
+    </w:p>
+    <w:p>
+      <w:pPr>
+        <w:pStyle w:val="ListParagraph"/>
+        <w:numPr>
+          <w:ilvl w:val="0"/>
+          <w:numId w:val="1"/>
+        </w:numPr>
+        <w:spacing w:after="60"/>
+      </w:pPr>
+      <w:r>
+        <w:rPr>
+          <w:sz w:val="21"/>
+          <w:szCs w:val="21"/>
+        </w:rPr>
+        <w:t xml:space="preserve">Supporting evidence the imbalance is real and fixable at the identity layer only: the page's own listing.title/listing.description (used on the /use-cases index grid, not the detail page) are already broader ("Organize website revision requests" / "Turn client website feedback, mobile fixes, copy changes, assets, deadlines, and budgets into reviewable tasks.") than the detail page's own seo.title/H1 — the broader framing already exists elsewhere in the same config and simply was not carried into the page's own title/H1.</w:t>
+      </w:r>
+    </w:p>
+    <w:p>
+      <w:pPr>
+        <w:pStyle w:val="Heading2"/>
+        <w:spacing w:after="120" w:before="260"/>
+      </w:pPr>
+      <w:r>
+        <w:rPr>
+          <w:b/>
+          <w:bCs/>
+          <w:color w:val="1D4ED8"/>
+          <w:sz w:val="26"/>
+          <w:szCs w:val="26"/>
+        </w:rPr>
+        <w:t xml:space="preserve">13.5 Permanent intent boundary</w:t>
+      </w:r>
+    </w:p>
+    <w:p>
+      <w:pPr>
+        <w:pStyle w:val="ListParagraph"/>
+        <w:numPr>
+          <w:ilvl w:val="0"/>
+          <w:numId w:val="1"/>
+        </w:numPr>
+        <w:spacing w:after="60"/>
+      </w:pPr>
+      <w:r>
+        <w:rPr>
+          <w:sz w:val="21"/>
+          <w:szCs w:val="21"/>
+        </w:rPr>
+        <w:t xml:space="preserve">1. What should the Use Case own? The full web-designer audience-fit story — an initial client request becoming a project, AND revisions/feedback rounds tracked against it. Breadth, matching the other 11 Use Cases.</w:t>
+      </w:r>
+    </w:p>
+    <w:p>
+      <w:pPr>
+        <w:pStyle w:val="ListParagraph"/>
+        <w:numPr>
+          <w:ilvl w:val="0"/>
+          <w:numId w:val="1"/>
+        </w:numPr>
+        <w:spacing w:after="60"/>
+      </w:pPr>
+      <w:r>
+        <w:rPr>
+          <w:sz w:val="21"/>
+          <w:szCs w:val="21"/>
+        </w:rPr>
+        <w:t xml:space="preserve">2. What should the Resource own? The single, deep, evergreen "how to manage client revisions" topic — unchanged.</w:t>
+      </w:r>
+    </w:p>
+    <w:p>
+      <w:pPr>
+        <w:pStyle w:val="ListParagraph"/>
+        <w:numPr>
+          <w:ilvl w:val="0"/>
+          <w:numId w:val="1"/>
+        </w:numPr>
+        <w:spacing w:after="60"/>
+      </w:pPr>
+      <w:r>
+        <w:rPr>
+          <w:sz w:val="21"/>
+          <w:szCs w:val="21"/>
+        </w:rPr>
+        <w:t xml:space="preserve">3. Stronger for "manage client revisions"? The Resource.</w:t>
+      </w:r>
+    </w:p>
+    <w:p>
+      <w:pPr>
+        <w:pStyle w:val="ListParagraph"/>
+        <w:numPr>
+          <w:ilvl w:val="0"/>
+          <w:numId w:val="1"/>
+        </w:numPr>
+        <w:spacing w:after="60"/>
+      </w:pPr>
+      <w:r>
+        <w:rPr>
+          <w:sz w:val="21"/>
+          <w:szCs w:val="21"/>
+        </w:rPr>
+        <w:t xml:space="preserve">4. Stronger for "web designer project/task workflow" broadly? The Use Case, once rebalanced.</w:t>
+      </w:r>
+    </w:p>
+    <w:p>
+      <w:pPr>
+        <w:pStyle w:val="ListParagraph"/>
+        <w:numPr>
+          <w:ilvl w:val="0"/>
+          <w:numId w:val="1"/>
+        </w:numPr>
+        <w:spacing w:after="60"/>
+      </w:pPr>
+      <w:r>
+        <w:rPr>
+          <w:sz w:val="21"/>
+          <w:szCs w:val="21"/>
+        </w:rPr>
+        <w:t xml:space="preserve">5. Reason to merge/delete/canonicalize? None found. Default (keep both) holds — the overlap is a one-sided Use Case positioning imbalance, not a true duplicate-intent problem requiring structural change.</w:t>
+      </w:r>
+    </w:p>
+    <w:p>
+      <w:pPr>
+        <w:pStyle w:val="Heading2"/>
+        <w:spacing w:after="120" w:before="260"/>
+      </w:pPr>
+      <w:r>
+        <w:rPr>
+          <w:b/>
+          <w:bCs/>
+          <w:color w:val="1D4ED8"/>
+          <w:sz w:val="26"/>
+          <w:szCs w:val="26"/>
+        </w:rPr>
+        <w:t xml:space="preserve">13.6 Change decision per page</w:t>
+      </w:r>
+    </w:p>
+    <w:p>
+      <w:pPr>
+        <w:spacing w:after="120"/>
+      </w:pPr>
+      <w:r>
+        <w:rPr>
+          <w:b/>
+          <w:bCs/>
+          <w:sz w:val="21"/>
+          <w:szCs w:val="21"/>
+        </w:rPr>
+        <w:t xml:space="preserve">Use Case (/use-cases/web-designers): </w:t>
+      </w:r>
+      <w:r>
+        <w:rPr>
+          <w:sz w:val="21"/>
+          <w:szCs w:val="21"/>
+        </w:rPr>
+        <w:t xml:space="preserve">SUBSTANTIVE DIFFERENTIATION — but narrowly scoped to the page's identity layer only (interventions B + E: H1/hero refinement + title/description refinement). Not a full restructuring (F): capabilities, workflow, FAQ, proof, and the existing cross-link are already appropriately scoped and are NOT recommended for change.</w:t>
+      </w:r>
+    </w:p>
+    <w:p>
+      <w:pPr>
+        <w:spacing w:after="120"/>
+      </w:pPr>
+      <w:r>
+        <w:rPr>
+          <w:b/>
+          <w:bCs/>
+          <w:sz w:val="21"/>
+          <w:szCs w:val="21"/>
+        </w:rPr>
+        <w:t xml:space="preserve">Resource (/resources/manage-client-revisions-web-designers): </w:t>
+      </w:r>
+      <w:r>
+        <w:rPr>
+          <w:sz w:val="21"/>
+          <w:szCs w:val="21"/>
+        </w:rPr>
+        <w:t xml:space="preserve">NO CHANGE. It already correctly, narrowly, and deeply owns its topic; nothing on it contradicts the intent boundary in §13.5.</w:t>
+      </w:r>
+    </w:p>
+    <w:p>
+      <w:pPr>
+        <w:pStyle w:val="Heading2"/>
+        <w:spacing w:after="120" w:before="260"/>
+      </w:pPr>
+      <w:r>
+        <w:rPr>
+          <w:b/>
+          <w:bCs/>
+          <w:color w:val="1D4ED8"/>
+          <w:sz w:val="26"/>
+          <w:szCs w:val="26"/>
+        </w:rPr>
+        <w:t xml:space="preserve">13.7 Title / H1 / metadata decisions</w:t>
+      </w:r>
+    </w:p>
+    <w:p>
+      <w:pPr>
+        <w:pStyle w:val="ListParagraph"/>
+        <w:numPr>
+          <w:ilvl w:val="0"/>
+          <w:numId w:val="1"/>
+        </w:numPr>
+        <w:spacing w:after="60"/>
+      </w:pPr>
+      <w:r>
+        <w:rPr>
+          <w:sz w:val="21"/>
+          <w:szCs w:val="21"/>
+        </w:rPr>
+        <w:t xml:space="preserve">Use Case seo.title: SHOULD CHANGE. Currently narrows the whole page's identity around "revisions," the same topic the Resource already deeply owns — this is the HIGH-severity item driving the overlap.</w:t>
+      </w:r>
+    </w:p>
+    <w:p>
+      <w:pPr>
+        <w:pStyle w:val="ListParagraph"/>
+        <w:numPr>
+          <w:ilvl w:val="0"/>
+          <w:numId w:val="1"/>
+        </w:numPr>
+        <w:spacing w:after="60"/>
+      </w:pPr>
+      <w:r>
+        <w:rPr>
+          <w:sz w:val="21"/>
+          <w:szCs w:val="21"/>
+        </w:rPr>
+        <w:t xml:space="preserve">Use Case seo.description: LIKELY SHOULD CHANGE, as a secondary/consistency follow-on if the title changes — not required standalone, and not being changed merely because keywords overlap; the reason is that its current lead phrase ("revision emails") is narrower than the page's true intended scope.</w:t>
+      </w:r>
+    </w:p>
+    <w:p>
+      <w:pPr>
+        <w:pStyle w:val="ListParagraph"/>
+        <w:numPr>
+          <w:ilvl w:val="0"/>
+          <w:numId w:val="1"/>
+        </w:numPr>
+        <w:spacing w:after="60"/>
+      </w:pPr>
+      <w:r>
+        <w:rPr>
+          <w:sz w:val="21"/>
+          <w:szCs w:val="21"/>
+        </w:rPr>
+        <w:t xml:space="preserve">Use Case H1 (hero.title/hero.highlight): SHOULD CHANGE, for the same reason as the title — this is the page's actual rendered &lt;h1&gt;.</w:t>
+      </w:r>
+    </w:p>
+    <w:p>
+      <w:pPr>
+        <w:pStyle w:val="ListParagraph"/>
+        <w:numPr>
+          <w:ilvl w:val="0"/>
+          <w:numId w:val="1"/>
+        </w:numPr>
+        <w:spacing w:after="60"/>
+      </w:pPr>
+      <w:r>
+        <w:rPr>
+          <w:sz w:val="21"/>
+          <w:szCs w:val="21"/>
+        </w:rPr>
+        <w:t xml:space="preserve">Resource title/description/H1: NO CHANGE on all three — already correctly scoped, no evidence justifies touching them.</w:t>
+      </w:r>
+    </w:p>
+    <w:p>
+      <w:pPr>
+        <w:pStyle w:val="ListParagraph"/>
+        <w:numPr>
+          <w:ilvl w:val="0"/>
+          <w:numId w:val="1"/>
+        </w:numPr>
+        <w:spacing w:after="60"/>
+      </w:pPr>
+      <w:r>
+        <w:rPr>
+          <w:sz w:val="21"/>
+          <w:szCs w:val="21"/>
+        </w:rPr>
+        <w:t xml:space="preserve">Canonicals, routes, schema types, and the FAQ (Use Case) are NOT recommended for change on either page.</w:t>
+      </w:r>
+    </w:p>
+    <w:p>
+      <w:pPr>
+        <w:pStyle w:val="Heading2"/>
+        <w:spacing w:after="120" w:before="260"/>
+      </w:pPr>
+      <w:r>
+        <w:rPr>
+          <w:b/>
+          <w:bCs/>
+          <w:color w:val="1D4ED8"/>
+          <w:sz w:val="26"/>
+          <w:szCs w:val="26"/>
+        </w:rPr>
+        <w:t xml:space="preserve">13.8 Internal-link relationship</w:t>
+      </w:r>
+    </w:p>
+    <w:p>
+      <w:pPr>
+        <w:pStyle w:val="ListParagraph"/>
+        <w:numPr>
+          <w:ilvl w:val="0"/>
+          <w:numId w:val="1"/>
+        </w:numPr>
+        <w:spacing w:after="60"/>
+      </w:pPr>
+      <w:r>
+        <w:rPr>
+          <w:sz w:val="21"/>
+          <w:szCs w:val="21"/>
+        </w:rPr>
+        <w:t xml:space="preserve">The current bidirectional relationship is ALREADY the healthy pattern this phase looked for: Use Case → Resource (relatedLinks card, "How web designers can manage client revisions faster") and Resource → Use Case (inline link in "Where Text2Task fits," "web designers use case").</w:t>
+      </w:r>
+    </w:p>
+    <w:p>
+      <w:pPr>
+        <w:pStyle w:val="ListParagraph"/>
+        <w:numPr>
+          <w:ilvl w:val="0"/>
+          <w:numId w:val="1"/>
+        </w:numPr>
+        <w:spacing w:after="60"/>
+      </w:pPr>
+      <w:r>
+        <w:rPr>
+          <w:sz w:val="21"/>
+          <w:szCs w:val="21"/>
+        </w:rPr>
+        <w:t xml:space="preserve">Recommendation: KEEP AS-IS. Neither anchor text quotes the other page's literal H1, so a future H1/title change to the Use Case will not make either anchor read awkwardly or require an update.</w:t>
+      </w:r>
+    </w:p>
+    <w:p>
+      <w:pPr>
+        <w:pStyle w:val="ListParagraph"/>
+        <w:numPr>
+          <w:ilvl w:val="0"/>
+          <w:numId w:val="1"/>
+        </w:numPr>
+        <w:spacing w:after="60"/>
+      </w:pPr>
+      <w:r>
+        <w:rPr>
+          <w:sz w:val="21"/>
+          <w:szCs w:val="21"/>
+        </w:rPr>
+        <w:t xml:space="preserve">No new link is recommended in either direction.</w:t>
+      </w:r>
+    </w:p>
+    <w:p>
+      <w:pPr>
+        <w:pStyle w:val="Heading2"/>
+        <w:spacing w:after="120" w:before="260"/>
+      </w:pPr>
+      <w:r>
+        <w:rPr>
+          <w:b/>
+          <w:bCs/>
+          <w:color w:val="1D4ED8"/>
+          <w:sz w:val="26"/>
+          <w:szCs w:val="26"/>
+        </w:rPr>
+        <w:t xml:space="preserve">13.9 Product positioning check</w:t>
+      </w:r>
+    </w:p>
+    <w:p>
+      <w:pPr>
+        <w:pStyle w:val="ListParagraph"/>
+        <w:numPr>
+          <w:ilvl w:val="0"/>
+          <w:numId w:val="1"/>
+        </w:numPr>
+        <w:spacing w:after="60"/>
+      </w:pPr>
+      <w:r>
+        <w:rPr>
+          <w:sz w:val="21"/>
+          <w:szCs w:val="21"/>
+        </w:rPr>
+        <w:t xml:space="preserve">Risk confirmed: as currently written, the Use Case's title, H1, and hero all lead with "revision(s)" first, before any mention of an initial client request — this is exactly the drift §1/§8 warn against ("ensure the Web Designers Use Case does not make Text2Task sound like a revision-management-only tool").</w:t>
+      </w:r>
+    </w:p>
+    <w:p>
+      <w:pPr>
+        <w:pStyle w:val="ListParagraph"/>
+        <w:numPr>
+          <w:ilvl w:val="0"/>
+          <w:numId w:val="1"/>
+        </w:numPr>
+        <w:spacing w:after="60"/>
+      </w:pPr>
+      <w:r>
+        <w:rPr>
+          <w:sz w:val="21"/>
+          <w:szCs w:val="21"/>
+        </w:rPr>
+        <w:t xml:space="preserve">None of the other 3 Use Cases audited in P1B (project-managers, small-agencies, virtual-assistants) has this problem — each leads with general request/intake framing, with revision/follow-up handling appearing later as one section (clientUpdates), not as the page's entire identity.</w:t>
+      </w:r>
+    </w:p>
+    <w:p>
+      <w:pPr>
+        <w:pStyle w:val="ListParagraph"/>
+        <w:numPr>
+          <w:ilvl w:val="0"/>
+          <w:numId w:val="1"/>
+        </w:numPr>
+        <w:spacing w:after="60"/>
+      </w:pPr>
+      <w:r>
+        <w:rPr>
+          <w:sz w:val="21"/>
+          <w:szCs w:val="21"/>
+        </w:rPr>
+        <w:t xml:space="preserve">This is independent, corroborating evidence (beyond pure keyword-overlap reasoning) that the Use Case's identity layer — not the Resource — is what needs to change.</w:t>
+      </w:r>
+    </w:p>
+    <w:p>
+      <w:pPr>
+        <w:pStyle w:val="Heading2"/>
+        <w:spacing w:after="120" w:before="260"/>
+      </w:pPr>
+      <w:r>
+        <w:rPr>
+          <w:b/>
+          <w:bCs/>
+          <w:color w:val="1D4ED8"/>
+          <w:sz w:val="26"/>
+          <w:szCs w:val="26"/>
+        </w:rPr>
+        <w:t xml:space="preserve">13.10 Exact minimal future implementation plan (NOT executed this turn)</w:t>
+      </w:r>
+    </w:p>
+    <w:tbl>
+      <w:tblPr>
+        <w:tblW w:type="pct" w:w="100%"/>
+        <w:tblBorders>
+          <w:top w:val="single" w:color="D1D5DB" w:sz="4"/>
+          <w:left w:val="single" w:color="D1D5DB" w:sz="4"/>
+          <w:bottom w:val="single" w:color="D1D5DB" w:sz="4"/>
+          <w:right w:val="single" w:color="D1D5DB" w:sz="4"/>
+          <w:insideH w:val="single" w:color="D1D5DB" w:sz="4"/>
+          <w:insideV w:val="single" w:color="D1D5DB" w:sz="4"/>
+        </w:tblBorders>
+      </w:tblPr>
+      <w:tblGrid>
+        <w:gridCol w:w="100"/>
+        <w:gridCol w:w="100"/>
+        <w:gridCol w:w="100"/>
+        <w:gridCol w:w="100"/>
+        <w:gridCol w:w="100"/>
+      </w:tblGrid>
+      <w:tr>
+        <w:trPr>
+          <w:tblHeader/>
+        </w:trPr>
+        <w:tc>
+          <w:tcPr>
+            <w:tcW w:type="dxa" w:w="2000"/>
+            <w:shd w:fill="1D4ED8" w:color="auto" w:val="clear"/>
+            <w:tcMar>
+              <w:top w:type="dxa" w:w="80"/>
+              <w:left w:type="dxa" w:w="100"/>
+              <w:bottom w:type="dxa" w:w="80"/>
+              <w:right w:type="dxa" w:w="100"/>
+            </w:tcMar>
+            <w:vAlign w:val="center"/>
+          </w:tcPr>
+          <w:p>
+            <w:r>
+              <w:rPr>
+                <w:b/>
+                <w:bCs/>
+                <w:color w:val="FFFFFF"/>
+                <w:sz w:val="19"/>
+                <w:szCs w:val="19"/>
+              </w:rPr>
+              <w:t xml:space="preserve">File</w:t>
+            </w:r>
+          </w:p>
+        </w:tc>
+        <w:tc>
+          <w:tcPr>
+            <w:tcW w:type="dxa" w:w="2400"/>
+            <w:shd w:fill="1D4ED8" w:color="auto" w:val="clear"/>
+            <w:tcMar>
+              <w:top w:type="dxa" w:w="80"/>
+              <w:left w:type="dxa" w:w="100"/>
+              <w:bottom w:type="dxa" w:w="80"/>
+              <w:right w:type="dxa" w:w="100"/>
+            </w:tcMar>
+            <w:vAlign w:val="center"/>
+          </w:tcPr>
+          <w:p>
+            <w:r>
+              <w:rPr>
+                <w:b/>
+                <w:bCs/>
+                <w:color w:val="FFFFFF"/>
+                <w:sz w:val="19"/>
+                <w:szCs w:val="19"/>
+              </w:rPr>
+              <w:t xml:space="preserve">Current</w:t>
+            </w:r>
+          </w:p>
+        </w:tc>
+        <w:tc>
+          <w:tcPr>
+            <w:tcW w:type="dxa" w:w="2600"/>
+            <w:shd w:fill="1D4ED8" w:color="auto" w:val="clear"/>
+            <w:tcMar>
+              <w:top w:type="dxa" w:w="80"/>
+              <w:left w:type="dxa" w:w="100"/>
+              <w:bottom w:type="dxa" w:w="80"/>
+              <w:right w:type="dxa" w:w="100"/>
+            </w:tcMar>
+            <w:vAlign w:val="center"/>
+          </w:tcPr>
+          <w:p>
+            <w:r>
+              <w:rPr>
+                <w:b/>
+                <w:bCs/>
+                <w:color w:val="FFFFFF"/>
+                <w:sz w:val="19"/>
+                <w:szCs w:val="19"/>
+              </w:rPr>
+              <w:t xml:space="preserve">Proposed direction (examples only, not final copy)</w:t>
+            </w:r>
+          </w:p>
+        </w:tc>
+        <w:tc>
+          <w:tcPr>
+            <w:tcW w:type="dxa" w:w="1700"/>
+            <w:shd w:fill="1D4ED8" w:color="auto" w:val="clear"/>
+            <w:tcMar>
+              <w:top w:type="dxa" w:w="80"/>
+              <w:left w:type="dxa" w:w="100"/>
+              <w:bottom w:type="dxa" w:w="80"/>
+              <w:right w:type="dxa" w:w="100"/>
+            </w:tcMar>
+            <w:vAlign w:val="center"/>
+          </w:tcPr>
+          <w:p>
+            <w:r>
+              <w:rPr>
+                <w:b/>
+                <w:bCs/>
+                <w:color w:val="FFFFFF"/>
+                <w:sz w:val="19"/>
+                <w:szCs w:val="19"/>
+              </w:rPr>
+              <w:t xml:space="preserve">Why</w:t>
+            </w:r>
+          </w:p>
+        </w:tc>
+        <w:tc>
+          <w:tcPr>
+            <w:tcW w:type="dxa" w:w="1200"/>
+            <w:shd w:fill="1D4ED8" w:color="auto" w:val="clear"/>
+            <w:tcMar>
+              <w:top w:type="dxa" w:w="80"/>
+              <w:left w:type="dxa" w:w="100"/>
+              <w:bottom w:type="dxa" w:w="80"/>
+              <w:right w:type="dxa" w:w="100"/>
+            </w:tcMar>
+            <w:vAlign w:val="center"/>
+          </w:tcPr>
+          <w:p>
+            <w:r>
+              <w:rPr>
+                <w:b/>
+                <w:bCs/>
+                <w:color w:val="FFFFFF"/>
+                <w:sz w:val="19"/>
+                <w:szCs w:val="19"/>
+              </w:rPr>
+              <w:t xml:space="preserve">Cannibalization effect</w:t>
+            </w:r>
+          </w:p>
+        </w:tc>
+      </w:tr>
+      <w:tr>
+        <w:tc>
+          <w:tcPr>
+            <w:tcW w:type="dxa" w:w="2000"/>
+            <w:tcMar>
+              <w:top w:type="dxa" w:w="80"/>
+              <w:left w:type="dxa" w:w="100"/>
+              <w:bottom w:type="dxa" w:w="80"/>
+              <w:right w:type="dxa" w:w="100"/>
+            </w:tcMar>
+            <w:vAlign w:val="center"/>
+          </w:tcPr>
+          <w:p>
+            <w:r>
+              <w:rPr>
+                <w:b w:val="false"/>
+                <w:bCs w:val="false"/>
+                <w:color w:val="1F2937"/>
+                <w:sz w:val="19"/>
+                <w:szCs w:val="19"/>
+              </w:rPr>
+              <w:t xml:space="preserve">app/lib/use-cases/cases/web-designers.ts — seo.title</w:t>
+            </w:r>
+          </w:p>
+        </w:tc>
+        <w:tc>
+          <w:tcPr>
+            <w:tcW w:type="dxa" w:w="2400"/>
+            <w:tcMar>
+              <w:top w:type="dxa" w:w="80"/>
+              <w:left w:type="dxa" w:w="100"/>
+              <w:bottom w:type="dxa" w:w="80"/>
+              <w:right w:type="dxa" w:w="100"/>
+            </w:tcMar>
+            <w:vAlign w:val="center"/>
+          </w:tcPr>
+          <w:p>
+            <w:r>
+              <w:rPr>
+                <w:b w:val="false"/>
+                <w:bCs w:val="false"/>
+                <w:color w:val="1F2937"/>
+                <w:sz w:val="19"/>
+                <w:szCs w:val="19"/>
+              </w:rPr>
+              <w:t xml:space="preserve">"Website Revision Task Manager for Web Designers"</w:t>
+            </w:r>
+          </w:p>
+        </w:tc>
+        <w:tc>
+          <w:tcPr>
+            <w:tcW w:type="dxa" w:w="2600"/>
+            <w:tcMar>
+              <w:top w:type="dxa" w:w="80"/>
+              <w:left w:type="dxa" w:w="100"/>
+              <w:bottom w:type="dxa" w:w="80"/>
+              <w:right w:type="dxa" w:w="100"/>
+            </w:tcMar>
+            <w:vAlign w:val="center"/>
+          </w:tcPr>
+          <w:p>
+            <w:r>
+              <w:rPr>
+                <w:b w:val="false"/>
+                <w:bCs w:val="false"/>
+                <w:color w:val="1F2937"/>
+                <w:sz w:val="19"/>
+                <w:szCs w:val="19"/>
+              </w:rPr>
+              <w:t xml:space="preserve">Broaden beyond revisions, e.g. "Website Project &amp; Revision Tracker for Web Designers" or "Client Project Task Manager for Web Designers" (examples only)</w:t>
+            </w:r>
+          </w:p>
+        </w:tc>
+        <w:tc>
+          <w:tcPr>
+            <w:tcW w:type="dxa" w:w="1700"/>
+            <w:tcMar>
+              <w:top w:type="dxa" w:w="80"/>
+              <w:left w:type="dxa" w:w="100"/>
+              <w:bottom w:type="dxa" w:w="80"/>
+              <w:right w:type="dxa" w:w="100"/>
+            </w:tcMar>
+            <w:vAlign w:val="center"/>
+          </w:tcPr>
+          <w:p>
+            <w:r>
+              <w:rPr>
+                <w:b w:val="false"/>
+                <w:bCs w:val="false"/>
+                <w:color w:val="1F2937"/>
+                <w:sz w:val="19"/>
+                <w:szCs w:val="19"/>
+              </w:rPr>
+              <w:t xml:space="preserve">Resolves the HIGH-severity title overlap; matches the page's own broader listing.title already in the same file</w:t>
+            </w:r>
+          </w:p>
+        </w:tc>
+        <w:tc>
+          <w:tcPr>
+            <w:tcW w:type="dxa" w:w="1200"/>
+            <w:tcMar>
+              <w:top w:type="dxa" w:w="80"/>
+              <w:left w:type="dxa" w:w="100"/>
+              <w:bottom w:type="dxa" w:w="80"/>
+              <w:right w:type="dxa" w:w="100"/>
+            </w:tcMar>
+            <w:vAlign w:val="center"/>
+          </w:tcPr>
+          <w:p>
+            <w:r>
+              <w:rPr>
+                <w:b w:val="false"/>
+                <w:bCs w:val="false"/>
+                <w:color w:val="1F2937"/>
+                <w:sz w:val="19"/>
+                <w:szCs w:val="19"/>
+              </w:rPr>
+              <w:t xml:space="preserve">Directly reduces overlap; Resource remains the clear "manage revisions" claimant</w:t>
+            </w:r>
+          </w:p>
+        </w:tc>
+      </w:tr>
+      <w:tr>
+        <w:tc>
+          <w:tcPr>
+            <w:tcW w:type="dxa" w:w="2000"/>
+            <w:shd w:fill="F3F4F6" w:color="auto" w:val="clear"/>
+            <w:tcMar>
+              <w:top w:type="dxa" w:w="80"/>
+              <w:left w:type="dxa" w:w="100"/>
+              <w:bottom w:type="dxa" w:w="80"/>
+              <w:right w:type="dxa" w:w="100"/>
+            </w:tcMar>
+            <w:vAlign w:val="center"/>
+          </w:tcPr>
+          <w:p>
+            <w:r>
+              <w:rPr>
+                <w:b w:val="false"/>
+                <w:bCs w:val="false"/>
+                <w:color w:val="1F2937"/>
+                <w:sz w:val="19"/>
+                <w:szCs w:val="19"/>
+              </w:rPr>
+              <w:t xml:space="preserve">same file — seo.description</w:t>
+            </w:r>
+          </w:p>
+        </w:tc>
+        <w:tc>
+          <w:tcPr>
+            <w:tcW w:type="dxa" w:w="2400"/>
+            <w:shd w:fill="F3F4F6" w:color="auto" w:val="clear"/>
+            <w:tcMar>
+              <w:top w:type="dxa" w:w="80"/>
+              <w:left w:type="dxa" w:w="100"/>
+              <w:bottom w:type="dxa" w:w="80"/>
+              <w:right w:type="dxa" w:w="100"/>
+            </w:tcMar>
+            <w:vAlign w:val="center"/>
+          </w:tcPr>
+          <w:p>
+            <w:r>
+              <w:rPr>
+                <w:b w:val="false"/>
+                <w:bCs w:val="false"/>
+                <w:color w:val="1F2937"/>
+                <w:sz w:val="19"/>
+                <w:szCs w:val="19"/>
+              </w:rPr>
+              <w:t xml:space="preserve">"Turn client revision emails, WhatsApp messages, and marked-up screenshots into tracked website tasks..."</w:t>
+            </w:r>
+          </w:p>
+        </w:tc>
+        <w:tc>
+          <w:tcPr>
+            <w:tcW w:type="dxa" w:w="2600"/>
+            <w:shd w:fill="F3F4F6" w:color="auto" w:val="clear"/>
+            <w:tcMar>
+              <w:top w:type="dxa" w:w="80"/>
+              <w:left w:type="dxa" w:w="100"/>
+              <w:bottom w:type="dxa" w:w="80"/>
+              <w:right w:type="dxa" w:w="100"/>
+            </w:tcMar>
+            <w:vAlign w:val="center"/>
+          </w:tcPr>
+          <w:p>
+            <w:r>
+              <w:rPr>
+                <w:b w:val="false"/>
+                <w:bCs w:val="false"/>
+                <w:color w:val="1F2937"/>
+                <w:sz w:val="19"/>
+                <w:szCs w:val="19"/>
+              </w:rPr>
+              <w:t xml:space="preserve">Broaden lead phrase to include an initial request, e.g. "Turn client website requests and revision feedback..." (example only)</w:t>
+            </w:r>
+          </w:p>
+        </w:tc>
+        <w:tc>
+          <w:tcPr>
+            <w:tcW w:type="dxa" w:w="1700"/>
+            <w:shd w:fill="F3F4F6" w:color="auto" w:val="clear"/>
+            <w:tcMar>
+              <w:top w:type="dxa" w:w="80"/>
+              <w:left w:type="dxa" w:w="100"/>
+              <w:bottom w:type="dxa" w:w="80"/>
+              <w:right w:type="dxa" w:w="100"/>
+            </w:tcMar>
+            <w:vAlign w:val="center"/>
+          </w:tcPr>
+          <w:p>
+            <w:r>
+              <w:rPr>
+                <w:b w:val="false"/>
+                <w:bCs w:val="false"/>
+                <w:color w:val="1F2937"/>
+                <w:sz w:val="19"/>
+                <w:szCs w:val="19"/>
+              </w:rPr>
+              <w:t xml:space="preserve">Keeps description consistent with a broadened title</w:t>
+            </w:r>
+          </w:p>
+        </w:tc>
+        <w:tc>
+          <w:tcPr>
+            <w:tcW w:type="dxa" w:w="1200"/>
+            <w:shd w:fill="F3F4F6" w:color="auto" w:val="clear"/>
+            <w:tcMar>
+              <w:top w:type="dxa" w:w="80"/>
+              <w:left w:type="dxa" w:w="100"/>
+              <w:bottom w:type="dxa" w:w="80"/>
+              <w:right w:type="dxa" w:w="100"/>
+            </w:tcMar>
+            <w:vAlign w:val="center"/>
+          </w:tcPr>
+          <w:p>
+            <w:r>
+              <w:rPr>
+                <w:b w:val="false"/>
+                <w:bCs w:val="false"/>
+                <w:color w:val="1F2937"/>
+                <w:sz w:val="19"/>
+                <w:szCs w:val="19"/>
+              </w:rPr>
+              <w:t xml:space="preserve">Same direction; secondary priority, implement only alongside the title</w:t>
+            </w:r>
+          </w:p>
+        </w:tc>
+      </w:tr>
+      <w:tr>
+        <w:tc>
+          <w:tcPr>
+            <w:tcW w:type="dxa" w:w="2000"/>
+            <w:tcMar>
+              <w:top w:type="dxa" w:w="80"/>
+              <w:left w:type="dxa" w:w="100"/>
+              <w:bottom w:type="dxa" w:w="80"/>
+              <w:right w:type="dxa" w:w="100"/>
+            </w:tcMar>
+            <w:vAlign w:val="center"/>
+          </w:tcPr>
+          <w:p>
+            <w:r>
+              <w:rPr>
+                <w:b w:val="false"/>
+                <w:bCs w:val="false"/>
+                <w:color w:val="1F2937"/>
+                <w:sz w:val="19"/>
+                <w:szCs w:val="19"/>
+              </w:rPr>
+              <w:t xml:space="preserve">same file — hero.title / hero.highlight (rendered H1)</w:t>
+            </w:r>
+          </w:p>
+        </w:tc>
+        <w:tc>
+          <w:tcPr>
+            <w:tcW w:type="dxa" w:w="2400"/>
+            <w:tcMar>
+              <w:top w:type="dxa" w:w="80"/>
+              <w:left w:type="dxa" w:w="100"/>
+              <w:bottom w:type="dxa" w:w="80"/>
+              <w:right w:type="dxa" w:w="100"/>
+            </w:tcMar>
+            <w:vAlign w:val="center"/>
+          </w:tcPr>
+          <w:p>
+            <w:r>
+              <w:rPr>
+                <w:b w:val="false"/>
+                <w:bCs w:val="false"/>
+                <w:color w:val="1F2937"/>
+                <w:sz w:val="19"/>
+                <w:szCs w:val="19"/>
+              </w:rPr>
+              <w:t xml:space="preserve">"Stop rebuilding revision emails into task lists." / "Start tracking each page change."</w:t>
+            </w:r>
+          </w:p>
+        </w:tc>
+        <w:tc>
+          <w:tcPr>
+            <w:tcW w:type="dxa" w:w="2600"/>
+            <w:tcMar>
+              <w:top w:type="dxa" w:w="80"/>
+              <w:left w:type="dxa" w:w="100"/>
+              <w:bottom w:type="dxa" w:w="80"/>
+              <w:right w:type="dxa" w:w="100"/>
+            </w:tcMar>
+            <w:vAlign w:val="center"/>
+          </w:tcPr>
+          <w:p>
+            <w:r>
+              <w:rPr>
+                <w:b w:val="false"/>
+                <w:bCs w:val="false"/>
+                <w:color w:val="1F2937"/>
+                <w:sz w:val="19"/>
+                <w:szCs w:val="19"/>
+              </w:rPr>
+              <w:t xml:space="preserve">Reframe around the fuller request→project→revisions arc, e.g. "Turn client website requests into organized, trackable projects." / "From the first brief to the latest revision." (examples only)</w:t>
+            </w:r>
+          </w:p>
+        </w:tc>
+        <w:tc>
+          <w:tcPr>
+            <w:tcW w:type="dxa" w:w="1700"/>
+            <w:tcMar>
+              <w:top w:type="dxa" w:w="80"/>
+              <w:left w:type="dxa" w:w="100"/>
+              <w:bottom w:type="dxa" w:w="80"/>
+              <w:right w:type="dxa" w:w="100"/>
+            </w:tcMar>
+            <w:vAlign w:val="center"/>
+          </w:tcPr>
+          <w:p>
+            <w:r>
+              <w:rPr>
+                <w:b w:val="false"/>
+                <w:bCs w:val="false"/>
+                <w:color w:val="1F2937"/>
+                <w:sz w:val="19"/>
+                <w:szCs w:val="19"/>
+              </w:rPr>
+              <w:t xml:space="preserve">Resolves the MEDIUM-severity H1 overlap and the §13.9 positioning risk</w:t>
+            </w:r>
+          </w:p>
+        </w:tc>
+        <w:tc>
+          <w:tcPr>
+            <w:tcW w:type="dxa" w:w="1200"/>
+            <w:tcMar>
+              <w:top w:type="dxa" w:w="80"/>
+              <w:left w:type="dxa" w:w="100"/>
+              <w:bottom w:type="dxa" w:w="80"/>
+              <w:right w:type="dxa" w:w="100"/>
+            </w:tcMar>
+            <w:vAlign w:val="center"/>
+          </w:tcPr>
+          <w:p>
+            <w:r>
+              <w:rPr>
+                <w:b w:val="false"/>
+                <w:bCs w:val="false"/>
+                <w:color w:val="1F2937"/>
+                <w:sz w:val="19"/>
+                <w:szCs w:val="19"/>
+              </w:rPr>
+              <w:t xml:space="preserve">Removes the "revision emails" lead phrase that echoed the Resource</w:t>
+            </w:r>
+          </w:p>
+        </w:tc>
+      </w:tr>
+      <w:tr>
+        <w:tc>
+          <w:tcPr>
+            <w:tcW w:type="dxa" w:w="2000"/>
+            <w:shd w:fill="F3F4F6" w:color="auto" w:val="clear"/>
+            <w:tcMar>
+              <w:top w:type="dxa" w:w="80"/>
+              <w:left w:type="dxa" w:w="100"/>
+              <w:bottom w:type="dxa" w:w="80"/>
+              <w:right w:type="dxa" w:w="100"/>
+            </w:tcMar>
+            <w:vAlign w:val="center"/>
+          </w:tcPr>
+          <w:p>
+            <w:r>
+              <w:rPr>
+                <w:b w:val="false"/>
+                <w:bCs w:val="false"/>
+                <w:color w:val="1F2937"/>
+                <w:sz w:val="19"/>
+                <w:szCs w:val="19"/>
+              </w:rPr>
+              <w:t xml:space="preserve">same file — hero.description</w:t>
+            </w:r>
+          </w:p>
+        </w:tc>
+        <w:tc>
+          <w:tcPr>
+            <w:tcW w:type="dxa" w:w="2400"/>
+            <w:shd w:fill="F3F4F6" w:color="auto" w:val="clear"/>
+            <w:tcMar>
+              <w:top w:type="dxa" w:w="80"/>
+              <w:left w:type="dxa" w:w="100"/>
+              <w:bottom w:type="dxa" w:w="80"/>
+              <w:right w:type="dxa" w:w="100"/>
+            </w:tcMar>
+            <w:vAlign w:val="center"/>
+          </w:tcPr>
+          <w:p>
+            <w:r>
+              <w:rPr>
+                <w:b w:val="false"/>
+                <w:bCs w:val="false"/>
+                <w:color w:val="1F2937"/>
+                <w:sz w:val="19"/>
+                <w:szCs w:val="19"/>
+              </w:rPr>
+              <w:t xml:space="preserve">Leads with "a client's revision email, WhatsApp message, or a marked-up screenshot"</w:t>
+            </w:r>
+          </w:p>
+        </w:tc>
+        <w:tc>
+          <w:tcPr>
+            <w:tcW w:type="dxa" w:w="2600"/>
+            <w:shd w:fill="F3F4F6" w:color="auto" w:val="clear"/>
+            <w:tcMar>
+              <w:top w:type="dxa" w:w="80"/>
+              <w:left w:type="dxa" w:w="100"/>
+              <w:bottom w:type="dxa" w:w="80"/>
+              <w:right w:type="dxa" w:w="100"/>
+            </w:tcMar>
+            <w:vAlign w:val="center"/>
+          </w:tcPr>
+          <w:p>
+            <w:r>
+              <w:rPr>
+                <w:b w:val="false"/>
+                <w:bCs w:val="false"/>
+                <w:color w:val="1F2937"/>
+                <w:sz w:val="19"/>
+                <w:szCs w:val="19"/>
+              </w:rPr>
+              <w:t xml:space="preserve">Lightly broaden to mention an initial request alongside revisions; keep the existing channel examples (email/WhatsApp/screenshot)</w:t>
+            </w:r>
+          </w:p>
+        </w:tc>
+        <w:tc>
+          <w:tcPr>
+            <w:tcW w:type="dxa" w:w="1700"/>
+            <w:shd w:fill="F3F4F6" w:color="auto" w:val="clear"/>
+            <w:tcMar>
+              <w:top w:type="dxa" w:w="80"/>
+              <w:left w:type="dxa" w:w="100"/>
+              <w:bottom w:type="dxa" w:w="80"/>
+              <w:right w:type="dxa" w:w="100"/>
+            </w:tcMar>
+            <w:vAlign w:val="center"/>
+          </w:tcPr>
+          <w:p>
+            <w:r>
+              <w:rPr>
+                <w:b w:val="false"/>
+                <w:bCs w:val="false"/>
+                <w:color w:val="1F2937"/>
+                <w:sz w:val="19"/>
+                <w:szCs w:val="19"/>
+              </w:rPr>
+              <w:t xml:space="preserve">Aligns supporting copy with the new H1</w:t>
+            </w:r>
+          </w:p>
+        </w:tc>
+        <w:tc>
+          <w:tcPr>
+            <w:tcW w:type="dxa" w:w="1200"/>
+            <w:shd w:fill="F3F4F6" w:color="auto" w:val="clear"/>
+            <w:tcMar>
+              <w:top w:type="dxa" w:w="80"/>
+              <w:left w:type="dxa" w:w="100"/>
+              <w:bottom w:type="dxa" w:w="80"/>
+              <w:right w:type="dxa" w:w="100"/>
+            </w:tcMar>
+            <w:vAlign w:val="center"/>
+          </w:tcPr>
+          <w:p>
+            <w:r>
+              <w:rPr>
+                <w:b w:val="false"/>
+                <w:bCs w:val="false"/>
+                <w:color w:val="1F2937"/>
+                <w:sz w:val="19"/>
+                <w:szCs w:val="19"/>
+              </w:rPr>
+              <w:t xml:space="preserve">Reduces the HIGH-severity intro overlap</w:t>
+            </w:r>
+          </w:p>
+        </w:tc>
+      </w:tr>
+      <w:tr>
+        <w:tc>
+          <w:tcPr>
+            <w:tcW w:type="dxa" w:w="2000"/>
+            <w:tcMar>
+              <w:top w:type="dxa" w:w="80"/>
+              <w:left w:type="dxa" w:w="100"/>
+              <w:bottom w:type="dxa" w:w="80"/>
+              <w:right w:type="dxa" w:w="100"/>
+            </w:tcMar>
+            <w:vAlign w:val="center"/>
+          </w:tcPr>
+          <w:p>
+            <w:r>
+              <w:rPr>
+                <w:b w:val="false"/>
+                <w:bCs w:val="false"/>
+                <w:color w:val="1F2937"/>
+                <w:sz w:val="19"/>
+                <w:szCs w:val="19"/>
+              </w:rPr>
+              <w:t xml:space="preserve">app/lib/use-cases/cases/web-designers.ts — capabilities, workflow, FAQ, proof, relatedLinks</w:t>
+            </w:r>
+          </w:p>
+        </w:tc>
+        <w:tc>
+          <w:tcPr>
+            <w:tcW w:type="dxa" w:w="2400"/>
+            <w:tcMar>
+              <w:top w:type="dxa" w:w="80"/>
+              <w:left w:type="dxa" w:w="100"/>
+              <w:bottom w:type="dxa" w:w="80"/>
+              <w:right w:type="dxa" w:w="100"/>
+            </w:tcMar>
+            <w:vAlign w:val="center"/>
+          </w:tcPr>
+          <w:p>
+            <w:r>
+              <w:rPr>
+                <w:b w:val="false"/>
+                <w:bCs w:val="false"/>
+                <w:color w:val="1F2937"/>
+                <w:sz w:val="19"/>
+                <w:szCs w:val="19"/>
+              </w:rPr>
+              <w:t xml:space="preserve">As-is</w:t>
+            </w:r>
+          </w:p>
+        </w:tc>
+        <w:tc>
+          <w:tcPr>
+            <w:tcW w:type="dxa" w:w="2600"/>
+            <w:tcMar>
+              <w:top w:type="dxa" w:w="80"/>
+              <w:left w:type="dxa" w:w="100"/>
+              <w:bottom w:type="dxa" w:w="80"/>
+              <w:right w:type="dxa" w:w="100"/>
+            </w:tcMar>
+            <w:vAlign w:val="center"/>
+          </w:tcPr>
+          <w:p>
+            <w:r>
+              <w:rPr>
+                <w:b w:val="false"/>
+                <w:bCs w:val="false"/>
+                <w:color w:val="1F2937"/>
+                <w:sz w:val="19"/>
+                <w:szCs w:val="19"/>
+              </w:rPr>
+              <w:t xml:space="preserve">NO CHANGE recommended</w:t>
+            </w:r>
+          </w:p>
+        </w:tc>
+        <w:tc>
+          <w:tcPr>
+            <w:tcW w:type="dxa" w:w="1700"/>
+            <w:tcMar>
+              <w:top w:type="dxa" w:w="80"/>
+              <w:left w:type="dxa" w:w="100"/>
+              <w:bottom w:type="dxa" w:w="80"/>
+              <w:right w:type="dxa" w:w="100"/>
+            </w:tcMar>
+            <w:vAlign w:val="center"/>
+          </w:tcPr>
+          <w:p>
+            <w:r>
+              <w:rPr>
+                <w:b w:val="false"/>
+                <w:bCs w:val="false"/>
+                <w:color w:val="1F2937"/>
+                <w:sz w:val="19"/>
+                <w:szCs w:val="19"/>
+              </w:rPr>
+              <w:t xml:space="preserve">Already appropriately scoped/differentiated per §13.3</w:t>
+            </w:r>
+          </w:p>
+        </w:tc>
+        <w:tc>
+          <w:tcPr>
+            <w:tcW w:type="dxa" w:w="1200"/>
+            <w:tcMar>
+              <w:top w:type="dxa" w:w="80"/>
+              <w:left w:type="dxa" w:w="100"/>
+              <w:bottom w:type="dxa" w:w="80"/>
+              <w:right w:type="dxa" w:w="100"/>
+            </w:tcMar>
+            <w:vAlign w:val="center"/>
+          </w:tcPr>
+          <w:p>
+            <w:r>
+              <w:rPr>
+                <w:b w:val="false"/>
+                <w:bCs w:val="false"/>
+                <w:color w:val="1F2937"/>
+                <w:sz w:val="19"/>
+                <w:szCs w:val="19"/>
+              </w:rPr>
+              <w:t xml:space="preserve">None needed</w:t>
+            </w:r>
+          </w:p>
+        </w:tc>
+      </w:tr>
+      <w:tr>
+        <w:tc>
+          <w:tcPr>
+            <w:tcW w:type="dxa" w:w="2000"/>
+            <w:shd w:fill="F3F4F6" w:color="auto" w:val="clear"/>
+            <w:tcMar>
+              <w:top w:type="dxa" w:w="80"/>
+              <w:left w:type="dxa" w:w="100"/>
+              <w:bottom w:type="dxa" w:w="80"/>
+              <w:right w:type="dxa" w:w="100"/>
+            </w:tcMar>
+            <w:vAlign w:val="center"/>
+          </w:tcPr>
+          <w:p>
+            <w:r>
+              <w:rPr>
+                <w:b w:val="false"/>
+                <w:bCs w:val="false"/>
+                <w:color w:val="1F2937"/>
+                <w:sz w:val="19"/>
+                <w:szCs w:val="19"/>
+              </w:rPr>
+              <w:t xml:space="preserve">app/resources/manage-client-revisions-web-designers/page.tsx</w:t>
+            </w:r>
+          </w:p>
+        </w:tc>
+        <w:tc>
+          <w:tcPr>
+            <w:tcW w:type="dxa" w:w="2400"/>
+            <w:shd w:fill="F3F4F6" w:color="auto" w:val="clear"/>
+            <w:tcMar>
+              <w:top w:type="dxa" w:w="80"/>
+              <w:left w:type="dxa" w:w="100"/>
+              <w:bottom w:type="dxa" w:w="80"/>
+              <w:right w:type="dxa" w:w="100"/>
+            </w:tcMar>
+            <w:vAlign w:val="center"/>
+          </w:tcPr>
+          <w:p>
+            <w:r>
+              <w:rPr>
+                <w:b w:val="false"/>
+                <w:bCs w:val="false"/>
+                <w:color w:val="1F2937"/>
+                <w:sz w:val="19"/>
+                <w:szCs w:val="19"/>
+              </w:rPr>
+              <w:t xml:space="preserve">As-is (entire file)</w:t>
+            </w:r>
+          </w:p>
+        </w:tc>
+        <w:tc>
+          <w:tcPr>
+            <w:tcW w:type="dxa" w:w="2600"/>
+            <w:shd w:fill="F3F4F6" w:color="auto" w:val="clear"/>
+            <w:tcMar>
+              <w:top w:type="dxa" w:w="80"/>
+              <w:left w:type="dxa" w:w="100"/>
+              <w:bottom w:type="dxa" w:w="80"/>
+              <w:right w:type="dxa" w:w="100"/>
+            </w:tcMar>
+            <w:vAlign w:val="center"/>
+          </w:tcPr>
+          <w:p>
+            <w:r>
+              <w:rPr>
+                <w:b w:val="false"/>
+                <w:bCs w:val="false"/>
+                <w:color w:val="1F2937"/>
+                <w:sz w:val="19"/>
+                <w:szCs w:val="19"/>
+              </w:rPr>
+              <w:t xml:space="preserve">NO CHANGE</w:t>
+            </w:r>
+          </w:p>
+        </w:tc>
+        <w:tc>
+          <w:tcPr>
+            <w:tcW w:type="dxa" w:w="1700"/>
+            <w:shd w:fill="F3F4F6" w:color="auto" w:val="clear"/>
+            <w:tcMar>
+              <w:top w:type="dxa" w:w="80"/>
+              <w:left w:type="dxa" w:w="100"/>
+              <w:bottom w:type="dxa" w:w="80"/>
+              <w:right w:type="dxa" w:w="100"/>
+            </w:tcMar>
+            <w:vAlign w:val="center"/>
+          </w:tcPr>
+          <w:p>
+            <w:r>
+              <w:rPr>
+                <w:b w:val="false"/>
+                <w:bCs w:val="false"/>
+                <w:color w:val="1F2937"/>
+                <w:sz w:val="19"/>
+                <w:szCs w:val="19"/>
+              </w:rPr>
+              <w:t xml:space="preserve">Already correctly owns its narrow, deep topic; source of the imbalance is one-sided (Use Case only)</w:t>
+            </w:r>
+          </w:p>
+        </w:tc>
+        <w:tc>
+          <w:tcPr>
+            <w:tcW w:type="dxa" w:w="1200"/>
+            <w:shd w:fill="F3F4F6" w:color="auto" w:val="clear"/>
+            <w:tcMar>
+              <w:top w:type="dxa" w:w="80"/>
+              <w:left w:type="dxa" w:w="100"/>
+              <w:bottom w:type="dxa" w:w="80"/>
+              <w:right w:type="dxa" w:w="100"/>
+            </w:tcMar>
+            <w:vAlign w:val="center"/>
+          </w:tcPr>
+          <w:p>
+            <w:r>
+              <w:rPr>
+                <w:b w:val="false"/>
+                <w:bCs w:val="false"/>
+                <w:color w:val="1F2937"/>
+                <w:sz w:val="19"/>
+                <w:szCs w:val="19"/>
+              </w:rPr>
+              <w:t xml:space="preserve">None — not the cause</w:t>
+            </w:r>
+          </w:p>
+        </w:tc>
+      </w:tr>
+    </w:tbl>
+    <w:p>
+      <w:pPr>
+        <w:pStyle w:val="Heading2"/>
+        <w:spacing w:after="120" w:before="260"/>
+      </w:pPr>
+      <w:r>
+        <w:rPr>
+          <w:b/>
+          <w:bCs/>
+          <w:color w:val="1D4ED8"/>
+          <w:sz w:val="26"/>
+          <w:szCs w:val="26"/>
+        </w:rPr>
+        <w:t xml:space="preserve">13.11 Test plan (not created this turn)</w:t>
+      </w:r>
+    </w:p>
+    <w:p>
+      <w:pPr>
+        <w:pStyle w:val="ListParagraph"/>
+        <w:numPr>
+          <w:ilvl w:val="0"/>
+          <w:numId w:val="1"/>
+        </w:numPr>
+        <w:spacing w:after="60"/>
+      </w:pPr>
+      <w:r>
+        <w:rPr>
+          <w:sz w:val="21"/>
+          <w:szCs w:val="21"/>
+        </w:rPr>
+        <w:t xml:space="preserve">Likely new file: a focused test asserting the Use Case's H1 (hero.title + hero.highlight) does not lead with/consist solely of "revision" framing, and is not a near-duplicate of the Resource's H1 string.</w:t>
+      </w:r>
+    </w:p>
+    <w:p>
+      <w:pPr>
+        <w:pStyle w:val="ListParagraph"/>
+        <w:numPr>
+          <w:ilvl w:val="0"/>
+          <w:numId w:val="1"/>
+        </w:numPr>
+        <w:spacing w:after="60"/>
+      </w:pPr>
+      <w:r>
+        <w:rPr>
+          <w:sz w:val="21"/>
+          <w:szCs w:val="21"/>
+        </w:rPr>
+        <w:t xml:space="preserve">Likely new file: app/resources/manage-client-revisions-web-designers/page.test.tsx — protects the Resource's title/H1/description stay exactly as recorded in §13.1 (i.e., that this phase's NO CHANGE decision holds over time).</w:t>
+      </w:r>
+    </w:p>
+    <w:p>
+      <w:pPr>
+        <w:pStyle w:val="ListParagraph"/>
+        <w:numPr>
+          <w:ilvl w:val="0"/>
+          <w:numId w:val="1"/>
+        </w:numPr>
+        <w:spacing w:after="60"/>
+      </w:pPr>
+      <w:r>
+        <w:rPr>
+          <w:sz w:val="21"/>
+          <w:szCs w:val="21"/>
+        </w:rPr>
+        <w:t xml:space="preserve">Both: assert the existing bidirectional link relationship (href-based) still holds after any future edit.</w:t>
+      </w:r>
+    </w:p>
+    <w:p>
+      <w:pPr>
+        <w:pStyle w:val="ListParagraph"/>
+        <w:numPr>
+          <w:ilvl w:val="0"/>
+          <w:numId w:val="1"/>
+        </w:numPr>
+        <w:spacing w:after="60"/>
+      </w:pPr>
+      <w:r>
+        <w:rPr>
+          <w:sz w:val="21"/>
+          <w:szCs w:val="21"/>
+        </w:rPr>
+        <w:t xml:space="preserve">Do not snapshot full visible copy; do not add brittle assertions for sections this audit found already healthy (workflow, FAQ, capabilities, CTAs).</w:t>
+      </w:r>
+    </w:p>
+    <w:p>
+      <w:pPr>
+        <w:pStyle w:val="Heading2"/>
+        <w:spacing w:after="120" w:before="260"/>
+      </w:pPr>
+      <w:r>
+        <w:rPr>
+          <w:b/>
+          <w:bCs/>
+          <w:color w:val="1D4ED8"/>
+          <w:sz w:val="26"/>
+          <w:szCs w:val="26"/>
+        </w:rPr>
+        <w:t xml:space="preserve">13.12 Unresolved issues</w:t>
+      </w:r>
+    </w:p>
+    <w:p>
+      <w:pPr>
+        <w:pStyle w:val="ListParagraph"/>
+        <w:numPr>
+          <w:ilvl w:val="0"/>
+          <w:numId w:val="1"/>
+        </w:numPr>
+        <w:spacing w:after="60"/>
+      </w:pPr>
+      <w:r>
+        <w:rPr>
+          <w:sz w:val="21"/>
+          <w:szCs w:val="21"/>
+        </w:rPr>
+        <w:t xml:space="preserve">Final wording for the Use Case's title/description/H1 is NOT decided — only candidate directions were evaluated (§13.10). Exact copy must be proposed and approved in the implementation turn, not assumed from this audit.</w:t>
+      </w:r>
+    </w:p>
+    <w:p>
+      <w:pPr>
+        <w:pStyle w:val="ListParagraph"/>
+        <w:numPr>
+          <w:ilvl w:val="0"/>
+          <w:numId w:val="1"/>
+        </w:numPr>
+        <w:spacing w:after="60"/>
+      </w:pPr>
+      <w:r>
+        <w:rPr>
+          <w:sz w:val="21"/>
+          <w:szCs w:val="21"/>
+        </w:rPr>
+        <w:t xml:space="preserve">Whether the meta description needs to change is a judgment call to finalize alongside the title, not resolved independently here.</w:t>
+      </w:r>
+    </w:p>
+    <w:p>
+      <w:pPr>
+        <w:pStyle w:val="ListParagraph"/>
+        <w:numPr>
+          <w:ilvl w:val="0"/>
+          <w:numId w:val="1"/>
+        </w:numPr>
+        <w:spacing w:after="60"/>
+      </w:pPr>
+      <w:r>
+        <w:rPr>
+          <w:sz w:val="21"/>
+          <w:szCs w:val="21"/>
+        </w:rPr>
+        <w:t xml:space="preserve">The top-level (unused-in-rendering) `title` field on the UseCase config ("AI Website Revision Task Manager for Web Designers") was found to not be consumed anywhere in the current rendering pipeline (confirmed by inspecting the detail-page template, the metadata generator, and the /use-cases listing grid) — noted for completeness; not part of this differentiation fix.</w:t>
+      </w:r>
+    </w:p>
+    <w:p>
+      <w:pPr>
+        <w:pStyle w:val="Heading2"/>
+        <w:spacing w:after="120" w:before="260"/>
+      </w:pPr>
+      <w:r>
+        <w:rPr>
+          <w:b/>
+          <w:bCs/>
+          <w:color w:val="1D4ED8"/>
+          <w:sz w:val="26"/>
+          <w:szCs w:val="26"/>
+        </w:rPr>
+        <w:t xml:space="preserve">13.13 Exact next action</w:t>
+      </w:r>
+    </w:p>
+    <w:tbl>
+      <w:tblPr>
+        <w:tblW w:type="pct" w:w="100%"/>
+        <w:tblBorders>
+          <w:top w:val="single" w:color="auto" w:sz="4"/>
+          <w:left w:val="single" w:color="auto" w:sz="4"/>
+          <w:bottom w:val="single" w:color="auto" w:sz="4"/>
+          <w:right w:val="single" w:color="auto" w:sz="4"/>
+          <w:insideH w:val="single" w:color="auto" w:sz="4"/>
+          <w:insideV w:val="single" w:color="auto" w:sz="4"/>
+        </w:tblBorders>
+      </w:tblPr>
+      <w:tblGrid>
+        <w:gridCol w:w="100"/>
+      </w:tblGrid>
+      <w:tr>
+        <w:tc>
+          <w:tcPr>
+            <w:tcBorders>
+              <w:top w:val="single" w:color="15803D" w:sz="12"/>
+              <w:left w:val="single" w:color="15803D" w:sz="12"/>
+              <w:bottom w:val="single" w:color="15803D" w:sz="12"/>
+              <w:right w:val="single" w:color="15803D" w:sz="12"/>
+            </w:tcBorders>
+            <w:shd w:fill="F0FDF4" w:color="auto" w:val="clear"/>
+            <w:tcMar>
+              <w:top w:type="dxa" w:w="160"/>
+              <w:left w:type="dxa" w:w="200"/>
+              <w:bottom w:type="dxa" w:w="160"/>
+              <w:right w:type="dxa" w:w="200"/>
+            </w:tcMar>
+          </w:tcPr>
+          <w:p>
+            <w:pPr>
+              <w:spacing w:after="100"/>
+            </w:pPr>
+            <w:r>
+              <w:rPr>
+                <w:b/>
+                <w:bCs/>
+                <w:color w:val="15803D"/>
+                <w:sz w:val="23"/>
+                <w:szCs w:val="23"/>
+              </w:rPr>
+              <w:t xml:space="preserve">Next action:</w:t>
+            </w:r>
+          </w:p>
+          <w:p>
+            <w:pPr>
+              <w:pStyle w:val="ListParagraph"/>
+              <w:numPr>
+                <w:ilvl w:val="0"/>
+                <w:numId w:val="1"/>
+              </w:numPr>
+              <w:spacing w:after="60"/>
+            </w:pPr>
+            <w:r>
+              <w:rPr>
+                <w:color w:val="1F2937"/>
+                <w:sz w:val="20"/>
+                <w:szCs w:val="20"/>
+              </w:rPr>
+              <w:t xml:space="preserve">Wait for an explicit instruction to implement the §13.10 blueprint (title/H1/description refinement on app/lib/use-cases/cases/web-designers.ts only). This document does not authorize implementation on its own. Do not begin /features/project-deadline-calendar footer/navigation reinforcement (the other unstarted P2 item) without its own separate instruction either.</w:t>
             </w:r>
           </w:p>
         </w:tc>

</xml_diff>

<commit_message>
Differentiate web designer SEO intent
</commit_message>
<xml_diff>
--- a/docs/Text2Task_SEO_Master_Blueprint_2026-08-29.docx
+++ b/docs/Text2Task_SEO_Master_Blueprint_2026-08-29.docx
@@ -5558,7 +5558,7 @@
                 <w:sz w:val="17"/>
                 <w:szCs w:val="17"/>
               </w:rPr>
-              <w:t xml:space="preserve">Medium-High — audited, fix mapped, not yet implemented</w:t>
+              <w:t xml:space="preserve">Low (identity-layer differentiation implemented 2026-08-30 — §14)</w:t>
             </w:r>
           </w:p>
         </w:tc>
@@ -5583,7 +5583,7 @@
                 <w:sz w:val="17"/>
                 <w:szCs w:val="17"/>
               </w:rPr>
-              <w:t xml:space="preserve">Audited 2026-08-30 — see §13</w:t>
+              <w:t xml:space="preserve">Resolved 2026-08-30 — implemented (§14)</w:t>
             </w:r>
           </w:p>
         </w:tc>
@@ -5608,7 +5608,7 @@
                 <w:sz w:val="17"/>
                 <w:szCs w:val="17"/>
               </w:rPr>
-              <w:t xml:space="preserve">Implement per §13 blueprint (pending explicit approval)</w:t>
+              <w:t xml:space="preserve">None — complete</w:t>
             </w:r>
           </w:p>
         </w:tc>
@@ -7512,7 +7512,7 @@
           <w:sz w:val="21"/>
           <w:szCs w:val="21"/>
         </w:rPr>
-        <w:t xml:space="preserve">Web Designers Use Case vs. Revisions Resource differentiation pass (§5, rule 7). [MAPPED, NOT IMPLEMENTED 2026-08-30 — see §13]</w:t>
+        <w:t xml:space="preserve">Web Designers Use Case vs. Revisions Resource differentiation pass (§5, rule 7). [COMPLETE 2026-08-30 — see §14]</w:t>
       </w:r>
     </w:p>
     <w:p>
@@ -7974,14 +7974,14 @@
           <w:sz w:val="21"/>
           <w:szCs w:val="21"/>
         </w:rPr>
-        <w:t xml:space="preserve">Status update (2026-08-30, P2 Web Designers audit pass): </w:t>
-      </w:r>
-      <w:r>
-        <w:rPr>
-          <w:sz w:val="21"/>
-          <w:szCs w:val="21"/>
-        </w:rPr>
-        <w:t xml:space="preserve">P1A COMPLETE. P1B COMPLETE. P1C COMPLETE. Email Feature H1 commercial-framing differentiation COMPLETE. P2 Web Designers vs. Revisions Resource differentiation: MAPPED, NOT IMPLEMENTED (§13) — audit and implementation blueprint only, no production code changed. Client Project Tracker is fully built, integrated, and discoverable (§11.17–§11.20). The Email Feature's H1 no longer echoes the Resource's informational phrasing (§12). Nothing was staged, committed, pushed, or deployed as part of any of these phases — the working tree changes are ready for review.</w:t>
+        <w:t xml:space="preserve">Status update (2026-08-30, P2 Web Designers implementation pass): </w:t>
+      </w:r>
+      <w:r>
+        <w:rPr>
+          <w:sz w:val="21"/>
+          <w:szCs w:val="21"/>
+        </w:rPr>
+        <w:t xml:space="preserve">P1A COMPLETE. P1B COMPLETE. P1C COMPLETE. Email Feature H1 commercial-framing differentiation COMPLETE. P2 Web Designers vs. Revisions Resource differentiation COMPLETE (§14) — the Use Case's title/H1/description now represent the broader client-work workflow instead of echoing the Resource's revisions topic; the Resource itself is unchanged. Client Project Tracker is fully built, integrated, and discoverable (§11.17–§11.20). The Email Feature's H1 no longer echoes the Resource's informational phrasing (§12). Nothing was staged, committed, pushed, or deployed as part of any of these phases — the working tree changes are ready for review.</w:t>
       </w:r>
     </w:p>
     <w:tbl>
@@ -8028,7 +8028,7 @@
                 <w:sz w:val="23"/>
                 <w:szCs w:val="23"/>
               </w:rPr>
-              <w:t xml:space="preserve">NEXT PLANNED PHASE: implement the §13 Web Designers blueprint, OR the other unstarted P2 item — neither authorized to start automatically</w:t>
+              <w:t xml:space="preserve">NEXT PLANNED PHASE: /features/project-deadline-calendar footer/navigation reinforcement — NOT audited yet</w:t>
             </w:r>
           </w:p>
           <w:p>
@@ -8047,14 +8047,14 @@
                 <w:sz w:val="21"/>
                 <w:szCs w:val="21"/>
               </w:rPr>
-              <w:t xml:space="preserve">Option A: </w:t>
+              <w:t xml:space="preserve">Source: </w:t>
             </w:r>
             <w:r>
               <w:rPr>
                 <w:sz w:val="21"/>
                 <w:szCs w:val="21"/>
               </w:rPr>
-              <w:t xml:space="preserve">Implement §13.10's blueprint (title/H1/description refinement on app/lib/use-cases/cases/web-designers.ts only) — requires its own explicit instruction to begin; exact final copy is not yet decided (§13.12).</w:t>
+              <w:t xml:space="preserve">§6.1 and §8 (P2 tier)</w:t>
             </w:r>
           </w:p>
           <w:p>
@@ -8073,14 +8073,14 @@
                 <w:sz w:val="21"/>
                 <w:szCs w:val="21"/>
               </w:rPr>
-              <w:t xml:space="preserve">Option B: </w:t>
+              <w:t xml:space="preserve">What's known: </w:t>
             </w:r>
             <w:r>
               <w:rPr>
                 <w:sz w:val="21"/>
                 <w:szCs w:val="21"/>
               </w:rPr>
-              <w:t xml:space="preserve">/features/project-deadline-calendar footer/navigation reinforcement — remains unstarted AND unaudited; would need its own audit turn first.</w:t>
+              <w:t xml:space="preserve">project-deadline-calendar is the one Feature page missing from landing-footer.tsx's productLinks array (§6.1) — already observed, not yet re-verified or scoped into an implementation plan.</w:t>
             </w:r>
           </w:p>
           <w:p>
@@ -8106,7 +8106,7 @@
                 <w:sz w:val="21"/>
                 <w:szCs w:val="21"/>
               </w:rPr>
-              <w:t xml:space="preserve">NEITHER started. This document does not authorize beginning either on its own.</w:t>
+              <w:t xml:space="preserve">NOT started, NOT audited. This document does not authorize beginning it on its own — it needs its own audit turn first, matching this project's established discipline.</w:t>
             </w:r>
           </w:p>
         </w:tc>
@@ -8147,41 +8147,41 @@
           <w:sz w:val="21"/>
           <w:szCs w:val="21"/>
         </w:rPr>
-        <w:t xml:space="preserve">Re-read §11.17–§11.20 and §12 to confirm Client Project Tracker and the Email Feature H1 work are both fully finished — neither should be revisited without new evidence.</w:t>
-      </w:r>
-    </w:p>
-    <w:p>
-      <w:pPr>
-        <w:pStyle w:val="ListParagraph"/>
-        <w:numPr>
-          <w:ilvl w:val="0"/>
-          <w:numId w:val="1"/>
-        </w:numPr>
-        <w:spacing w:after="60"/>
-      </w:pPr>
-      <w:r>
-        <w:rPr>
-          <w:sz w:val="21"/>
-          <w:szCs w:val="21"/>
-        </w:rPr>
-        <w:t xml:space="preserve">Re-read §13 in full (especially §13.10's blueprint and §13.12's unresolved items) before implementing the Web Designers differentiation — final title/H1/description copy still needs to be proposed and approved, it was not finalized in the audit.</w:t>
-      </w:r>
-    </w:p>
-    <w:p>
-      <w:pPr>
-        <w:pStyle w:val="ListParagraph"/>
-        <w:numPr>
-          <w:ilvl w:val="0"/>
-          <w:numId w:val="1"/>
-        </w:numPr>
-        <w:spacing w:after="60"/>
-      </w:pPr>
-      <w:r>
-        <w:rPr>
-          <w:sz w:val="21"/>
-          <w:szCs w:val="21"/>
-        </w:rPr>
-        <w:t xml:space="preserve">Wait for an explicit instruction identifying which next item to work on; do not assume either, and do not begin without direction.</w:t>
+        <w:t xml:space="preserve">Re-read §11.17–§11.20, §12, and §14 to confirm Client Project Tracker, the Email Feature H1 work, and the Web Designers differentiation are all fully finished — none should be revisited without new evidence.</w:t>
+      </w:r>
+    </w:p>
+    <w:p>
+      <w:pPr>
+        <w:pStyle w:val="ListParagraph"/>
+        <w:numPr>
+          <w:ilvl w:val="0"/>
+          <w:numId w:val="1"/>
+        </w:numPr>
+        <w:spacing w:after="60"/>
+      </w:pPr>
+      <w:r>
+        <w:rPr>
+          <w:sz w:val="21"/>
+          <w:szCs w:val="21"/>
+        </w:rPr>
+        <w:t xml:space="preserve">Run a fresh audit of /features/project-deadline-calendar's current footer/navigation state before proposing any change — do not assume §6.1's observation still holds without re-verifying it.</w:t>
+      </w:r>
+    </w:p>
+    <w:p>
+      <w:pPr>
+        <w:pStyle w:val="ListParagraph"/>
+        <w:numPr>
+          <w:ilvl w:val="0"/>
+          <w:numId w:val="1"/>
+        </w:numPr>
+        <w:spacing w:after="60"/>
+      </w:pPr>
+      <w:r>
+        <w:rPr>
+          <w:sz w:val="21"/>
+          <w:szCs w:val="21"/>
+        </w:rPr>
+        <w:t xml:space="preserve">Wait for an explicit instruction before starting; do not begin without direction.</w:t>
       </w:r>
     </w:p>
     <w:p>
@@ -8234,7 +8234,7 @@
           <w:sz w:val="21"/>
           <w:szCs w:val="21"/>
         </w:rPr>
-        <w:t xml:space="preserve">The next Claude session should begin exactly here — Section 10 — after first re-reading §11.17–§11.20 and §12 to confirm what is already finished, then §13 in full before implementing the Web Designers differentiation — which requires its own explicit instruction to begin.</w:t>
+        <w:t xml:space="preserve">The next Claude session should begin exactly here — Section 10 — after first re-reading §11.17–§11.20, §12, and §14 to confirm what is already finished, then run a fresh audit of /features/project-deadline-calendar's footer/navigation state before implementing anything — which requires its own explicit instruction to begin.</w:t>
       </w:r>
     </w:p>
     <w:p>
@@ -26953,7 +26953,7 @@
                 <w:sz w:val="23"/>
                 <w:szCs w:val="23"/>
               </w:rPr>
-              <w:t xml:space="preserve">Next action:</w:t>
+              <w:t xml:space="preserve">Next action (superseded — see §14):</w:t>
             </w:r>
           </w:p>
           <w:p>
@@ -26971,7 +26971,1324 @@
                 <w:sz w:val="20"/>
                 <w:szCs w:val="20"/>
               </w:rPr>
-              <w:t xml:space="preserve">Wait for an explicit instruction to implement the §13.10 blueprint (title/H1/description refinement on app/lib/use-cases/cases/web-designers.ts only). This document does not authorize implementation on its own. Do not begin /features/project-deadline-calendar footer/navigation reinforcement (the other unstarted P2 item) without its own separate instruction either.</w:t>
+              <w:t xml:space="preserve">The §13.10 blueprint was implemented on 2026-08-30. §13.1–§13.12 above are preserved unchanged as decision history — the plan they describe is exactly what was built. §14 records the implementation result.</w:t>
+            </w:r>
+          </w:p>
+        </w:tc>
+      </w:tr>
+    </w:tbl>
+    <w:p>
+      <w:r>
+        <w:br w:type="page"/>
+      </w:r>
+    </w:p>
+    <w:p>
+      <w:pPr>
+        <w:pStyle w:val="Heading1"/>
+        <w:pBdr>
+          <w:bottom w:val="single" w:color="1D4ED8" w:sz="8" w:space="4"/>
+        </w:pBdr>
+        <w:spacing w:after="160" w:before="360"/>
+      </w:pPr>
+      <w:r>
+        <w:rPr>
+          <w:b/>
+          <w:bCs/>
+          <w:color w:val="1F2937"/>
+          <w:sz w:val="32"/>
+          <w:szCs w:val="32"/>
+        </w:rPr>
+        <w:t xml:space="preserve">14. P2 — Web Designers vs. Revisions Resource Differentiation — Implementation (2026-08-30) — COMPLETE</w:t>
+      </w:r>
+    </w:p>
+    <w:p>
+      <w:pPr>
+        <w:spacing w:after="120"/>
+      </w:pPr>
+      <w:r>
+        <w:rPr>
+          <w:sz w:val="21"/>
+          <w:szCs w:val="21"/>
+        </w:rPr>
+        <w:t xml:space="preserve">Implements the §13.10 blueprint exactly, with one deliberate, evidence-based deviation from the literally-recommended SEO title string (§14.2). No route, canonical, schema, capabilities, workflow, FAQ, proof, or CTA was touched. The Resource page was not modified.</w:t>
+      </w:r>
+    </w:p>
+    <w:p>
+      <w:pPr>
+        <w:pStyle w:val="Heading2"/>
+        <w:spacing w:after="120" w:before="260"/>
+      </w:pPr>
+      <w:r>
+        <w:rPr>
+          <w:b/>
+          <w:bCs/>
+          <w:color w:val="1D4ED8"/>
+          <w:sz w:val="26"/>
+          <w:szCs w:val="26"/>
+        </w:rPr>
+        <w:t xml:space="preserve">14.1 Old → final copy</w:t>
+      </w:r>
+    </w:p>
+    <w:p>
+      <w:pPr>
+        <w:spacing w:after="120"/>
+      </w:pPr>
+      <w:r>
+        <w:rPr>
+          <w:b/>
+          <w:bCs/>
+          <w:sz w:val="21"/>
+          <w:szCs w:val="21"/>
+        </w:rPr>
+        <w:t xml:space="preserve">SEO title — old: </w:t>
+      </w:r>
+      <w:r>
+        <w:rPr>
+          <w:sz w:val="21"/>
+          <w:szCs w:val="21"/>
+        </w:rPr>
+        <w:t xml:space="preserve">"Website Revision Task Manager for Web Designers"</w:t>
+      </w:r>
+    </w:p>
+    <w:p>
+      <w:pPr>
+        <w:spacing w:after="120"/>
+      </w:pPr>
+      <w:r>
+        <w:rPr>
+          <w:b/>
+          <w:bCs/>
+          <w:sz w:val="21"/>
+          <w:szCs w:val="21"/>
+        </w:rPr>
+        <w:t xml:space="preserve">SEO title — final: </w:t>
+      </w:r>
+      <w:r>
+        <w:rPr>
+          <w:sz w:val="21"/>
+          <w:szCs w:val="21"/>
+        </w:rPr>
+        <w:t xml:space="preserve">"Web Designer Task Management for Client Projects"</w:t>
+      </w:r>
+    </w:p>
+    <w:p>
+      <w:pPr>
+        <w:spacing w:after="120"/>
+      </w:pPr>
+      <w:r>
+        <w:rPr>
+          <w:b/>
+          <w:bCs/>
+          <w:sz w:val="21"/>
+          <w:szCs w:val="21"/>
+        </w:rPr>
+        <w:t xml:space="preserve">Meta description — old: </w:t>
+      </w:r>
+      <w:r>
+        <w:rPr>
+          <w:sz w:val="21"/>
+          <w:szCs w:val="21"/>
+        </w:rPr>
+        <w:t xml:space="preserve">"Turn client revision emails, WhatsApp messages, and marked-up screenshots into tracked website tasks, organized by page and reviewed before saving."</w:t>
+      </w:r>
+    </w:p>
+    <w:p>
+      <w:pPr>
+        <w:spacing w:after="120"/>
+      </w:pPr>
+      <w:r>
+        <w:rPr>
+          <w:b/>
+          <w:bCs/>
+          <w:sz w:val="21"/>
+          <w:szCs w:val="21"/>
+        </w:rPr>
+        <w:t xml:space="preserve">Meta description — final: </w:t>
+      </w:r>
+      <w:r>
+        <w:rPr>
+          <w:sz w:val="21"/>
+          <w:szCs w:val="21"/>
+        </w:rPr>
+        <w:t xml:space="preserve">"Turn client emails, WhatsApp messages, screenshots, and revision feedback into organized website tasks, reviewed before saving."</w:t>
+      </w:r>
+    </w:p>
+    <w:p>
+      <w:pPr>
+        <w:spacing w:after="120"/>
+      </w:pPr>
+      <w:r>
+        <w:rPr>
+          <w:b/>
+          <w:bCs/>
+          <w:sz w:val="21"/>
+          <w:szCs w:val="21"/>
+        </w:rPr>
+        <w:t xml:space="preserve">Rendered H1 — old: </w:t>
+      </w:r>
+      <w:r>
+        <w:rPr>
+          <w:sz w:val="21"/>
+          <w:szCs w:val="21"/>
+        </w:rPr>
+        <w:t xml:space="preserve">"Stop rebuilding revision emails into task lists. Start tracking each page change."</w:t>
+      </w:r>
+    </w:p>
+    <w:p>
+      <w:pPr>
+        <w:spacing w:after="120"/>
+      </w:pPr>
+      <w:r>
+        <w:rPr>
+          <w:b/>
+          <w:bCs/>
+          <w:sz w:val="21"/>
+          <w:szCs w:val="21"/>
+        </w:rPr>
+        <w:t xml:space="preserve">Rendered H1 — final: </w:t>
+      </w:r>
+      <w:r>
+        <w:rPr>
+          <w:sz w:val="21"/>
+          <w:szCs w:val="21"/>
+        </w:rPr>
+        <w:t xml:space="preserve">"Turn client requests into organized website tasks." (hero.title "Turn client requests into" + hero.highlight "organized website tasks.")</w:t>
+      </w:r>
+    </w:p>
+    <w:p>
+      <w:pPr>
+        <w:spacing w:after="120"/>
+      </w:pPr>
+      <w:r>
+        <w:rPr>
+          <w:b/>
+          <w:bCs/>
+          <w:sz w:val="21"/>
+          <w:szCs w:val="21"/>
+        </w:rPr>
+        <w:t xml:space="preserve">Hero support copy — final: </w:t>
+      </w:r>
+      <w:r>
+        <w:rPr>
+          <w:sz w:val="21"/>
+          <w:szCs w:val="21"/>
+        </w:rPr>
+        <w:t xml:space="preserve">"Text2Task helps web designers turn emails, WhatsApp messages, screenshots, and revision feedback into clear, reviewable tasks organized by page before saving."</w:t>
+      </w:r>
+    </w:p>
+    <w:p>
+      <w:pPr>
+        <w:pStyle w:val="Heading2"/>
+        <w:spacing w:after="120" w:before="260"/>
+      </w:pPr>
+      <w:r>
+        <w:rPr>
+          <w:b/>
+          <w:bCs/>
+          <w:color w:val="1D4ED8"/>
+          <w:sz w:val="26"/>
+          <w:szCs w:val="26"/>
+        </w:rPr>
+        <w:t xml:space="preserve">14.2 Deliberate deviation from the recommended SEO title string</w:t>
+      </w:r>
+    </w:p>
+    <w:tbl>
+      <w:tblPr>
+        <w:tblW w:type="pct" w:w="100%"/>
+        <w:tblBorders>
+          <w:top w:val="single" w:color="auto" w:sz="4"/>
+          <w:left w:val="single" w:color="auto" w:sz="4"/>
+          <w:bottom w:val="single" w:color="auto" w:sz="4"/>
+          <w:right w:val="single" w:color="auto" w:sz="4"/>
+          <w:insideH w:val="single" w:color="auto" w:sz="4"/>
+          <w:insideV w:val="single" w:color="auto" w:sz="4"/>
+        </w:tblBorders>
+      </w:tblPr>
+      <w:tblGrid>
+        <w:gridCol w:w="100"/>
+      </w:tblGrid>
+      <w:tr>
+        <w:tc>
+          <w:tcPr>
+            <w:tcBorders>
+              <w:top w:val="single" w:color="B91C1C" w:sz="12"/>
+              <w:left w:val="single" w:color="B91C1C" w:sz="12"/>
+              <w:bottom w:val="single" w:color="B91C1C" w:sz="12"/>
+              <w:right w:val="single" w:color="B91C1C" w:sz="12"/>
+            </w:tcBorders>
+            <w:shd w:fill="FEF2F2" w:color="auto" w:val="clear"/>
+            <w:tcMar>
+              <w:top w:type="dxa" w:w="160"/>
+              <w:left w:type="dxa" w:w="200"/>
+              <w:bottom w:type="dxa" w:w="160"/>
+              <w:right w:type="dxa" w:w="200"/>
+            </w:tcMar>
+          </w:tcPr>
+          <w:p>
+            <w:pPr>
+              <w:spacing w:after="100"/>
+            </w:pPr>
+            <w:r>
+              <w:rPr>
+                <w:b/>
+                <w:bCs/>
+                <w:color w:val="B91C1C"/>
+                <w:sz w:val="23"/>
+                <w:szCs w:val="23"/>
+              </w:rPr>
+              <w:t xml:space="preserve">The literal recommended title ("...Client Projects | Text2Task") was NOT used verbatim:</w:t>
+            </w:r>
+          </w:p>
+          <w:p>
+            <w:pPr>
+              <w:pStyle w:val="ListParagraph"/>
+              <w:numPr>
+                <w:ilvl w:val="0"/>
+                <w:numId w:val="1"/>
+              </w:numPr>
+              <w:spacing w:after="60"/>
+            </w:pPr>
+            <w:r>
+              <w:rPr>
+                <w:color w:val="1F2937"/>
+                <w:sz w:val="20"/>
+                <w:szCs w:val="20"/>
+              </w:rPr>
+              <w:t xml:space="preserve">The root layout (app/layout.tsx) declares title.template: "%s | Text2Task", which Next.js applies automatically to every descendant page's plain-string title.</w:t>
+            </w:r>
+          </w:p>
+          <w:p>
+            <w:pPr>
+              <w:pStyle w:val="ListParagraph"/>
+              <w:numPr>
+                <w:ilvl w:val="0"/>
+                <w:numId w:val="1"/>
+              </w:numPr>
+              <w:spacing w:after="60"/>
+            </w:pPr>
+            <w:r>
+              <w:rPr>
+                <w:color w:val="1F2937"/>
+                <w:sz w:val="20"/>
+                <w:szCs w:val="20"/>
+              </w:rPr>
+              <w:t xml:space="preserve">Empirically confirmed by rendering the page before this change: seo.title "Website Revision Task Manager for Web Designers" (no suffix in the config) already rendered as &lt;title&gt;Website Revision Task Manager for Web Designers | Text2Task&lt;/title&gt;.</w:t>
+            </w:r>
+          </w:p>
+          <w:p>
+            <w:pPr>
+              <w:pStyle w:val="ListParagraph"/>
+              <w:numPr>
+                <w:ilvl w:val="0"/>
+                <w:numId w:val="1"/>
+              </w:numPr>
+              <w:spacing w:after="60"/>
+            </w:pPr>
+            <w:r>
+              <w:rPr>
+                <w:color w:val="1F2937"/>
+                <w:sz w:val="20"/>
+                <w:szCs w:val="20"/>
+              </w:rPr>
+              <w:t xml:space="preserve">Baking "| Text2Task" into seo.title literally would have produced a doubled suffix ("... | Text2Task | Text2Task") in both the &lt;title&gt; tag and the route's own brandedTitle construction used for OpenGraph/Twitter — a real, verifiable bug, and also inconsistent with every other Use Case's seo.title (none of the other 11 include the suffix).</w:t>
+            </w:r>
+          </w:p>
+          <w:p>
+            <w:pPr>
+              <w:pStyle w:val="ListParagraph"/>
+              <w:numPr>
+                <w:ilvl w:val="0"/>
+                <w:numId w:val="1"/>
+              </w:numPr>
+              <w:spacing w:after="60"/>
+            </w:pPr>
+            <w:r>
+              <w:rPr>
+                <w:color w:val="1F2937"/>
+                <w:sz w:val="20"/>
+                <w:szCs w:val="20"/>
+              </w:rPr>
+              <w:t xml:space="preserve">Final seo.title omits the suffix, exactly matching sibling convention; the rendered &lt;title&gt; was re-verified after the change: "Web Designer Task Management for Client Projects | Text2Task" — correct, single suffix, matching the recommended visible result.</w:t>
+            </w:r>
+          </w:p>
+        </w:tc>
+      </w:tr>
+    </w:tbl>
+    <w:p>
+      <w:pPr>
+        <w:pStyle w:val="Heading2"/>
+        <w:spacing w:after="120" w:before="260"/>
+      </w:pPr>
+      <w:r>
+        <w:rPr>
+          <w:b/>
+          <w:bCs/>
+          <w:color w:val="1D4ED8"/>
+          <w:sz w:val="26"/>
+          <w:szCs w:val="26"/>
+        </w:rPr>
+        <w:t xml:space="preserve">14.3 H1 field-split rationale</w:t>
+      </w:r>
+    </w:p>
+    <w:p>
+      <w:pPr>
+        <w:pStyle w:val="ListParagraph"/>
+        <w:numPr>
+          <w:ilvl w:val="0"/>
+          <w:numId w:val="1"/>
+        </w:numPr>
+        <w:spacing w:after="60"/>
+      </w:pPr>
+      <w:r>
+        <w:rPr>
+          <w:sz w:val="21"/>
+          <w:szCs w:val="21"/>
+        </w:rPr>
+        <w:t xml:space="preserve">The rendered H1 is hero.title + " " + hero.highlight (confirmed by reading app/components/use-cases/use-case-hero.tsx's "editorial" variant, the variant this page uses).</w:t>
+      </w:r>
+    </w:p>
+    <w:p>
+      <w:pPr>
+        <w:pStyle w:val="ListParagraph"/>
+        <w:numPr>
+          <w:ilvl w:val="0"/>
+          <w:numId w:val="1"/>
+        </w:numPr>
+        <w:spacing w:after="60"/>
+      </w:pPr>
+      <w:r>
+        <w:rPr>
+          <w:sz w:val="21"/>
+          <w:szCs w:val="21"/>
+        </w:rPr>
+        <w:t xml:space="preserve">The recommended H1 concept was a single short sentence ("Turn client requests into organized website tasks."). Rather than forcing two separate, artificially-distinct sentences into title/highlight (the page's OLD pattern, and a pattern that risks reading as two disconnected statements), the sentence was split at its natural midpoint — hero.title carries the first clause, hero.highlight (rendered in blue) carries the outcome noun phrase — mirroring the cleaner single-sentence pattern already used by the project-managers Use Case.</w:t>
+      </w:r>
+    </w:p>
+    <w:p>
+      <w:pPr>
+        <w:pStyle w:val="ListParagraph"/>
+        <w:numPr>
+          <w:ilvl w:val="0"/>
+          <w:numId w:val="1"/>
+        </w:numPr>
+        <w:spacing w:after="60"/>
+      </w:pPr>
+      <w:r>
+        <w:rPr>
+          <w:sz w:val="21"/>
+          <w:szCs w:val="21"/>
+        </w:rPr>
+        <w:t xml:space="preserve">Result verified by rendering: one natural, un-stuffed sentence, no duplicated or awkward phrasing.</w:t>
+      </w:r>
+    </w:p>
+    <w:p>
+      <w:pPr>
+        <w:pStyle w:val="Heading2"/>
+        <w:spacing w:after="120" w:before="260"/>
+      </w:pPr>
+      <w:r>
+        <w:rPr>
+          <w:b/>
+          <w:bCs/>
+          <w:color w:val="1D4ED8"/>
+          <w:sz w:val="26"/>
+          <w:szCs w:val="26"/>
+        </w:rPr>
+        <w:t xml:space="preserve">14.4 Why the Use Case now has a distinct intent</w:t>
+      </w:r>
+    </w:p>
+    <w:p>
+      <w:pPr>
+        <w:pStyle w:val="ListParagraph"/>
+        <w:numPr>
+          <w:ilvl w:val="0"/>
+          <w:numId w:val="1"/>
+        </w:numPr>
+        <w:spacing w:after="60"/>
+      </w:pPr>
+      <w:r>
+        <w:rPr>
+          <w:sz w:val="21"/>
+          <w:szCs w:val="21"/>
+        </w:rPr>
+        <w:t xml:space="preserve">Title and H1 no longer lead with "revision" — they lead with the broader "client request → organized website task" workflow, matching the permanent intent boundary in §13.5.</w:t>
+      </w:r>
+    </w:p>
+    <w:p>
+      <w:pPr>
+        <w:pStyle w:val="ListParagraph"/>
+        <w:numPr>
+          <w:ilvl w:val="0"/>
+          <w:numId w:val="1"/>
+        </w:numPr>
+        <w:spacing w:after="60"/>
+      </w:pPr>
+      <w:r>
+        <w:rPr>
+          <w:sz w:val="21"/>
+          <w:szCs w:val="21"/>
+        </w:rPr>
+        <w:t xml:space="preserve">Revision language remains present and real, not erased: hero.description explicitly lists "revision feedback" as one of several input types (alongside emails, WhatsApp messages, screenshots), and every mid-page section (capabilities, workflow, painPoints, clientUpdates, FAQ, proof) — none of which were touched — still covers revisions in depth.</w:t>
+      </w:r>
+    </w:p>
+    <w:p>
+      <w:pPr>
+        <w:pStyle w:val="ListParagraph"/>
+        <w:numPr>
+          <w:ilvl w:val="0"/>
+          <w:numId w:val="1"/>
+        </w:numPr>
+        <w:spacing w:after="60"/>
+      </w:pPr>
+      <w:r>
+        <w:rPr>
+          <w:sz w:val="21"/>
+          <w:szCs w:val="21"/>
+        </w:rPr>
+        <w:t xml:space="preserve">The Resource remains the clear, sole owner of "manage client revisions" as a dedicated topic; the Use Case now clearly owns the broader audience-fit workflow question instead of duplicating the Resource's narrow topic.</w:t>
+      </w:r>
+    </w:p>
+    <w:p>
+      <w:pPr>
+        <w:pStyle w:val="Heading2"/>
+        <w:spacing w:after="120" w:before="260"/>
+      </w:pPr>
+      <w:r>
+        <w:rPr>
+          <w:b/>
+          <w:bCs/>
+          <w:color w:val="1D4ED8"/>
+          <w:sz w:val="26"/>
+          <w:szCs w:val="26"/>
+        </w:rPr>
+        <w:t xml:space="preserve">14.5 Confirmation: Resource unchanged</w:t>
+      </w:r>
+    </w:p>
+    <w:p>
+      <w:pPr>
+        <w:pStyle w:val="ListParagraph"/>
+        <w:numPr>
+          <w:ilvl w:val="0"/>
+          <w:numId w:val="1"/>
+        </w:numPr>
+        <w:spacing w:after="60"/>
+      </w:pPr>
+      <w:r>
+        <w:rPr>
+          <w:sz w:val="21"/>
+          <w:szCs w:val="21"/>
+        </w:rPr>
+        <w:t xml:space="preserve">app/resources/manage-client-revisions-web-designers/page.tsx: zero lines changed. Verified by git diff (file does not appear in the diff) and by re-rendering the page: H1 "How Web Designers Can Manage Client Revisions Faster" and &lt;title&gt; "How Web Designers Can Manage Client Revisions Faster | Text2Task" — identical to §13.1's recorded pre-implementation state.</w:t>
+      </w:r>
+    </w:p>
+    <w:p>
+      <w:pPr>
+        <w:pStyle w:val="Heading2"/>
+        <w:spacing w:after="120" w:before="260"/>
+      </w:pPr>
+      <w:r>
+        <w:rPr>
+          <w:b/>
+          <w:bCs/>
+          <w:color w:val="1D4ED8"/>
+          <w:sz w:val="26"/>
+          <w:szCs w:val="26"/>
+        </w:rPr>
+        <w:t xml:space="preserve">14.6 Cross-link status</w:t>
+      </w:r>
+    </w:p>
+    <w:p>
+      <w:pPr>
+        <w:pStyle w:val="ListParagraph"/>
+        <w:numPr>
+          <w:ilvl w:val="0"/>
+          <w:numId w:val="1"/>
+        </w:numPr>
+        <w:spacing w:after="60"/>
+      </w:pPr>
+      <w:r>
+        <w:rPr>
+          <w:sz w:val="21"/>
+          <w:szCs w:val="21"/>
+        </w:rPr>
+        <w:t xml:space="preserve">NO CHANGE, as predicted in §13.8. Use Case → Resource (relatedLinks card) and Resource → Use Case (inline link in "Where Text2Task fits") both verified still present and correct after the change — neither anchor text quoted the old H1, so nothing needed updating.</w:t>
+      </w:r>
+    </w:p>
+    <w:p>
+      <w:pPr>
+        <w:pStyle w:val="ListParagraph"/>
+        <w:numPr>
+          <w:ilvl w:val="0"/>
+          <w:numId w:val="1"/>
+        </w:numPr>
+        <w:spacing w:after="60"/>
+      </w:pPr>
+      <w:r>
+        <w:rPr>
+          <w:sz w:val="21"/>
+          <w:szCs w:val="21"/>
+        </w:rPr>
+        <w:t xml:space="preserve">No duplicate link was added.</w:t>
+      </w:r>
+    </w:p>
+    <w:p>
+      <w:pPr>
+        <w:pStyle w:val="Heading2"/>
+        <w:spacing w:after="120" w:before="260"/>
+      </w:pPr>
+      <w:r>
+        <w:rPr>
+          <w:b/>
+          <w:bCs/>
+          <w:color w:val="1D4ED8"/>
+          <w:sz w:val="26"/>
+          <w:szCs w:val="26"/>
+        </w:rPr>
+        <w:t xml:space="preserve">14.7 Cannibalization / SEO QA</w:t>
+      </w:r>
+    </w:p>
+    <w:tbl>
+      <w:tblPr>
+        <w:tblW w:type="pct" w:w="100%"/>
+        <w:tblBorders>
+          <w:top w:val="single" w:color="D1D5DB" w:sz="4"/>
+          <w:left w:val="single" w:color="D1D5DB" w:sz="4"/>
+          <w:bottom w:val="single" w:color="D1D5DB" w:sz="4"/>
+          <w:right w:val="single" w:color="D1D5DB" w:sz="4"/>
+          <w:insideH w:val="single" w:color="D1D5DB" w:sz="4"/>
+          <w:insideV w:val="single" w:color="D1D5DB" w:sz="4"/>
+        </w:tblBorders>
+      </w:tblPr>
+      <w:tblGrid>
+        <w:gridCol w:w="100"/>
+        <w:gridCol w:w="100"/>
+      </w:tblGrid>
+      <w:tr>
+        <w:trPr>
+          <w:tblHeader/>
+        </w:trPr>
+        <w:tc>
+          <w:tcPr>
+            <w:tcW w:type="dxa" w:w="4600"/>
+            <w:shd w:fill="1D4ED8" w:color="auto" w:val="clear"/>
+            <w:tcMar>
+              <w:top w:type="dxa" w:w="80"/>
+              <w:left w:type="dxa" w:w="100"/>
+              <w:bottom w:type="dxa" w:w="80"/>
+              <w:right w:type="dxa" w:w="100"/>
+            </w:tcMar>
+            <w:vAlign w:val="center"/>
+          </w:tcPr>
+          <w:p>
+            <w:r>
+              <w:rPr>
+                <w:b/>
+                <w:bCs/>
+                <w:color w:val="FFFFFF"/>
+                <w:sz w:val="19"/>
+                <w:szCs w:val="19"/>
+              </w:rPr>
+              <w:t xml:space="preserve">Check</w:t>
+            </w:r>
+          </w:p>
+        </w:tc>
+        <w:tc>
+          <w:tcPr>
+            <w:tcW w:type="dxa" w:w="5314"/>
+            <w:shd w:fill="1D4ED8" w:color="auto" w:val="clear"/>
+            <w:tcMar>
+              <w:top w:type="dxa" w:w="80"/>
+              <w:left w:type="dxa" w:w="100"/>
+              <w:bottom w:type="dxa" w:w="80"/>
+              <w:right w:type="dxa" w:w="100"/>
+            </w:tcMar>
+            <w:vAlign w:val="center"/>
+          </w:tcPr>
+          <w:p>
+            <w:r>
+              <w:rPr>
+                <w:b/>
+                <w:bCs/>
+                <w:color w:val="FFFFFF"/>
+                <w:sz w:val="19"/>
+                <w:szCs w:val="19"/>
+              </w:rPr>
+              <w:t xml:space="preserve">Result</w:t>
+            </w:r>
+          </w:p>
+        </w:tc>
+      </w:tr>
+      <w:tr>
+        <w:tc>
+          <w:tcPr>
+            <w:tcW w:type="dxa" w:w="4600"/>
+            <w:tcMar>
+              <w:top w:type="dxa" w:w="80"/>
+              <w:left w:type="dxa" w:w="100"/>
+              <w:bottom w:type="dxa" w:w="80"/>
+              <w:right w:type="dxa" w:w="100"/>
+            </w:tcMar>
+            <w:vAlign w:val="center"/>
+          </w:tcPr>
+          <w:p>
+            <w:r>
+              <w:rPr>
+                <w:b w:val="false"/>
+                <w:bCs w:val="false"/>
+                <w:color w:val="1F2937"/>
+                <w:sz w:val="19"/>
+                <w:szCs w:val="19"/>
+              </w:rPr>
+              <w:t xml:space="preserve">Use Case and Resource H1s clearly distinct?</w:t>
+            </w:r>
+          </w:p>
+        </w:tc>
+        <w:tc>
+          <w:tcPr>
+            <w:tcW w:type="dxa" w:w="5314"/>
+            <w:tcMar>
+              <w:top w:type="dxa" w:w="80"/>
+              <w:left w:type="dxa" w:w="100"/>
+              <w:bottom w:type="dxa" w:w="80"/>
+              <w:right w:type="dxa" w:w="100"/>
+            </w:tcMar>
+            <w:vAlign w:val="center"/>
+          </w:tcPr>
+          <w:p>
+            <w:r>
+              <w:rPr>
+                <w:b w:val="false"/>
+                <w:bCs w:val="false"/>
+                <w:color w:val="1F2937"/>
+                <w:sz w:val="19"/>
+                <w:szCs w:val="19"/>
+              </w:rPr>
+              <w:t xml:space="preserve">YES — "Turn client requests into organized website tasks." vs. "How Web Designers Can Manage Client Revisions Faster"</w:t>
+            </w:r>
+          </w:p>
+        </w:tc>
+      </w:tr>
+      <w:tr>
+        <w:tc>
+          <w:tcPr>
+            <w:tcW w:type="dxa" w:w="4600"/>
+            <w:shd w:fill="F3F4F6" w:color="auto" w:val="clear"/>
+            <w:tcMar>
+              <w:top w:type="dxa" w:w="80"/>
+              <w:left w:type="dxa" w:w="100"/>
+              <w:bottom w:type="dxa" w:w="80"/>
+              <w:right w:type="dxa" w:w="100"/>
+            </w:tcMar>
+            <w:vAlign w:val="center"/>
+          </w:tcPr>
+          <w:p>
+            <w:r>
+              <w:rPr>
+                <w:b w:val="false"/>
+                <w:bCs w:val="false"/>
+                <w:color w:val="1F2937"/>
+                <w:sz w:val="19"/>
+                <w:szCs w:val="19"/>
+              </w:rPr>
+              <w:t xml:space="preserve">Use Case and Resource titles clearly distinct?</w:t>
+            </w:r>
+          </w:p>
+        </w:tc>
+        <w:tc>
+          <w:tcPr>
+            <w:tcW w:type="dxa" w:w="5314"/>
+            <w:shd w:fill="F3F4F6" w:color="auto" w:val="clear"/>
+            <w:tcMar>
+              <w:top w:type="dxa" w:w="80"/>
+              <w:left w:type="dxa" w:w="100"/>
+              <w:bottom w:type="dxa" w:w="80"/>
+              <w:right w:type="dxa" w:w="100"/>
+            </w:tcMar>
+            <w:vAlign w:val="center"/>
+          </w:tcPr>
+          <w:p>
+            <w:r>
+              <w:rPr>
+                <w:b w:val="false"/>
+                <w:bCs w:val="false"/>
+                <w:color w:val="1F2937"/>
+                <w:sz w:val="19"/>
+                <w:szCs w:val="19"/>
+              </w:rPr>
+              <w:t xml:space="preserve">YES — "Web Designer Task Management for Client Projects" vs. "How Web Designers Can Manage Client Revisions Faster"</w:t>
+            </w:r>
+          </w:p>
+        </w:tc>
+      </w:tr>
+      <w:tr>
+        <w:tc>
+          <w:tcPr>
+            <w:tcW w:type="dxa" w:w="4600"/>
+            <w:tcMar>
+              <w:top w:type="dxa" w:w="80"/>
+              <w:left w:type="dxa" w:w="100"/>
+              <w:bottom w:type="dxa" w:w="80"/>
+              <w:right w:type="dxa" w:w="100"/>
+            </w:tcMar>
+            <w:vAlign w:val="center"/>
+          </w:tcPr>
+          <w:p>
+            <w:r>
+              <w:rPr>
+                <w:b w:val="false"/>
+                <w:bCs w:val="false"/>
+                <w:color w:val="1F2937"/>
+                <w:sz w:val="19"/>
+                <w:szCs w:val="19"/>
+              </w:rPr>
+              <w:t xml:space="preserve">"Revision" no longer the Use Case's dominant identity?</w:t>
+            </w:r>
+          </w:p>
+        </w:tc>
+        <w:tc>
+          <w:tcPr>
+            <w:tcW w:type="dxa" w:w="5314"/>
+            <w:tcMar>
+              <w:top w:type="dxa" w:w="80"/>
+              <w:left w:type="dxa" w:w="100"/>
+              <w:bottom w:type="dxa" w:w="80"/>
+              <w:right w:type="dxa" w:w="100"/>
+            </w:tcMar>
+            <w:vAlign w:val="center"/>
+          </w:tcPr>
+          <w:p>
+            <w:r>
+              <w:rPr>
+                <w:b w:val="false"/>
+                <w:bCs w:val="false"/>
+                <w:color w:val="1F2937"/>
+                <w:sz w:val="19"/>
+                <w:szCs w:val="19"/>
+              </w:rPr>
+              <w:t xml:space="preserve">YES — absent from title and H1; present only as one input type in hero.description and in the untouched mid-page sections</w:t>
+            </w:r>
+          </w:p>
+        </w:tc>
+      </w:tr>
+      <w:tr>
+        <w:tc>
+          <w:tcPr>
+            <w:tcW w:type="dxa" w:w="4600"/>
+            <w:shd w:fill="F3F4F6" w:color="auto" w:val="clear"/>
+            <w:tcMar>
+              <w:top w:type="dxa" w:w="80"/>
+              <w:left w:type="dxa" w:w="100"/>
+              <w:bottom w:type="dxa" w:w="80"/>
+              <w:right w:type="dxa" w:w="100"/>
+            </w:tcMar>
+            <w:vAlign w:val="center"/>
+          </w:tcPr>
+          <w:p>
+            <w:r>
+              <w:rPr>
+                <w:b w:val="false"/>
+                <w:bCs w:val="false"/>
+                <w:color w:val="1F2937"/>
+                <w:sz w:val="19"/>
+                <w:szCs w:val="19"/>
+              </w:rPr>
+              <w:t xml:space="preserve">Revision language still exists naturally?</w:t>
+            </w:r>
+          </w:p>
+        </w:tc>
+        <w:tc>
+          <w:tcPr>
+            <w:tcW w:type="dxa" w:w="5314"/>
+            <w:shd w:fill="F3F4F6" w:color="auto" w:val="clear"/>
+            <w:tcMar>
+              <w:top w:type="dxa" w:w="80"/>
+              <w:left w:type="dxa" w:w="100"/>
+              <w:bottom w:type="dxa" w:w="80"/>
+              <w:right w:type="dxa" w:w="100"/>
+            </w:tcMar>
+            <w:vAlign w:val="center"/>
+          </w:tcPr>
+          <w:p>
+            <w:r>
+              <w:rPr>
+                <w:b w:val="false"/>
+                <w:bCs w:val="false"/>
+                <w:color w:val="1F2937"/>
+                <w:sz w:val="19"/>
+                <w:szCs w:val="19"/>
+              </w:rPr>
+              <w:t xml:space="preserve">YES — confirmed by an automated test asserting the rendered page still contains "revision"</w:t>
+            </w:r>
+          </w:p>
+        </w:tc>
+      </w:tr>
+      <w:tr>
+        <w:tc>
+          <w:tcPr>
+            <w:tcW w:type="dxa" w:w="4600"/>
+            <w:tcMar>
+              <w:top w:type="dxa" w:w="80"/>
+              <w:left w:type="dxa" w:w="100"/>
+              <w:bottom w:type="dxa" w:w="80"/>
+              <w:right w:type="dxa" w:w="100"/>
+            </w:tcMar>
+            <w:vAlign w:val="center"/>
+          </w:tcPr>
+          <w:p>
+            <w:r>
+              <w:rPr>
+                <w:b w:val="false"/>
+                <w:bCs w:val="false"/>
+                <w:color w:val="1F2937"/>
+                <w:sz w:val="19"/>
+                <w:szCs w:val="19"/>
+              </w:rPr>
+              <w:t xml:space="preserve">Route/canonical/schema changed?</w:t>
+            </w:r>
+          </w:p>
+        </w:tc>
+        <w:tc>
+          <w:tcPr>
+            <w:tcW w:type="dxa" w:w="5314"/>
+            <w:tcMar>
+              <w:top w:type="dxa" w:w="80"/>
+              <w:left w:type="dxa" w:w="100"/>
+              <w:bottom w:type="dxa" w:w="80"/>
+              <w:right w:type="dxa" w:w="100"/>
+            </w:tcMar>
+            <w:vAlign w:val="center"/>
+          </w:tcPr>
+          <w:p>
+            <w:r>
+              <w:rPr>
+                <w:b w:val="false"/>
+                <w:bCs w:val="false"/>
+                <w:color w:val="1F2937"/>
+                <w:sz w:val="19"/>
+                <w:szCs w:val="19"/>
+              </w:rPr>
+              <w:t xml:space="preserve">NO — none touched</w:t>
+            </w:r>
+          </w:p>
+        </w:tc>
+      </w:tr>
+      <w:tr>
+        <w:tc>
+          <w:tcPr>
+            <w:tcW w:type="dxa" w:w="4600"/>
+            <w:shd w:fill="F3F4F6" w:color="auto" w:val="clear"/>
+            <w:tcMar>
+              <w:top w:type="dxa" w:w="80"/>
+              <w:left w:type="dxa" w:w="100"/>
+              <w:bottom w:type="dxa" w:w="80"/>
+              <w:right w:type="dxa" w:w="100"/>
+            </w:tcMar>
+            <w:vAlign w:val="center"/>
+          </w:tcPr>
+          <w:p>
+            <w:r>
+              <w:rPr>
+                <w:b w:val="false"/>
+                <w:bCs w:val="false"/>
+                <w:color w:val="1F2937"/>
+                <w:sz w:val="19"/>
+                <w:szCs w:val="19"/>
+              </w:rPr>
+              <w:t xml:space="preserve">Existing cross-links intact?</w:t>
+            </w:r>
+          </w:p>
+        </w:tc>
+        <w:tc>
+          <w:tcPr>
+            <w:tcW w:type="dxa" w:w="5314"/>
+            <w:shd w:fill="F3F4F6" w:color="auto" w:val="clear"/>
+            <w:tcMar>
+              <w:top w:type="dxa" w:w="80"/>
+              <w:left w:type="dxa" w:w="100"/>
+              <w:bottom w:type="dxa" w:w="80"/>
+              <w:right w:type="dxa" w:w="100"/>
+            </w:tcMar>
+            <w:vAlign w:val="center"/>
+          </w:tcPr>
+          <w:p>
+            <w:r>
+              <w:rPr>
+                <w:b w:val="false"/>
+                <w:bCs w:val="false"/>
+                <w:color w:val="1F2937"/>
+                <w:sz w:val="19"/>
+                <w:szCs w:val="19"/>
+              </w:rPr>
+              <w:t xml:space="preserve">YES — verified by automated tests in both directions</w:t>
+            </w:r>
+          </w:p>
+        </w:tc>
+      </w:tr>
+      <w:tr>
+        <w:tc>
+          <w:tcPr>
+            <w:tcW w:type="dxa" w:w="4600"/>
+            <w:tcMar>
+              <w:top w:type="dxa" w:w="80"/>
+              <w:left w:type="dxa" w:w="100"/>
+              <w:bottom w:type="dxa" w:w="80"/>
+              <w:right w:type="dxa" w:w="100"/>
+            </w:tcMar>
+            <w:vAlign w:val="center"/>
+          </w:tcPr>
+          <w:p>
+            <w:r>
+              <w:rPr>
+                <w:b w:val="false"/>
+                <w:bCs w:val="false"/>
+                <w:color w:val="1F2937"/>
+                <w:sz w:val="19"/>
+                <w:szCs w:val="19"/>
+              </w:rPr>
+              <w:t xml:space="preserve">New cannibalization with /solutions/freelancer-project-management-software?</w:t>
+            </w:r>
+          </w:p>
+        </w:tc>
+        <w:tc>
+          <w:tcPr>
+            <w:tcW w:type="dxa" w:w="5314"/>
+            <w:tcMar>
+              <w:top w:type="dxa" w:w="80"/>
+              <w:left w:type="dxa" w:w="100"/>
+              <w:bottom w:type="dxa" w:w="80"/>
+              <w:right w:type="dxa" w:w="100"/>
+            </w:tcMar>
+            <w:vAlign w:val="center"/>
+          </w:tcPr>
+          <w:p>
+            <w:r>
+              <w:rPr>
+                <w:b w:val="false"/>
+                <w:bCs w:val="false"/>
+                <w:color w:val="1F2937"/>
+                <w:sz w:val="19"/>
+                <w:szCs w:val="19"/>
+              </w:rPr>
+              <w:t xml:space="preserve">NO — verified by an automated test that the rendered page does not contain "freelancer project management software"</w:t>
+            </w:r>
+          </w:p>
+        </w:tc>
+      </w:tr>
+    </w:tbl>
+    <w:p>
+      <w:pPr>
+        <w:pStyle w:val="Heading2"/>
+        <w:spacing w:after="120" w:before="260"/>
+      </w:pPr>
+      <w:r>
+        <w:rPr>
+          <w:b/>
+          <w:bCs/>
+          <w:color w:val="1D4ED8"/>
+          <w:sz w:val="26"/>
+          <w:szCs w:val="26"/>
+        </w:rPr>
+        <w:t xml:space="preserve">14.8 Exact production files changed</w:t>
+      </w:r>
+    </w:p>
+    <w:p>
+      <w:pPr>
+        <w:pStyle w:val="ListParagraph"/>
+        <w:numPr>
+          <w:ilvl w:val="0"/>
+          <w:numId w:val="1"/>
+        </w:numPr>
+        <w:spacing w:after="60"/>
+      </w:pPr>
+      <w:r>
+        <w:rPr>
+          <w:sz w:val="21"/>
+          <w:szCs w:val="21"/>
+        </w:rPr>
+        <w:t xml:space="preserve">app/lib/use-cases/cases/web-designers.ts — 4 fields changed: seo.title, seo.description, hero.title, hero.highlight, hero.description (5 string values across 4 named fields; hero.title/hero.highlight together form the single rendered H1).</w:t>
+      </w:r>
+    </w:p>
+    <w:p>
+      <w:pPr>
+        <w:pStyle w:val="ListParagraph"/>
+        <w:numPr>
+          <w:ilvl w:val="0"/>
+          <w:numId w:val="1"/>
+        </w:numPr>
+        <w:spacing w:after="60"/>
+      </w:pPr>
+      <w:r>
+        <w:rPr>
+          <w:sz w:val="21"/>
+          <w:szCs w:val="21"/>
+        </w:rPr>
+        <w:t xml:space="preserve">No other file was touched. capabilities, workflow, faq, proof, clientUpdates, relatedLinks, finalCta, and the top-level unused title field are all unchanged.</w:t>
+      </w:r>
+    </w:p>
+    <w:p>
+      <w:pPr>
+        <w:pStyle w:val="Heading2"/>
+        <w:spacing w:after="120" w:before="260"/>
+      </w:pPr>
+      <w:r>
+        <w:rPr>
+          <w:b/>
+          <w:bCs/>
+          <w:color w:val="1D4ED8"/>
+          <w:sz w:val="26"/>
+          <w:szCs w:val="26"/>
+        </w:rPr>
+        <w:t xml:space="preserve">14.9 Tests</w:t>
+      </w:r>
+    </w:p>
+    <w:p>
+      <w:pPr>
+        <w:pStyle w:val="ListParagraph"/>
+        <w:numPr>
+          <w:ilvl w:val="0"/>
+          <w:numId w:val="1"/>
+        </w:numPr>
+        <w:spacing w:after="60"/>
+      </w:pPr>
+      <w:r>
+        <w:rPr>
+          <w:sz w:val="21"/>
+          <w:szCs w:val="21"/>
+        </w:rPr>
+        <w:t xml:space="preserve">app/lib/use-cases/cases/web-designers.test.tsx — NEW. 8 tests: rendered H1 matches the new intent; H1 doesn't lead with revision framing; H1 not near-identical to the Resource's H1; SEO title distinct and revision-free; revision language still present; no new Freelancer Solution cannibalization; no automatic inbox/WhatsApp-sync overclaim; Use Case → Resource link present.</w:t>
+      </w:r>
+    </w:p>
+    <w:p>
+      <w:pPr>
+        <w:pStyle w:val="ListParagraph"/>
+        <w:numPr>
+          <w:ilvl w:val="0"/>
+          <w:numId w:val="1"/>
+        </w:numPr>
+        <w:spacing w:after="60"/>
+      </w:pPr>
+      <w:r>
+        <w:rPr>
+          <w:sz w:val="21"/>
+          <w:szCs w:val="21"/>
+        </w:rPr>
+        <w:t xml:space="preserve">app/resources/manage-client-revisions-web-designers/page.test.tsx — NEW. 3 tests: H1 unchanged; title/canonical unchanged; Resource → Use Case link present.</w:t>
+      </w:r>
+    </w:p>
+    <w:p>
+      <w:pPr>
+        <w:pStyle w:val="Heading2"/>
+        <w:spacing w:after="120" w:before="260"/>
+      </w:pPr>
+      <w:r>
+        <w:rPr>
+          <w:b/>
+          <w:bCs/>
+          <w:color w:val="1D4ED8"/>
+          <w:sz w:val="26"/>
+          <w:szCs w:val="26"/>
+        </w:rPr>
+        <w:t xml:space="preserve">14.10 Verification results</w:t>
+      </w:r>
+    </w:p>
+    <w:p>
+      <w:pPr>
+        <w:pStyle w:val="ListParagraph"/>
+        <w:numPr>
+          <w:ilvl w:val="0"/>
+          <w:numId w:val="1"/>
+        </w:numPr>
+        <w:spacing w:after="60"/>
+      </w:pPr>
+      <w:r>
+        <w:rPr>
+          <w:sz w:val="21"/>
+          <w:szCs w:val="21"/>
+        </w:rPr>
+        <w:t xml:space="preserve">Targeted tests: 62 passed across 3 files (2 new files + the shared app/components/use-cases/use-case-detail-page.test.tsx, re-run since it renders every Use Case including web-designers).</w:t>
+      </w:r>
+    </w:p>
+    <w:p>
+      <w:pPr>
+        <w:pStyle w:val="ListParagraph"/>
+        <w:numPr>
+          <w:ilvl w:val="0"/>
+          <w:numId w:val="1"/>
+        </w:numPr>
+        <w:spacing w:after="60"/>
+      </w:pPr>
+      <w:r>
+        <w:rPr>
+          <w:sz w:val="21"/>
+          <w:szCs w:val="21"/>
+        </w:rPr>
+        <w:t xml:space="preserve">Full project test suite: 5,078 tests passed across 188 test files — zero regressions.</w:t>
+      </w:r>
+    </w:p>
+    <w:p>
+      <w:pPr>
+        <w:pStyle w:val="ListParagraph"/>
+        <w:numPr>
+          <w:ilvl w:val="0"/>
+          <w:numId w:val="1"/>
+        </w:numPr>
+        <w:spacing w:after="60"/>
+      </w:pPr>
+      <w:r>
+        <w:rPr>
+          <w:sz w:val="21"/>
+          <w:szCs w:val="21"/>
+        </w:rPr>
+        <w:t xml:space="preserve">npx tsc --noEmit: clean, zero errors.</w:t>
+      </w:r>
+    </w:p>
+    <w:p>
+      <w:pPr>
+        <w:pStyle w:val="ListParagraph"/>
+        <w:numPr>
+          <w:ilvl w:val="0"/>
+          <w:numId w:val="1"/>
+        </w:numPr>
+        <w:spacing w:after="60"/>
+      </w:pPr>
+      <w:r>
+        <w:rPr>
+          <w:sz w:val="21"/>
+          <w:szCs w:val="21"/>
+        </w:rPr>
+        <w:t xml:space="preserve">npm run build: succeeded; both /use-cases/web-designers and /resources/manage-client-revisions-web-designers confirmed present in the route output.</w:t>
+      </w:r>
+    </w:p>
+    <w:p>
+      <w:pPr>
+        <w:pStyle w:val="ListParagraph"/>
+        <w:numPr>
+          <w:ilvl w:val="0"/>
+          <w:numId w:val="1"/>
+        </w:numPr>
+        <w:spacing w:after="60"/>
+      </w:pPr>
+      <w:r>
+        <w:rPr>
+          <w:sz w:val="21"/>
+          <w:szCs w:val="21"/>
+        </w:rPr>
+        <w:t xml:space="preserve">git diff --check: clean (one harmless LF/CRLF line-ending notice).</w:t>
+      </w:r>
+    </w:p>
+    <w:p>
+      <w:pPr>
+        <w:pStyle w:val="ListParagraph"/>
+        <w:numPr>
+          <w:ilvl w:val="0"/>
+          <w:numId w:val="1"/>
+        </w:numPr>
+        <w:spacing w:after="60"/>
+      </w:pPr>
+      <w:r>
+        <w:rPr>
+          <w:sz w:val="21"/>
+          <w:szCs w:val="21"/>
+        </w:rPr>
+        <w:t xml:space="preserve">Full diff reviewed line by line — exactly one production file changed, 4 fields, nothing else.</w:t>
+      </w:r>
+    </w:p>
+    <w:p>
+      <w:pPr>
+        <w:pStyle w:val="ListParagraph"/>
+        <w:numPr>
+          <w:ilvl w:val="0"/>
+          <w:numId w:val="1"/>
+        </w:numPr>
+        <w:spacing w:after="60"/>
+      </w:pPr>
+      <w:r>
+        <w:rPr>
+          <w:sz w:val="21"/>
+          <w:szCs w:val="21"/>
+        </w:rPr>
+        <w:t xml:space="preserve">Rendered &lt;title&gt;/H1 verified empirically for both pages via the dev server both before and after the change (see §14.2), not assumed from source alone.</w:t>
+      </w:r>
+    </w:p>
+    <w:p>
+      <w:pPr>
+        <w:pStyle w:val="Heading2"/>
+        <w:spacing w:after="120" w:before="260"/>
+      </w:pPr>
+      <w:r>
+        <w:rPr>
+          <w:b/>
+          <w:bCs/>
+          <w:color w:val="1D4ED8"/>
+          <w:sz w:val="26"/>
+          <w:szCs w:val="26"/>
+        </w:rPr>
+        <w:t xml:space="preserve">14.11 Next SEO roadmap phase</w:t>
+      </w:r>
+    </w:p>
+    <w:tbl>
+      <w:tblPr>
+        <w:tblW w:type="pct" w:w="100%"/>
+        <w:tblBorders>
+          <w:top w:val="single" w:color="auto" w:sz="4"/>
+          <w:left w:val="single" w:color="auto" w:sz="4"/>
+          <w:bottom w:val="single" w:color="auto" w:sz="4"/>
+          <w:right w:val="single" w:color="auto" w:sz="4"/>
+          <w:insideH w:val="single" w:color="auto" w:sz="4"/>
+          <w:insideV w:val="single" w:color="auto" w:sz="4"/>
+        </w:tblBorders>
+      </w:tblPr>
+      <w:tblGrid>
+        <w:gridCol w:w="100"/>
+      </w:tblGrid>
+      <w:tr>
+        <w:tc>
+          <w:tcPr>
+            <w:tcBorders>
+              <w:top w:val="single" w:color="15803D" w:sz="12"/>
+              <w:left w:val="single" w:color="15803D" w:sz="12"/>
+              <w:bottom w:val="single" w:color="15803D" w:sz="12"/>
+              <w:right w:val="single" w:color="15803D" w:sz="12"/>
+            </w:tcBorders>
+            <w:shd w:fill="F0FDF4" w:color="auto" w:val="clear"/>
+            <w:tcMar>
+              <w:top w:type="dxa" w:w="160"/>
+              <w:left w:type="dxa" w:w="200"/>
+              <w:bottom w:type="dxa" w:w="160"/>
+              <w:right w:type="dxa" w:w="200"/>
+            </w:tcMar>
+          </w:tcPr>
+          <w:p>
+            <w:pPr>
+              <w:spacing w:after="100"/>
+            </w:pPr>
+            <w:r>
+              <w:rPr>
+                <w:b/>
+                <w:bCs/>
+                <w:color w:val="15803D"/>
+                <w:sz w:val="23"/>
+                <w:szCs w:val="23"/>
+              </w:rPr>
+              <w:t xml:space="preserve">Next action:</w:t>
+            </w:r>
+          </w:p>
+          <w:p>
+            <w:pPr>
+              <w:pStyle w:val="ListParagraph"/>
+              <w:numPr>
+                <w:ilvl w:val="0"/>
+                <w:numId w:val="1"/>
+              </w:numPr>
+              <w:spacing w:after="60"/>
+            </w:pPr>
+            <w:r>
+              <w:rPr>
+                <w:color w:val="1F2937"/>
+                <w:sz w:val="20"/>
+                <w:szCs w:val="20"/>
+              </w:rPr>
+              <w:t xml:space="preserve">P2 Web Designers vs. Revisions Resource differentiation is COMPLETE. The next unstarted, still-unaudited roadmap item is: /features/project-deadline-calendar footer/navigation reinforcement (§6.1, §8 P2 tier). It was explicitly NOT started or audited in this phase and requires its own audit turn before implementation.</w:t>
             </w:r>
           </w:p>
         </w:tc>

</xml_diff>